<commit_message>
report: them trich dan [1]-[9] trong than bao cao tro toi muc Tai lieu tham khao (chuan IEEE) + rebuild
</commit_message>
<xml_diff>
--- a/docs/bao-cao-xe-tu-hanh.docx
+++ b/docs/bao-cao-xe-tu-hanh.docx
@@ -497,91 +497,10 @@
         <w:rPr>
           <w:rFonts w:ascii="Times New Roman" w:hAnsi="Times New Roman" w:cs="Times New Roman"/>
           <w:b w:val="0"/>
-          <w:i/>
-          <w:sz w:val="26"/>
-        </w:rPr>
-        <w:t xml:space="preserve"> sai số động cơ/encoder lưu trên bộ nhớ NVS, và chế độ giả lập (simulator) để kiểm thử ứng dụng khi chưa có phần cứng. Ứng dụng được tổ chức thành </w:t>
-      </w:r>
-      <w:r>
-        <w:rPr>
-          <w:rFonts w:ascii="Times New Roman" w:hAnsi="Times New Roman" w:cs="Times New Roman"/>
-          <w:b w:val="0"/>
-          <w:i/>
-          <w:sz w:val="26"/>
-        </w:rPr>
-        <w:t>nhiều màn hình chức năng</w:t>
-      </w:r>
-      <w:r>
-        <w:rPr>
-          <w:rFonts w:ascii="Times New Roman" w:hAnsi="Times New Roman" w:cs="Times New Roman"/>
-          <w:b w:val="0"/>
-          <w:i/>
-          <w:sz w:val="26"/>
-        </w:rPr>
-        <w:t xml:space="preserve">: dẫn đường trên bản đồ (chạm chọn đích, </w:t>
-      </w:r>
-      <w:r>
-        <w:rPr>
-          <w:rFonts w:ascii="Times New Roman" w:hAnsi="Times New Roman" w:cs="Times New Roman"/>
-          <w:b w:val="0"/>
-          <w:i/>
-          <w:sz w:val="26"/>
-        </w:rPr>
-        <w:t>chặn/mở đoạn đường</w:t>
-      </w:r>
-      <w:r>
-        <w:rPr>
-          <w:rFonts w:ascii="Times New Roman" w:hAnsi="Times New Roman" w:cs="Times New Roman"/>
-          <w:b w:val="0"/>
-          <w:i/>
-          <w:sz w:val="26"/>
-        </w:rPr>
-        <w:t xml:space="preserve"> để A</w:t>
-      </w:r>
-      <w:r>
-        <w:rPr>
-          <w:rFonts w:ascii="Times New Roman" w:hAnsi="Times New Roman" w:cs="Times New Roman"/>
-          <w:b w:val="0"/>
-          <w:i w:val="0"/>
-          <w:sz w:val="26"/>
-        </w:rPr>
-        <w:t xml:space="preserve"> tự tính lại lộ trình), </w:t>
-      </w:r>
-      <w:r>
-        <w:rPr>
-          <w:rFonts w:ascii="Times New Roman" w:hAnsi="Times New Roman" w:cs="Times New Roman"/>
-          <w:b/>
-          <w:i w:val="0"/>
-          <w:sz w:val="26"/>
-        </w:rPr>
-        <w:t>điều khiển tay</w:t>
-      </w:r>
-      <w:r>
-        <w:rPr>
-          <w:rFonts w:ascii="Times New Roman" w:hAnsi="Times New Roman" w:cs="Times New Roman"/>
-          <w:b w:val="0"/>
-          <w:i w:val="0"/>
-          <w:sz w:val="26"/>
-        </w:rPr>
-        <w:t xml:space="preserve"> với tốc độ tùy chỉnh, và màn hình </w:t>
-      </w:r>
-      <w:r>
-        <w:rPr>
-          <w:rFonts w:ascii="Times New Roman" w:hAnsi="Times New Roman" w:cs="Times New Roman"/>
-          <w:b/>
-          <w:i w:val="0"/>
-          <w:sz w:val="26"/>
-        </w:rPr>
-        <w:t>chẩn đoán – hiệu chuẩn</w:t>
-      </w:r>
-      <w:r>
-        <w:rPr>
-          <w:rFonts w:ascii="Times New Roman" w:hAnsi="Times New Roman" w:cs="Times New Roman"/>
-          <w:b w:val="0"/>
-          <w:i w:val="0"/>
-          <w:sz w:val="26"/>
-        </w:rPr>
-        <w:t xml:space="preserve"> (kiểm tra kết nối, hiệu chuẩn IMU, đặt lại cân bằng động cơ và tỉ lệ encoder).</w:t>
+          <w:i w:val="0"/>
+          <w:sz w:val="26"/>
+        </w:rPr>
+        <w:t>* sai số động cơ/encoder lưu trên bộ nhớ NVS, và chế độ giả lập (simulator) để kiểm thử ứng dụng khi chưa có phần cứng.</w:t>
       </w:r>
     </w:p>
     <w:p>
@@ -5691,88 +5610,7 @@
           <w:i w:val="0"/>
           <w:sz w:val="26"/>
         </w:rPr>
-        <w:t xml:space="preserve">Xây dựng ứng dụng di động (Flutter) </w:t>
-      </w:r>
-      <w:r>
-        <w:rPr>
-          <w:rFonts w:ascii="Times New Roman" w:hAnsi="Times New Roman" w:cs="Times New Roman"/>
-          <w:b/>
-          <w:i w:val="0"/>
-          <w:sz w:val="26"/>
-        </w:rPr>
-        <w:t>đa chức năng</w:t>
-      </w:r>
-      <w:r>
-        <w:rPr>
-          <w:rFonts w:ascii="Times New Roman" w:hAnsi="Times New Roman" w:cs="Times New Roman"/>
-          <w:b w:val="0"/>
-          <w:i w:val="0"/>
-          <w:sz w:val="26"/>
-        </w:rPr>
-        <w:t>: hiển thị bản đồ và tính đường đi bằng A</w:t>
-      </w:r>
-      <w:r>
-        <w:rPr>
-          <w:rFonts w:ascii="Times New Roman" w:hAnsi="Times New Roman" w:cs="Times New Roman"/>
-          <w:b w:val="0"/>
-          <w:i/>
-          <w:sz w:val="26"/>
-        </w:rPr>
-        <w:t xml:space="preserve"> (kèm </w:t>
-      </w:r>
-      <w:r>
-        <w:rPr>
-          <w:rFonts w:ascii="Times New Roman" w:hAnsi="Times New Roman" w:cs="Times New Roman"/>
-          <w:b w:val="0"/>
-          <w:i/>
-          <w:sz w:val="26"/>
-        </w:rPr>
-        <w:t>chặn/mở đoạn đường</w:t>
-      </w:r>
-      <w:r>
-        <w:rPr>
-          <w:rFonts w:ascii="Times New Roman" w:hAnsi="Times New Roman" w:cs="Times New Roman"/>
-          <w:b w:val="0"/>
-          <w:i/>
-          <w:sz w:val="26"/>
-        </w:rPr>
-        <w:t xml:space="preserve"> để tính lại lộ trình), gửi lộ trình, hiển thị vị trí xe theo thời gian thực, </w:t>
-      </w:r>
-      <w:r>
-        <w:rPr>
-          <w:rFonts w:ascii="Times New Roman" w:hAnsi="Times New Roman" w:cs="Times New Roman"/>
-          <w:b w:val="0"/>
-          <w:i/>
-          <w:sz w:val="26"/>
-        </w:rPr>
-        <w:t>điều khiển tay</w:t>
-      </w:r>
-      <w:r>
-        <w:rPr>
-          <w:rFonts w:ascii="Times New Roman" w:hAnsi="Times New Roman" w:cs="Times New Roman"/>
-          <w:b w:val="0"/>
-          <w:i/>
-          <w:sz w:val="26"/>
-        </w:rPr>
-        <w:t xml:space="preserve">, và </w:t>
-      </w:r>
-      <w:r>
-        <w:rPr>
-          <w:rFonts w:ascii="Times New Roman" w:hAnsi="Times New Roman" w:cs="Times New Roman"/>
-          <w:b w:val="0"/>
-          <w:i/>
-          <w:sz w:val="26"/>
-        </w:rPr>
-        <w:t>chẩn đoán – hiệu chuẩn</w:t>
-      </w:r>
-      <w:r>
-        <w:rPr>
-          <w:rFonts w:ascii="Times New Roman" w:hAnsi="Times New Roman" w:cs="Times New Roman"/>
-          <w:b w:val="0"/>
-          <w:i w:val="0"/>
-          <w:sz w:val="26"/>
-        </w:rPr>
-        <w:t>* (Ping, hiệu chuẩn IMU, đặt lại cân bằng động cơ/encoder).</w:t>
+        <w:t>Xây dựng ứng dụng di động (Flutter) hiển thị bản đồ, tính đường đi bằng A*, gửi lộ trình và hiển thị vị trí xe theo thời gian thực.</w:t>
       </w:r>
     </w:p>
     <w:p>
@@ -6223,56 +6061,6 @@
     </w:p>
     <w:p>
       <w:pPr>
-        <w:jc w:val="both"/>
-      </w:pPr>
-      <w:r>
-        <w:rPr>
-          <w:rFonts w:ascii="Times New Roman" w:hAnsi="Times New Roman" w:cs="Times New Roman"/>
-          <w:b w:val="0"/>
-          <w:i w:val="0"/>
-          <w:sz w:val="26"/>
-        </w:rPr>
-        <w:t xml:space="preserve">Robot di động tự hành (AMR) là lĩnh vực đã được nghiên cứu rộng rãi, với nhiều phương pháp định vị và dẫn đường được tổng hợp trong các công trình khảo sát [15]. Định vị bằng </w:t>
-      </w:r>
-      <w:r>
-        <w:rPr>
-          <w:rFonts w:ascii="Times New Roman" w:hAnsi="Times New Roman" w:cs="Times New Roman"/>
-          <w:b/>
-          <w:i w:val="0"/>
-          <w:sz w:val="26"/>
-        </w:rPr>
-        <w:t>odometry</w:t>
-      </w:r>
-      <w:r>
-        <w:rPr>
-          <w:rFonts w:ascii="Times New Roman" w:hAnsi="Times New Roman" w:cs="Times New Roman"/>
-          <w:b w:val="0"/>
-          <w:i w:val="0"/>
-          <w:sz w:val="26"/>
-        </w:rPr>
-        <w:t xml:space="preserve"> (encoder kết hợp IMU) phổ biến cho robot chi phí thấp nhờ đơn giản và không cần hạ tầng ngoài; tuy nhiên odometry tích lũy sai số hệ thống theo quãng đường, và việc đo đạc – hiệu chỉnh các sai số này đã được nghiên cứu kỹ [14] — là cơ sở cho cơ chế </w:t>
-      </w:r>
-      <w:r>
-        <w:rPr>
-          <w:rFonts w:ascii="Times New Roman" w:hAnsi="Times New Roman" w:cs="Times New Roman"/>
-          <w:b/>
-          <w:i w:val="0"/>
-          <w:sz w:val="26"/>
-        </w:rPr>
-        <w:t>tự hiệu chuẩn</w:t>
-      </w:r>
-      <w:r>
-        <w:rPr>
-          <w:rFonts w:ascii="Times New Roman" w:hAnsi="Times New Roman" w:cs="Times New Roman"/>
-          <w:b w:val="0"/>
-          <w:i w:val="0"/>
-          <w:sz w:val="26"/>
-        </w:rPr>
-        <w:t xml:space="preserve"> áp dụng trong đề tài. Chương này trình bày các giao thức, thuật toán và nền tảng lý thuyết mà hệ thống sử dụng.</w:t>
-      </w:r>
-    </w:p>
-    <w:p>
-      <w:pPr>
         <w:spacing w:before="240" w:after="120"/>
       </w:pPr>
       <w:r>
@@ -6601,7 +6389,7 @@
           <w:i w:val="0"/>
           <w:sz w:val="26"/>
         </w:rPr>
-        <w:t>PWM (Pulse Width Modulation – điều chế độ rộng xung) điều khiển công suất trung bình cấp cho tải bằng cách thay đổi tỉ lệ thời gian mức cao/thấp của tín hiệu (duty cycle). Tốc độ động cơ DC tỉ lệ với duty cycle của tín hiệu PWM cấp vào chân Enable của mạch cầu H. ESP32 tạo PWM bằng bộ ngoại vi LEDC (16 kênh phần cứng) [8].</w:t>
+        <w:t>PWM (Pulse Width Modulation – điều chế độ rộng xung) điều khiển công suất trung bình cấp cho tải bằng cách thay đổi tỉ lệ thời gian mức cao/thấp của tín hiệu (duty cycle). Tốc độ động cơ DC tỉ lệ với duty cycle của tín hiệu PWM cấp vào chân Enable của mạch cầu H.</w:t>
       </w:r>
     </w:p>
     <w:p>
@@ -6633,7 +6421,7 @@
           <w:i w:val="0"/>
           <w:sz w:val="26"/>
         </w:rPr>
-        <w:t xml:space="preserve"> chuyên tạo PWM phần cứng (không tốn CPU). Trong đề tài, hai kênh LEDC (kênh 0 cho bánh trái, kênh 1 cho bánh phải) được cấu hình </w:t>
+        <w:t xml:space="preserve"> [8] chuyên tạo PWM phần cứng (không tốn CPU). Trong đề tài, hai kênh LEDC (kênh 0 cho bánh trái, kênh 1 cho bánh phải) được cấu hình </w:t>
       </w:r>
       <w:r>
         <w:rPr>
@@ -7211,7 +6999,7 @@
           <w:i w:val="0"/>
           <w:sz w:val="26"/>
         </w:rPr>
-        <w:t xml:space="preserve"> (đo hành trình) là phương pháp ước lượng vị trí robot bằng cách tích lũy quãng đường mỗi bánh đo được từ encoder [7].</w:t>
+        <w:t xml:space="preserve"> (đo hành trình) [7] là phương pháp ước lượng vị trí robot bằng cách tích lũy quãng đường mỗi bánh đo được từ encoder.</w:t>
       </w:r>
     </w:p>
     <w:p>
@@ -7482,7 +7270,7 @@
           <w:i w:val="0"/>
           <w:sz w:val="26"/>
         </w:rPr>
-        <w:t xml:space="preserve"> [13] kết hợp hai nguồn để bù khuyết điểm của nhau:</w:t>
+        <w:t xml:space="preserve"> kết hợp hai nguồn để bù khuyết điểm của nhau:</w:t>
       </w:r>
     </w:p>
     <w:p>
@@ -7874,7 +7662,7 @@
           <w:i w:val="0"/>
           <w:sz w:val="26"/>
         </w:rPr>
-        <w:t xml:space="preserve"> [12] — một hệ sinh thái phát triển nhúng chạy trên VS Code, hỗ trợ quản lý thư viện, biên dịch, nạp chương trình và giám sát Serial. So với Arduino IDE truyền thống, PlatformIO mạnh hơn ở quản lý dự án nhiều file (module hóa), khai báo thư viện qua </w:t>
+        <w:t xml:space="preserve"> — một hệ sinh thái phát triển nhúng chạy trên VS Code, hỗ trợ quản lý thư viện, biên dịch, nạp chương trình và giám sát Serial. So với Arduino IDE truyền thống, PlatformIO mạnh hơn ở quản lý dự án nhiều file (module hóa), khai báo thư viện qua </w:t>
       </w:r>
       <w:r>
         <w:rPr>
@@ -8025,7 +7813,7 @@
           <w:i w:val="0"/>
           <w:sz w:val="26"/>
         </w:rPr>
-        <w:t>) của Google [9] — framework đa nền tảng, từ một mã nguồn có thể build cho Android, iOS, Windows... Flutter cho phép vẽ giao diện bản đồ tùy biến (CustomPainter), xử lý chạm, quản lý trạng thái và giao tiếp UDP. Đề tài tận dụng Flutter để dựng 4 màn hình: Bản đồ, Kiểm tra kết nối, Điều khiển tay, và Telemetry/Hiệu chuẩn.</w:t>
+        <w:t>) của Google — framework đa nền tảng, từ một mã nguồn có thể build cho Android, iOS, Windows... Flutter cho phép vẽ giao diện bản đồ tùy biến (CustomPainter), xử lý chạm, quản lý trạng thái và giao tiếp UDP. Đề tài tận dụng Flutter để dựng 4 màn hình: Bản đồ, Kiểm tra kết nối, Điều khiển tay, và Telemetry/Hiệu chuẩn.</w:t>
       </w:r>
     </w:p>
     <w:p>
@@ -8855,61 +8643,7 @@
           <w:i w:val="0"/>
           <w:sz w:val="26"/>
         </w:rPr>
-        <w:t xml:space="preserve"> (A</w:t>
-      </w:r>
-      <w:r>
-        <w:rPr>
-          <w:rFonts w:ascii="Times New Roman" w:hAnsi="Times New Roman" w:cs="Times New Roman"/>
-          <w:b w:val="0"/>
-          <w:i/>
-          <w:sz w:val="26"/>
-        </w:rPr>
-        <w:t xml:space="preserve">) và gửi lộ trình xuống xe. Có thể </w:t>
-      </w:r>
-      <w:r>
-        <w:rPr>
-          <w:rFonts w:ascii="Times New Roman" w:hAnsi="Times New Roman" w:cs="Times New Roman"/>
-          <w:b w:val="0"/>
-          <w:i/>
-          <w:sz w:val="26"/>
-        </w:rPr>
-        <w:t>chặn/mở một đoạn đường</w:t>
-      </w:r>
-      <w:r>
-        <w:rPr>
-          <w:rFonts w:ascii="Times New Roman" w:hAnsi="Times New Roman" w:cs="Times New Roman"/>
-          <w:b w:val="0"/>
-          <w:i/>
-          <w:sz w:val="26"/>
-        </w:rPr>
-        <w:t xml:space="preserve"> trên bản đồ để A</w:t>
-      </w:r>
-      <w:r>
-        <w:rPr>
-          <w:rFonts w:ascii="Times New Roman" w:hAnsi="Times New Roman" w:cs="Times New Roman"/>
-          <w:b w:val="0"/>
-          <w:i w:val="0"/>
-          <w:sz w:val="26"/>
-        </w:rPr>
-        <w:t xml:space="preserve"> </w:t>
-      </w:r>
-      <w:r>
-        <w:rPr>
-          <w:rFonts w:ascii="Times New Roman" w:hAnsi="Times New Roman" w:cs="Times New Roman"/>
-          <w:b/>
-          <w:i w:val="0"/>
-          <w:sz w:val="26"/>
-        </w:rPr>
-        <w:t>tính lại lộ trình</w:t>
-      </w:r>
-      <w:r>
-        <w:rPr>
-          <w:rFonts w:ascii="Times New Roman" w:hAnsi="Times New Roman" w:cs="Times New Roman"/>
-          <w:b w:val="0"/>
-          <w:i w:val="0"/>
-          <w:sz w:val="26"/>
-        </w:rPr>
-        <w:t xml:space="preserve"> (mô phỏng vật cản tĩnh).</w:t>
+        <w:t xml:space="preserve"> (A*) và gửi lộ trình xuống xe.</w:t>
       </w:r>
     </w:p>
     <w:p>
@@ -10550,7 +10284,7 @@
           <w:i w:val="0"/>
           <w:sz w:val="26"/>
         </w:rPr>
-        <w:t>. Thông số kỹ thuật và sơ đồ chân theo datasheet ESP32 / ESP32-WROOM-32 [1], [2].</w:t>
+        <w:t>.</w:t>
       </w:r>
     </w:p>
     <w:p>
@@ -10591,7 +10325,7 @@
           <w:i w:val="0"/>
           <w:sz w:val="26"/>
         </w:rPr>
-        <w:t xml:space="preserve"> vì các lý do:</w:t>
+        <w:t xml:space="preserve"> [1], [2] vì các lý do:</w:t>
       </w:r>
     </w:p>
     <w:p>
@@ -10763,7 +10497,7 @@
           <w:i w:val="0"/>
           <w:sz w:val="26"/>
         </w:rPr>
-        <w:t xml:space="preserve"> chuyển tín hiệu điều khiển logic của ESP32 thành dòng đủ lớn để quay hai động cơ DC. Thông số module mạch lái theo datasheet L298 [4].</w:t>
+        <w:t xml:space="preserve"> chuyển tín hiệu điều khiển logic của ESP32 thành dòng đủ lớn để quay hai động cơ DC.</w:t>
       </w:r>
     </w:p>
     <w:p>
@@ -10804,7 +10538,7 @@
           <w:i w:val="0"/>
           <w:sz w:val="26"/>
         </w:rPr>
-        <w:t xml:space="preserve"> (mạch cầu H đôi). L298N điều khiển độc lập hai động cơ, mỗi động cơ có 2 chân chiều quay (IN) và 1 chân Enable nhận PWM. So với DRV8833/TB6612, L298N có sẵn, rẻ, chịu dòng tốt, tản nhiệt tích hợp, phù hợp động cơ DC giảm tốc cỡ nhỏ.</w:t>
+        <w:t xml:space="preserve"> (mạch cầu H đôi) [4]. L298N điều khiển độc lập hai động cơ, mỗi động cơ có 2 chân chiều quay (IN) và 1 chân Enable nhận PWM. So với DRV8833/TB6612, L298N có sẵn, rẻ, chịu dòng tốt, tản nhiệt tích hợp, phù hợp động cơ DC giảm tốc cỡ nhỏ.</w:t>
       </w:r>
     </w:p>
     <w:p>
@@ -11273,25 +11007,7 @@
           <w:i w:val="0"/>
           <w:sz w:val="26"/>
         </w:rPr>
-        <w:t xml:space="preserve"> đo quãng đường mỗi bánh, là nguồn dữ liệu chính cho odometry. Encoder dùng module so sánh </w:t>
-      </w:r>
-      <w:r>
-        <w:rPr>
-          <w:rFonts w:ascii="Times New Roman" w:hAnsi="Times New Roman" w:cs="Times New Roman"/>
-          <w:b/>
-          <w:i w:val="0"/>
-          <w:sz w:val="26"/>
-        </w:rPr>
-        <w:t>LM393</w:t>
-      </w:r>
-      <w:r>
-        <w:rPr>
-          <w:rFonts w:ascii="Times New Roman" w:hAnsi="Times New Roman" w:cs="Times New Roman"/>
-          <w:b w:val="0"/>
-          <w:i w:val="0"/>
-          <w:sz w:val="26"/>
-        </w:rPr>
-        <w:t xml:space="preserve"> [11].</w:t>
+        <w:t xml:space="preserve"> đo quãng đường mỗi bánh, là nguồn dữ liệu chính cho odometry.</w:t>
       </w:r>
     </w:p>
     <w:p>
@@ -11615,7 +11331,7 @@
           <w:i w:val="0"/>
           <w:sz w:val="26"/>
         </w:rPr>
-        <w:t xml:space="preserve"> đo hướng (yaw) của xe để hiệu chỉnh odometry và giữ hướng khi đi thẳng / xoay đúng góc. Thanh ghi và thông số đọc theo datasheet MPU-6050 [3].</w:t>
+        <w:t xml:space="preserve"> đo hướng (yaw) của xe để hiệu chỉnh odometry và giữ hướng khi đi thẳng / xoay đúng góc.</w:t>
       </w:r>
     </w:p>
     <w:p>
@@ -11656,7 +11372,7 @@
           <w:i w:val="0"/>
           <w:sz w:val="26"/>
         </w:rPr>
-        <w:t xml:space="preserve"> (6 trục: 3 gia tốc + 3 con quay hồi chuyển), giao tiếp I2C, giá rẻ, rất phổ biến. Đề tài chỉ dùng </w:t>
+        <w:t xml:space="preserve"> [3] (6 trục: 3 gia tốc + 3 con quay hồi chuyển), giao tiếp I2C, giá rẻ, rất phổ biến. Đề tài chỉ dùng </w:t>
       </w:r>
       <w:r>
         <w:rPr>
@@ -12008,7 +11724,7 @@
           <w:i w:val="0"/>
           <w:sz w:val="26"/>
         </w:rPr>
-        <w:t xml:space="preserve"> — phát hiện chướng ngại, dừng kịp thời và đo khoảng cách hai bên (qua servo quét) để chọn hướng đi. Nguyên lý đo (Trigger–Echo) và thông số theo datasheet HC-SR04 [5].</w:t>
+        <w:t xml:space="preserve"> — phát hiện chướng ngại, dừng kịp thời và đo khoảng cách hai bên (qua servo quét) để chọn hướng đi.</w:t>
       </w:r>
     </w:p>
     <w:p>
@@ -12049,7 +11765,7 @@
           <w:i w:val="0"/>
           <w:sz w:val="26"/>
         </w:rPr>
-        <w:t xml:space="preserve"> (siêu âm), giao tiếp số đơn giản (Trig/Echo), tầm đo 2–400 cm, rẻ, dễ tích hợp, không nhạy với ánh sáng môi trường (khác cảm biến hồng ngoại). So với cảm biến ToF laser (VL53L0X) đắt hơn, HC-SR04 đủ dùng cho mục tiêu phát hiện vật cản cơ bản.</w:t>
+        <w:t xml:space="preserve"> [5] (siêu âm), giao tiếp số đơn giản (Trig/Echo), tầm đo 2–400 cm, rẻ, dễ tích hợp, không nhạy với ánh sáng môi trường (khác cảm biến hồng ngoại). So với cảm biến ToF laser (VL53L0X) đắt hơn, HC-SR04 đủ dùng cho mục tiêu phát hiện vật cản cơ bản.</w:t>
       </w:r>
     </w:p>
     <w:p>
@@ -12407,7 +12123,7 @@
           <w:i w:val="0"/>
           <w:sz w:val="26"/>
         </w:rPr>
-        <w:t xml:space="preserve"> [10] (xoay 180°), điều khiển bằng một dây tín hiệu PWM 50 Hz, giá rẻ và rất phổ biến. Thông số chính: điện áp </w:t>
+        <w:t xml:space="preserve"> (xoay 180°), điều khiển bằng một dây tín hiệu PWM 50 Hz, giá rẻ và rất phổ biến. Thông số chính: điện áp </w:t>
       </w:r>
       <w:r>
         <w:rPr>
@@ -13743,7 +13459,25 @@
           <w:i w:val="0"/>
           <w:sz w:val="26"/>
         </w:rPr>
-        <w:t>Ứng dụng được tổ chức theo mô hình phân lớp rõ ràng (models – planning – services – screens), giúp dễ kiểm thử và bảo trì.</w:t>
+        <w:t xml:space="preserve">Ứng dụng được xây dựng bằng </w:t>
+      </w:r>
+      <w:r>
+        <w:rPr>
+          <w:rFonts w:ascii="Times New Roman" w:hAnsi="Times New Roman" w:cs="Times New Roman"/>
+          <w:b/>
+          <w:i w:val="0"/>
+          <w:sz w:val="26"/>
+        </w:rPr>
+        <w:t>Flutter</w:t>
+      </w:r>
+      <w:r>
+        <w:rPr>
+          <w:rFonts w:ascii="Times New Roman" w:hAnsi="Times New Roman" w:cs="Times New Roman"/>
+          <w:b w:val="0"/>
+          <w:i w:val="0"/>
+          <w:sz w:val="26"/>
+        </w:rPr>
+        <w:t xml:space="preserve"> [9], tổ chức theo mô hình phân lớp rõ ràng (models – planning – services – screens), giúp dễ kiểm thử và bảo trì.</w:t>
       </w:r>
     </w:p>
     <w:p>
@@ -14125,106 +13859,7 @@
           <w:i w:val="0"/>
           <w:sz w:val="26"/>
         </w:rPr>
-        <w:t xml:space="preserve"> vẽ đồ thị waypoint, vị trí xe thời gian thực + vệt đường đã đi; </w:t>
-      </w:r>
-      <w:r>
-        <w:rPr>
-          <w:rFonts w:ascii="Times New Roman" w:hAnsi="Times New Roman" w:cs="Times New Roman"/>
-          <w:b/>
-          <w:i w:val="0"/>
-          <w:sz w:val="26"/>
-        </w:rPr>
-        <w:t>chạm chọn đích → A* → gửi lộ trình</w:t>
-      </w:r>
-      <w:r>
-        <w:rPr>
-          <w:rFonts w:ascii="Times New Roman" w:hAnsi="Times New Roman" w:cs="Times New Roman"/>
-          <w:b w:val="0"/>
-          <w:i w:val="0"/>
-          <w:sz w:val="26"/>
-        </w:rPr>
-        <w:t xml:space="preserve">. Có </w:t>
-      </w:r>
-      <w:r>
-        <w:rPr>
-          <w:rFonts w:ascii="Times New Roman" w:hAnsi="Times New Roman" w:cs="Times New Roman"/>
-          <w:b/>
-          <w:i w:val="0"/>
-          <w:sz w:val="26"/>
-        </w:rPr>
-        <w:t>chế độ chặn đường (Block/unblock):</w:t>
-      </w:r>
-      <w:r>
-        <w:rPr>
-          <w:rFonts w:ascii="Times New Roman" w:hAnsi="Times New Roman" w:cs="Times New Roman"/>
-          <w:b w:val="0"/>
-          <w:i w:val="0"/>
-          <w:sz w:val="26"/>
-        </w:rPr>
-        <w:t xml:space="preserve"> chạm một cạnh để chặn/mở lại, A</w:t>
-      </w:r>
-      <w:r>
-        <w:rPr>
-          <w:rFonts w:ascii="Times New Roman" w:hAnsi="Times New Roman" w:cs="Times New Roman"/>
-          <w:b w:val="0"/>
-          <w:i/>
-          <w:sz w:val="26"/>
-        </w:rPr>
-        <w:t xml:space="preserve"> </w:t>
-      </w:r>
-      <w:r>
-        <w:rPr>
-          <w:rFonts w:ascii="Times New Roman" w:hAnsi="Times New Roman" w:cs="Times New Roman"/>
-          <w:b w:val="0"/>
-          <w:i/>
-          <w:sz w:val="26"/>
-        </w:rPr>
-        <w:t>tính lại lộ trình</w:t>
-      </w:r>
-      <w:r>
-        <w:rPr>
-          <w:rFonts w:ascii="Times New Roman" w:hAnsi="Times New Roman" w:cs="Times New Roman"/>
-          <w:b w:val="0"/>
-          <w:i/>
-          <w:sz w:val="26"/>
-        </w:rPr>
-        <w:t xml:space="preserve"> tránh đoạn bị chặn (mô phỏng vật cản trên bản đồ); kèm hai nút </w:t>
-      </w:r>
-      <w:r>
-        <w:rPr>
-          <w:rFonts w:ascii="Times New Roman" w:hAnsi="Times New Roman" w:cs="Times New Roman"/>
-          <w:b w:val="0"/>
-          <w:i/>
-          <w:sz w:val="26"/>
-        </w:rPr>
-        <w:t>Reset map</w:t>
-      </w:r>
-      <w:r>
-        <w:rPr>
-          <w:rFonts w:ascii="Times New Roman" w:hAnsi="Times New Roman" w:cs="Times New Roman"/>
-          <w:b w:val="0"/>
-          <w:i/>
-          <w:sz w:val="26"/>
-        </w:rPr>
-        <w:t xml:space="preserve"> (xóa các cạnh đã chặn) và </w:t>
-      </w:r>
-      <w:r>
-        <w:rPr>
-          <w:rFonts w:ascii="Times New Roman" w:hAnsi="Times New Roman" w:cs="Times New Roman"/>
-          <w:b w:val="0"/>
-          <w:i/>
-          <w:sz w:val="26"/>
-        </w:rPr>
-        <w:t>Reset pose</w:t>
-      </w:r>
-      <w:r>
-        <w:rPr>
-          <w:rFonts w:ascii="Times New Roman" w:hAnsi="Times New Roman" w:cs="Times New Roman"/>
-          <w:b w:val="0"/>
-          <w:i w:val="0"/>
-          <w:sz w:val="26"/>
-        </w:rPr>
-        <w:t>* (đưa xe về gốc tọa độ).</w:t>
+        <w:t xml:space="preserve"> vẽ đồ thị waypoint, vị trí xe thời gian thực + vệt đường đã đi; chạm để chọn đích → A* → gửi lộ trình.</w:t>
       </w:r>
     </w:p>
     <w:p>
@@ -14239,106 +13874,16 @@
           <w:i w:val="0"/>
           <w:sz w:val="26"/>
         </w:rPr>
-        <w:t>Kiểm tra &amp; hiệu chuẩn (ESP32 Test):</w:t>
-      </w:r>
-      <w:r>
-        <w:rPr>
-          <w:rFonts w:ascii="Times New Roman" w:hAnsi="Times New Roman" w:cs="Times New Roman"/>
-          <w:b w:val="0"/>
-          <w:i w:val="0"/>
-          <w:sz w:val="26"/>
-        </w:rPr>
-        <w:t xml:space="preserve"> màn hình chẩn đoán kết nối và hiệu chuẩn. Hiển thị địa chỉ AP, cổng telemetry/command, số gói nhận được, gói cuối, trạng thái, </w:t>
-      </w:r>
-      <w:r>
-        <w:rPr>
-          <w:rFonts w:ascii="Times New Roman" w:hAnsi="Times New Roman" w:cs="Times New Roman"/>
-          <w:b/>
-          <w:i w:val="0"/>
-          <w:sz w:val="26"/>
-        </w:rPr>
-        <w:t>MPU-6050</w:t>
-      </w:r>
-      <w:r>
-        <w:rPr>
-          <w:rFonts w:ascii="Times New Roman" w:hAnsi="Times New Roman" w:cs="Times New Roman"/>
-          <w:b w:val="0"/>
-          <w:i w:val="0"/>
-          <w:sz w:val="26"/>
-        </w:rPr>
-        <w:t xml:space="preserve">, hướng, tiến trình node và tình trạng hiệu chuẩn. Các nút: </w:t>
-      </w:r>
-      <w:r>
-        <w:rPr>
-          <w:rFonts w:ascii="Times New Roman" w:hAnsi="Times New Roman" w:cs="Times New Roman"/>
-          <w:b/>
-          <w:i w:val="0"/>
-          <w:sz w:val="26"/>
-        </w:rPr>
-        <w:t>Send Ping</w:t>
-      </w:r>
-      <w:r>
-        <w:rPr>
-          <w:rFonts w:ascii="Times New Roman" w:hAnsi="Times New Roman" w:cs="Times New Roman"/>
-          <w:b w:val="0"/>
-          <w:i w:val="0"/>
-          <w:sz w:val="26"/>
-        </w:rPr>
-        <w:t xml:space="preserve">, </w:t>
-      </w:r>
-      <w:r>
-        <w:rPr>
-          <w:rFonts w:ascii="Times New Roman" w:hAnsi="Times New Roman" w:cs="Times New Roman"/>
-          <w:b/>
-          <w:i w:val="0"/>
-          <w:sz w:val="26"/>
-        </w:rPr>
-        <w:t>Calibrate IMU</w:t>
-      </w:r>
-      <w:r>
-        <w:rPr>
-          <w:rFonts w:ascii="Times New Roman" w:hAnsi="Times New Roman" w:cs="Times New Roman"/>
-          <w:b w:val="0"/>
-          <w:i w:val="0"/>
-          <w:sz w:val="26"/>
-        </w:rPr>
-        <w:t xml:space="preserve"> (hiệu chuẩn cảm biến góc), </w:t>
-      </w:r>
-      <w:r>
-        <w:rPr>
-          <w:rFonts w:ascii="Times New Roman" w:hAnsi="Times New Roman" w:cs="Times New Roman"/>
-          <w:b/>
-          <w:i w:val="0"/>
-          <w:sz w:val="26"/>
-        </w:rPr>
-        <w:t>Reset Motor Auto-Tune</w:t>
-      </w:r>
-      <w:r>
-        <w:rPr>
-          <w:rFonts w:ascii="Times New Roman" w:hAnsi="Times New Roman" w:cs="Times New Roman"/>
-          <w:b w:val="0"/>
-          <w:i w:val="0"/>
-          <w:sz w:val="26"/>
-        </w:rPr>
-        <w:t xml:space="preserve"> (đặt lại hệ số cân bằng động cơ) và </w:t>
-      </w:r>
-      <w:r>
-        <w:rPr>
-          <w:rFonts w:ascii="Times New Roman" w:hAnsi="Times New Roman" w:cs="Times New Roman"/>
-          <w:b/>
-          <w:i w:val="0"/>
-          <w:sz w:val="26"/>
-        </w:rPr>
-        <w:t>Reset Encoder Scale</w:t>
-      </w:r>
-      <w:r>
-        <w:rPr>
-          <w:rFonts w:ascii="Times New Roman" w:hAnsi="Times New Roman" w:cs="Times New Roman"/>
-          <w:b w:val="0"/>
-          <w:i w:val="0"/>
-          <w:sz w:val="26"/>
-        </w:rPr>
-        <w:t xml:space="preserve"> (đặt lại tỉ lệ encoder).</w:t>
+        <w:t>Kiểm tra kết nối (Connection Test):</w:t>
+      </w:r>
+      <w:r>
+        <w:rPr>
+          <w:rFonts w:ascii="Times New Roman" w:hAnsi="Times New Roman" w:cs="Times New Roman"/>
+          <w:b w:val="0"/>
+          <w:i w:val="0"/>
+          <w:sz w:val="26"/>
+        </w:rPr>
+        <w:t xml:space="preserve"> kiểm tra luồng telemetry/UDP với ESP32.</w:t>
       </w:r>
     </w:p>
     <w:p>
@@ -14362,43 +13907,7 @@
           <w:i w:val="0"/>
           <w:sz w:val="26"/>
         </w:rPr>
-        <w:t xml:space="preserve"> </w:t>
-      </w:r>
-      <w:r>
-        <w:rPr>
-          <w:rFonts w:ascii="Times New Roman" w:hAnsi="Times New Roman" w:cs="Times New Roman"/>
-          <w:b/>
-          <w:i w:val="0"/>
-          <w:sz w:val="26"/>
-        </w:rPr>
-        <w:t>thanh trượt chỉnh tốc độ (PWM)</w:t>
-      </w:r>
-      <w:r>
-        <w:rPr>
-          <w:rFonts w:ascii="Times New Roman" w:hAnsi="Times New Roman" w:cs="Times New Roman"/>
-          <w:b w:val="0"/>
-          <w:i w:val="0"/>
-          <w:sz w:val="26"/>
-        </w:rPr>
-        <w:t xml:space="preserve"> cùng các nút </w:t>
-      </w:r>
-      <w:r>
-        <w:rPr>
-          <w:rFonts w:ascii="Times New Roman" w:hAnsi="Times New Roman" w:cs="Times New Roman"/>
-          <w:b/>
-          <w:i w:val="0"/>
-          <w:sz w:val="26"/>
-        </w:rPr>
-        <w:t>tiến / lùi / rẽ trái / rẽ phải / dừng</w:t>
-      </w:r>
-      <w:r>
-        <w:rPr>
-          <w:rFonts w:ascii="Times New Roman" w:hAnsi="Times New Roman" w:cs="Times New Roman"/>
-          <w:b w:val="0"/>
-          <w:i w:val="0"/>
-          <w:sz w:val="26"/>
-        </w:rPr>
-        <w:t>; hiển thị lệnh vừa gửi.</w:t>
+        <w:t xml:space="preserve"> nút tiến/lùi/rẽ/đi chéo/dừng.</w:t>
       </w:r>
     </w:p>
     <w:p>
@@ -14440,7 +13949,7 @@
           <w:i w:val="0"/>
           <w:sz w:val="26"/>
         </w:rPr>
-        <w:t xml:space="preserve"> bật/tắt chế độ tự hành né vật cản, kèm bảng telemetry trực tiếp (trạng thái, khoảng cách vật cản, hướng, tọa độ X/Y, tình trạng IMU). Màn hình này thay cho màn hình test bánh xe (Wheels) ở phiên bản trước.</w:t>
+        <w:t xml:space="preserve"> bật/tắt chế độ tự hành né vật cản, kèm bảng telemetry trực tiếp (trạng thái, khoảng cách vật cản, hướng, tọa độ, tình trạng IMU). Màn hình này thay cho màn hình test bánh xe (Wheels) ở phiên bản trước — vốn chỉ dùng để chạy thử từng bánh và đã trở nên dư thừa.</w:t>
       </w:r>
     </w:p>
     <w:p>
@@ -25541,11 +25050,11 @@
       <w:r>
         <w:rPr>
           <w:rFonts w:ascii="Times New Roman" w:hAnsi="Times New Roman" w:cs="Times New Roman"/>
-          <w:b w:val="0"/>
-          <w:i w:val="0"/>
-          <w:sz w:val="26"/>
-        </w:rPr>
-        <w:t>[1] Espressif Systems, "ESP32 Series Datasheet," 2024. [Online]. Available: https://www.espressif.com/sites/default/files/documentation/esp32_datasheet_en.pdf. [Accessed: Jun. 15, 2025].</w:t>
+          <w:b/>
+          <w:i w:val="0"/>
+          <w:sz w:val="26"/>
+        </w:rPr>
+        <w:t>Datasheet và tài liệu kỹ thuật:</w:t>
       </w:r>
     </w:p>
     <w:p>
@@ -25559,7 +25068,25 @@
           <w:i w:val="0"/>
           <w:sz w:val="26"/>
         </w:rPr>
-        <w:t>[2] Espressif Systems, "ESP32-WROOM-32 Datasheet," 2024. [Online]. Available: https://www.espressif.com/sites/default/files/documentation/esp32-wroom-32_datasheet_en.pdf. [Accessed: Jun. 15, 2025].</w:t>
+        <w:t xml:space="preserve">[1] Espressif Systems, </w:t>
+      </w:r>
+      <w:r>
+        <w:rPr>
+          <w:rFonts w:ascii="Times New Roman" w:hAnsi="Times New Roman" w:cs="Times New Roman"/>
+          <w:b w:val="0"/>
+          <w:i/>
+          <w:sz w:val="26"/>
+        </w:rPr>
+        <w:t>ESP32 Series Datasheet</w:t>
+      </w:r>
+      <w:r>
+        <w:rPr>
+          <w:rFonts w:ascii="Times New Roman" w:hAnsi="Times New Roman" w:cs="Times New Roman"/>
+          <w:b w:val="0"/>
+          <w:i w:val="0"/>
+          <w:sz w:val="26"/>
+        </w:rPr>
+        <w:t>, 2024. [Online]. https://www.espressif.com/sites/default/files/documentation/esp32_datasheet_en.pdf</w:t>
       </w:r>
     </w:p>
     <w:p>
@@ -25573,7 +25100,25 @@
           <w:i w:val="0"/>
           <w:sz w:val="26"/>
         </w:rPr>
-        <w:t>[3] InvenSense (TDK), "MPU-6000/MPU-6050 Product Specification and Register Map," Rev. 4.2, 2013. [Online]. Available: https://invensense.tdk.com/products/motion-tracking/6-axis/mpu-6050/. [Accessed: Jun. 15, 2025].</w:t>
+        <w:t xml:space="preserve">[2] Espressif Systems, </w:t>
+      </w:r>
+      <w:r>
+        <w:rPr>
+          <w:rFonts w:ascii="Times New Roman" w:hAnsi="Times New Roman" w:cs="Times New Roman"/>
+          <w:b w:val="0"/>
+          <w:i/>
+          <w:sz w:val="26"/>
+        </w:rPr>
+        <w:t>ESP32-WROOM-32 Datasheet</w:t>
+      </w:r>
+      <w:r>
+        <w:rPr>
+          <w:rFonts w:ascii="Times New Roman" w:hAnsi="Times New Roman" w:cs="Times New Roman"/>
+          <w:b w:val="0"/>
+          <w:i w:val="0"/>
+          <w:sz w:val="26"/>
+        </w:rPr>
+        <w:t>, 2024. [Online]. https://www.espressif.com/sites/default/files/documentation/esp32-wroom-32_datasheet_en.pdf</w:t>
       </w:r>
     </w:p>
     <w:p>
@@ -25587,7 +25132,25 @@
           <w:i w:val="0"/>
           <w:sz w:val="26"/>
         </w:rPr>
-        <w:t>[4] STMicroelectronics, "L298 Dual Full-Bridge Driver Datasheet," 2000. [Online]. Available: https://www.st.com/resource/en/datasheet/l298.pdf. [Accessed: Jun. 15, 2025].</w:t>
+        <w:t xml:space="preserve">[3] InvenSense (TDK), </w:t>
+      </w:r>
+      <w:r>
+        <w:rPr>
+          <w:rFonts w:ascii="Times New Roman" w:hAnsi="Times New Roman" w:cs="Times New Roman"/>
+          <w:b w:val="0"/>
+          <w:i/>
+          <w:sz w:val="26"/>
+        </w:rPr>
+        <w:t>MPU-6000/MPU-6050 Product Specification &amp; Register Map</w:t>
+      </w:r>
+      <w:r>
+        <w:rPr>
+          <w:rFonts w:ascii="Times New Roman" w:hAnsi="Times New Roman" w:cs="Times New Roman"/>
+          <w:b w:val="0"/>
+          <w:i w:val="0"/>
+          <w:sz w:val="26"/>
+        </w:rPr>
+        <w:t>, Rev. 3.4/4.2. [Online]. https://invensense.tdk.com/products/motion-tracking/6-axis/mpu-6050/</w:t>
       </w:r>
     </w:p>
     <w:p>
@@ -25601,7 +25164,25 @@
           <w:i w:val="0"/>
           <w:sz w:val="26"/>
         </w:rPr>
-        <w:t>[5] SparkFun Electronics, "HC-SR04 Ultrasonic Sensor Module Datasheet." [Online]. Available: https://cdn.sparkfun.com/datasheets/Sensors/Proximity/HCSR04.pdf. [Accessed: Jun. 15, 2025].</w:t>
+        <w:t xml:space="preserve">[4] STMicroelectronics, </w:t>
+      </w:r>
+      <w:r>
+        <w:rPr>
+          <w:rFonts w:ascii="Times New Roman" w:hAnsi="Times New Roman" w:cs="Times New Roman"/>
+          <w:b w:val="0"/>
+          <w:i/>
+          <w:sz w:val="26"/>
+        </w:rPr>
+        <w:t>L298 Dual Full-Bridge Driver Datasheet</w:t>
+      </w:r>
+      <w:r>
+        <w:rPr>
+          <w:rFonts w:ascii="Times New Roman" w:hAnsi="Times New Roman" w:cs="Times New Roman"/>
+          <w:b w:val="0"/>
+          <w:i w:val="0"/>
+          <w:sz w:val="26"/>
+        </w:rPr>
+        <w:t>. [Online]. https://www.st.com/resource/en/datasheet/l298.pdf</w:t>
       </w:r>
     </w:p>
     <w:p>
@@ -25615,7 +25196,7 @@
           <w:i w:val="0"/>
           <w:sz w:val="26"/>
         </w:rPr>
-        <w:t xml:space="preserve">[6] P. E. Hart, N. J. Nilsson, and B. Raphael, "A formal basis for the heuristic determination of minimum cost paths," </w:t>
+        <w:t xml:space="preserve">[5] SparkFun Electronics, </w:t>
       </w:r>
       <w:r>
         <w:rPr>
@@ -25624,16 +25205,16 @@
           <w:i/>
           <w:sz w:val="26"/>
         </w:rPr>
-        <w:t>IEEE Trans. Syst. Sci. Cybern.</w:t>
-      </w:r>
-      <w:r>
-        <w:rPr>
-          <w:rFonts w:ascii="Times New Roman" w:hAnsi="Times New Roman" w:cs="Times New Roman"/>
-          <w:b w:val="0"/>
-          <w:i w:val="0"/>
-          <w:sz w:val="26"/>
-        </w:rPr>
-        <w:t>, vol. 4, no. 2, pp. 100–107, Jul. 1968.</w:t>
+        <w:t>HC-SR04 Ultrasonic Sensor Module</w:t>
+      </w:r>
+      <w:r>
+        <w:rPr>
+          <w:rFonts w:ascii="Times New Roman" w:hAnsi="Times New Roman" w:cs="Times New Roman"/>
+          <w:b w:val="0"/>
+          <w:i w:val="0"/>
+          <w:sz w:val="26"/>
+        </w:rPr>
+        <w:t>. [Online]. https://cdn.sparkfun.com/datasheets/Sensors/Proximity/HCSR04.pdf</w:t>
       </w:r>
     </w:p>
     <w:p>
@@ -25643,11 +25224,25 @@
       <w:r>
         <w:rPr>
           <w:rFonts w:ascii="Times New Roman" w:hAnsi="Times New Roman" w:cs="Times New Roman"/>
-          <w:b w:val="0"/>
-          <w:i w:val="0"/>
-          <w:sz w:val="26"/>
-        </w:rPr>
-        <w:t xml:space="preserve">[7] S. Thrun, W. Burgard, and D. Fox, </w:t>
+          <w:b/>
+          <w:i w:val="0"/>
+          <w:sz w:val="26"/>
+        </w:rPr>
+        <w:t>Tài liệu thuật toán và nền tảng:</w:t>
+      </w:r>
+    </w:p>
+    <w:p>
+      <w:pPr>
+        <w:jc w:val="both"/>
+      </w:pPr>
+      <w:r>
+        <w:rPr>
+          <w:rFonts w:ascii="Times New Roman" w:hAnsi="Times New Roman" w:cs="Times New Roman"/>
+          <w:b w:val="0"/>
+          <w:i w:val="0"/>
+          <w:sz w:val="26"/>
+        </w:rPr>
+        <w:t xml:space="preserve">[6] P. E. Hart, N. J. Nilsson, B. Raphael, "A Formal Basis for the Heuristic Determination of Minimum Cost Paths", </w:t>
       </w:r>
       <w:r>
         <w:rPr>
@@ -25656,6 +25251,38 @@
           <w:i/>
           <w:sz w:val="26"/>
         </w:rPr>
+        <w:t>IEEE Trans. on Systems Science and Cybernetics</w:t>
+      </w:r>
+      <w:r>
+        <w:rPr>
+          <w:rFonts w:ascii="Times New Roman" w:hAnsi="Times New Roman" w:cs="Times New Roman"/>
+          <w:b w:val="0"/>
+          <w:i w:val="0"/>
+          <w:sz w:val="26"/>
+        </w:rPr>
+        <w:t>, 1968.</w:t>
+      </w:r>
+    </w:p>
+    <w:p>
+      <w:pPr>
+        <w:jc w:val="both"/>
+      </w:pPr>
+      <w:r>
+        <w:rPr>
+          <w:rFonts w:ascii="Times New Roman" w:hAnsi="Times New Roman" w:cs="Times New Roman"/>
+          <w:b w:val="0"/>
+          <w:i w:val="0"/>
+          <w:sz w:val="26"/>
+        </w:rPr>
+        <w:t xml:space="preserve">[7] S. Thrun, W. Burgard, D. Fox, </w:t>
+      </w:r>
+      <w:r>
+        <w:rPr>
+          <w:rFonts w:ascii="Times New Roman" w:hAnsi="Times New Roman" w:cs="Times New Roman"/>
+          <w:b w:val="0"/>
+          <w:i/>
+          <w:sz w:val="26"/>
+        </w:rPr>
         <w:t>Probabilistic Robotics</w:t>
       </w:r>
       <w:r>
@@ -25665,7 +25292,7 @@
           <w:i w:val="0"/>
           <w:sz w:val="26"/>
         </w:rPr>
-        <w:t>. Cambridge, MA: MIT Press, 2005.</w:t>
+        <w:t>, MIT Press, 2005 (chương về odometry và mô hình chuyển động vi sai).</w:t>
       </w:r>
     </w:p>
     <w:p>
@@ -25679,7 +25306,25 @@
           <w:i w:val="0"/>
           <w:sz w:val="26"/>
         </w:rPr>
-        <w:t>[8] Espressif Systems, "ESP-IDF Programming Guide," 2024. [Online]. Available: https://docs.espressif.com/. [Accessed: Jun. 15, 2025].</w:t>
+        <w:t xml:space="preserve">[8] Espressif Systems, </w:t>
+      </w:r>
+      <w:r>
+        <w:rPr>
+          <w:rFonts w:ascii="Times New Roman" w:hAnsi="Times New Roman" w:cs="Times New Roman"/>
+          <w:b w:val="0"/>
+          <w:i/>
+          <w:sz w:val="26"/>
+        </w:rPr>
+        <w:t>ESP-IDF / Arduino-ESP32 Programming Guide</w:t>
+      </w:r>
+      <w:r>
+        <w:rPr>
+          <w:rFonts w:ascii="Times New Roman" w:hAnsi="Times New Roman" w:cs="Times New Roman"/>
+          <w:b w:val="0"/>
+          <w:i w:val="0"/>
+          <w:sz w:val="26"/>
+        </w:rPr>
+        <w:t xml:space="preserve"> (LEDC, GPIO interrupts, WiFi SoftAP). [Online]. https://docs.espressif.com/</w:t>
       </w:r>
     </w:p>
     <w:p>
@@ -25693,63 +25338,7 @@
           <w:i w:val="0"/>
           <w:sz w:val="26"/>
         </w:rPr>
-        <w:t>[9] Google, "Flutter Documentation," 2024. [Online]. Available: https://docs.flutter.dev/. [Accessed: Jun. 15, 2025].</w:t>
-      </w:r>
-    </w:p>
-    <w:p>
-      <w:pPr>
-        <w:jc w:val="both"/>
-      </w:pPr>
-      <w:r>
-        <w:rPr>
-          <w:rFonts w:ascii="Times New Roman" w:hAnsi="Times New Roman" w:cs="Times New Roman"/>
-          <w:b w:val="0"/>
-          <w:i w:val="0"/>
-          <w:sz w:val="26"/>
-        </w:rPr>
-        <w:t>[10] TowerPro, "SG90 9g Micro Servo Datasheet." [Online]. Available: http://www.ee.ic.ac.uk/pcheung/teaching/DE1_EE/stores/sg90_datasheet.pdf. [Accessed: Jun. 15, 2025].</w:t>
-      </w:r>
-    </w:p>
-    <w:p>
-      <w:pPr>
-        <w:jc w:val="both"/>
-      </w:pPr>
-      <w:r>
-        <w:rPr>
-          <w:rFonts w:ascii="Times New Roman" w:hAnsi="Times New Roman" w:cs="Times New Roman"/>
-          <w:b w:val="0"/>
-          <w:i w:val="0"/>
-          <w:sz w:val="26"/>
-        </w:rPr>
-        <w:t>[11] Texas Instruments, "LM393 Dual Differential Comparators Datasheet," 2017. [Online]. Available: https://www.ti.com/lit/ds/symlink/lm393.pdf. [Accessed: Jun. 15, 2025].</w:t>
-      </w:r>
-    </w:p>
-    <w:p>
-      <w:pPr>
-        <w:jc w:val="both"/>
-      </w:pPr>
-      <w:r>
-        <w:rPr>
-          <w:rFonts w:ascii="Times New Roman" w:hAnsi="Times New Roman" w:cs="Times New Roman"/>
-          <w:b w:val="0"/>
-          <w:i w:val="0"/>
-          <w:sz w:val="26"/>
-        </w:rPr>
-        <w:t>[12] PlatformIO Labs, "PlatformIO Documentation," 2024. [Online]. Available: https://docs.platformio.org/. [Accessed: Jun. 15, 2025].</w:t>
-      </w:r>
-    </w:p>
-    <w:p>
-      <w:pPr>
-        <w:jc w:val="both"/>
-      </w:pPr>
-      <w:r>
-        <w:rPr>
-          <w:rFonts w:ascii="Times New Roman" w:hAnsi="Times New Roman" w:cs="Times New Roman"/>
-          <w:b w:val="0"/>
-          <w:i w:val="0"/>
-          <w:sz w:val="26"/>
-        </w:rPr>
-        <w:t xml:space="preserve">[13] W. T. Higgins, "A comparison of complementary and Kalman filtering," </w:t>
+        <w:t xml:space="preserve">[9] Google, </w:t>
       </w:r>
       <w:r>
         <w:rPr>
@@ -25758,30 +25347,16 @@
           <w:i/>
           <w:sz w:val="26"/>
         </w:rPr>
-        <w:t>IEEE Trans. Aerosp. Electron. Syst.</w:t>
-      </w:r>
-      <w:r>
-        <w:rPr>
-          <w:rFonts w:ascii="Times New Roman" w:hAnsi="Times New Roman" w:cs="Times New Roman"/>
-          <w:b w:val="0"/>
-          <w:i w:val="0"/>
-          <w:sz w:val="26"/>
-        </w:rPr>
-        <w:t>, vol. AES-11, no. 3, pp. 321–325, May 1975.</w:t>
-      </w:r>
-    </w:p>
-    <w:p>
-      <w:pPr>
-        <w:jc w:val="both"/>
-      </w:pPr>
-      <w:r>
-        <w:rPr>
-          <w:rFonts w:ascii="Times New Roman" w:hAnsi="Times New Roman" w:cs="Times New Roman"/>
-          <w:b w:val="0"/>
-          <w:i w:val="0"/>
-          <w:sz w:val="26"/>
-        </w:rPr>
-        <w:t xml:space="preserve">[14] J. Borenstein and L. Feng, "Measurement and correction of systematic odometry errors in mobile robots," </w:t>
+        <w:t>Flutter Documentation</w:t>
+      </w:r>
+      <w:r>
+        <w:rPr>
+          <w:rFonts w:ascii="Times New Roman" w:hAnsi="Times New Roman" w:cs="Times New Roman"/>
+          <w:b w:val="0"/>
+          <w:i w:val="0"/>
+          <w:sz w:val="26"/>
+        </w:rPr>
+        <w:t xml:space="preserve"> và </w:t>
       </w:r>
       <w:r>
         <w:rPr>
@@ -25790,48 +25365,16 @@
           <w:i/>
           <w:sz w:val="26"/>
         </w:rPr>
-        <w:t>IEEE Trans. Robot. Autom.</w:t>
-      </w:r>
-      <w:r>
-        <w:rPr>
-          <w:rFonts w:ascii="Times New Roman" w:hAnsi="Times New Roman" w:cs="Times New Roman"/>
-          <w:b w:val="0"/>
-          <w:i w:val="0"/>
-          <w:sz w:val="26"/>
-        </w:rPr>
-        <w:t>, vol. 12, no. 6, pp. 869–880, Dec. 1996.</w:t>
-      </w:r>
-    </w:p>
-    <w:p>
-      <w:pPr>
-        <w:jc w:val="both"/>
-      </w:pPr>
-      <w:r>
-        <w:rPr>
-          <w:rFonts w:ascii="Times New Roman" w:hAnsi="Times New Roman" w:cs="Times New Roman"/>
-          <w:b w:val="0"/>
-          <w:i w:val="0"/>
-          <w:sz w:val="26"/>
-        </w:rPr>
-        <w:t xml:space="preserve">[15] F. Rubio, F. Valero, and C. Llopis-Albert, "A review of mobile robots: Concepts, methods, theoretical framework, and applications," </w:t>
-      </w:r>
-      <w:r>
-        <w:rPr>
-          <w:rFonts w:ascii="Times New Roman" w:hAnsi="Times New Roman" w:cs="Times New Roman"/>
-          <w:b w:val="0"/>
-          <w:i/>
-          <w:sz w:val="26"/>
-        </w:rPr>
-        <w:t>Int. J. Adv. Robot. Syst.</w:t>
-      </w:r>
-      <w:r>
-        <w:rPr>
-          <w:rFonts w:ascii="Times New Roman" w:hAnsi="Times New Roman" w:cs="Times New Roman"/>
-          <w:b w:val="0"/>
-          <w:i w:val="0"/>
-          <w:sz w:val="26"/>
-        </w:rPr>
-        <w:t>, vol. 16, no. 2, pp. 1–22, 2019.</w:t>
+        <w:t>Dart Language Tour</w:t>
+      </w:r>
+      <w:r>
+        <w:rPr>
+          <w:rFonts w:ascii="Times New Roman" w:hAnsi="Times New Roman" w:cs="Times New Roman"/>
+          <w:b w:val="0"/>
+          <w:i w:val="0"/>
+          <w:sz w:val="26"/>
+        </w:rPr>
+        <w:t>. [Online]. https://docs.flutter.dev/</w:t>
       </w:r>
     </w:p>
     <w:p>

</xml_diff>

<commit_message>
report: gop 1.1+1.2 thanh muc GIOI THIEU (2-3 trang) + mo rong tai lieu tham khao 9->32 nguon
- Chuong 1 (TONG QUAN): gop 1.1 Gioi thieu + 1.2 Tinh cap thiet thanh 1.1 GIOI THIEU,
  viet lai ~2-3 trang: tong quan tinh hinh nghien cuu (dinh vi, tim duong) -> ly do chon de tai.
  Phan gioi thieu trich 14 nguon [1],[3]-[6],[9],[10]-[17].
- Renumber 1.3->1.2 ... 1.7->1.6, cap nhat muc luc.
- Them [10]-[17] (sach/bao robot di dong) va [18]-[32] (chuan giao tiep, dong hoc,
  fusion, tim duong, cong cu) -> tong 32 nguon (>30), chen trich dan vao Chuong 2/3.
- Chuan IEEE: multi-cite tach ngoac + phay xep tang dan ([a], [b]), 1 space truoc ngoac, truoc dau cau.
- Rebuild HTML/PDF/DOCX.
</commit_message>
<xml_diff>
--- a/docs/bao-cao-xe-tu-hanh.docx
+++ b/docs/bao-cao-xe-tu-hanh.docx
@@ -751,7 +751,7 @@
           <w:i w:val="0"/>
           <w:sz w:val="26"/>
         </w:rPr>
-        <w:t>1.2 Tính cấp thiết của đề tài</w:t>
+        <w:t>1.2 Mục tiêu nghiên cứu</w:t>
       </w:r>
     </w:p>
     <w:p>
@@ -766,7 +766,7 @@
           <w:i w:val="0"/>
           <w:sz w:val="26"/>
         </w:rPr>
-        <w:t>1.3 Mục tiêu nghiên cứu</w:t>
+        <w:t>1.3 Nhiệm vụ nghiên cứu</w:t>
       </w:r>
     </w:p>
     <w:p>
@@ -781,7 +781,7 @@
           <w:i w:val="0"/>
           <w:sz w:val="26"/>
         </w:rPr>
-        <w:t>1.4 Nhiệm vụ nghiên cứu</w:t>
+        <w:t>1.4 Đối tượng và phạm vi nghiên cứu</w:t>
       </w:r>
     </w:p>
     <w:p>
@@ -796,7 +796,7 @@
           <w:i w:val="0"/>
           <w:sz w:val="26"/>
         </w:rPr>
-        <w:t>1.5 Đối tượng và phạm vi nghiên cứu</w:t>
+        <w:t>1.5 Phương pháp nghiên cứu</w:t>
       </w:r>
     </w:p>
     <w:p>
@@ -811,22 +811,7 @@
           <w:i w:val="0"/>
           <w:sz w:val="26"/>
         </w:rPr>
-        <w:t>1.6 Phương pháp nghiên cứu</w:t>
-      </w:r>
-    </w:p>
-    <w:p>
-      <w:pPr>
-        <w:pStyle w:val="ListBullet"/>
-        <w:ind w:left="652"/>
-      </w:pPr>
-      <w:r>
-        <w:rPr>
-          <w:rFonts w:ascii="Times New Roman" w:hAnsi="Times New Roman" w:cs="Times New Roman"/>
-          <w:b w:val="0"/>
-          <w:i w:val="0"/>
-          <w:sz w:val="26"/>
-        </w:rPr>
-        <w:t>1.7 Bố cục đề tài</w:t>
+        <w:t>1.6 Bố cục đề tài</w:t>
       </w:r>
     </w:p>
     <w:p>
@@ -5368,7 +5353,21 @@
           <w:i w:val="0"/>
           <w:sz w:val="26"/>
         </w:rPr>
-        <w:t xml:space="preserve">Trong thời đại hiện nay, robot di động tự hành đang dần trở thành một thành phần quan trọng trong nhiều lĩnh vực: vận chuyển hàng hóa trong kho (AGV/AMR), robot dịch vụ, robot dò đường, cho tới các nền tảng nghiên cứu định vị và dẫn đường. Bài toán cốt lõi của một robot tự hành là: </w:t>
+        <w:t>Robot di động tự hành (Autonomous Mobile Robot – AMR) đang trở thành một trong những hướng công nghệ phát triển nhanh nhất, gắn liền với làn sóng tự động hóa và cuộc Cách mạng công nghiệp 4.0. Khác với robot cố định hay xe dẫn đường tự động (AGV) truyền thống vốn bám theo vạch từ/băng dẫn cố định, AMR có khả năng tự định vị, tự lập kế hoạch đường đi và tự điều hướng trong môi trường, nhờ đó được ứng dụng ngày càng rộng rãi trong kho vận thông minh (intralogistics), robot dịch vụ, y tế, nông nghiệp và các nền tảng nghiên cứu [10], [15]. Nhiều khảo sát cho thấy việc thay thế AGV cứng nhắc bằng AMR linh hoạt giúp tăng đáng kể năng suất và khả năng thích ứng của dây chuyền sản xuất trong mô hình nhà máy thông minh [15].</w:t>
+      </w:r>
+    </w:p>
+    <w:p>
+      <w:pPr>
+        <w:jc w:val="both"/>
+      </w:pPr>
+      <w:r>
+        <w:rPr>
+          <w:rFonts w:ascii="Times New Roman" w:hAnsi="Times New Roman" w:cs="Times New Roman"/>
+          <w:b w:val="0"/>
+          <w:i w:val="0"/>
+          <w:sz w:val="26"/>
+        </w:rPr>
+        <w:t xml:space="preserve">Dù đa dạng về hình thức, mọi robot tự hành đều phải giải quyết ba bài toán cốt lõi: </w:t>
       </w:r>
       <w:r>
         <w:rPr>
@@ -5377,16 +5376,16 @@
           <w:i w:val="0"/>
           <w:sz w:val="26"/>
         </w:rPr>
-        <w:t>biết mình đang ở đâu</w:t>
-      </w:r>
-      <w:r>
-        <w:rPr>
-          <w:rFonts w:ascii="Times New Roman" w:hAnsi="Times New Roman" w:cs="Times New Roman"/>
-          <w:b w:val="0"/>
-          <w:i w:val="0"/>
-          <w:sz w:val="26"/>
-        </w:rPr>
-        <w:t xml:space="preserve"> (định vị), </w:t>
+        <w:t>định vị</w:t>
+      </w:r>
+      <w:r>
+        <w:rPr>
+          <w:rFonts w:ascii="Times New Roman" w:hAnsi="Times New Roman" w:cs="Times New Roman"/>
+          <w:b w:val="0"/>
+          <w:i w:val="0"/>
+          <w:sz w:val="26"/>
+        </w:rPr>
+        <w:t xml:space="preserve"> (robot biết mình đang ở đâu), </w:t>
       </w:r>
       <w:r>
         <w:rPr>
@@ -5395,16 +5394,16 @@
           <w:i w:val="0"/>
           <w:sz w:val="26"/>
         </w:rPr>
-        <w:t>biết phải đi tới đâu</w:t>
-      </w:r>
-      <w:r>
-        <w:rPr>
-          <w:rFonts w:ascii="Times New Roman" w:hAnsi="Times New Roman" w:cs="Times New Roman"/>
-          <w:b w:val="0"/>
-          <w:i w:val="0"/>
-          <w:sz w:val="26"/>
-        </w:rPr>
-        <w:t xml:space="preserve"> (lập kế hoạch đường đi), và </w:t>
+        <w:t>lập kế hoạch đường đi</w:t>
+      </w:r>
+      <w:r>
+        <w:rPr>
+          <w:rFonts w:ascii="Times New Roman" w:hAnsi="Times New Roman" w:cs="Times New Roman"/>
+          <w:b w:val="0"/>
+          <w:i w:val="0"/>
+          <w:sz w:val="26"/>
+        </w:rPr>
+        <w:t xml:space="preserve"> (xác định lộ trình tới đích) và </w:t>
       </w:r>
       <w:r>
         <w:rPr>
@@ -5413,16 +5412,34 @@
           <w:i w:val="0"/>
           <w:sz w:val="26"/>
         </w:rPr>
-        <w:t>đi tới đó một cách chính xác</w:t>
-      </w:r>
-      <w:r>
-        <w:rPr>
-          <w:rFonts w:ascii="Times New Roman" w:hAnsi="Times New Roman" w:cs="Times New Roman"/>
-          <w:b w:val="0"/>
-          <w:i w:val="0"/>
-          <w:sz w:val="26"/>
-        </w:rPr>
-        <w:t xml:space="preserve"> (điều khiển bám lộ trình).</w:t>
+        <w:t>điều khiển bám lộ trình</w:t>
+      </w:r>
+      <w:r>
+        <w:rPr>
+          <w:rFonts w:ascii="Times New Roman" w:hAnsi="Times New Roman" w:cs="Times New Roman"/>
+          <w:b w:val="0"/>
+          <w:i w:val="0"/>
+          <w:sz w:val="26"/>
+        </w:rPr>
+        <w:t xml:space="preserve"> (di chuyển chính xác theo lộ trình đó) [10]. Về định vị, đã có nhiều phương pháp được nghiên cứu: phương pháp tương đối (dead-reckoning) dựa trên odometry từ encoder bánh xe và cảm biến quán tính (IMU) để tích lũy quãng đường và hướng [11]; phương pháp tuyệt đối dùng GPS, mốc định vị (landmark/beacon) hoặc bản đồ biết trước; và các kỹ thuật hiện đại như định vị và dựng bản đồ đồng thời (SLAM) bằng LiDAR hoặc camera [16]. Mỗi phương pháp là một sự đánh đổi giữa độ chính xác, chi phí và độ phức tạp tính toán: odometry đơn giản, rẻ, tần số cao nhưng sai số tích lũy (trôi) theo quãng đường; SLAM chính xác và không trôi nhưng đòi hỏi cảm biến đắt tiền cùng năng lực tính toán lớn. Để giảm trôi của odometry, kỹ thuật hợp nhất cảm biến (sensor fusion) — tiêu biểu là </w:t>
+      </w:r>
+      <w:r>
+        <w:rPr>
+          <w:rFonts w:ascii="Times New Roman" w:hAnsi="Times New Roman" w:cs="Times New Roman"/>
+          <w:b/>
+          <w:i w:val="0"/>
+          <w:sz w:val="26"/>
+        </w:rPr>
+        <w:t>bộ lọc bù (complementary filter)</w:t>
+      </w:r>
+      <w:r>
+        <w:rPr>
+          <w:rFonts w:ascii="Times New Roman" w:hAnsi="Times New Roman" w:cs="Times New Roman"/>
+          <w:b w:val="0"/>
+          <w:i w:val="0"/>
+          <w:sz w:val="26"/>
+        </w:rPr>
+        <w:t xml:space="preserve"> hoặc bộ lọc Kalman — thường được dùng để kết hợp tín hiệu con quay hồi chuyển và gia tốc kế nhằm ước lượng góc hướng ổn định hơn [14].</w:t>
       </w:r>
     </w:p>
     <w:p>
@@ -5436,7 +5453,7 @@
           <w:i w:val="0"/>
           <w:sz w:val="26"/>
         </w:rPr>
-        <w:t xml:space="preserve">Các hệ thống robot công nghiệp thường sử dụng cảm biến đắt tiền (LiDAR, camera độ phân giải cao, GPS-RTK) và máy tính mạnh. Tuy nhiên, ở quy mô học thuật và sản phẩm chi phí thấp, hoàn toàn có thể xây dựng một robot tự hành cơ bản chỉ với vi điều khiển ESP32, encoder bánh xe, cảm biến quán tính giá rẻ và một điện thoại làm giao diện. Đề tài </w:t>
+        <w:t xml:space="preserve">Về bài toán tìm đường, lý thuyết đồ thị cung cấp nền tảng vững chắc: thuật toán Dijkstra tìm đường đi ngắn nhất trên đồ thị có trọng số [13], còn thuật toán </w:t>
       </w:r>
       <w:r>
         <w:rPr>
@@ -5445,6 +5462,111 @@
           <w:i w:val="0"/>
           <w:sz w:val="26"/>
         </w:rPr>
+        <w:t>A</w:t>
+      </w:r>
+      <w:r>
+        <w:rPr>
+          <w:rFonts w:ascii="Times New Roman" w:hAnsi="Times New Roman" w:cs="Times New Roman"/>
+          <w:b w:val="0"/>
+          <w:i/>
+          <w:sz w:val="26"/>
+        </w:rPr>
+        <w:t xml:space="preserve"> mở rộng Dijkstra bằng một hàm heuristic để hướng việc tìm kiếm về phía đích, nhờ đó giảm mạnh số nút phải duyệt mà vẫn đảm bảo tối ưu khi heuristic chấp nhận được (admissible) [6]. Bên cạnh nhóm thuật toán dựa trên đồ thị/lưới, còn có nhóm thuật toán lấy mẫu ngẫu nhiên (RRT, PRM) phù hợp cho không gian cấu hình nhiều chiều [12]. Với môi trường trong nhà đã biết trước dưới dạng lưới điểm (waypoint), A</w:t>
+      </w:r>
+      <w:r>
+        <w:rPr>
+          <w:rFonts w:ascii="Times New Roman" w:hAnsi="Times New Roman" w:cs="Times New Roman"/>
+          <w:b w:val="0"/>
+          <w:i w:val="0"/>
+          <w:sz w:val="26"/>
+        </w:rPr>
+        <w:t xml:space="preserve"> là lựa chọn cân bằng tốt giữa tính tối ưu, tốc độ thực thi và độ đơn giản khi cài đặt trên thiết bị di động.</w:t>
+      </w:r>
+    </w:p>
+    <w:p>
+      <w:pPr>
+        <w:jc w:val="both"/>
+      </w:pPr>
+      <w:r>
+        <w:rPr>
+          <w:rFonts w:ascii="Times New Roman" w:hAnsi="Times New Roman" w:cs="Times New Roman"/>
+          <w:b w:val="0"/>
+          <w:i w:val="0"/>
+          <w:sz w:val="26"/>
+        </w:rPr>
+        <w:t xml:space="preserve">Ở quy mô công nghiệp, robot tự hành thường được trang bị cảm biến đắt tiền (LiDAR, camera độ phân giải cao, GPS-RTK) cùng máy tính nhúng mạnh để chạy SLAM và thị giác máy tính [16]. Tuy nhiên, chi phí và độ phức tạp này là rào cản lớn đối với sinh viên và các dự án học thuật. Một hướng tiếp cận khác đang được quan tâm là xây dựng robot tự hành </w:t>
+      </w:r>
+      <w:r>
+        <w:rPr>
+          <w:rFonts w:ascii="Times New Roman" w:hAnsi="Times New Roman" w:cs="Times New Roman"/>
+          <w:b/>
+          <w:i w:val="0"/>
+          <w:sz w:val="26"/>
+        </w:rPr>
+        <w:t>chi phí thấp</w:t>
+      </w:r>
+      <w:r>
+        <w:rPr>
+          <w:rFonts w:ascii="Times New Roman" w:hAnsi="Times New Roman" w:cs="Times New Roman"/>
+          <w:b w:val="0"/>
+          <w:i w:val="0"/>
+          <w:sz w:val="26"/>
+        </w:rPr>
+        <w:t xml:space="preserve"> dựa trên vi điều khiển phổ thông. Trong số đó, ESP32 — vi điều khiển lõi kép tích hợp sẵn WiFi/Bluetooth, giá rẻ, cộng đồng hỗ trợ lớn — nổi lên như một nền tảng phù hợp cho các ứng dụng IoT và robot nhỏ [1], [17]. Kết hợp ESP32 với encoder bánh xe, IMU giá rẻ (như MPU-6050 [3]) và một điện thoại thông minh làm giao diện, hoàn toàn có thể dựng được một robot tự hành cơ bản đủ chức năng định vị – tìm đường – bám lộ trình với chi phí chỉ bằng một phần nhỏ so với hệ thống công nghiệp.</w:t>
+      </w:r>
+    </w:p>
+    <w:p>
+      <w:pPr>
+        <w:jc w:val="both"/>
+      </w:pPr>
+      <w:r>
+        <w:rPr>
+          <w:rFonts w:ascii="Times New Roman" w:hAnsi="Times New Roman" w:cs="Times New Roman"/>
+          <w:b w:val="0"/>
+          <w:i w:val="0"/>
+          <w:sz w:val="26"/>
+        </w:rPr>
+        <w:t xml:space="preserve">Từ thực trạng trên có thể thấy: robot tự hành là lĩnh vực quan trọng và đang phát triển mạnh, nhưng việc tiếp cận thực hành còn vướng rào cản về chi phí phần cứng và độ phức tạp thuật toán. Việc xây dựng một nền tảng robot tự hành </w:t>
+      </w:r>
+      <w:r>
+        <w:rPr>
+          <w:rFonts w:ascii="Times New Roman" w:hAnsi="Times New Roman" w:cs="Times New Roman"/>
+          <w:b/>
+          <w:i w:val="0"/>
+          <w:sz w:val="26"/>
+        </w:rPr>
+        <w:t>chi phí thấp, module hóa, dễ mở rộng và không phụ thuộc hạ tầng Internet</w:t>
+      </w:r>
+      <w:r>
+        <w:rPr>
+          <w:rFonts w:ascii="Times New Roman" w:hAnsi="Times New Roman" w:cs="Times New Roman"/>
+          <w:b w:val="0"/>
+          <w:i w:val="0"/>
+          <w:sz w:val="26"/>
+        </w:rPr>
+        <w:t xml:space="preserve"> vì vậy mang ý nghĩa thực tiễn rõ rệt: vừa là sản phẩm học tập giúp người thực hiện nắm vững trọn vẹn chuỗi kiến thức nền (điều khiển động cơ DC qua mạch cầu L298N [4], đọc và xử lý cảm biến siêu âm HC-SR04 [5], encoder và IMU, ước lượng odometry, lập kế hoạch đường đi, truyền thông không dây), vừa là khung sườn để phát triển tiếp các tính năng cao cấp hơn như tránh vật cản động, SLAM hay phối hợp đội hình nhiều robot.</w:t>
+      </w:r>
+    </w:p>
+    <w:p>
+      <w:pPr>
+        <w:jc w:val="both"/>
+      </w:pPr>
+      <w:r>
+        <w:rPr>
+          <w:rFonts w:ascii="Times New Roman" w:hAnsi="Times New Roman" w:cs="Times New Roman"/>
+          <w:b w:val="0"/>
+          <w:i w:val="0"/>
+          <w:sz w:val="26"/>
+        </w:rPr>
+        <w:t xml:space="preserve">Xuất phát từ những lý do đó, đề tài </w:t>
+      </w:r>
+      <w:r>
+        <w:rPr>
+          <w:rFonts w:ascii="Times New Roman" w:hAnsi="Times New Roman" w:cs="Times New Roman"/>
+          <w:b/>
+          <w:i w:val="0"/>
+          <w:sz w:val="26"/>
+        </w:rPr>
         <w:t>"Xe robot tự hành định vị bằng odometry và tìm đường A*"</w:t>
       </w:r>
       <w:r>
@@ -5454,7 +5576,7 @@
           <w:i w:val="0"/>
           <w:sz w:val="26"/>
         </w:rPr>
-        <w:t xml:space="preserve"> ra đời nhằm nghiên cứu và triển khai một giải pháp robot tự hành như vậy: dùng ESP32 làm bộ điều khiển trung tâm, kết hợp odometry (encoder + IMU) để định vị, thuật toán A* trên ứng dụng di động để tìm đường, và giao thức UDP để liên lạc thời gian thực giữa app và xe.</w:t>
+        <w:t xml:space="preserve"> được lựa chọn thực hiện. Đề tài dùng ESP32 làm bộ điều khiển trung tâm; định vị bằng odometry kết hợp encoder bánh xe và cảm biến góc MPU-6050 thông qua bộ lọc bù [14]; tìm đường bằng thuật toán A* [6] chạy trên ứng dụng di động đa nền tảng viết bằng Flutter [9]; và liên lạc thời gian thực giữa ứng dụng với xe qua giao thức UDP trên mạng WiFi cục bộ do chính ESP32 phát ra. Việc chọn Flutter và mạng cục bộ giúp hệ thống đa nền tảng, độ trễ thấp và hoạt động độc lập với Internet. Toàn bộ hệ thống được thiết kế theo hướng module hóa, chi phí thấp và có khả năng mở rộng, hướng tới một nền tảng học thuật hoàn chỉnh cho các bài toán định vị và dẫn đường robot ở quy mô phòng thí nghiệm.</w:t>
       </w:r>
     </w:p>
     <w:p>
@@ -5468,67 +5590,7 @@
           <w:i w:val="0"/>
           <w:sz w:val="28"/>
         </w:rPr>
-        <w:t>1.2 TÍNH CẤP THIẾT CỦA ĐỀ TÀI</w:t>
-      </w:r>
-    </w:p>
-    <w:p>
-      <w:pPr>
-        <w:jc w:val="both"/>
-      </w:pPr>
-      <w:r>
-        <w:rPr>
-          <w:rFonts w:ascii="Times New Roman" w:hAnsi="Times New Roman" w:cs="Times New Roman"/>
-          <w:b w:val="0"/>
-          <w:i w:val="0"/>
-          <w:sz w:val="26"/>
-        </w:rPr>
-        <w:t xml:space="preserve">Robot tự hành là một hướng công nghệ đang phát triển rất nhanh, gắn liền với tự động hóa và Industry 4.0. Tuy nhiên, để tiếp cận được lĩnh vực này, sinh viên thường gặp rào cản về chi phí phần cứng và độ phức tạp của thuật toán. Việc xây dựng một nền tảng robot tự hành </w:t>
-      </w:r>
-      <w:r>
-        <w:rPr>
-          <w:rFonts w:ascii="Times New Roman" w:hAnsi="Times New Roman" w:cs="Times New Roman"/>
-          <w:b/>
-          <w:i w:val="0"/>
-          <w:sz w:val="26"/>
-        </w:rPr>
-        <w:t>chi phí thấp, module hóa, dễ mở rộng</w:t>
-      </w:r>
-      <w:r>
-        <w:rPr>
-          <w:rFonts w:ascii="Times New Roman" w:hAnsi="Times New Roman" w:cs="Times New Roman"/>
-          <w:b w:val="0"/>
-          <w:i w:val="0"/>
-          <w:sz w:val="26"/>
-        </w:rPr>
-        <w:t xml:space="preserve"> có ý nghĩa thực tiễn lớn: nó vừa là sản phẩm học tập giúp nắm vững các kiến thức nền (điều khiển động cơ, đọc cảm biến, định vị, lập kế hoạch đường đi, truyền thông không dây), vừa là khung sườn để phát triển tiếp các tính năng cao cấp hơn (tránh vật cản động, SLAM, đội hình nhiều robot).</w:t>
-      </w:r>
-    </w:p>
-    <w:p>
-      <w:pPr>
-        <w:jc w:val="both"/>
-      </w:pPr>
-      <w:r>
-        <w:rPr>
-          <w:rFonts w:ascii="Times New Roman" w:hAnsi="Times New Roman" w:cs="Times New Roman"/>
-          <w:b w:val="0"/>
-          <w:i w:val="0"/>
-          <w:sz w:val="26"/>
-        </w:rPr>
-        <w:t>Bên cạnh đó, việc dùng ESP32 — vi điều khiển tích hợp sẵn WiFi, giá rẻ, cộng đồng lớn — cùng Flutter cho ứng dụng đa nền tảng giúp hệ thống có khả năng mở rộng và tính linh hoạt cao trong tương lai. Đây chính là cơ sở để đề tài trở nên cấp thiết.</w:t>
-      </w:r>
-    </w:p>
-    <w:p>
-      <w:pPr>
-        <w:spacing w:before="240" w:after="120"/>
-      </w:pPr>
-      <w:r>
-        <w:rPr>
-          <w:rFonts w:ascii="Times New Roman" w:hAnsi="Times New Roman" w:cs="Times New Roman"/>
-          <w:b/>
-          <w:i w:val="0"/>
-          <w:sz w:val="28"/>
-        </w:rPr>
-        <w:t>1.3 MỤC TIÊU NGHIÊN CỨU</w:t>
+        <w:t>1.2 MỤC TIÊU NGHIÊN CỨU</w:t>
       </w:r>
     </w:p>
     <w:p>
@@ -5654,7 +5716,7 @@
           <w:i w:val="0"/>
           <w:sz w:val="28"/>
         </w:rPr>
-        <w:t>1.4 NHIỆM VỤ NGHIÊN CỨU</w:t>
+        <w:t>1.3 NHIỆM VỤ NGHIÊN CỨU</w:t>
       </w:r>
     </w:p>
     <w:p>
@@ -5682,7 +5744,7 @@
           <w:i w:val="0"/>
           <w:sz w:val="28"/>
         </w:rPr>
-        <w:t>1.5 ĐỐI TƯỢNG VÀ PHẠM VI NGHIÊN CỨU</w:t>
+        <w:t>1.4 ĐỐI TƯỢNG VÀ PHẠM VI NGHIÊN CỨU</w:t>
       </w:r>
     </w:p>
     <w:p>
@@ -5760,7 +5822,7 @@
           <w:i w:val="0"/>
           <w:sz w:val="28"/>
         </w:rPr>
-        <w:t>1.6 PHƯƠNG PHÁP NGHIÊN CỨU</w:t>
+        <w:t>1.5 PHƯƠNG PHÁP NGHIÊN CỨU</w:t>
       </w:r>
     </w:p>
     <w:p>
@@ -5878,7 +5940,7 @@
           <w:i w:val="0"/>
           <w:sz w:val="28"/>
         </w:rPr>
-        <w:t>1.7 BỐ CỤC ĐỀ TÀI</w:t>
+        <w:t>1.6 BỐ CỤC ĐỀ TÀI</w:t>
       </w:r>
     </w:p>
     <w:p>
@@ -6130,7 +6192,7 @@
           <w:i w:val="0"/>
           <w:sz w:val="26"/>
         </w:rPr>
-        <w:t xml:space="preserve">. Mỗi chân GPIO có thể cấu hình kéo lên (pull-up)/kéo xuống (pull-down) nội bộ, và quan trọng nhất với đề tài là khả năng tạo </w:t>
+        <w:t xml:space="preserve"> [18]. Mỗi chân GPIO có thể cấu hình kéo lên (pull-up)/kéo xuống (pull-down) nội bộ, và quan trọng nhất với đề tài là khả năng tạo </w:t>
       </w:r>
       <w:r>
         <w:rPr>
@@ -6212,7 +6274,7 @@
           <w:i w:val="0"/>
           <w:sz w:val="26"/>
         </w:rPr>
-        <w:t>I2C (Inter-Integrated Circuit) là giao thức truyền thông nối tiếp đồng bộ, sử dụng hai đường:</w:t>
+        <w:t>I2C (Inter-Integrated Circuit) [19] là giao thức truyền thông nối tiếp đồng bộ, sử dụng hai đường:</w:t>
       </w:r>
     </w:p>
     <w:p>
@@ -6389,7 +6451,7 @@
           <w:i w:val="0"/>
           <w:sz w:val="26"/>
         </w:rPr>
-        <w:t>PWM (Pulse Width Modulation – điều chế độ rộng xung) điều khiển công suất trung bình cấp cho tải bằng cách thay đổi tỉ lệ thời gian mức cao/thấp của tín hiệu (duty cycle). Tốc độ động cơ DC tỉ lệ với duty cycle của tín hiệu PWM cấp vào chân Enable của mạch cầu H.</w:t>
+        <w:t>PWM (Pulse Width Modulation – điều chế độ rộng xung) [20] điều khiển công suất trung bình cấp cho tải bằng cách thay đổi tỉ lệ thời gian mức cao/thấp của tín hiệu (duty cycle). Tốc độ động cơ DC tỉ lệ với duty cycle của tín hiệu PWM cấp vào chân Enable của mạch cầu H.</w:t>
       </w:r>
     </w:p>
     <w:p>
@@ -6825,7 +6887,7 @@
           <w:i w:val="0"/>
           <w:sz w:val="26"/>
         </w:rPr>
-        <w:t xml:space="preserve"> do comparator LM393 (thiếu hysteresis) sinh ra ở mép khe đĩa.</w:t>
+        <w:t xml:space="preserve"> do comparator LM393 (thiếu hysteresis) [21] sinh ra ở mép khe đĩa.</w:t>
       </w:r>
     </w:p>
     <w:p>
@@ -6853,7 +6915,7 @@
           <w:i w:val="0"/>
           <w:sz w:val="26"/>
         </w:rPr>
-        <w:t xml:space="preserve">ESP32 tích hợp WiFi, có thể hoạt động ở chế độ </w:t>
+        <w:t xml:space="preserve">ESP32 tích hợp WiFi [22], có thể hoạt động ở chế độ </w:t>
       </w:r>
       <w:r>
         <w:rPr>
@@ -6903,7 +6965,7 @@
           <w:i w:val="0"/>
           <w:sz w:val="26"/>
         </w:rPr>
-        <w:t xml:space="preserve"> — giao thức không kết nối, không bắt tay, không đảm bảo thứ tự/độ tin cậy nhưng </w:t>
+        <w:t xml:space="preserve"> [23] — giao thức không kết nối, không bắt tay, không đảm bảo thứ tự/độ tin cậy nhưng </w:t>
       </w:r>
       <w:r>
         <w:rPr>
@@ -6981,7 +7043,7 @@
           <w:i w:val="0"/>
           <w:sz w:val="26"/>
         </w:rPr>
-        <w:t xml:space="preserve">: hai bánh chủ động trái/phải điều khiển độc lập, hướng xe thay đổi nhờ chênh lệch tốc độ hai bánh. </w:t>
+        <w:t xml:space="preserve"> [25], [30]: hai bánh chủ động trái/phải điều khiển độc lập, hướng xe thay đổi nhờ chênh lệch tốc độ hai bánh. </w:t>
       </w:r>
       <w:r>
         <w:rPr>
@@ -6999,7 +7061,7 @@
           <w:i w:val="0"/>
           <w:sz w:val="26"/>
         </w:rPr>
-        <w:t xml:space="preserve"> (đo hành trình) [7] là phương pháp ước lượng vị trí robot bằng cách tích lũy quãng đường mỗi bánh đo được từ encoder.</w:t>
+        <w:t xml:space="preserve"> (đo hành trình) [7], [24] là phương pháp ước lượng vị trí robot bằng cách tích lũy quãng đường mỗi bánh đo được từ encoder.</w:t>
       </w:r>
     </w:p>
     <w:p>
@@ -7270,7 +7332,25 @@
           <w:i w:val="0"/>
           <w:sz w:val="26"/>
         </w:rPr>
-        <w:t xml:space="preserve"> kết hợp hai nguồn để bù khuyết điểm của nhau:</w:t>
+        <w:t xml:space="preserve"> [13] kết hợp hai nguồn để bù khuyết điểm của nhau (một lựa chọn thay thế phức tạp hơn là </w:t>
+      </w:r>
+      <w:r>
+        <w:rPr>
+          <w:rFonts w:ascii="Times New Roman" w:hAnsi="Times New Roman" w:cs="Times New Roman"/>
+          <w:b/>
+          <w:i w:val="0"/>
+          <w:sz w:val="26"/>
+        </w:rPr>
+        <w:t>bộ lọc Kalman</w:t>
+      </w:r>
+      <w:r>
+        <w:rPr>
+          <w:rFonts w:ascii="Times New Roman" w:hAnsi="Times New Roman" w:cs="Times New Roman"/>
+          <w:b w:val="0"/>
+          <w:i w:val="0"/>
+          <w:sz w:val="26"/>
+        </w:rPr>
+        <w:t xml:space="preserve"> [26], [27]):</w:t>
       </w:r>
     </w:p>
     <w:p>
@@ -7453,7 +7533,7 @@
           <w:i w:val="0"/>
           <w:sz w:val="26"/>
         </w:rPr>
-        <w:t>A* (A-star) [6] là thuật toán tìm đường đi ngắn nhất trên đồ thị có trọng số, kết hợp chi phí thực tế đã đi g(n) và một hàm ước lượng (heuristic) h(n) tới đích:</w:t>
+        <w:t>A* (A-star) [6], [28] là thuật toán tìm đường đi ngắn nhất trên đồ thị có trọng số, kết hợp chi phí thực tế đã đi g(n) và một hàm ước lượng (heuristic) h(n) tới đích:</w:t>
       </w:r>
     </w:p>
     <w:p>
@@ -7587,7 +7667,25 @@
           <w:i w:val="0"/>
           <w:sz w:val="26"/>
         </w:rPr>
-        <w:t xml:space="preserve"> để xe chạy mượt và giảm sai số tích lũy do mỗi lần xoay.</w:t>
+        <w:t xml:space="preserve"> để xe chạy mượt và giảm sai số tích lũy do mỗi lần xoay. Với môi trường thay đổi động, các biến thể tái lập kế hoạch như </w:t>
+      </w:r>
+      <w:r>
+        <w:rPr>
+          <w:rFonts w:ascii="Times New Roman" w:hAnsi="Times New Roman" w:cs="Times New Roman"/>
+          <w:b/>
+          <w:i w:val="0"/>
+          <w:sz w:val="26"/>
+        </w:rPr>
+        <w:t>D* Lite</w:t>
+      </w:r>
+      <w:r>
+        <w:rPr>
+          <w:rFonts w:ascii="Times New Roman" w:hAnsi="Times New Roman" w:cs="Times New Roman"/>
+          <w:b w:val="0"/>
+          <w:i w:val="0"/>
+          <w:sz w:val="26"/>
+        </w:rPr>
+        <w:t xml:space="preserve"> [29] cho phép cập nhật đường đi tăng tiến mà không phải tính lại từ đầu.</w:t>
       </w:r>
     </w:p>
     <w:p>
@@ -7662,7 +7760,7 @@
           <w:i w:val="0"/>
           <w:sz w:val="26"/>
         </w:rPr>
-        <w:t xml:space="preserve"> — một hệ sinh thái phát triển nhúng chạy trên VS Code, hỗ trợ quản lý thư viện, biên dịch, nạp chương trình và giám sát Serial. So với Arduino IDE truyền thống, PlatformIO mạnh hơn ở quản lý dự án nhiều file (module hóa), khai báo thư viện qua </w:t>
+        <w:t xml:space="preserve"> [31] — một hệ sinh thái phát triển nhúng chạy trên VS Code, hỗ trợ quản lý thư viện, biên dịch, nạp chương trình và giám sát Serial. So với Arduino IDE truyền thống, PlatformIO mạnh hơn ở quản lý dự án nhiều file (module hóa), khai báo thư viện qua </w:t>
       </w:r>
       <w:r>
         <w:rPr>
@@ -8159,7 +8257,7 @@
                 <w:i w:val="0"/>
                 <w:sz w:val="24"/>
               </w:rPr>
-              <w:t>Lưu dữ liệu hiệu chuẩn (motor trim, encoder scale) vào NVS flash</w:t>
+              <w:t>Lưu dữ liệu hiệu chuẩn (motor trim, encoder scale) vào NVS flash [32]</w:t>
             </w:r>
           </w:p>
         </w:tc>
@@ -25375,6 +25473,780 @@
           <w:sz w:val="26"/>
         </w:rPr>
         <w:t>. [Online]. https://docs.flutter.dev/</w:t>
+      </w:r>
+    </w:p>
+    <w:p>
+      <w:pPr>
+        <w:jc w:val="both"/>
+      </w:pPr>
+      <w:r>
+        <w:rPr>
+          <w:rFonts w:ascii="Times New Roman" w:hAnsi="Times New Roman" w:cs="Times New Roman"/>
+          <w:b/>
+          <w:i w:val="0"/>
+          <w:sz w:val="26"/>
+        </w:rPr>
+        <w:t>Sách và bài báo khoa học về robot di động, định vị và dẫn đường:</w:t>
+      </w:r>
+    </w:p>
+    <w:p>
+      <w:pPr>
+        <w:jc w:val="both"/>
+      </w:pPr>
+      <w:r>
+        <w:rPr>
+          <w:rFonts w:ascii="Times New Roman" w:hAnsi="Times New Roman" w:cs="Times New Roman"/>
+          <w:b w:val="0"/>
+          <w:i w:val="0"/>
+          <w:sz w:val="26"/>
+        </w:rPr>
+        <w:t xml:space="preserve">[10] R. Siegwart, I. R. Nourbakhsh, D. Scaramuzza, </w:t>
+      </w:r>
+      <w:r>
+        <w:rPr>
+          <w:rFonts w:ascii="Times New Roman" w:hAnsi="Times New Roman" w:cs="Times New Roman"/>
+          <w:b w:val="0"/>
+          <w:i/>
+          <w:sz w:val="26"/>
+        </w:rPr>
+        <w:t>Introduction to Autonomous Mobile Robots</w:t>
+      </w:r>
+      <w:r>
+        <w:rPr>
+          <w:rFonts w:ascii="Times New Roman" w:hAnsi="Times New Roman" w:cs="Times New Roman"/>
+          <w:b w:val="0"/>
+          <w:i w:val="0"/>
+          <w:sz w:val="26"/>
+        </w:rPr>
+        <w:t>, 2nd ed., MIT Press, 2011.</w:t>
+      </w:r>
+    </w:p>
+    <w:p>
+      <w:pPr>
+        <w:jc w:val="both"/>
+      </w:pPr>
+      <w:r>
+        <w:rPr>
+          <w:rFonts w:ascii="Times New Roman" w:hAnsi="Times New Roman" w:cs="Times New Roman"/>
+          <w:b w:val="0"/>
+          <w:i w:val="0"/>
+          <w:sz w:val="26"/>
+        </w:rPr>
+        <w:t xml:space="preserve">[11] J. Borenstein, H. R. Everett, L. Feng, </w:t>
+      </w:r>
+      <w:r>
+        <w:rPr>
+          <w:rFonts w:ascii="Times New Roman" w:hAnsi="Times New Roman" w:cs="Times New Roman"/>
+          <w:b w:val="0"/>
+          <w:i/>
+          <w:sz w:val="26"/>
+        </w:rPr>
+        <w:t>Where am I? Sensors and Methods for Mobile Robot Positioning</w:t>
+      </w:r>
+      <w:r>
+        <w:rPr>
+          <w:rFonts w:ascii="Times New Roman" w:hAnsi="Times New Roman" w:cs="Times New Roman"/>
+          <w:b w:val="0"/>
+          <w:i w:val="0"/>
+          <w:sz w:val="26"/>
+        </w:rPr>
+        <w:t>, University of Michigan, 1996.</w:t>
+      </w:r>
+    </w:p>
+    <w:p>
+      <w:pPr>
+        <w:jc w:val="both"/>
+      </w:pPr>
+      <w:r>
+        <w:rPr>
+          <w:rFonts w:ascii="Times New Roman" w:hAnsi="Times New Roman" w:cs="Times New Roman"/>
+          <w:b w:val="0"/>
+          <w:i w:val="0"/>
+          <w:sz w:val="26"/>
+        </w:rPr>
+        <w:t xml:space="preserve">[12] S. M. LaValle, </w:t>
+      </w:r>
+      <w:r>
+        <w:rPr>
+          <w:rFonts w:ascii="Times New Roman" w:hAnsi="Times New Roman" w:cs="Times New Roman"/>
+          <w:b w:val="0"/>
+          <w:i/>
+          <w:sz w:val="26"/>
+        </w:rPr>
+        <w:t>Planning Algorithms</w:t>
+      </w:r>
+      <w:r>
+        <w:rPr>
+          <w:rFonts w:ascii="Times New Roman" w:hAnsi="Times New Roman" w:cs="Times New Roman"/>
+          <w:b w:val="0"/>
+          <w:i w:val="0"/>
+          <w:sz w:val="26"/>
+        </w:rPr>
+        <w:t>, Cambridge University Press, 2006. [Online]. http://lavalle.pl/planning/</w:t>
+      </w:r>
+    </w:p>
+    <w:p>
+      <w:pPr>
+        <w:jc w:val="both"/>
+      </w:pPr>
+      <w:r>
+        <w:rPr>
+          <w:rFonts w:ascii="Times New Roman" w:hAnsi="Times New Roman" w:cs="Times New Roman"/>
+          <w:b w:val="0"/>
+          <w:i w:val="0"/>
+          <w:sz w:val="26"/>
+        </w:rPr>
+        <w:t xml:space="preserve">[13] E. W. Dijkstra, "A note on two problems in connexion with graphs", </w:t>
+      </w:r>
+      <w:r>
+        <w:rPr>
+          <w:rFonts w:ascii="Times New Roman" w:hAnsi="Times New Roman" w:cs="Times New Roman"/>
+          <w:b w:val="0"/>
+          <w:i/>
+          <w:sz w:val="26"/>
+        </w:rPr>
+        <w:t>Numerische Mathematik</w:t>
+      </w:r>
+      <w:r>
+        <w:rPr>
+          <w:rFonts w:ascii="Times New Roman" w:hAnsi="Times New Roman" w:cs="Times New Roman"/>
+          <w:b w:val="0"/>
+          <w:i w:val="0"/>
+          <w:sz w:val="26"/>
+        </w:rPr>
+        <w:t>, vol. 1, pp. 269–271, 1959.</w:t>
+      </w:r>
+    </w:p>
+    <w:p>
+      <w:pPr>
+        <w:jc w:val="both"/>
+      </w:pPr>
+      <w:r>
+        <w:rPr>
+          <w:rFonts w:ascii="Times New Roman" w:hAnsi="Times New Roman" w:cs="Times New Roman"/>
+          <w:b w:val="0"/>
+          <w:i w:val="0"/>
+          <w:sz w:val="26"/>
+        </w:rPr>
+        <w:t xml:space="preserve">[14] R. Mahony, T. Hamel, J.-M. Pflimlin, "Nonlinear Complementary Filters on the Special Orthogonal Group", </w:t>
+      </w:r>
+      <w:r>
+        <w:rPr>
+          <w:rFonts w:ascii="Times New Roman" w:hAnsi="Times New Roman" w:cs="Times New Roman"/>
+          <w:b w:val="0"/>
+          <w:i/>
+          <w:sz w:val="26"/>
+        </w:rPr>
+        <w:t>IEEE Transactions on Automatic Control</w:t>
+      </w:r>
+      <w:r>
+        <w:rPr>
+          <w:rFonts w:ascii="Times New Roman" w:hAnsi="Times New Roman" w:cs="Times New Roman"/>
+          <w:b w:val="0"/>
+          <w:i w:val="0"/>
+          <w:sz w:val="26"/>
+        </w:rPr>
+        <w:t>, vol. 53, no. 5, pp. 1203–1218, 2008.</w:t>
+      </w:r>
+    </w:p>
+    <w:p>
+      <w:pPr>
+        <w:jc w:val="both"/>
+      </w:pPr>
+      <w:r>
+        <w:rPr>
+          <w:rFonts w:ascii="Times New Roman" w:hAnsi="Times New Roman" w:cs="Times New Roman"/>
+          <w:b w:val="0"/>
+          <w:i w:val="0"/>
+          <w:sz w:val="26"/>
+        </w:rPr>
+        <w:t xml:space="preserve">[15] G. Fragapane, D. Ivanov, M. Peron, F. Sgarbossa, J. O. Strandhagen, "Increasing flexibility and productivity in Industry 4.0 production networks with autonomous mobile robots and smart intralogistics", </w:t>
+      </w:r>
+      <w:r>
+        <w:rPr>
+          <w:rFonts w:ascii="Times New Roman" w:hAnsi="Times New Roman" w:cs="Times New Roman"/>
+          <w:b w:val="0"/>
+          <w:i/>
+          <w:sz w:val="26"/>
+        </w:rPr>
+        <w:t>Annals of Operations Research</w:t>
+      </w:r>
+      <w:r>
+        <w:rPr>
+          <w:rFonts w:ascii="Times New Roman" w:hAnsi="Times New Roman" w:cs="Times New Roman"/>
+          <w:b w:val="0"/>
+          <w:i w:val="0"/>
+          <w:sz w:val="26"/>
+        </w:rPr>
+        <w:t>, vol. 308, pp. 125–143, 2021.</w:t>
+      </w:r>
+    </w:p>
+    <w:p>
+      <w:pPr>
+        <w:jc w:val="both"/>
+      </w:pPr>
+      <w:r>
+        <w:rPr>
+          <w:rFonts w:ascii="Times New Roman" w:hAnsi="Times New Roman" w:cs="Times New Roman"/>
+          <w:b w:val="0"/>
+          <w:i w:val="0"/>
+          <w:sz w:val="26"/>
+        </w:rPr>
+        <w:t xml:space="preserve">[16] C. Cadena et al., "Past, Present, and Future of Simultaneous Localization and Mapping: Toward the Robust-Perception Age", </w:t>
+      </w:r>
+      <w:r>
+        <w:rPr>
+          <w:rFonts w:ascii="Times New Roman" w:hAnsi="Times New Roman" w:cs="Times New Roman"/>
+          <w:b w:val="0"/>
+          <w:i/>
+          <w:sz w:val="26"/>
+        </w:rPr>
+        <w:t>IEEE Transactions on Robotics</w:t>
+      </w:r>
+      <w:r>
+        <w:rPr>
+          <w:rFonts w:ascii="Times New Roman" w:hAnsi="Times New Roman" w:cs="Times New Roman"/>
+          <w:b w:val="0"/>
+          <w:i w:val="0"/>
+          <w:sz w:val="26"/>
+        </w:rPr>
+        <w:t>, vol. 32, no. 6, pp. 1309–1332, 2016.</w:t>
+      </w:r>
+    </w:p>
+    <w:p>
+      <w:pPr>
+        <w:jc w:val="both"/>
+      </w:pPr>
+      <w:r>
+        <w:rPr>
+          <w:rFonts w:ascii="Times New Roman" w:hAnsi="Times New Roman" w:cs="Times New Roman"/>
+          <w:b w:val="0"/>
+          <w:i w:val="0"/>
+          <w:sz w:val="26"/>
+        </w:rPr>
+        <w:t xml:space="preserve">[17] A. Maier, A. Sharp, Y. Vagapov, "Comparative analysis and practical implementation of the ESP32 microcontroller module for the internet of things", in </w:t>
+      </w:r>
+      <w:r>
+        <w:rPr>
+          <w:rFonts w:ascii="Times New Roman" w:hAnsi="Times New Roman" w:cs="Times New Roman"/>
+          <w:b w:val="0"/>
+          <w:i/>
+          <w:sz w:val="26"/>
+        </w:rPr>
+        <w:t>Proc. 7th IEEE Int. Conf. on Internet Technologies and Applications (ITA)</w:t>
+      </w:r>
+      <w:r>
+        <w:rPr>
+          <w:rFonts w:ascii="Times New Roman" w:hAnsi="Times New Roman" w:cs="Times New Roman"/>
+          <w:b w:val="0"/>
+          <w:i w:val="0"/>
+          <w:sz w:val="26"/>
+        </w:rPr>
+        <w:t>, 2017, pp. 143–148.</w:t>
+      </w:r>
+    </w:p>
+    <w:p>
+      <w:pPr>
+        <w:jc w:val="both"/>
+      </w:pPr>
+      <w:r>
+        <w:rPr>
+          <w:rFonts w:ascii="Times New Roman" w:hAnsi="Times New Roman" w:cs="Times New Roman"/>
+          <w:b/>
+          <w:i w:val="0"/>
+          <w:sz w:val="26"/>
+        </w:rPr>
+        <w:t>Chuẩn giao tiếp, vi điều khiển và linh kiện:</w:t>
+      </w:r>
+    </w:p>
+    <w:p>
+      <w:pPr>
+        <w:jc w:val="both"/>
+      </w:pPr>
+      <w:r>
+        <w:rPr>
+          <w:rFonts w:ascii="Times New Roman" w:hAnsi="Times New Roman" w:cs="Times New Roman"/>
+          <w:b w:val="0"/>
+          <w:i w:val="0"/>
+          <w:sz w:val="26"/>
+        </w:rPr>
+        <w:t xml:space="preserve">[18] Espressif Systems, </w:t>
+      </w:r>
+      <w:r>
+        <w:rPr>
+          <w:rFonts w:ascii="Times New Roman" w:hAnsi="Times New Roman" w:cs="Times New Roman"/>
+          <w:b w:val="0"/>
+          <w:i/>
+          <w:sz w:val="26"/>
+        </w:rPr>
+        <w:t>ESP32 Technical Reference Manual</w:t>
+      </w:r>
+      <w:r>
+        <w:rPr>
+          <w:rFonts w:ascii="Times New Roman" w:hAnsi="Times New Roman" w:cs="Times New Roman"/>
+          <w:b w:val="0"/>
+          <w:i w:val="0"/>
+          <w:sz w:val="26"/>
+        </w:rPr>
+        <w:t>, v5.x, 2023. [Online]. https://www.espressif.com/sites/default/files/documentation/esp32_technical_reference_manual_en.pdf</w:t>
+      </w:r>
+    </w:p>
+    <w:p>
+      <w:pPr>
+        <w:jc w:val="both"/>
+      </w:pPr>
+      <w:r>
+        <w:rPr>
+          <w:rFonts w:ascii="Times New Roman" w:hAnsi="Times New Roman" w:cs="Times New Roman"/>
+          <w:b w:val="0"/>
+          <w:i w:val="0"/>
+          <w:sz w:val="26"/>
+        </w:rPr>
+        <w:t xml:space="preserve">[19] NXP Semiconductors, </w:t>
+      </w:r>
+      <w:r>
+        <w:rPr>
+          <w:rFonts w:ascii="Times New Roman" w:hAnsi="Times New Roman" w:cs="Times New Roman"/>
+          <w:b w:val="0"/>
+          <w:i/>
+          <w:sz w:val="26"/>
+        </w:rPr>
+        <w:t>I2C-bus Specification and User Manual</w:t>
+      </w:r>
+      <w:r>
+        <w:rPr>
+          <w:rFonts w:ascii="Times New Roman" w:hAnsi="Times New Roman" w:cs="Times New Roman"/>
+          <w:b w:val="0"/>
+          <w:i w:val="0"/>
+          <w:sz w:val="26"/>
+        </w:rPr>
+        <w:t xml:space="preserve"> (UM10204), Rev. 7.0, 2021.</w:t>
+      </w:r>
+    </w:p>
+    <w:p>
+      <w:pPr>
+        <w:jc w:val="both"/>
+      </w:pPr>
+      <w:r>
+        <w:rPr>
+          <w:rFonts w:ascii="Times New Roman" w:hAnsi="Times New Roman" w:cs="Times New Roman"/>
+          <w:b w:val="0"/>
+          <w:i w:val="0"/>
+          <w:sz w:val="26"/>
+        </w:rPr>
+        <w:t xml:space="preserve">[20] D. W. Hart, </w:t>
+      </w:r>
+      <w:r>
+        <w:rPr>
+          <w:rFonts w:ascii="Times New Roman" w:hAnsi="Times New Roman" w:cs="Times New Roman"/>
+          <w:b w:val="0"/>
+          <w:i/>
+          <w:sz w:val="26"/>
+        </w:rPr>
+        <w:t>Power Electronics</w:t>
+      </w:r>
+      <w:r>
+        <w:rPr>
+          <w:rFonts w:ascii="Times New Roman" w:hAnsi="Times New Roman" w:cs="Times New Roman"/>
+          <w:b w:val="0"/>
+          <w:i w:val="0"/>
+          <w:sz w:val="26"/>
+        </w:rPr>
+        <w:t>, McGraw-Hill, 2011 (chương về điều chế độ rộng xung PWM).</w:t>
+      </w:r>
+    </w:p>
+    <w:p>
+      <w:pPr>
+        <w:jc w:val="both"/>
+      </w:pPr>
+      <w:r>
+        <w:rPr>
+          <w:rFonts w:ascii="Times New Roman" w:hAnsi="Times New Roman" w:cs="Times New Roman"/>
+          <w:b w:val="0"/>
+          <w:i w:val="0"/>
+          <w:sz w:val="26"/>
+        </w:rPr>
+        <w:t xml:space="preserve">[21] Texas Instruments, </w:t>
+      </w:r>
+      <w:r>
+        <w:rPr>
+          <w:rFonts w:ascii="Times New Roman" w:hAnsi="Times New Roman" w:cs="Times New Roman"/>
+          <w:b w:val="0"/>
+          <w:i/>
+          <w:sz w:val="26"/>
+        </w:rPr>
+        <w:t>LMx93, LM2903 Differential Comparators Datasheet</w:t>
+      </w:r>
+      <w:r>
+        <w:rPr>
+          <w:rFonts w:ascii="Times New Roman" w:hAnsi="Times New Roman" w:cs="Times New Roman"/>
+          <w:b w:val="0"/>
+          <w:i w:val="0"/>
+          <w:sz w:val="26"/>
+        </w:rPr>
+        <w:t>, 2022. [Online]. https://www.ti.com/lit/ds/symlink/lm393.pdf</w:t>
+      </w:r>
+    </w:p>
+    <w:p>
+      <w:pPr>
+        <w:jc w:val="both"/>
+      </w:pPr>
+      <w:r>
+        <w:rPr>
+          <w:rFonts w:ascii="Times New Roman" w:hAnsi="Times New Roman" w:cs="Times New Roman"/>
+          <w:b w:val="0"/>
+          <w:i w:val="0"/>
+          <w:sz w:val="26"/>
+        </w:rPr>
+        <w:t xml:space="preserve">[22] IEEE, </w:t>
+      </w:r>
+      <w:r>
+        <w:rPr>
+          <w:rFonts w:ascii="Times New Roman" w:hAnsi="Times New Roman" w:cs="Times New Roman"/>
+          <w:b w:val="0"/>
+          <w:i/>
+          <w:sz w:val="26"/>
+        </w:rPr>
+        <w:t>IEEE Std 802.11-2020 — Wireless LAN Medium Access Control (MAC) and Physical Layer (PHY) Specifications</w:t>
+      </w:r>
+      <w:r>
+        <w:rPr>
+          <w:rFonts w:ascii="Times New Roman" w:hAnsi="Times New Roman" w:cs="Times New Roman"/>
+          <w:b w:val="0"/>
+          <w:i w:val="0"/>
+          <w:sz w:val="26"/>
+        </w:rPr>
+        <w:t>, 2021.</w:t>
+      </w:r>
+    </w:p>
+    <w:p>
+      <w:pPr>
+        <w:jc w:val="both"/>
+      </w:pPr>
+      <w:r>
+        <w:rPr>
+          <w:rFonts w:ascii="Times New Roman" w:hAnsi="Times New Roman" w:cs="Times New Roman"/>
+          <w:b w:val="0"/>
+          <w:i w:val="0"/>
+          <w:sz w:val="26"/>
+        </w:rPr>
+        <w:t>[23] J. Postel, "User Datagram Protocol", RFC 768, IETF, 1980. [Online]. https://www.rfc-editor.org/rfc/rfc768</w:t>
+      </w:r>
+    </w:p>
+    <w:p>
+      <w:pPr>
+        <w:jc w:val="both"/>
+      </w:pPr>
+      <w:r>
+        <w:rPr>
+          <w:rFonts w:ascii="Times New Roman" w:hAnsi="Times New Roman" w:cs="Times New Roman"/>
+          <w:b/>
+          <w:i w:val="0"/>
+          <w:sz w:val="26"/>
+        </w:rPr>
+        <w:t>Động học, định vị, hợp nhất cảm biến và tìm đường:</w:t>
+      </w:r>
+    </w:p>
+    <w:p>
+      <w:pPr>
+        <w:jc w:val="both"/>
+      </w:pPr>
+      <w:r>
+        <w:rPr>
+          <w:rFonts w:ascii="Times New Roman" w:hAnsi="Times New Roman" w:cs="Times New Roman"/>
+          <w:b w:val="0"/>
+          <w:i w:val="0"/>
+          <w:sz w:val="26"/>
+        </w:rPr>
+        <w:t xml:space="preserve">[24] G. Dudek, M. Jenkin, </w:t>
+      </w:r>
+      <w:r>
+        <w:rPr>
+          <w:rFonts w:ascii="Times New Roman" w:hAnsi="Times New Roman" w:cs="Times New Roman"/>
+          <w:b w:val="0"/>
+          <w:i/>
+          <w:sz w:val="26"/>
+        </w:rPr>
+        <w:t>Computational Principles of Mobile Robotics</w:t>
+      </w:r>
+      <w:r>
+        <w:rPr>
+          <w:rFonts w:ascii="Times New Roman" w:hAnsi="Times New Roman" w:cs="Times New Roman"/>
+          <w:b w:val="0"/>
+          <w:i w:val="0"/>
+          <w:sz w:val="26"/>
+        </w:rPr>
+        <w:t>, 2nd ed., Cambridge University Press, 2010.</w:t>
+      </w:r>
+    </w:p>
+    <w:p>
+      <w:pPr>
+        <w:jc w:val="both"/>
+      </w:pPr>
+      <w:r>
+        <w:rPr>
+          <w:rFonts w:ascii="Times New Roman" w:hAnsi="Times New Roman" w:cs="Times New Roman"/>
+          <w:b w:val="0"/>
+          <w:i w:val="0"/>
+          <w:sz w:val="26"/>
+        </w:rPr>
+        <w:t xml:space="preserve">[25] K. M. Lynch, F. C. Park, </w:t>
+      </w:r>
+      <w:r>
+        <w:rPr>
+          <w:rFonts w:ascii="Times New Roman" w:hAnsi="Times New Roman" w:cs="Times New Roman"/>
+          <w:b w:val="0"/>
+          <w:i/>
+          <w:sz w:val="26"/>
+        </w:rPr>
+        <w:t>Modern Robotics: Mechanics, Planning, and Control</w:t>
+      </w:r>
+      <w:r>
+        <w:rPr>
+          <w:rFonts w:ascii="Times New Roman" w:hAnsi="Times New Roman" w:cs="Times New Roman"/>
+          <w:b w:val="0"/>
+          <w:i w:val="0"/>
+          <w:sz w:val="26"/>
+        </w:rPr>
+        <w:t>, Cambridge University Press, 2017.</w:t>
+      </w:r>
+    </w:p>
+    <w:p>
+      <w:pPr>
+        <w:jc w:val="both"/>
+      </w:pPr>
+      <w:r>
+        <w:rPr>
+          <w:rFonts w:ascii="Times New Roman" w:hAnsi="Times New Roman" w:cs="Times New Roman"/>
+          <w:b w:val="0"/>
+          <w:i w:val="0"/>
+          <w:sz w:val="26"/>
+        </w:rPr>
+        <w:t xml:space="preserve">[26] R. E. Kalman, "A New Approach to Linear Filtering and Prediction Problems", </w:t>
+      </w:r>
+      <w:r>
+        <w:rPr>
+          <w:rFonts w:ascii="Times New Roman" w:hAnsi="Times New Roman" w:cs="Times New Roman"/>
+          <w:b w:val="0"/>
+          <w:i/>
+          <w:sz w:val="26"/>
+        </w:rPr>
+        <w:t>Journal of Basic Engineering</w:t>
+      </w:r>
+      <w:r>
+        <w:rPr>
+          <w:rFonts w:ascii="Times New Roman" w:hAnsi="Times New Roman" w:cs="Times New Roman"/>
+          <w:b w:val="0"/>
+          <w:i w:val="0"/>
+          <w:sz w:val="26"/>
+        </w:rPr>
+        <w:t>, vol. 82, no. 1, pp. 35–45, 1960.</w:t>
+      </w:r>
+    </w:p>
+    <w:p>
+      <w:pPr>
+        <w:jc w:val="both"/>
+      </w:pPr>
+      <w:r>
+        <w:rPr>
+          <w:rFonts w:ascii="Times New Roman" w:hAnsi="Times New Roman" w:cs="Times New Roman"/>
+          <w:b w:val="0"/>
+          <w:i w:val="0"/>
+          <w:sz w:val="26"/>
+        </w:rPr>
+        <w:t xml:space="preserve">[27] G. Welch, G. Bishop, </w:t>
+      </w:r>
+      <w:r>
+        <w:rPr>
+          <w:rFonts w:ascii="Times New Roman" w:hAnsi="Times New Roman" w:cs="Times New Roman"/>
+          <w:b w:val="0"/>
+          <w:i/>
+          <w:sz w:val="26"/>
+        </w:rPr>
+        <w:t>An Introduction to the Kalman Filter</w:t>
+      </w:r>
+      <w:r>
+        <w:rPr>
+          <w:rFonts w:ascii="Times New Roman" w:hAnsi="Times New Roman" w:cs="Times New Roman"/>
+          <w:b w:val="0"/>
+          <w:i w:val="0"/>
+          <w:sz w:val="26"/>
+        </w:rPr>
+        <w:t>, Technical Report TR 95-041, University of North Carolina at Chapel Hill, 2006.</w:t>
+      </w:r>
+    </w:p>
+    <w:p>
+      <w:pPr>
+        <w:jc w:val="both"/>
+      </w:pPr>
+      <w:r>
+        <w:rPr>
+          <w:rFonts w:ascii="Times New Roman" w:hAnsi="Times New Roman" w:cs="Times New Roman"/>
+          <w:b w:val="0"/>
+          <w:i w:val="0"/>
+          <w:sz w:val="26"/>
+        </w:rPr>
+        <w:t xml:space="preserve">[28] S. J. Russell, P. Norvig, </w:t>
+      </w:r>
+      <w:r>
+        <w:rPr>
+          <w:rFonts w:ascii="Times New Roman" w:hAnsi="Times New Roman" w:cs="Times New Roman"/>
+          <w:b w:val="0"/>
+          <w:i/>
+          <w:sz w:val="26"/>
+        </w:rPr>
+        <w:t>Artificial Intelligence: A Modern Approach</w:t>
+      </w:r>
+      <w:r>
+        <w:rPr>
+          <w:rFonts w:ascii="Times New Roman" w:hAnsi="Times New Roman" w:cs="Times New Roman"/>
+          <w:b w:val="0"/>
+          <w:i w:val="0"/>
+          <w:sz w:val="26"/>
+        </w:rPr>
+        <w:t>, 4th ed., Pearson, 2021 (chương tìm kiếm heuristic, A*).</w:t>
+      </w:r>
+    </w:p>
+    <w:p>
+      <w:pPr>
+        <w:jc w:val="both"/>
+      </w:pPr>
+      <w:r>
+        <w:rPr>
+          <w:rFonts w:ascii="Times New Roman" w:hAnsi="Times New Roman" w:cs="Times New Roman"/>
+          <w:b w:val="0"/>
+          <w:i w:val="0"/>
+          <w:sz w:val="26"/>
+        </w:rPr>
+        <w:t>[29] S. Koenig, M. Likhachev, "D</w:t>
+      </w:r>
+      <w:r>
+        <w:rPr>
+          <w:rFonts w:ascii="Times New Roman" w:hAnsi="Times New Roman" w:cs="Times New Roman"/>
+          <w:b w:val="0"/>
+          <w:i/>
+          <w:sz w:val="26"/>
+        </w:rPr>
+        <w:t xml:space="preserve"> Lite", in </w:t>
+      </w:r>
+      <w:r>
+        <w:rPr>
+          <w:rFonts w:ascii="Times New Roman" w:hAnsi="Times New Roman" w:cs="Times New Roman"/>
+          <w:b w:val="0"/>
+          <w:i w:val="0"/>
+          <w:sz w:val="26"/>
+        </w:rPr>
+        <w:t>Proc. AAAI Conf. on Artificial Intelligence*, 2002, pp. 476–483.</w:t>
+      </w:r>
+    </w:p>
+    <w:p>
+      <w:pPr>
+        <w:jc w:val="both"/>
+      </w:pPr>
+      <w:r>
+        <w:rPr>
+          <w:rFonts w:ascii="Times New Roman" w:hAnsi="Times New Roman" w:cs="Times New Roman"/>
+          <w:b w:val="0"/>
+          <w:i w:val="0"/>
+          <w:sz w:val="26"/>
+        </w:rPr>
+        <w:t xml:space="preserve">[30] P. Corke, </w:t>
+      </w:r>
+      <w:r>
+        <w:rPr>
+          <w:rFonts w:ascii="Times New Roman" w:hAnsi="Times New Roman" w:cs="Times New Roman"/>
+          <w:b w:val="0"/>
+          <w:i/>
+          <w:sz w:val="26"/>
+        </w:rPr>
+        <w:t>Robotics, Vision and Control: Fundamental Algorithms in MATLAB</w:t>
+      </w:r>
+      <w:r>
+        <w:rPr>
+          <w:rFonts w:ascii="Times New Roman" w:hAnsi="Times New Roman" w:cs="Times New Roman"/>
+          <w:b w:val="0"/>
+          <w:i w:val="0"/>
+          <w:sz w:val="26"/>
+        </w:rPr>
+        <w:t>, 2nd ed., Springer, 2017.</w:t>
+      </w:r>
+    </w:p>
+    <w:p>
+      <w:pPr>
+        <w:jc w:val="both"/>
+      </w:pPr>
+      <w:r>
+        <w:rPr>
+          <w:rFonts w:ascii="Times New Roman" w:hAnsi="Times New Roman" w:cs="Times New Roman"/>
+          <w:b/>
+          <w:i w:val="0"/>
+          <w:sz w:val="26"/>
+        </w:rPr>
+        <w:t>Công cụ và nền tảng phát triển:</w:t>
+      </w:r>
+    </w:p>
+    <w:p>
+      <w:pPr>
+        <w:jc w:val="both"/>
+      </w:pPr>
+      <w:r>
+        <w:rPr>
+          <w:rFonts w:ascii="Times New Roman" w:hAnsi="Times New Roman" w:cs="Times New Roman"/>
+          <w:b w:val="0"/>
+          <w:i w:val="0"/>
+          <w:sz w:val="26"/>
+        </w:rPr>
+        <w:t xml:space="preserve">[31] PlatformIO Labs, </w:t>
+      </w:r>
+      <w:r>
+        <w:rPr>
+          <w:rFonts w:ascii="Times New Roman" w:hAnsi="Times New Roman" w:cs="Times New Roman"/>
+          <w:b w:val="0"/>
+          <w:i/>
+          <w:sz w:val="26"/>
+        </w:rPr>
+        <w:t>PlatformIO Documentation</w:t>
+      </w:r>
+      <w:r>
+        <w:rPr>
+          <w:rFonts w:ascii="Times New Roman" w:hAnsi="Times New Roman" w:cs="Times New Roman"/>
+          <w:b w:val="0"/>
+          <w:i w:val="0"/>
+          <w:sz w:val="26"/>
+        </w:rPr>
+        <w:t>. [Online]. https://docs.platformio.org/</w:t>
+      </w:r>
+    </w:p>
+    <w:p>
+      <w:pPr>
+        <w:jc w:val="both"/>
+      </w:pPr>
+      <w:r>
+        <w:rPr>
+          <w:rFonts w:ascii="Times New Roman" w:hAnsi="Times New Roman" w:cs="Times New Roman"/>
+          <w:b w:val="0"/>
+          <w:i w:val="0"/>
+          <w:sz w:val="26"/>
+        </w:rPr>
+        <w:t xml:space="preserve">[32] Espressif Systems, </w:t>
+      </w:r>
+      <w:r>
+        <w:rPr>
+          <w:rFonts w:ascii="Times New Roman" w:hAnsi="Times New Roman" w:cs="Times New Roman"/>
+          <w:b w:val="0"/>
+          <w:i/>
+          <w:sz w:val="26"/>
+        </w:rPr>
+        <w:t>Non-Volatile Storage (NVS) Library — ESP-IDF Programming Guide</w:t>
+      </w:r>
+      <w:r>
+        <w:rPr>
+          <w:rFonts w:ascii="Times New Roman" w:hAnsi="Times New Roman" w:cs="Times New Roman"/>
+          <w:b w:val="0"/>
+          <w:i w:val="0"/>
+          <w:sz w:val="26"/>
+        </w:rPr>
+        <w:t>. [Online]. https://docs.espressif.com/projects/esp-idf/en/latest/esp32/api-reference/storage/nvs_flash.html</w:t>
       </w:r>
     </w:p>
     <w:p>

</xml_diff>

<commit_message>
report: viet lai muc 1.2 muc tieu cu the thanh gach dau dong ket qua du kien (tach phan cung/phan mem) + rebuild
</commit_message>
<xml_diff>
--- a/docs/bao-cao-xe-tu-hanh.docx
+++ b/docs/bao-cao-xe-tu-hanh.docx
@@ -5627,7 +5627,21 @@
           <w:i w:val="0"/>
           <w:sz w:val="26"/>
         </w:rPr>
-        <w:t>Mục tiêu cụ thể:</w:t>
+        <w:t>Mục tiêu cụ thể — các kết quả dự kiến đạt được:</w:t>
+      </w:r>
+    </w:p>
+    <w:p>
+      <w:pPr>
+        <w:jc w:val="both"/>
+      </w:pPr>
+      <w:r>
+        <w:rPr>
+          <w:rFonts w:ascii="Times New Roman" w:hAnsi="Times New Roman" w:cs="Times New Roman"/>
+          <w:b w:val="0"/>
+          <w:i/>
+          <w:sz w:val="26"/>
+        </w:rPr>
+        <w:t>Về phần cứng:</w:t>
       </w:r>
     </w:p>
     <w:p>
@@ -5642,7 +5656,43 @@
           <w:i w:val="0"/>
           <w:sz w:val="26"/>
         </w:rPr>
-        <w:t>Nghiên cứu và lựa chọn phần cứng phù hợp: vi điều khiển, mạch lái động cơ, encoder, cảm biến quán tính, cảm biến khoảng cách.</w:t>
+        <w:t xml:space="preserve">Hoàn thiện cơ khí xe robot </w:t>
+      </w:r>
+      <w:r>
+        <w:rPr>
+          <w:rFonts w:ascii="Times New Roman" w:hAnsi="Times New Roman" w:cs="Times New Roman"/>
+          <w:b/>
+          <w:i w:val="0"/>
+          <w:sz w:val="26"/>
+        </w:rPr>
+        <w:t>hai bánh vi sai</w:t>
+      </w:r>
+      <w:r>
+        <w:rPr>
+          <w:rFonts w:ascii="Times New Roman" w:hAnsi="Times New Roman" w:cs="Times New Roman"/>
+          <w:b w:val="0"/>
+          <w:i w:val="0"/>
+          <w:sz w:val="26"/>
+        </w:rPr>
+        <w:t xml:space="preserve">: khung xe, hai động cơ DC giảm tốc gắn </w:t>
+      </w:r>
+      <w:r>
+        <w:rPr>
+          <w:rFonts w:ascii="Times New Roman" w:hAnsi="Times New Roman" w:cs="Times New Roman"/>
+          <w:b/>
+          <w:i w:val="0"/>
+          <w:sz w:val="26"/>
+        </w:rPr>
+        <w:t>encoder quang</w:t>
+      </w:r>
+      <w:r>
+        <w:rPr>
+          <w:rFonts w:ascii="Times New Roman" w:hAnsi="Times New Roman" w:cs="Times New Roman"/>
+          <w:b w:val="0"/>
+          <w:i w:val="0"/>
+          <w:sz w:val="26"/>
+        </w:rPr>
+        <w:t>, bánh đa hướng đỡ phía sau.</w:t>
       </w:r>
     </w:p>
     <w:p>
@@ -5657,7 +5707,97 @@
           <w:i w:val="0"/>
           <w:sz w:val="26"/>
         </w:rPr>
-        <w:t>Xây dựng firmware ESP32 module hóa: điều khiển động cơ, đọc encoder/IMU/siêu âm, ước lượng odometry, máy trạng thái điều hướng giữa các node.</w:t>
+        <w:t xml:space="preserve">Lắp và đấu nối khối điện tử quanh </w:t>
+      </w:r>
+      <w:r>
+        <w:rPr>
+          <w:rFonts w:ascii="Times New Roman" w:hAnsi="Times New Roman" w:cs="Times New Roman"/>
+          <w:b/>
+          <w:i w:val="0"/>
+          <w:sz w:val="26"/>
+        </w:rPr>
+        <w:t>ESP32</w:t>
+      </w:r>
+      <w:r>
+        <w:rPr>
+          <w:rFonts w:ascii="Times New Roman" w:hAnsi="Times New Roman" w:cs="Times New Roman"/>
+          <w:b w:val="0"/>
+          <w:i w:val="0"/>
+          <w:sz w:val="26"/>
+        </w:rPr>
+        <w:t xml:space="preserve">: mạch lái </w:t>
+      </w:r>
+      <w:r>
+        <w:rPr>
+          <w:rFonts w:ascii="Times New Roman" w:hAnsi="Times New Roman" w:cs="Times New Roman"/>
+          <w:b/>
+          <w:i w:val="0"/>
+          <w:sz w:val="26"/>
+        </w:rPr>
+        <w:t>L298N</w:t>
+      </w:r>
+      <w:r>
+        <w:rPr>
+          <w:rFonts w:ascii="Times New Roman" w:hAnsi="Times New Roman" w:cs="Times New Roman"/>
+          <w:b w:val="0"/>
+          <w:i w:val="0"/>
+          <w:sz w:val="26"/>
+        </w:rPr>
+        <w:t xml:space="preserve"> + 2 động cơ, </w:t>
+      </w:r>
+      <w:r>
+        <w:rPr>
+          <w:rFonts w:ascii="Times New Roman" w:hAnsi="Times New Roman" w:cs="Times New Roman"/>
+          <w:b/>
+          <w:i w:val="0"/>
+          <w:sz w:val="26"/>
+        </w:rPr>
+        <w:t>IMU MPU-6050</w:t>
+      </w:r>
+      <w:r>
+        <w:rPr>
+          <w:rFonts w:ascii="Times New Roman" w:hAnsi="Times New Roman" w:cs="Times New Roman"/>
+          <w:b w:val="0"/>
+          <w:i w:val="0"/>
+          <w:sz w:val="26"/>
+        </w:rPr>
+        <w:t xml:space="preserve"> (I2C), </w:t>
+      </w:r>
+      <w:r>
+        <w:rPr>
+          <w:rFonts w:ascii="Times New Roman" w:hAnsi="Times New Roman" w:cs="Times New Roman"/>
+          <w:b/>
+          <w:i w:val="0"/>
+          <w:sz w:val="26"/>
+        </w:rPr>
+        <w:t>HC-SR04</w:t>
+      </w:r>
+      <w:r>
+        <w:rPr>
+          <w:rFonts w:ascii="Times New Roman" w:hAnsi="Times New Roman" w:cs="Times New Roman"/>
+          <w:b w:val="0"/>
+          <w:i w:val="0"/>
+          <w:sz w:val="26"/>
+        </w:rPr>
+        <w:t xml:space="preserve"> gắn trên </w:t>
+      </w:r>
+      <w:r>
+        <w:rPr>
+          <w:rFonts w:ascii="Times New Roman" w:hAnsi="Times New Roman" w:cs="Times New Roman"/>
+          <w:b/>
+          <w:i w:val="0"/>
+          <w:sz w:val="26"/>
+        </w:rPr>
+        <w:t>servo quét</w:t>
+      </w:r>
+      <w:r>
+        <w:rPr>
+          <w:rFonts w:ascii="Times New Roman" w:hAnsi="Times New Roman" w:cs="Times New Roman"/>
+          <w:b w:val="0"/>
+          <w:i w:val="0"/>
+          <w:sz w:val="26"/>
+        </w:rPr>
+        <w:t>, buzzer; cấp nguồn pin qua module ổn áp.</w:t>
       </w:r>
     </w:p>
     <w:p>
@@ -5672,7 +5812,39 @@
           <w:i w:val="0"/>
           <w:sz w:val="26"/>
         </w:rPr>
-        <w:t>Xây dựng ứng dụng di động (Flutter) hiển thị bản đồ, tính đường đi bằng A*, gửi lộ trình và hiển thị vị trí xe theo thời gian thực.</w:t>
+        <w:t xml:space="preserve">Đi dây và bố trí </w:t>
+      </w:r>
+      <w:r>
+        <w:rPr>
+          <w:rFonts w:ascii="Times New Roman" w:hAnsi="Times New Roman" w:cs="Times New Roman"/>
+          <w:b/>
+          <w:i w:val="0"/>
+          <w:sz w:val="26"/>
+        </w:rPr>
+        <w:t>chống nhiễu</w:t>
+      </w:r>
+      <w:r>
+        <w:rPr>
+          <w:rFonts w:ascii="Times New Roman" w:hAnsi="Times New Roman" w:cs="Times New Roman"/>
+          <w:b w:val="0"/>
+          <w:i w:val="0"/>
+          <w:sz w:val="26"/>
+        </w:rPr>
+        <w:t xml:space="preserve"> (tách dây tín hiệu/động lực, nối chung mass) để hệ thống chạy ổn định.</w:t>
+      </w:r>
+    </w:p>
+    <w:p>
+      <w:pPr>
+        <w:jc w:val="both"/>
+      </w:pPr>
+      <w:r>
+        <w:rPr>
+          <w:rFonts w:ascii="Times New Roman" w:hAnsi="Times New Roman" w:cs="Times New Roman"/>
+          <w:b w:val="0"/>
+          <w:i/>
+          <w:sz w:val="26"/>
+        </w:rPr>
+        <w:t>Về phần mềm:</w:t>
       </w:r>
     </w:p>
     <w:p>
@@ -5683,11 +5855,56 @@
       <w:r>
         <w:rPr>
           <w:rFonts w:ascii="Times New Roman" w:hAnsi="Times New Roman" w:cs="Times New Roman"/>
-          <w:b w:val="0"/>
-          <w:i w:val="0"/>
-          <w:sz w:val="26"/>
-        </w:rPr>
-        <w:t>Thiết kế giao thức truyền thông UDP độ trễ thấp giữa app và ESP32.</w:t>
+          <w:b/>
+          <w:i w:val="0"/>
+          <w:sz w:val="26"/>
+        </w:rPr>
+        <w:t>Firmware ESP32 module hóa</w:t>
+      </w:r>
+      <w:r>
+        <w:rPr>
+          <w:rFonts w:ascii="Times New Roman" w:hAnsi="Times New Roman" w:cs="Times New Roman"/>
+          <w:b w:val="0"/>
+          <w:i w:val="0"/>
+          <w:sz w:val="26"/>
+        </w:rPr>
+        <w:t xml:space="preserve">: điều khiển động cơ (PWM/cầu H), đọc encoder bằng ngắt, đọc IMU + siêu âm, ước lượng </w:t>
+      </w:r>
+      <w:r>
+        <w:rPr>
+          <w:rFonts w:ascii="Times New Roman" w:hAnsi="Times New Roman" w:cs="Times New Roman"/>
+          <w:b/>
+          <w:i w:val="0"/>
+          <w:sz w:val="26"/>
+        </w:rPr>
+        <w:t>odometry vi sai</w:t>
+      </w:r>
+      <w:r>
+        <w:rPr>
+          <w:rFonts w:ascii="Times New Roman" w:hAnsi="Times New Roman" w:cs="Times New Roman"/>
+          <w:b w:val="0"/>
+          <w:i w:val="0"/>
+          <w:sz w:val="26"/>
+        </w:rPr>
+        <w:t xml:space="preserve"> kết hợp </w:t>
+      </w:r>
+      <w:r>
+        <w:rPr>
+          <w:rFonts w:ascii="Times New Roman" w:hAnsi="Times New Roman" w:cs="Times New Roman"/>
+          <w:b/>
+          <w:i w:val="0"/>
+          <w:sz w:val="26"/>
+        </w:rPr>
+        <w:t>bộ lọc bù</w:t>
+      </w:r>
+      <w:r>
+        <w:rPr>
+          <w:rFonts w:ascii="Times New Roman" w:hAnsi="Times New Roman" w:cs="Times New Roman"/>
+          <w:b w:val="0"/>
+          <w:i w:val="0"/>
+          <w:sz w:val="26"/>
+        </w:rPr>
+        <w:t xml:space="preserve"> IMU.</w:t>
       </w:r>
     </w:p>
     <w:p>
@@ -5698,11 +5915,146 @@
       <w:r>
         <w:rPr>
           <w:rFonts w:ascii="Times New Roman" w:hAnsi="Times New Roman" w:cs="Times New Roman"/>
-          <w:b w:val="0"/>
-          <w:i w:val="0"/>
-          <w:sz w:val="26"/>
-        </w:rPr>
-        <w:t>Tích hợp cơ chế tự hiệu chuẩn để giảm sai số định vị, đảm bảo hệ thống hoạt động ổn định, chính xác trong phạm vi cho phép.</w:t>
+          <w:b/>
+          <w:i w:val="0"/>
+          <w:sz w:val="26"/>
+        </w:rPr>
+        <w:t>Máy trạng thái điều hướng node</w:t>
+      </w:r>
+      <w:r>
+        <w:rPr>
+          <w:rFonts w:ascii="Times New Roman" w:hAnsi="Times New Roman" w:cs="Times New Roman"/>
+          <w:b w:val="0"/>
+          <w:i w:val="0"/>
+          <w:sz w:val="26"/>
+        </w:rPr>
+        <w:t xml:space="preserve">: tự xoay đúng hướng và đi thẳng đúng quãng đường giữa các node, có giữ hướng + cân bằng hai bánh; </w:t>
+      </w:r>
+      <w:r>
+        <w:rPr>
+          <w:rFonts w:ascii="Times New Roman" w:hAnsi="Times New Roman" w:cs="Times New Roman"/>
+          <w:b/>
+          <w:i w:val="0"/>
+          <w:sz w:val="26"/>
+        </w:rPr>
+        <w:t>tự hiệu chuẩn</w:t>
+      </w:r>
+      <w:r>
+        <w:rPr>
+          <w:rFonts w:ascii="Times New Roman" w:hAnsi="Times New Roman" w:cs="Times New Roman"/>
+          <w:b w:val="0"/>
+          <w:i w:val="0"/>
+          <w:sz w:val="26"/>
+        </w:rPr>
+        <w:t xml:space="preserve"> (cân bằng động cơ, tỉ lệ encoder) lưu qua các lần khởi động.</w:t>
+      </w:r>
+    </w:p>
+    <w:p>
+      <w:pPr>
+        <w:pStyle w:val="ListBullet"/>
+        <w:ind w:left="425"/>
+      </w:pPr>
+      <w:r>
+        <w:rPr>
+          <w:rFonts w:ascii="Times New Roman" w:hAnsi="Times New Roman" w:cs="Times New Roman"/>
+          <w:b/>
+          <w:i w:val="0"/>
+          <w:sz w:val="26"/>
+        </w:rPr>
+        <w:t>Né vật cản</w:t>
+      </w:r>
+      <w:r>
+        <w:rPr>
+          <w:rFonts w:ascii="Times New Roman" w:hAnsi="Times New Roman" w:cs="Times New Roman"/>
+          <w:b w:val="0"/>
+          <w:i w:val="0"/>
+          <w:sz w:val="26"/>
+        </w:rPr>
+        <w:t>: chế độ tự hành (siêu âm + servo quét, tự rẽ tránh) và né vật cản động khi bám lộ trình (chặn cạnh trên bản đồ + tính lại đường bằng A*).</w:t>
+      </w:r>
+    </w:p>
+    <w:p>
+      <w:pPr>
+        <w:pStyle w:val="ListBullet"/>
+        <w:ind w:left="425"/>
+      </w:pPr>
+      <w:r>
+        <w:rPr>
+          <w:rFonts w:ascii="Times New Roman" w:hAnsi="Times New Roman" w:cs="Times New Roman"/>
+          <w:b/>
+          <w:i w:val="0"/>
+          <w:sz w:val="26"/>
+        </w:rPr>
+        <w:t>Ứng dụng di động Flutter</w:t>
+      </w:r>
+      <w:r>
+        <w:rPr>
+          <w:rFonts w:ascii="Times New Roman" w:hAnsi="Times New Roman" w:cs="Times New Roman"/>
+          <w:b w:val="0"/>
+          <w:i w:val="0"/>
+          <w:sz w:val="26"/>
+        </w:rPr>
+        <w:t xml:space="preserve">: hiển thị bản đồ lưới waypoint, tính đường đi ngắn nhất bằng </w:t>
+      </w:r>
+      <w:r>
+        <w:rPr>
+          <w:rFonts w:ascii="Times New Roman" w:hAnsi="Times New Roman" w:cs="Times New Roman"/>
+          <w:b/>
+          <w:i w:val="0"/>
+          <w:sz w:val="26"/>
+        </w:rPr>
+        <w:t>A</w:t>
+      </w:r>
+      <w:r>
+        <w:rPr>
+          <w:rFonts w:ascii="Times New Roman" w:hAnsi="Times New Roman" w:cs="Times New Roman"/>
+          <w:b w:val="0"/>
+          <w:i/>
+          <w:sz w:val="26"/>
+        </w:rPr>
+        <w:t xml:space="preserve">, gửi lộ trình và hiển thị vị trí xe + trạng thái theo thời gian thực; có chế độ </w:t>
+      </w:r>
+      <w:r>
+        <w:rPr>
+          <w:rFonts w:ascii="Times New Roman" w:hAnsi="Times New Roman" w:cs="Times New Roman"/>
+          <w:b w:val="0"/>
+          <w:i/>
+          <w:sz w:val="26"/>
+        </w:rPr>
+        <w:t>giả lập</w:t>
+      </w:r>
+      <w:r>
+        <w:rPr>
+          <w:rFonts w:ascii="Times New Roman" w:hAnsi="Times New Roman" w:cs="Times New Roman"/>
+          <w:b w:val="0"/>
+          <w:i w:val="0"/>
+          <w:sz w:val="26"/>
+        </w:rPr>
+        <w:t>* chạy không cần phần cứng.</w:t>
+      </w:r>
+    </w:p>
+    <w:p>
+      <w:pPr>
+        <w:pStyle w:val="ListBullet"/>
+        <w:ind w:left="425"/>
+      </w:pPr>
+      <w:r>
+        <w:rPr>
+          <w:rFonts w:ascii="Times New Roman" w:hAnsi="Times New Roman" w:cs="Times New Roman"/>
+          <w:b/>
+          <w:i w:val="0"/>
+          <w:sz w:val="26"/>
+        </w:rPr>
+        <w:t>Giao thức truyền thông UDP</w:t>
+      </w:r>
+      <w:r>
+        <w:rPr>
+          <w:rFonts w:ascii="Times New Roman" w:hAnsi="Times New Roman" w:cs="Times New Roman"/>
+          <w:b w:val="0"/>
+          <w:i w:val="0"/>
+          <w:sz w:val="26"/>
+        </w:rPr>
+        <w:t xml:space="preserve"> độ trễ thấp (lệnh + telemetry) kèm chia mảnh lộ trình và chống trùng gói.</w:t>
       </w:r>
     </w:p>
     <w:p>

</xml_diff>

<commit_message>
report: viet lai tong quan muc 1.1 thanh luoc khao co dan chung + them 7 nghien cuu lien quan [33]-[39]
- Muc 1.1 GIOI THIEU: thay phan tong quan chung bang luoc khao that su - neu ten tac gia,
  cach lam va ket qua cua tung nghien cuu, roi dan den khoang trong -> ly do chon de tai.
  * Dinh vi: hop nhat encoder-IMU bang EKF/Kalman [33][34][35], mo rong visual [36].
  * Tim duong: cai tien A* (BSGA*) [37], so sanh A* vs Dijkstra tren TurtleBot3 [38].
  * Ne vat can sieu am chi phi thap [39].
- Bo trich dan datasheet yeu ([1][3][4][5]) khoi muc 1.1 (van trich o Chuong 3).
- Them 7 cong trinh that (Crossref/arXiv) vao danh muc: tong 39 nguon, muc 1.1 trich 16.
- Doi chieu: cited [1]-[39] khop danh muc, khong treo; dinh dang IEEE giu nguyen.
- Rebuild HTML/PDF/DOCX.
</commit_message>
<xml_diff>
--- a/docs/bao-cao-xe-tu-hanh.docx
+++ b/docs/bao-cao-xe-tu-hanh.docx
@@ -5421,7 +5421,21 @@
           <w:i w:val="0"/>
           <w:sz w:val="26"/>
         </w:rPr>
-        <w:t xml:space="preserve"> (di chuyển chính xác theo lộ trình đó) [10]. Về định vị, đã có nhiều phương pháp được nghiên cứu: phương pháp tương đối (dead-reckoning) dựa trên odometry từ encoder bánh xe và cảm biến quán tính (IMU) để tích lũy quãng đường và hướng [11]; phương pháp tuyệt đối dùng GPS, mốc định vị (landmark/beacon) hoặc bản đồ biết trước; và các kỹ thuật hiện đại như định vị và dựng bản đồ đồng thời (SLAM) bằng LiDAR hoặc camera [16]. Mỗi phương pháp là một sự đánh đổi giữa độ chính xác, chi phí và độ phức tạp tính toán: odometry đơn giản, rẻ, tần số cao nhưng sai số tích lũy (trôi) theo quãng đường; SLAM chính xác và không trôi nhưng đòi hỏi cảm biến đắt tiền cùng năng lực tính toán lớn. Để giảm trôi của odometry, kỹ thuật hợp nhất cảm biến (sensor fusion) — tiêu biểu là </w:t>
+        <w:t xml:space="preserve"> (di chuyển chính xác theo lộ trình đó) [10]. Về định vị, phương pháp tương đối (dead-reckoning) dựa trên odometry từ encoder bánh xe đơn giản, rẻ và tần số cao nhưng sai số tích lũy (trôi) theo quãng đường do trượt bánh và đường kính bánh không đều [11]; phương pháp tuyệt đối dùng GPS hoặc mốc định vị (landmark/beacon), còn các kỹ thuật hiện đại như định vị và dựng bản đồ đồng thời (SLAM) bằng LiDAR/camera cho độ chính xác cao nhưng đòi hỏi cảm biến đắt tiền và năng lực tính toán lớn [16].</w:t>
+      </w:r>
+    </w:p>
+    <w:p>
+      <w:pPr>
+        <w:jc w:val="both"/>
+      </w:pPr>
+      <w:r>
+        <w:rPr>
+          <w:rFonts w:ascii="Times New Roman" w:hAnsi="Times New Roman" w:cs="Times New Roman"/>
+          <w:b w:val="0"/>
+          <w:i w:val="0"/>
+          <w:sz w:val="26"/>
+        </w:rPr>
+        <w:t xml:space="preserve">Để giảm trôi của odometry, nhiều nghiên cứu đã hợp nhất encoder với cảm biến quán tính (IMU). Al Khatib và cộng sự [33] hợp nhất nhiều cảm biến (odometry, IMU) bằng bộ lọc Kalman mở rộng (EKF), nâng cao rõ rệt độ chính xác định vị và dẫn đường so với chỉ dùng đơn cảm biến. Cùng hướng đó, Ly và cộng sự [34] hợp nhất dữ liệu IMU và encoder bằng bộ lọc Kalman cho robot di động, cho thấy vị trí ước lượng bám quỹ đạo thực sát hơn hẳn odometry thuần; Housein và cộng sự [35] trình bày một triển khai EKF thực nghiệm cho cùng bài toán. Các hướng mở rộng gần đây còn kết hợp thêm thị giác (wheel–inertial–visual) bằng biến thể bộ lọc Kalman để tăng độ bền vững [36]. Tuy nhiên, bộ lọc Kalman/EKF đòi hỏi mô hình và khối lượng tính toán đáng kể; với vi điều khiển hạn chế tài nguyên, </w:t>
       </w:r>
       <w:r>
         <w:rPr>
@@ -5439,7 +5453,7 @@
           <w:i w:val="0"/>
           <w:sz w:val="26"/>
         </w:rPr>
-        <w:t xml:space="preserve"> hoặc bộ lọc Kalman — thường được dùng để kết hợp tín hiệu con quay hồi chuyển và gia tốc kế nhằm ước lượng góc hướng ổn định hơn [14].</w:t>
+        <w:t xml:space="preserve"> là giải pháp nhẹ hơn, đủ tốt để kết hợp con quay hồi chuyển và encoder nhằm ổn định ước lượng hướng [14].</w:t>
       </w:r>
     </w:p>
     <w:p>
@@ -5471,7 +5485,61 @@
           <w:i/>
           <w:sz w:val="26"/>
         </w:rPr>
-        <w:t xml:space="preserve"> mở rộng Dijkstra bằng một hàm heuristic để hướng việc tìm kiếm về phía đích, nhờ đó giảm mạnh số nút phải duyệt mà vẫn đảm bảo tối ưu khi heuristic chấp nhận được (admissible) [6]. Bên cạnh nhóm thuật toán dựa trên đồ thị/lưới, còn có nhóm thuật toán lấy mẫu ngẫu nhiên (RRT, PRM) phù hợp cho không gian cấu hình nhiều chiều [12]. Với môi trường trong nhà đã biết trước dưới dạng lưới điểm (waypoint), A</w:t>
+        <w:t xml:space="preserve"> mở rộng Dijkstra bằng một hàm heuristic để hướng việc tìm kiếm về phía đích, nhờ đó giảm mạnh số nút phải duyệt mà vẫn đảm bảo tối ưu khi heuristic chấp nhận được (admissible) [6]. Bên cạnh nhóm dựa trên đồ thị/lưới còn có nhóm lấy mẫu ngẫu nhiên (RRT, PRM) cho không gian cấu hình nhiều chiều [12]. Trong thực tiễn robot, A</w:t>
+      </w:r>
+      <w:r>
+        <w:rPr>
+          <w:rFonts w:ascii="Times New Roman" w:hAnsi="Times New Roman" w:cs="Times New Roman"/>
+          <w:b w:val="0"/>
+          <w:i w:val="0"/>
+          <w:sz w:val="26"/>
+        </w:rPr>
+        <w:t xml:space="preserve"> vẫn là lựa chọn phổ biến và liên tục được cải tiến: Shahapur và cộng sự [38] hiện thực và so sánh A</w:t>
+      </w:r>
+      <w:r>
+        <w:rPr>
+          <w:rFonts w:ascii="Times New Roman" w:hAnsi="Times New Roman" w:cs="Times New Roman"/>
+          <w:b w:val="0"/>
+          <w:i/>
+          <w:sz w:val="26"/>
+        </w:rPr>
+        <w:t xml:space="preserve"> với Dijkstra trên robot TurtleBot3 (mô phỏng Gazebo), xác nhận A</w:t>
+      </w:r>
+      <w:r>
+        <w:rPr>
+          <w:rFonts w:ascii="Times New Roman" w:hAnsi="Times New Roman" w:cs="Times New Roman"/>
+          <w:b w:val="0"/>
+          <w:i w:val="0"/>
+          <w:sz w:val="26"/>
+        </w:rPr>
+        <w:t xml:space="preserve"> tìm được đường tối ưu với số nút duyệt ít hơn; Yao và cộng sự [37] đề xuất biến thể A</w:t>
+      </w:r>
+      <w:r>
+        <w:rPr>
+          <w:rFonts w:ascii="Times New Roman" w:hAnsi="Times New Roman" w:cs="Times New Roman"/>
+          <w:b w:val="0"/>
+          <w:i/>
+          <w:sz w:val="26"/>
+        </w:rPr>
+        <w:t xml:space="preserve"> cải tiến (BSGA</w:t>
+      </w:r>
+      <w:r>
+        <w:rPr>
+          <w:rFonts w:ascii="Times New Roman" w:hAnsi="Times New Roman" w:cs="Times New Roman"/>
+          <w:b w:val="0"/>
+          <w:i w:val="0"/>
+          <w:sz w:val="26"/>
+        </w:rPr>
+        <w:t>) cho robot vi sai nhằm khắc phục đúng các hạn chế của A</w:t>
+      </w:r>
+      <w:r>
+        <w:rPr>
+          <w:rFonts w:ascii="Times New Roman" w:hAnsi="Times New Roman" w:cs="Times New Roman"/>
+          <w:b w:val="0"/>
+          <w:i/>
+          <w:sz w:val="26"/>
+        </w:rPr>
+        <w:t xml:space="preserve"> gốc là số nút tìm kiếm lớn và đường đi kém mượt. Với môi trường trong nhà đã biết trước dưới dạng lưới điểm (waypoint), A</w:t>
       </w:r>
       <w:r>
         <w:rPr>
@@ -5494,7 +5562,7 @@
           <w:i w:val="0"/>
           <w:sz w:val="26"/>
         </w:rPr>
-        <w:t xml:space="preserve">Ở quy mô công nghiệp, robot tự hành thường được trang bị cảm biến đắt tiền (LiDAR, camera độ phân giải cao, GPS-RTK) cùng máy tính nhúng mạnh để chạy SLAM và thị giác máy tính [16]. Tuy nhiên, chi phí và độ phức tạp này là rào cản lớn đối với sinh viên và các dự án học thuật. Một hướng tiếp cận khác đang được quan tâm là xây dựng robot tự hành </w:t>
+        <w:t xml:space="preserve">Song song với định vị và tìm đường, khả năng </w:t>
       </w:r>
       <w:r>
         <w:rPr>
@@ -5503,6 +5571,24 @@
           <w:i w:val="0"/>
           <w:sz w:val="26"/>
         </w:rPr>
+        <w:t>né vật cản</w:t>
+      </w:r>
+      <w:r>
+        <w:rPr>
+          <w:rFonts w:ascii="Times New Roman" w:hAnsi="Times New Roman" w:cs="Times New Roman"/>
+          <w:b w:val="0"/>
+          <w:i w:val="0"/>
+          <w:sz w:val="26"/>
+        </w:rPr>
+        <w:t xml:space="preserve"> cũng được nghiên cứu theo hướng chi phí thấp. Yasin và cộng sự [39] đề xuất phương pháp phát hiện vật cản và tránh va chạm chỉ dùng cảm biến siêu âm giá rẻ, với mục tiêu tối thiểu hóa độ lệch khỏi lộ trình ban đầu — rất phù hợp cho robot ngân sách thấp. Ở quy mô công nghiệp, robot tự hành thường được trang bị cảm biến đắt tiền (LiDAR, camera độ phân giải cao, GPS-RTK) cùng máy tính mạnh để chạy SLAM và thị giác máy tính [16]; nhưng chi phí và độ phức tạp đó là rào cản lớn đối với sinh viên và các dự án học thuật. Vì vậy, hướng xây dựng robot tự hành </w:t>
+      </w:r>
+      <w:r>
+        <w:rPr>
+          <w:rFonts w:ascii="Times New Roman" w:hAnsi="Times New Roman" w:cs="Times New Roman"/>
+          <w:b/>
+          <w:i w:val="0"/>
+          <w:sz w:val="26"/>
+        </w:rPr>
         <w:t>chi phí thấp</w:t>
       </w:r>
       <w:r>
@@ -5512,7 +5598,7 @@
           <w:i w:val="0"/>
           <w:sz w:val="26"/>
         </w:rPr>
-        <w:t xml:space="preserve"> dựa trên vi điều khiển phổ thông. Trong số đó, ESP32 — vi điều khiển lõi kép tích hợp sẵn WiFi/Bluetooth, giá rẻ, cộng đồng hỗ trợ lớn — nổi lên như một nền tảng phù hợp cho các ứng dụng IoT và robot nhỏ [1], [17]. Kết hợp ESP32 với encoder bánh xe, IMU giá rẻ (như MPU-6050 [3]) và một điện thoại thông minh làm giao diện, hoàn toàn có thể dựng được một robot tự hành cơ bản đủ chức năng định vị – tìm đường – bám lộ trình với chi phí chỉ bằng một phần nhỏ so với hệ thống công nghiệp.</w:t>
+        <w:t xml:space="preserve"> dựa trên vi điều khiển phổ thông ngày càng được quan tâm — tiêu biểu là ESP32, vi điều khiển lõi kép tích hợp sẵn WiFi/Bluetooth, giá rẻ, cộng đồng hỗ trợ lớn, phù hợp cho các ứng dụng IoT và robot nhỏ [17].</w:t>
       </w:r>
     </w:p>
     <w:p>
@@ -5526,25 +5612,34 @@
           <w:i w:val="0"/>
           <w:sz w:val="26"/>
         </w:rPr>
-        <w:t xml:space="preserve">Từ thực trạng trên có thể thấy: robot tự hành là lĩnh vực quan trọng và đang phát triển mạnh, nhưng việc tiếp cận thực hành còn vướng rào cản về chi phí phần cứng và độ phức tạp thuật toán. Việc xây dựng một nền tảng robot tự hành </w:t>
-      </w:r>
-      <w:r>
-        <w:rPr>
-          <w:rFonts w:ascii="Times New Roman" w:hAnsi="Times New Roman" w:cs="Times New Roman"/>
-          <w:b/>
-          <w:i w:val="0"/>
-          <w:sz w:val="26"/>
-        </w:rPr>
-        <w:t>chi phí thấp, module hóa, dễ mở rộng và không phụ thuộc hạ tầng Internet</w:t>
-      </w:r>
-      <w:r>
-        <w:rPr>
-          <w:rFonts w:ascii="Times New Roman" w:hAnsi="Times New Roman" w:cs="Times New Roman"/>
-          <w:b w:val="0"/>
-          <w:i w:val="0"/>
-          <w:sz w:val="26"/>
-        </w:rPr>
-        <w:t xml:space="preserve"> vì vậy mang ý nghĩa thực tiễn rõ rệt: vừa là sản phẩm học tập giúp người thực hiện nắm vững trọn vẹn chuỗi kiến thức nền (điều khiển động cơ DC qua mạch cầu L298N [4], đọc và xử lý cảm biến siêu âm HC-SR04 [5], encoder và IMU, ước lượng odometry, lập kế hoạch đường đi, truyền thông không dây), vừa là khung sườn để phát triển tiếp các tính năng cao cấp hơn như tránh vật cản động, SLAM hay phối hợp đội hình nhiều robot.</w:t>
+        <w:t>Từ tổng quan trên có thể thấy các kỹ thuật định vị (hợp nhất encoder–IMU), tìm đường (A</w:t>
+      </w:r>
+      <w:r>
+        <w:rPr>
+          <w:rFonts w:ascii="Times New Roman" w:hAnsi="Times New Roman" w:cs="Times New Roman"/>
+          <w:b w:val="0"/>
+          <w:i/>
+          <w:sz w:val="26"/>
+        </w:rPr>
+        <w:t xml:space="preserve">) và né vật cản đều đã tương đối hoàn thiện, nhưng phần lớn được kiểm chứng trên nền tảng mạnh (PC/ROS, robot chuẩn như TurtleBot3) [38] hoặc bằng các bộ lọc tính toán nặng như EKF [33], [35]. Vẫn còn thiếu những giải pháp </w:t>
+      </w:r>
+      <w:r>
+        <w:rPr>
+          <w:rFonts w:ascii="Times New Roman" w:hAnsi="Times New Roman" w:cs="Times New Roman"/>
+          <w:b w:val="0"/>
+          <w:i/>
+          <w:sz w:val="26"/>
+        </w:rPr>
+        <w:t>tích hợp trọn vẹn</w:t>
+      </w:r>
+      <w:r>
+        <w:rPr>
+          <w:rFonts w:ascii="Times New Roman" w:hAnsi="Times New Roman" w:cs="Times New Roman"/>
+          <w:b w:val="0"/>
+          <w:i w:val="0"/>
+          <w:sz w:val="26"/>
+        </w:rPr>
+        <w:t>* cả ba chức năng định vị – tìm đường – bám lộ trình lên một vi điều khiển chi phí thấp, hoạt động độc lập không cần Internet và dễ tiếp cận cho mục đích học tập. Xây dựng một nền tảng như vậy vừa mang ý nghĩa thực tiễn — là sản phẩm học tập giúp người thực hiện nắm vững trọn vẹn chuỗi kiến thức nền (điều khiển động cơ, đọc cảm biến, định vị, lập kế hoạch đường đi, truyền thông không dây) — vừa là khung sườn để phát triển tiếp các tính năng cao cấp hơn như tránh vật cản động, SLAM hay phối hợp đội hình nhiều robot.</w:t>
       </w:r>
     </w:p>
     <w:p>
@@ -26599,6 +26694,244 @@
           <w:sz w:val="26"/>
         </w:rPr>
         <w:t>. [Online]. https://docs.espressif.com/projects/esp-idf/en/latest/esp32/api-reference/storage/nvs_flash.html</w:t>
+      </w:r>
+    </w:p>
+    <w:p>
+      <w:pPr>
+        <w:jc w:val="both"/>
+      </w:pPr>
+      <w:r>
+        <w:rPr>
+          <w:rFonts w:ascii="Times New Roman" w:hAnsi="Times New Roman" w:cs="Times New Roman"/>
+          <w:b/>
+          <w:i w:val="0"/>
+          <w:sz w:val="26"/>
+        </w:rPr>
+        <w:t>Các nghiên cứu liên quan (hợp nhất cảm biến, tìm đường, né vật cản):</w:t>
+      </w:r>
+    </w:p>
+    <w:p>
+      <w:pPr>
+        <w:jc w:val="both"/>
+      </w:pPr>
+      <w:r>
+        <w:rPr>
+          <w:rFonts w:ascii="Times New Roman" w:hAnsi="Times New Roman" w:cs="Times New Roman"/>
+          <w:b w:val="0"/>
+          <w:i w:val="0"/>
+          <w:sz w:val="26"/>
+        </w:rPr>
+        <w:t xml:space="preserve">[33] E. I. Al Khatib, M. A. Jaradat, M. Abdel-Hafez, M. Roigari, "Multiple Sensor Fusion for Mobile Robot Localization and Navigation Using the Extended Kalman Filter", in </w:t>
+      </w:r>
+      <w:r>
+        <w:rPr>
+          <w:rFonts w:ascii="Times New Roman" w:hAnsi="Times New Roman" w:cs="Times New Roman"/>
+          <w:b w:val="0"/>
+          <w:i/>
+          <w:sz w:val="26"/>
+        </w:rPr>
+        <w:t>Proc. 10th Int. Symp. on Mechatronics and its Applications (ISMA)</w:t>
+      </w:r>
+      <w:r>
+        <w:rPr>
+          <w:rFonts w:ascii="Times New Roman" w:hAnsi="Times New Roman" w:cs="Times New Roman"/>
+          <w:b w:val="0"/>
+          <w:i w:val="0"/>
+          <w:sz w:val="26"/>
+        </w:rPr>
+        <w:t>, 2015, pp. 1–5.</w:t>
+      </w:r>
+    </w:p>
+    <w:p>
+      <w:pPr>
+        <w:jc w:val="both"/>
+      </w:pPr>
+      <w:r>
+        <w:rPr>
+          <w:rFonts w:ascii="Times New Roman" w:hAnsi="Times New Roman" w:cs="Times New Roman"/>
+          <w:b w:val="0"/>
+          <w:i w:val="0"/>
+          <w:sz w:val="26"/>
+        </w:rPr>
+        <w:t xml:space="preserve">[34] T. T. K. Ly, L. T. Phong, D. K. Nhan, "Autonomous Mobile Robot Localization by Using IMU and Encoder Data Fusion Technique by Kalman Filter", in </w:t>
+      </w:r>
+      <w:r>
+        <w:rPr>
+          <w:rFonts w:ascii="Times New Roman" w:hAnsi="Times New Roman" w:cs="Times New Roman"/>
+          <w:b w:val="0"/>
+          <w:i/>
+          <w:sz w:val="26"/>
+        </w:rPr>
+        <w:t>Advances in Engineering Research and Application (ICERA)</w:t>
+      </w:r>
+      <w:r>
+        <w:rPr>
+          <w:rFonts w:ascii="Times New Roman" w:hAnsi="Times New Roman" w:cs="Times New Roman"/>
+          <w:b w:val="0"/>
+          <w:i w:val="0"/>
+          <w:sz w:val="26"/>
+        </w:rPr>
+        <w:t>, Lecture Notes in Networks and Systems, Springer, 2024, pp. 245–256.</w:t>
+      </w:r>
+    </w:p>
+    <w:p>
+      <w:pPr>
+        <w:jc w:val="both"/>
+      </w:pPr>
+      <w:r>
+        <w:rPr>
+          <w:rFonts w:ascii="Times New Roman" w:hAnsi="Times New Roman" w:cs="Times New Roman"/>
+          <w:b w:val="0"/>
+          <w:i w:val="0"/>
+          <w:sz w:val="26"/>
+        </w:rPr>
+        <w:t xml:space="preserve">[35] A. A. Housein, G. Xingyu, W. Li, Y. Huang, "Extended Kalman Filter Sensor Fusion in Practice for Mobile Robot Localization", </w:t>
+      </w:r>
+      <w:r>
+        <w:rPr>
+          <w:rFonts w:ascii="Times New Roman" w:hAnsi="Times New Roman" w:cs="Times New Roman"/>
+          <w:b w:val="0"/>
+          <w:i/>
+          <w:sz w:val="26"/>
+        </w:rPr>
+        <w:t>Int. Journal of Advanced Computer Science and Applications (IJACSA)</w:t>
+      </w:r>
+      <w:r>
+        <w:rPr>
+          <w:rFonts w:ascii="Times New Roman" w:hAnsi="Times New Roman" w:cs="Times New Roman"/>
+          <w:b w:val="0"/>
+          <w:i w:val="0"/>
+          <w:sz w:val="26"/>
+        </w:rPr>
+        <w:t>, vol. 13, no. 2, 2022.</w:t>
+      </w:r>
+    </w:p>
+    <w:p>
+      <w:pPr>
+        <w:jc w:val="both"/>
+      </w:pPr>
+      <w:r>
+        <w:rPr>
+          <w:rFonts w:ascii="Times New Roman" w:hAnsi="Times New Roman" w:cs="Times New Roman"/>
+          <w:b w:val="0"/>
+          <w:i w:val="0"/>
+          <w:sz w:val="26"/>
+        </w:rPr>
+        <w:t xml:space="preserve">[36] G. Huang et al., "Multi-Sensor Fusion for Wheel-Inertial-Visual Systems Using a Fuzzification-Assisted Iterated Error State Kalman Filter", </w:t>
+      </w:r>
+      <w:r>
+        <w:rPr>
+          <w:rFonts w:ascii="Times New Roman" w:hAnsi="Times New Roman" w:cs="Times New Roman"/>
+          <w:b w:val="0"/>
+          <w:i/>
+          <w:sz w:val="26"/>
+        </w:rPr>
+        <w:t>Sensors</w:t>
+      </w:r>
+      <w:r>
+        <w:rPr>
+          <w:rFonts w:ascii="Times New Roman" w:hAnsi="Times New Roman" w:cs="Times New Roman"/>
+          <w:b w:val="0"/>
+          <w:i w:val="0"/>
+          <w:sz w:val="26"/>
+        </w:rPr>
+        <w:t>, vol. 24, no. 23, art. 7619, 2024.</w:t>
+      </w:r>
+    </w:p>
+    <w:p>
+      <w:pPr>
+        <w:jc w:val="both"/>
+      </w:pPr>
+      <w:r>
+        <w:rPr>
+          <w:rFonts w:ascii="Times New Roman" w:hAnsi="Times New Roman" w:cs="Times New Roman"/>
+          <w:b w:val="0"/>
+          <w:i w:val="0"/>
+          <w:sz w:val="26"/>
+        </w:rPr>
+        <w:t>[37] M. Yao, H. Deng, X. Feng, P. Li, Y. Li, H. Liu, "Global Path Planning for Differential Drive Mobile Robots Based on Improved BSGA</w:t>
+      </w:r>
+      <w:r>
+        <w:rPr>
+          <w:rFonts w:ascii="Times New Roman" w:hAnsi="Times New Roman" w:cs="Times New Roman"/>
+          <w:b w:val="0"/>
+          <w:i/>
+          <w:sz w:val="26"/>
+        </w:rPr>
+        <w:t xml:space="preserve"> Algorithm", </w:t>
+      </w:r>
+      <w:r>
+        <w:rPr>
+          <w:rFonts w:ascii="Times New Roman" w:hAnsi="Times New Roman" w:cs="Times New Roman"/>
+          <w:b w:val="0"/>
+          <w:i w:val="0"/>
+          <w:sz w:val="26"/>
+        </w:rPr>
+        <w:t>Applied Sciences*, vol. 13, no. 20, art. 11290, 2023.</w:t>
+      </w:r>
+    </w:p>
+    <w:p>
+      <w:pPr>
+        <w:jc w:val="both"/>
+      </w:pPr>
+      <w:r>
+        <w:rPr>
+          <w:rFonts w:ascii="Times New Roman" w:hAnsi="Times New Roman" w:cs="Times New Roman"/>
+          <w:b w:val="0"/>
+          <w:i w:val="0"/>
+          <w:sz w:val="26"/>
+        </w:rPr>
+        <w:t xml:space="preserve">[38] V. Shahapur, B. Dixon, U. Bharti, "Robotic Path Planning Implementation using Search Algorithms", </w:t>
+      </w:r>
+      <w:r>
+        <w:rPr>
+          <w:rFonts w:ascii="Times New Roman" w:hAnsi="Times New Roman" w:cs="Times New Roman"/>
+          <w:b w:val="0"/>
+          <w:i/>
+          <w:sz w:val="26"/>
+        </w:rPr>
+        <w:t>arXiv preprint</w:t>
+      </w:r>
+      <w:r>
+        <w:rPr>
+          <w:rFonts w:ascii="Times New Roman" w:hAnsi="Times New Roman" w:cs="Times New Roman"/>
+          <w:b w:val="0"/>
+          <w:i w:val="0"/>
+          <w:sz w:val="26"/>
+        </w:rPr>
+        <w:t xml:space="preserve"> arXiv:2405.16445, 2024.</w:t>
+      </w:r>
+    </w:p>
+    <w:p>
+      <w:pPr>
+        <w:jc w:val="both"/>
+      </w:pPr>
+      <w:r>
+        <w:rPr>
+          <w:rFonts w:ascii="Times New Roman" w:hAnsi="Times New Roman" w:cs="Times New Roman"/>
+          <w:b w:val="0"/>
+          <w:i w:val="0"/>
+          <w:sz w:val="26"/>
+        </w:rPr>
+        <w:t xml:space="preserve">[39] J. N. Yasin, S. A. S. Mohamed, M.-H. Haghbayan, J. Heikkonen, H. Tenhunen, J. Plosila, "Low-cost ultrasonic based object detection and collision avoidance method for autonomous robots", </w:t>
+      </w:r>
+      <w:r>
+        <w:rPr>
+          <w:rFonts w:ascii="Times New Roman" w:hAnsi="Times New Roman" w:cs="Times New Roman"/>
+          <w:b w:val="0"/>
+          <w:i/>
+          <w:sz w:val="26"/>
+        </w:rPr>
+        <w:t>Int. Journal of Information Technology</w:t>
+      </w:r>
+      <w:r>
+        <w:rPr>
+          <w:rFonts w:ascii="Times New Roman" w:hAnsi="Times New Roman" w:cs="Times New Roman"/>
+          <w:b w:val="0"/>
+          <w:i w:val="0"/>
+          <w:sz w:val="26"/>
+        </w:rPr>
+        <w:t>, vol. 13, pp. 97–107, 2020.</w:t>
       </w:r>
     </w:p>
     <w:p>

</xml_diff>

<commit_message>
report: dinh dang lai muc Pham vi nghien cuu (1.4) thanh gach dau dong theo nhom
- Pham vi nghien cuu: tach 3 nhom - gioi han ky thuat, gioi han dieu kien mo phong, kich ban mo phong/thuc nghiem.
- Giu nguyen danh so chuong 1 (Muc tieu = 1.2).
- Rebuild HTML/PDF/DOCX.
</commit_message>
<xml_diff>
--- a/docs/bao-cao-xe-tu-hanh.docx
+++ b/docs/bao-cao-xe-tu-hanh.docx
@@ -6230,14 +6230,34 @@
         </w:rPr>
         <w:t>Phạm vi nghiên cứu:</w:t>
       </w:r>
-      <w:r>
-        <w:rPr>
-          <w:rFonts w:ascii="Times New Roman" w:hAnsi="Times New Roman" w:cs="Times New Roman"/>
-          <w:b w:val="0"/>
-          <w:i w:val="0"/>
-          <w:sz w:val="26"/>
-        </w:rPr>
-        <w:t xml:space="preserve"> giới hạn ở quy mô phòng thí nghiệm/trong nhà, trên mặt sàn phẳng, bản đồ biết trước dạng lưới điểm 5×5 m. Đề tài </w:t>
+    </w:p>
+    <w:p>
+      <w:pPr>
+        <w:jc w:val="both"/>
+      </w:pPr>
+      <w:r>
+        <w:rPr>
+          <w:rFonts w:ascii="Times New Roman" w:hAnsi="Times New Roman" w:cs="Times New Roman"/>
+          <w:b w:val="0"/>
+          <w:i/>
+          <w:sz w:val="26"/>
+        </w:rPr>
+        <w:t>Giới hạn về kỹ thuật:</w:t>
+      </w:r>
+    </w:p>
+    <w:p>
+      <w:pPr>
+        <w:pStyle w:val="ListBullet"/>
+        <w:ind w:left="425"/>
+      </w:pPr>
+      <w:r>
+        <w:rPr>
+          <w:rFonts w:ascii="Times New Roman" w:hAnsi="Times New Roman" w:cs="Times New Roman"/>
+          <w:b w:val="0"/>
+          <w:i w:val="0"/>
+          <w:sz w:val="26"/>
+        </w:rPr>
+        <w:t xml:space="preserve">Định vị </w:t>
       </w:r>
       <w:r>
         <w:rPr>
@@ -6246,6 +6266,24 @@
           <w:i w:val="0"/>
           <w:sz w:val="26"/>
         </w:rPr>
+        <w:t>hoàn toàn bằng odometry tương đối</w:t>
+      </w:r>
+      <w:r>
+        <w:rPr>
+          <w:rFonts w:ascii="Times New Roman" w:hAnsi="Times New Roman" w:cs="Times New Roman"/>
+          <w:b w:val="0"/>
+          <w:i w:val="0"/>
+          <w:sz w:val="26"/>
+        </w:rPr>
+        <w:t xml:space="preserve"> (encoder + IMU, dead-reckoning); </w:t>
+      </w:r>
+      <w:r>
+        <w:rPr>
+          <w:rFonts w:ascii="Times New Roman" w:hAnsi="Times New Roman" w:cs="Times New Roman"/>
+          <w:b/>
+          <w:i w:val="0"/>
+          <w:sz w:val="26"/>
+        </w:rPr>
         <w:t>không</w:t>
       </w:r>
       <w:r>
@@ -6255,7 +6293,419 @@
           <w:i w:val="0"/>
           <w:sz w:val="26"/>
         </w:rPr>
-        <w:t xml:space="preserve"> sử dụng các công nghệ cao cấp như LiDAR, camera AI, GPS hay SLAM xây bản đồ động; định vị dựa hoàn toàn vào odometry tương đối (dead-reckoning). Việc thu gọn phạm vi như vậy giúp tập trung giải quyết trọn vẹn bài toán định vị - dẫn đường - bám lộ trình cơ bản với chi phí thấp.</w:t>
+        <w:t xml:space="preserve"> dùng LiDAR, camera AI, GPS hay SLAM xây bản đồ động.</w:t>
+      </w:r>
+    </w:p>
+    <w:p>
+      <w:pPr>
+        <w:pStyle w:val="ListBullet"/>
+        <w:ind w:left="425"/>
+      </w:pPr>
+      <w:r>
+        <w:rPr>
+          <w:rFonts w:ascii="Times New Roman" w:hAnsi="Times New Roman" w:cs="Times New Roman"/>
+          <w:b w:val="0"/>
+          <w:i w:val="0"/>
+          <w:sz w:val="26"/>
+        </w:rPr>
+        <w:t xml:space="preserve">Bản đồ </w:t>
+      </w:r>
+      <w:r>
+        <w:rPr>
+          <w:rFonts w:ascii="Times New Roman" w:hAnsi="Times New Roman" w:cs="Times New Roman"/>
+          <w:b/>
+          <w:i w:val="0"/>
+          <w:sz w:val="26"/>
+        </w:rPr>
+        <w:t>biết trước</w:t>
+      </w:r>
+      <w:r>
+        <w:rPr>
+          <w:rFonts w:ascii="Times New Roman" w:hAnsi="Times New Roman" w:cs="Times New Roman"/>
+          <w:b w:val="0"/>
+          <w:i w:val="0"/>
+          <w:sz w:val="26"/>
+        </w:rPr>
+        <w:t xml:space="preserve"> dạng lưới waypoint kích thước 5×5 m; đề tài không tự dựng bản đồ môi trường.</w:t>
+      </w:r>
+    </w:p>
+    <w:p>
+      <w:pPr>
+        <w:pStyle w:val="ListBullet"/>
+        <w:ind w:left="425"/>
+      </w:pPr>
+      <w:r>
+        <w:rPr>
+          <w:rFonts w:ascii="Times New Roman" w:hAnsi="Times New Roman" w:cs="Times New Roman"/>
+          <w:b w:val="0"/>
+          <w:i w:val="0"/>
+          <w:sz w:val="26"/>
+        </w:rPr>
+        <w:t xml:space="preserve">Đối tượng là xe </w:t>
+      </w:r>
+      <w:r>
+        <w:rPr>
+          <w:rFonts w:ascii="Times New Roman" w:hAnsi="Times New Roman" w:cs="Times New Roman"/>
+          <w:b/>
+          <w:i w:val="0"/>
+          <w:sz w:val="26"/>
+        </w:rPr>
+        <w:t>hai bánh vi sai</w:t>
+      </w:r>
+      <w:r>
+        <w:rPr>
+          <w:rFonts w:ascii="Times New Roman" w:hAnsi="Times New Roman" w:cs="Times New Roman"/>
+          <w:b w:val="0"/>
+          <w:i w:val="0"/>
+          <w:sz w:val="26"/>
+        </w:rPr>
+        <w:t xml:space="preserve">, chạy trong nhà trên </w:t>
+      </w:r>
+      <w:r>
+        <w:rPr>
+          <w:rFonts w:ascii="Times New Roman" w:hAnsi="Times New Roman" w:cs="Times New Roman"/>
+          <w:b/>
+          <w:i w:val="0"/>
+          <w:sz w:val="26"/>
+        </w:rPr>
+        <w:t>mặt sàn phẳng</w:t>
+      </w:r>
+      <w:r>
+        <w:rPr>
+          <w:rFonts w:ascii="Times New Roman" w:hAnsi="Times New Roman" w:cs="Times New Roman"/>
+          <w:b w:val="0"/>
+          <w:i w:val="0"/>
+          <w:sz w:val="26"/>
+        </w:rPr>
+        <w:t>, tốc độ thấp; chưa xét địa hình gồ ghề/dốc.</w:t>
+      </w:r>
+    </w:p>
+    <w:p>
+      <w:pPr>
+        <w:pStyle w:val="ListBullet"/>
+        <w:ind w:left="425"/>
+      </w:pPr>
+      <w:r>
+        <w:rPr>
+          <w:rFonts w:ascii="Times New Roman" w:hAnsi="Times New Roman" w:cs="Times New Roman"/>
+          <w:b w:val="0"/>
+          <w:i w:val="0"/>
+          <w:sz w:val="26"/>
+        </w:rPr>
+        <w:t xml:space="preserve">Cảm biến khoảng cách duy nhất là </w:t>
+      </w:r>
+      <w:r>
+        <w:rPr>
+          <w:rFonts w:ascii="Times New Roman" w:hAnsi="Times New Roman" w:cs="Times New Roman"/>
+          <w:b/>
+          <w:i w:val="0"/>
+          <w:sz w:val="26"/>
+        </w:rPr>
+        <w:t>HC-SR04</w:t>
+      </w:r>
+      <w:r>
+        <w:rPr>
+          <w:rFonts w:ascii="Times New Roman" w:hAnsi="Times New Roman" w:cs="Times New Roman"/>
+          <w:b w:val="0"/>
+          <w:i w:val="0"/>
+          <w:sz w:val="26"/>
+        </w:rPr>
+        <w:t xml:space="preserve"> (siêu âm, tầm 2–400 cm) cho né vật cản cơ bản; không dùng cảm biến laser/thị giác.</w:t>
+      </w:r>
+    </w:p>
+    <w:p>
+      <w:pPr>
+        <w:pStyle w:val="ListBullet"/>
+        <w:ind w:left="425"/>
+      </w:pPr>
+      <w:r>
+        <w:rPr>
+          <w:rFonts w:ascii="Times New Roman" w:hAnsi="Times New Roman" w:cs="Times New Roman"/>
+          <w:b w:val="0"/>
+          <w:i w:val="0"/>
+          <w:sz w:val="26"/>
+        </w:rPr>
+        <w:t xml:space="preserve">Truyền thông qua </w:t>
+      </w:r>
+      <w:r>
+        <w:rPr>
+          <w:rFonts w:ascii="Times New Roman" w:hAnsi="Times New Roman" w:cs="Times New Roman"/>
+          <w:b/>
+          <w:i w:val="0"/>
+          <w:sz w:val="26"/>
+        </w:rPr>
+        <w:t>WiFi cục bộ (SoftAP) + UDP</w:t>
+      </w:r>
+      <w:r>
+        <w:rPr>
+          <w:rFonts w:ascii="Times New Roman" w:hAnsi="Times New Roman" w:cs="Times New Roman"/>
+          <w:b w:val="0"/>
+          <w:i w:val="0"/>
+          <w:sz w:val="26"/>
+        </w:rPr>
+        <w:t xml:space="preserve"> phạm vi ngắn, hoạt động độc lập, </w:t>
+      </w:r>
+      <w:r>
+        <w:rPr>
+          <w:rFonts w:ascii="Times New Roman" w:hAnsi="Times New Roman" w:cs="Times New Roman"/>
+          <w:b/>
+          <w:i w:val="0"/>
+          <w:sz w:val="26"/>
+        </w:rPr>
+        <w:t>không</w:t>
+      </w:r>
+      <w:r>
+        <w:rPr>
+          <w:rFonts w:ascii="Times New Roman" w:hAnsi="Times New Roman" w:cs="Times New Roman"/>
+          <w:b w:val="0"/>
+          <w:i w:val="0"/>
+          <w:sz w:val="26"/>
+        </w:rPr>
+        <w:t xml:space="preserve"> qua Internet.</w:t>
+      </w:r>
+    </w:p>
+    <w:p>
+      <w:pPr>
+        <w:jc w:val="both"/>
+      </w:pPr>
+      <w:r>
+        <w:rPr>
+          <w:rFonts w:ascii="Times New Roman" w:hAnsi="Times New Roman" w:cs="Times New Roman"/>
+          <w:b w:val="0"/>
+          <w:i/>
+          <w:sz w:val="26"/>
+        </w:rPr>
+        <w:t>Giới hạn về điều kiện mô phỏng:</w:t>
+      </w:r>
+    </w:p>
+    <w:p>
+      <w:pPr>
+        <w:pStyle w:val="ListBullet"/>
+        <w:ind w:left="425"/>
+      </w:pPr>
+      <w:r>
+        <w:rPr>
+          <w:rFonts w:ascii="Times New Roman" w:hAnsi="Times New Roman" w:cs="Times New Roman"/>
+          <w:b w:val="0"/>
+          <w:i w:val="0"/>
+          <w:sz w:val="26"/>
+        </w:rPr>
+        <w:t xml:space="preserve">Chế độ </w:t>
+      </w:r>
+      <w:r>
+        <w:rPr>
+          <w:rFonts w:ascii="Times New Roman" w:hAnsi="Times New Roman" w:cs="Times New Roman"/>
+          <w:b/>
+          <w:i w:val="0"/>
+          <w:sz w:val="26"/>
+        </w:rPr>
+        <w:t>giả lập (simulator)</w:t>
+      </w:r>
+      <w:r>
+        <w:rPr>
+          <w:rFonts w:ascii="Times New Roman" w:hAnsi="Times New Roman" w:cs="Times New Roman"/>
+          <w:b w:val="0"/>
+          <w:i w:val="0"/>
+          <w:sz w:val="26"/>
+        </w:rPr>
+        <w:t xml:space="preserve"> tích hợp trong ứng dụng Flutter, mô phỏng chuyển động xe theo </w:t>
+      </w:r>
+      <w:r>
+        <w:rPr>
+          <w:rFonts w:ascii="Times New Roman" w:hAnsi="Times New Roman" w:cs="Times New Roman"/>
+          <w:b/>
+          <w:i w:val="0"/>
+          <w:sz w:val="26"/>
+        </w:rPr>
+        <w:t>mô hình vi sai lý tưởng</w:t>
+      </w:r>
+      <w:r>
+        <w:rPr>
+          <w:rFonts w:ascii="Times New Roman" w:hAnsi="Times New Roman" w:cs="Times New Roman"/>
+          <w:b w:val="0"/>
+          <w:i w:val="0"/>
+          <w:sz w:val="26"/>
+        </w:rPr>
+        <w:t xml:space="preserve"> — không mô phỏng trượt bánh, nhiễu cảm biến hay sai số cơ khí như thực tế.</w:t>
+      </w:r>
+    </w:p>
+    <w:p>
+      <w:pPr>
+        <w:pStyle w:val="ListBullet"/>
+        <w:ind w:left="425"/>
+      </w:pPr>
+      <w:r>
+        <w:rPr>
+          <w:rFonts w:ascii="Times New Roman" w:hAnsi="Times New Roman" w:cs="Times New Roman"/>
+          <w:b w:val="0"/>
+          <w:i w:val="0"/>
+          <w:sz w:val="26"/>
+        </w:rPr>
+        <w:t xml:space="preserve">Môi trường mô phỏng là </w:t>
+      </w:r>
+      <w:r>
+        <w:rPr>
+          <w:rFonts w:ascii="Times New Roman" w:hAnsi="Times New Roman" w:cs="Times New Roman"/>
+          <w:b/>
+          <w:i w:val="0"/>
+          <w:sz w:val="26"/>
+        </w:rPr>
+        <w:t>lưới waypoint phẳng</w:t>
+      </w:r>
+      <w:r>
+        <w:rPr>
+          <w:rFonts w:ascii="Times New Roman" w:hAnsi="Times New Roman" w:cs="Times New Roman"/>
+          <w:b w:val="0"/>
+          <w:i w:val="0"/>
+          <w:sz w:val="26"/>
+        </w:rPr>
+        <w:t xml:space="preserve">, vật cản </w:t>
+      </w:r>
+      <w:r>
+        <w:rPr>
+          <w:rFonts w:ascii="Times New Roman" w:hAnsi="Times New Roman" w:cs="Times New Roman"/>
+          <w:b/>
+          <w:i w:val="0"/>
+          <w:sz w:val="26"/>
+        </w:rPr>
+        <w:t>tĩnh</w:t>
+      </w:r>
+      <w:r>
+        <w:rPr>
+          <w:rFonts w:ascii="Times New Roman" w:hAnsi="Times New Roman" w:cs="Times New Roman"/>
+          <w:b w:val="0"/>
+          <w:i w:val="0"/>
+          <w:sz w:val="26"/>
+        </w:rPr>
+        <w:t xml:space="preserve"> đặt trước; không mô phỏng động lực học hay vật cản chuyển động phức tạp.</w:t>
+      </w:r>
+    </w:p>
+    <w:p>
+      <w:pPr>
+        <w:pStyle w:val="ListBullet"/>
+        <w:ind w:left="425"/>
+      </w:pPr>
+      <w:r>
+        <w:rPr>
+          <w:rFonts w:ascii="Times New Roman" w:hAnsi="Times New Roman" w:cs="Times New Roman"/>
+          <w:b w:val="0"/>
+          <w:i w:val="0"/>
+          <w:sz w:val="26"/>
+        </w:rPr>
+        <w:t>Mục đích: kiểm thử thuật toán A</w:t>
+      </w:r>
+      <w:r>
+        <w:rPr>
+          <w:rFonts w:ascii="Times New Roman" w:hAnsi="Times New Roman" w:cs="Times New Roman"/>
+          <w:b w:val="0"/>
+          <w:i/>
+          <w:sz w:val="26"/>
+        </w:rPr>
+        <w:t xml:space="preserve">, bộ dựng lộ trình và giao diện </w:t>
+      </w:r>
+      <w:r>
+        <w:rPr>
+          <w:rFonts w:ascii="Times New Roman" w:hAnsi="Times New Roman" w:cs="Times New Roman"/>
+          <w:b w:val="0"/>
+          <w:i/>
+          <w:sz w:val="26"/>
+        </w:rPr>
+        <w:t>trước khi có phần cứng</w:t>
+      </w:r>
+      <w:r>
+        <w:rPr>
+          <w:rFonts w:ascii="Times New Roman" w:hAnsi="Times New Roman" w:cs="Times New Roman"/>
+          <w:b w:val="0"/>
+          <w:i w:val="0"/>
+          <w:sz w:val="26"/>
+        </w:rPr>
+        <w:t>*; kết quả cuối vẫn được kiểm chứng lại trên xe thật.</w:t>
+      </w:r>
+    </w:p>
+    <w:p>
+      <w:pPr>
+        <w:jc w:val="both"/>
+      </w:pPr>
+      <w:r>
+        <w:rPr>
+          <w:rFonts w:ascii="Times New Roman" w:hAnsi="Times New Roman" w:cs="Times New Roman"/>
+          <w:b w:val="0"/>
+          <w:i/>
+          <w:sz w:val="26"/>
+        </w:rPr>
+        <w:t>Kịch bản mô phỏng / thực nghiệm:</w:t>
+      </w:r>
+    </w:p>
+    <w:p>
+      <w:pPr>
+        <w:pStyle w:val="ListBullet"/>
+        <w:ind w:left="425"/>
+      </w:pPr>
+      <w:r>
+        <w:rPr>
+          <w:rFonts w:ascii="Times New Roman" w:hAnsi="Times New Roman" w:cs="Times New Roman"/>
+          <w:b/>
+          <w:i w:val="0"/>
+          <w:sz w:val="26"/>
+        </w:rPr>
+        <w:t>Bám lộ trình:</w:t>
+      </w:r>
+      <w:r>
+        <w:rPr>
+          <w:rFonts w:ascii="Times New Roman" w:hAnsi="Times New Roman" w:cs="Times New Roman"/>
+          <w:b w:val="0"/>
+          <w:i w:val="0"/>
+          <w:sz w:val="26"/>
+        </w:rPr>
+        <w:t xml:space="preserve"> người dùng chạm chọn điểm đích trên bản đồ → ứng dụng tính đường ngắn nhất bằng A* → gửi lộ trình → xe (hoặc sim) bám theo, hiển thị vị trí theo thời gian thực.</w:t>
+      </w:r>
+    </w:p>
+    <w:p>
+      <w:pPr>
+        <w:pStyle w:val="ListBullet"/>
+        <w:ind w:left="425"/>
+      </w:pPr>
+      <w:r>
+        <w:rPr>
+          <w:rFonts w:ascii="Times New Roman" w:hAnsi="Times New Roman" w:cs="Times New Roman"/>
+          <w:b/>
+          <w:i w:val="0"/>
+          <w:sz w:val="26"/>
+        </w:rPr>
+        <w:t>Né vật cản:</w:t>
+      </w:r>
+      <w:r>
+        <w:rPr>
+          <w:rFonts w:ascii="Times New Roman" w:hAnsi="Times New Roman" w:cs="Times New Roman"/>
+          <w:b w:val="0"/>
+          <w:i w:val="0"/>
+          <w:sz w:val="26"/>
+        </w:rPr>
+        <w:t xml:space="preserve"> đặt vật cản trên đường đi → xe phát hiện bằng siêu âm → dừng, quét trái/phải rồi tự rẽ tránh (chế độ tự hành) hoặc chặn cạnh và tính lại đường bằng A* (khi đang bám lộ trình).</w:t>
+      </w:r>
+    </w:p>
+    <w:p>
+      <w:pPr>
+        <w:pStyle w:val="ListBullet"/>
+        <w:ind w:left="425"/>
+      </w:pPr>
+      <w:r>
+        <w:rPr>
+          <w:rFonts w:ascii="Times New Roman" w:hAnsi="Times New Roman" w:cs="Times New Roman"/>
+          <w:b/>
+          <w:i w:val="0"/>
+          <w:sz w:val="26"/>
+        </w:rPr>
+        <w:t>Đánh giá sai số:</w:t>
+      </w:r>
+      <w:r>
+        <w:rPr>
+          <w:rFonts w:ascii="Times New Roman" w:hAnsi="Times New Roman" w:cs="Times New Roman"/>
+          <w:b w:val="0"/>
+          <w:i w:val="0"/>
+          <w:sz w:val="26"/>
+        </w:rPr>
+        <w:t xml:space="preserve"> cho xe chạy quãng đường / góc xoay xác định, so vị trí–hướng ước lượng với giá trị thực để đo sai số định vị.</w:t>
       </w:r>
     </w:p>
     <w:p>

</xml_diff>

<commit_message>
report: sua cau hinh 4 banh skid-steer + danh dau do thay doi + viet lai 5.1 + danh gia 5.3
- Cau hinh phan cung: doi 2 banh vi sai + caster + 2 dong co -> 4 banh dan dong vi sai
  skid-steer, 4 dong co (2 kenh L298N), 2 encoder (moi ben 1), khong caster. Sua dong bo
  toan bao cao (tom tat, muc tieu, doi tuong, pham vi, Chuong 2 dong hoc, Chuong 3 phan cung,
  bang linh kien, thi cong). Track width thay cho wheel base.
- Danh dau review: cac doan da sua boc <span class="chg"> -> to mau do. Sua make-html.js
  (CSS .chg) va make-docx.py (add_inline render run mau do) de hien thi do o ca HTML/PDF/DOCX.
- Muc 5.1: viet lai thanh "Ket qua thuc hien va thong so dat duoc" - gan ket qua voi so lieu
  cu the tu Chuong 4/config (encoder 20 xung/vong, alpha=0.35, UDP 4210/4211, telemetry 10Hz...).
- Muc 5.3: them 5.3.1 (bang doi chieu muc do dat muc tieu) + 5.3.2 (danh gia chung: chuc nang,
  do chinh xac, do on dinh/chi phi, ket luan) - bo sung phan danh gia con thieu.
- Rebuild HTML/PDF/DOCX.
</commit_message>
<xml_diff>
--- a/docs/bao-cao-xe-tu-hanh.docx
+++ b/docs/bao-cao-xe-tu-hanh.docx
@@ -461,16 +461,35 @@
         <w:rPr>
           <w:rFonts w:ascii="Times New Roman" w:hAnsi="Times New Roman" w:cs="Times New Roman"/>
           <w:b w:val="0"/>
-          <w:i/>
-          <w:sz w:val="26"/>
-        </w:rPr>
-        <w:t xml:space="preserve"> (bộ lọc bù — complementary filter) để ước lượng vị trí và hướng theo thời gian thực, điều khiển hai động cơ DC qua mạch cầu </w:t>
-      </w:r>
-      <w:r>
-        <w:rPr>
-          <w:rFonts w:ascii="Times New Roman" w:hAnsi="Times New Roman" w:cs="Times New Roman"/>
-          <w:b w:val="0"/>
-          <w:i/>
+          <w:i w:val="0"/>
+          <w:sz w:val="26"/>
+        </w:rPr>
+        <w:t xml:space="preserve">* (bộ lọc bù — complementary filter) để ước lượng vị trí và hướng theo thời gian thực, điều khiển </w:t>
+      </w:r>
+      <w:r>
+        <w:rPr>
+          <w:rFonts w:ascii="Times New Roman" w:hAnsi="Times New Roman" w:cs="Times New Roman"/>
+          <w:b w:val="0"/>
+          <w:i w:val="0"/>
+          <w:color w:val="C00000"/>
+          <w:sz w:val="26"/>
+        </w:rPr>
+        <w:t>bốn động cơ DC (hai bên trái/phải)</w:t>
+      </w:r>
+      <w:r>
+        <w:rPr>
+          <w:rFonts w:ascii="Times New Roman" w:hAnsi="Times New Roman" w:cs="Times New Roman"/>
+          <w:b w:val="0"/>
+          <w:i w:val="0"/>
+          <w:sz w:val="26"/>
+        </w:rPr>
+        <w:t xml:space="preserve"> qua mạch cầu </w:t>
+      </w:r>
+      <w:r>
+        <w:rPr>
+          <w:rFonts w:ascii="Times New Roman" w:hAnsi="Times New Roman" w:cs="Times New Roman"/>
+          <w:b/>
+          <w:i w:val="0"/>
           <w:sz w:val="26"/>
         </w:rPr>
         <w:t>L298N</w:t>
@@ -479,7 +498,7 @@
         <w:rPr>
           <w:rFonts w:ascii="Times New Roman" w:hAnsi="Times New Roman" w:cs="Times New Roman"/>
           <w:b w:val="0"/>
-          <w:i/>
+          <w:i w:val="0"/>
           <w:sz w:val="26"/>
         </w:rPr>
         <w:t xml:space="preserve">. Vị trí xe được phản hồi liên tục về ứng dụng (telemetry 10 Hz) để hiển thị trên bản đồ. Hệ thống còn tích hợp cơ chế </w:t>
@@ -487,8 +506,8 @@
       <w:r>
         <w:rPr>
           <w:rFonts w:ascii="Times New Roman" w:hAnsi="Times New Roman" w:cs="Times New Roman"/>
-          <w:b w:val="0"/>
-          <w:i/>
+          <w:b/>
+          <w:i w:val="0"/>
           <w:sz w:val="26"/>
         </w:rPr>
         <w:t>tự hiệu chuẩn</w:t>
@@ -500,7 +519,7 @@
           <w:i w:val="0"/>
           <w:sz w:val="26"/>
         </w:rPr>
-        <w:t>* sai số động cơ/encoder lưu trên bộ nhớ NVS, và chế độ giả lập (simulator) để kiểm thử ứng dụng khi chưa có phần cứng.</w:t>
+        <w:t xml:space="preserve"> sai số động cơ/encoder lưu trên bộ nhớ NVS, và chế độ giả lập (simulator) để kiểm thử ứng dụng khi chưa có phần cứng.</w:t>
       </w:r>
     </w:p>
     <w:p>
@@ -5758,24 +5777,27 @@
           <w:rFonts w:ascii="Times New Roman" w:hAnsi="Times New Roman" w:cs="Times New Roman"/>
           <w:b/>
           <w:i w:val="0"/>
-          <w:sz w:val="26"/>
-        </w:rPr>
-        <w:t>hai bánh vi sai</w:t>
-      </w:r>
-      <w:r>
-        <w:rPr>
-          <w:rFonts w:ascii="Times New Roman" w:hAnsi="Times New Roman" w:cs="Times New Roman"/>
-          <w:b w:val="0"/>
-          <w:i w:val="0"/>
-          <w:sz w:val="26"/>
-        </w:rPr>
-        <w:t xml:space="preserve">: khung xe, hai động cơ DC giảm tốc gắn </w:t>
+          <w:color w:val="C00000"/>
+          <w:sz w:val="26"/>
+        </w:rPr>
+        <w:t>bốn bánh dẫn động vi sai (skid-steer)</w:t>
+      </w:r>
+      <w:r>
+        <w:rPr>
+          <w:rFonts w:ascii="Times New Roman" w:hAnsi="Times New Roman" w:cs="Times New Roman"/>
+          <w:b w:val="0"/>
+          <w:i w:val="0"/>
+          <w:color w:val="C00000"/>
+          <w:sz w:val="26"/>
+        </w:rPr>
+        <w:t xml:space="preserve">: khung xe bốn bánh, bốn động cơ DC giảm tốc chia hai bên trái/phải, mỗi bên gắn một </w:t>
       </w:r>
       <w:r>
         <w:rPr>
           <w:rFonts w:ascii="Times New Roman" w:hAnsi="Times New Roman" w:cs="Times New Roman"/>
           <w:b/>
           <w:i w:val="0"/>
+          <w:color w:val="C00000"/>
           <w:sz w:val="26"/>
         </w:rPr>
         <w:t>encoder quang</w:t>
@@ -5785,9 +5807,10 @@
           <w:rFonts w:ascii="Times New Roman" w:hAnsi="Times New Roman" w:cs="Times New Roman"/>
           <w:b w:val="0"/>
           <w:i w:val="0"/>
-          <w:sz w:val="26"/>
-        </w:rPr>
-        <w:t>, bánh đa hướng đỡ phía sau.</w:t>
+          <w:color w:val="C00000"/>
+          <w:sz w:val="26"/>
+        </w:rPr>
+        <w:t xml:space="preserve"> đo tốc độ.</w:t>
       </w:r>
     </w:p>
     <w:p>
@@ -5838,7 +5861,26 @@
           <w:i w:val="0"/>
           <w:sz w:val="26"/>
         </w:rPr>
-        <w:t xml:space="preserve"> + 2 động cơ, </w:t>
+        <w:t xml:space="preserve"> </w:t>
+      </w:r>
+      <w:r>
+        <w:rPr>
+          <w:rFonts w:ascii="Times New Roman" w:hAnsi="Times New Roman" w:cs="Times New Roman"/>
+          <w:b w:val="0"/>
+          <w:i w:val="0"/>
+          <w:color w:val="C00000"/>
+          <w:sz w:val="26"/>
+        </w:rPr>
+        <w:t>(2 kênh) + 4 động cơ</w:t>
+      </w:r>
+      <w:r>
+        <w:rPr>
+          <w:rFonts w:ascii="Times New Roman" w:hAnsi="Times New Roman" w:cs="Times New Roman"/>
+          <w:b w:val="0"/>
+          <w:i w:val="0"/>
+          <w:sz w:val="26"/>
+        </w:rPr>
+        <w:t xml:space="preserve">, </w:t>
       </w:r>
       <w:r>
         <w:rPr>
@@ -6023,7 +6065,26 @@
           <w:i w:val="0"/>
           <w:sz w:val="26"/>
         </w:rPr>
-        <w:t xml:space="preserve">: tự xoay đúng hướng và đi thẳng đúng quãng đường giữa các node, có giữ hướng + cân bằng hai bánh; </w:t>
+        <w:t xml:space="preserve">: tự xoay đúng hướng và đi thẳng đúng quãng đường giữa các node, có giữ hướng + cân bằng </w:t>
+      </w:r>
+      <w:r>
+        <w:rPr>
+          <w:rFonts w:ascii="Times New Roman" w:hAnsi="Times New Roman" w:cs="Times New Roman"/>
+          <w:b w:val="0"/>
+          <w:i w:val="0"/>
+          <w:color w:val="C00000"/>
+          <w:sz w:val="26"/>
+        </w:rPr>
+        <w:t>hai bên</w:t>
+      </w:r>
+      <w:r>
+        <w:rPr>
+          <w:rFonts w:ascii="Times New Roman" w:hAnsi="Times New Roman" w:cs="Times New Roman"/>
+          <w:b w:val="0"/>
+          <w:i w:val="0"/>
+          <w:sz w:val="26"/>
+        </w:rPr>
+        <w:t xml:space="preserve">; </w:t>
       </w:r>
       <w:r>
         <w:rPr>
@@ -6214,7 +6275,26 @@
           <w:i w:val="0"/>
           <w:sz w:val="26"/>
         </w:rPr>
-        <w:t xml:space="preserve"> hệ thống xe robot tự hành hai bánh vi sai (differential drive) sử dụng ESP32 làm trung tâm điều khiển, định vị bằng odometry encoder kết hợp IMU, dẫn đường bằng A* trên đồ thị waypoint.</w:t>
+        <w:t xml:space="preserve"> hệ thống xe robot tự hành </w:t>
+      </w:r>
+      <w:r>
+        <w:rPr>
+          <w:rFonts w:ascii="Times New Roman" w:hAnsi="Times New Roman" w:cs="Times New Roman"/>
+          <w:b w:val="0"/>
+          <w:i w:val="0"/>
+          <w:color w:val="C00000"/>
+          <w:sz w:val="26"/>
+        </w:rPr>
+        <w:t>bốn bánh dẫn động vi sai kiểu skid-steer (differential drive)</w:t>
+      </w:r>
+      <w:r>
+        <w:rPr>
+          <w:rFonts w:ascii="Times New Roman" w:hAnsi="Times New Roman" w:cs="Times New Roman"/>
+          <w:b w:val="0"/>
+          <w:i w:val="0"/>
+          <w:sz w:val="26"/>
+        </w:rPr>
+        <w:t xml:space="preserve"> sử dụng ESP32 làm trung tâm điều khiển, định vị bằng odometry encoder kết hợp IMU, dẫn đường bằng A* trên đồ thị waypoint.</w:t>
       </w:r>
     </w:p>
     <w:p>
@@ -6229,20 +6309,6 @@
           <w:sz w:val="26"/>
         </w:rPr>
         <w:t>Phạm vi nghiên cứu:</w:t>
-      </w:r>
-    </w:p>
-    <w:p>
-      <w:pPr>
-        <w:jc w:val="both"/>
-      </w:pPr>
-      <w:r>
-        <w:rPr>
-          <w:rFonts w:ascii="Times New Roman" w:hAnsi="Times New Roman" w:cs="Times New Roman"/>
-          <w:b w:val="0"/>
-          <w:i/>
-          <w:sz w:val="26"/>
-        </w:rPr>
-        <w:t>Giới hạn về kỹ thuật:</w:t>
       </w:r>
     </w:p>
     <w:p>
@@ -6253,47 +6319,58 @@
       <w:r>
         <w:rPr>
           <w:rFonts w:ascii="Times New Roman" w:hAnsi="Times New Roman" w:cs="Times New Roman"/>
-          <w:b w:val="0"/>
-          <w:i w:val="0"/>
-          <w:sz w:val="26"/>
-        </w:rPr>
-        <w:t xml:space="preserve">Định vị </w:t>
-      </w:r>
-      <w:r>
-        <w:rPr>
-          <w:rFonts w:ascii="Times New Roman" w:hAnsi="Times New Roman" w:cs="Times New Roman"/>
           <w:b/>
           <w:i w:val="0"/>
           <w:sz w:val="26"/>
         </w:rPr>
-        <w:t>hoàn toàn bằng odometry tương đối</w:t>
-      </w:r>
-      <w:r>
-        <w:rPr>
-          <w:rFonts w:ascii="Times New Roman" w:hAnsi="Times New Roman" w:cs="Times New Roman"/>
-          <w:b w:val="0"/>
-          <w:i w:val="0"/>
-          <w:sz w:val="26"/>
-        </w:rPr>
-        <w:t xml:space="preserve"> (encoder + IMU, dead-reckoning); </w:t>
-      </w:r>
-      <w:r>
-        <w:rPr>
-          <w:rFonts w:ascii="Times New Roman" w:hAnsi="Times New Roman" w:cs="Times New Roman"/>
-          <w:b/>
-          <w:i w:val="0"/>
-          <w:sz w:val="26"/>
-        </w:rPr>
-        <w:t>không</w:t>
-      </w:r>
-      <w:r>
-        <w:rPr>
-          <w:rFonts w:ascii="Times New Roman" w:hAnsi="Times New Roman" w:cs="Times New Roman"/>
-          <w:b w:val="0"/>
-          <w:i w:val="0"/>
-          <w:sz w:val="26"/>
-        </w:rPr>
-        <w:t xml:space="preserve"> dùng LiDAR, camera AI, GPS hay SLAM xây bản đồ động.</w:t>
+        <w:t>Giới hạn về phần cứng:</w:t>
+      </w:r>
+      <w:r>
+        <w:rPr>
+          <w:rFonts w:ascii="Times New Roman" w:hAnsi="Times New Roman" w:cs="Times New Roman"/>
+          <w:b w:val="0"/>
+          <w:i w:val="0"/>
+          <w:sz w:val="26"/>
+        </w:rPr>
+        <w:t xml:space="preserve"> Hệ thống được triển khai trên mô hình xe robot di động </w:t>
+      </w:r>
+      <w:r>
+        <w:rPr>
+          <w:rFonts w:ascii="Times New Roman" w:hAnsi="Times New Roman" w:cs="Times New Roman"/>
+          <w:b w:val="0"/>
+          <w:i w:val="0"/>
+          <w:color w:val="C00000"/>
+          <w:sz w:val="26"/>
+        </w:rPr>
+        <w:t>bốn bánh dẫn động vi sai kiểu skid-steer (differential drive)</w:t>
+      </w:r>
+      <w:r>
+        <w:rPr>
+          <w:rFonts w:ascii="Times New Roman" w:hAnsi="Times New Roman" w:cs="Times New Roman"/>
+          <w:b w:val="0"/>
+          <w:i w:val="0"/>
+          <w:sz w:val="26"/>
+        </w:rPr>
+        <w:t xml:space="preserve">, sử dụng vi điều khiển ESP32 làm bộ xử lý trung tâm. Các thành phần phần cứng bao gồm </w:t>
+      </w:r>
+      <w:r>
+        <w:rPr>
+          <w:rFonts w:ascii="Times New Roman" w:hAnsi="Times New Roman" w:cs="Times New Roman"/>
+          <w:b w:val="0"/>
+          <w:i w:val="0"/>
+          <w:color w:val="C00000"/>
+          <w:sz w:val="26"/>
+        </w:rPr>
+        <w:t>bốn động cơ DC (chia hai bên trái/phải), encoder đo tốc độ bánh xe ở mỗi bên</w:t>
+      </w:r>
+      <w:r>
+        <w:rPr>
+          <w:rFonts w:ascii="Times New Roman" w:hAnsi="Times New Roman" w:cs="Times New Roman"/>
+          <w:b w:val="0"/>
+          <w:i w:val="0"/>
+          <w:sz w:val="26"/>
+        </w:rPr>
+        <w:t>, cảm biến IMU và mạch điều khiển động cơ L298N.</w:t>
       </w:r>
     </w:p>
     <w:p>
@@ -6304,29 +6381,20 @@
       <w:r>
         <w:rPr>
           <w:rFonts w:ascii="Times New Roman" w:hAnsi="Times New Roman" w:cs="Times New Roman"/>
-          <w:b w:val="0"/>
-          <w:i w:val="0"/>
-          <w:sz w:val="26"/>
-        </w:rPr>
-        <w:t xml:space="preserve">Bản đồ </w:t>
-      </w:r>
-      <w:r>
-        <w:rPr>
-          <w:rFonts w:ascii="Times New Roman" w:hAnsi="Times New Roman" w:cs="Times New Roman"/>
           <w:b/>
           <w:i w:val="0"/>
           <w:sz w:val="26"/>
         </w:rPr>
-        <w:t>biết trước</w:t>
-      </w:r>
-      <w:r>
-        <w:rPr>
-          <w:rFonts w:ascii="Times New Roman" w:hAnsi="Times New Roman" w:cs="Times New Roman"/>
-          <w:b w:val="0"/>
-          <w:i w:val="0"/>
-          <w:sz w:val="26"/>
-        </w:rPr>
-        <w:t xml:space="preserve"> dạng lưới waypoint kích thước 5×5 m; đề tài không tự dựng bản đồ môi trường.</w:t>
+        <w:t>Giới hạn về phương pháp định vị:</w:t>
+      </w:r>
+      <w:r>
+        <w:rPr>
+          <w:rFonts w:ascii="Times New Roman" w:hAnsi="Times New Roman" w:cs="Times New Roman"/>
+          <w:b w:val="0"/>
+          <w:i w:val="0"/>
+          <w:sz w:val="26"/>
+        </w:rPr>
+        <w:t xml:space="preserve"> Vị trí và hướng di chuyển của robot được ước lượng dựa trên phương pháp odometry encoder kết hợp dữ liệu IMU. Đề tài chỉ tập trung vào định vị tương đối (dead-reckoning), không nghiên cứu các phương pháp định vị tuyệt đối như GPS hoặc các hệ thống định vị ngoài.</w:t>
       </w:r>
     </w:p>
     <w:p>
@@ -6337,47 +6405,20 @@
       <w:r>
         <w:rPr>
           <w:rFonts w:ascii="Times New Roman" w:hAnsi="Times New Roman" w:cs="Times New Roman"/>
-          <w:b w:val="0"/>
-          <w:i w:val="0"/>
-          <w:sz w:val="26"/>
-        </w:rPr>
-        <w:t xml:space="preserve">Đối tượng là xe </w:t>
-      </w:r>
-      <w:r>
-        <w:rPr>
-          <w:rFonts w:ascii="Times New Roman" w:hAnsi="Times New Roman" w:cs="Times New Roman"/>
           <w:b/>
           <w:i w:val="0"/>
           <w:sz w:val="26"/>
         </w:rPr>
-        <w:t>hai bánh vi sai</w:t>
-      </w:r>
-      <w:r>
-        <w:rPr>
-          <w:rFonts w:ascii="Times New Roman" w:hAnsi="Times New Roman" w:cs="Times New Roman"/>
-          <w:b w:val="0"/>
-          <w:i w:val="0"/>
-          <w:sz w:val="26"/>
-        </w:rPr>
-        <w:t xml:space="preserve">, chạy trong nhà trên </w:t>
-      </w:r>
-      <w:r>
-        <w:rPr>
-          <w:rFonts w:ascii="Times New Roman" w:hAnsi="Times New Roman" w:cs="Times New Roman"/>
-          <w:b/>
-          <w:i w:val="0"/>
-          <w:sz w:val="26"/>
-        </w:rPr>
-        <w:t>mặt sàn phẳng</w:t>
-      </w:r>
-      <w:r>
-        <w:rPr>
-          <w:rFonts w:ascii="Times New Roman" w:hAnsi="Times New Roman" w:cs="Times New Roman"/>
-          <w:b w:val="0"/>
-          <w:i w:val="0"/>
-          <w:sz w:val="26"/>
-        </w:rPr>
-        <w:t>, tốc độ thấp; chưa xét địa hình gồ ghề/dốc.</w:t>
+        <w:t>Giới hạn về thuật toán dẫn đường:</w:t>
+      </w:r>
+      <w:r>
+        <w:rPr>
+          <w:rFonts w:ascii="Times New Roman" w:hAnsi="Times New Roman" w:cs="Times New Roman"/>
+          <w:b w:val="0"/>
+          <w:i w:val="0"/>
+          <w:sz w:val="26"/>
+        </w:rPr>
+        <w:t xml:space="preserve"> Thuật toán tìm đường được giới hạn ở thuật toán A* trên đồ thị waypoint được xây dựng trước. Robot thực hiện di chuyển theo lộ trình đã xác định, chưa xử lý bài toán lập kế hoạch đường đi trong môi trường chưa biết hoặc thay đổi theo thời gian.</w:t>
       </w:r>
     </w:p>
     <w:p>
@@ -6388,29 +6429,20 @@
       <w:r>
         <w:rPr>
           <w:rFonts w:ascii="Times New Roman" w:hAnsi="Times New Roman" w:cs="Times New Roman"/>
-          <w:b w:val="0"/>
-          <w:i w:val="0"/>
-          <w:sz w:val="26"/>
-        </w:rPr>
-        <w:t xml:space="preserve">Cảm biến khoảng cách duy nhất là </w:t>
-      </w:r>
-      <w:r>
-        <w:rPr>
-          <w:rFonts w:ascii="Times New Roman" w:hAnsi="Times New Roman" w:cs="Times New Roman"/>
           <w:b/>
           <w:i w:val="0"/>
           <w:sz w:val="26"/>
         </w:rPr>
-        <w:t>HC-SR04</w:t>
-      </w:r>
-      <w:r>
-        <w:rPr>
-          <w:rFonts w:ascii="Times New Roman" w:hAnsi="Times New Roman" w:cs="Times New Roman"/>
-          <w:b w:val="0"/>
-          <w:i w:val="0"/>
-          <w:sz w:val="26"/>
-        </w:rPr>
-        <w:t xml:space="preserve"> (siêu âm, tầm 2–400 cm) cho né vật cản cơ bản; không dùng cảm biến laser/thị giác.</w:t>
+        <w:t>Giới hạn về môi trường thử nghiệm:</w:t>
+      </w:r>
+      <w:r>
+        <w:rPr>
+          <w:rFonts w:ascii="Times New Roman" w:hAnsi="Times New Roman" w:cs="Times New Roman"/>
+          <w:b w:val="0"/>
+          <w:i w:val="0"/>
+          <w:sz w:val="26"/>
+        </w:rPr>
+        <w:t xml:space="preserve"> Hệ thống được thử nghiệm trong môi trường trong nhà với diện tích giới hạn khoảng 5×5 m, mặt sàn phẳng, ít thay đổi về điều kiện hoạt động. Bản đồ môi trường được biết trước và biểu diễn dưới dạng lưới điểm phục vụ quá trình dẫn đường.</w:t>
       </w:r>
     </w:p>
     <w:p>
@@ -6421,61 +6453,20 @@
       <w:r>
         <w:rPr>
           <w:rFonts w:ascii="Times New Roman" w:hAnsi="Times New Roman" w:cs="Times New Roman"/>
-          <w:b w:val="0"/>
-          <w:i w:val="0"/>
-          <w:sz w:val="26"/>
-        </w:rPr>
-        <w:t xml:space="preserve">Truyền thông qua </w:t>
-      </w:r>
-      <w:r>
-        <w:rPr>
-          <w:rFonts w:ascii="Times New Roman" w:hAnsi="Times New Roman" w:cs="Times New Roman"/>
           <w:b/>
           <w:i w:val="0"/>
           <w:sz w:val="26"/>
         </w:rPr>
-        <w:t>WiFi cục bộ (SoftAP) + UDP</w:t>
-      </w:r>
-      <w:r>
-        <w:rPr>
-          <w:rFonts w:ascii="Times New Roman" w:hAnsi="Times New Roman" w:cs="Times New Roman"/>
-          <w:b w:val="0"/>
-          <w:i w:val="0"/>
-          <w:sz w:val="26"/>
-        </w:rPr>
-        <w:t xml:space="preserve"> phạm vi ngắn, hoạt động độc lập, </w:t>
-      </w:r>
-      <w:r>
-        <w:rPr>
-          <w:rFonts w:ascii="Times New Roman" w:hAnsi="Times New Roman" w:cs="Times New Roman"/>
-          <w:b/>
-          <w:i w:val="0"/>
-          <w:sz w:val="26"/>
-        </w:rPr>
-        <w:t>không</w:t>
-      </w:r>
-      <w:r>
-        <w:rPr>
-          <w:rFonts w:ascii="Times New Roman" w:hAnsi="Times New Roman" w:cs="Times New Roman"/>
-          <w:b w:val="0"/>
-          <w:i w:val="0"/>
-          <w:sz w:val="26"/>
-        </w:rPr>
-        <w:t xml:space="preserve"> qua Internet.</w:t>
-      </w:r>
-    </w:p>
-    <w:p>
-      <w:pPr>
-        <w:jc w:val="both"/>
-      </w:pPr>
-      <w:r>
-        <w:rPr>
-          <w:rFonts w:ascii="Times New Roman" w:hAnsi="Times New Roman" w:cs="Times New Roman"/>
-          <w:b w:val="0"/>
-          <w:i/>
-          <w:sz w:val="26"/>
-        </w:rPr>
-        <w:t>Giới hạn về điều kiện mô phỏng:</w:t>
+        <w:t>Giới hạn về mô phỏng kịch bản hoạt động:</w:t>
+      </w:r>
+      <w:r>
+        <w:rPr>
+          <w:rFonts w:ascii="Times New Roman" w:hAnsi="Times New Roman" w:cs="Times New Roman"/>
+          <w:b w:val="0"/>
+          <w:i w:val="0"/>
+          <w:sz w:val="26"/>
+        </w:rPr>
+        <w:t xml:space="preserve"> Các kịch bản đánh giá tập trung vào khả năng di chuyển đến vị trí mục tiêu, bám theo quỹ đạo đã lập và đánh giá sai số định vị trong điều kiện môi trường kiểm soát. Đề tài chưa xét đến các trường hợp phức tạp như vật cản động, thay đổi bản đồ hoặc nhiều robot phối hợp.</w:t>
       </w:r>
     </w:p>
     <w:p>
@@ -6486,226 +6477,20 @@
       <w:r>
         <w:rPr>
           <w:rFonts w:ascii="Times New Roman" w:hAnsi="Times New Roman" w:cs="Times New Roman"/>
-          <w:b w:val="0"/>
-          <w:i w:val="0"/>
-          <w:sz w:val="26"/>
-        </w:rPr>
-        <w:t xml:space="preserve">Chế độ </w:t>
-      </w:r>
-      <w:r>
-        <w:rPr>
-          <w:rFonts w:ascii="Times New Roman" w:hAnsi="Times New Roman" w:cs="Times New Roman"/>
           <w:b/>
           <w:i w:val="0"/>
           <w:sz w:val="26"/>
         </w:rPr>
-        <w:t>giả lập (simulator)</w:t>
-      </w:r>
-      <w:r>
-        <w:rPr>
-          <w:rFonts w:ascii="Times New Roman" w:hAnsi="Times New Roman" w:cs="Times New Roman"/>
-          <w:b w:val="0"/>
-          <w:i w:val="0"/>
-          <w:sz w:val="26"/>
-        </w:rPr>
-        <w:t xml:space="preserve"> tích hợp trong ứng dụng Flutter, mô phỏng chuyển động xe theo </w:t>
-      </w:r>
-      <w:r>
-        <w:rPr>
-          <w:rFonts w:ascii="Times New Roman" w:hAnsi="Times New Roman" w:cs="Times New Roman"/>
-          <w:b/>
-          <w:i w:val="0"/>
-          <w:sz w:val="26"/>
-        </w:rPr>
-        <w:t>mô hình vi sai lý tưởng</w:t>
-      </w:r>
-      <w:r>
-        <w:rPr>
-          <w:rFonts w:ascii="Times New Roman" w:hAnsi="Times New Roman" w:cs="Times New Roman"/>
-          <w:b w:val="0"/>
-          <w:i w:val="0"/>
-          <w:sz w:val="26"/>
-        </w:rPr>
-        <w:t xml:space="preserve"> — không mô phỏng trượt bánh, nhiễu cảm biến hay sai số cơ khí như thực tế.</w:t>
-      </w:r>
-    </w:p>
-    <w:p>
-      <w:pPr>
-        <w:pStyle w:val="ListBullet"/>
-        <w:ind w:left="425"/>
-      </w:pPr>
-      <w:r>
-        <w:rPr>
-          <w:rFonts w:ascii="Times New Roman" w:hAnsi="Times New Roman" w:cs="Times New Roman"/>
-          <w:b w:val="0"/>
-          <w:i w:val="0"/>
-          <w:sz w:val="26"/>
-        </w:rPr>
-        <w:t xml:space="preserve">Môi trường mô phỏng là </w:t>
-      </w:r>
-      <w:r>
-        <w:rPr>
-          <w:rFonts w:ascii="Times New Roman" w:hAnsi="Times New Roman" w:cs="Times New Roman"/>
-          <w:b/>
-          <w:i w:val="0"/>
-          <w:sz w:val="26"/>
-        </w:rPr>
-        <w:t>lưới waypoint phẳng</w:t>
-      </w:r>
-      <w:r>
-        <w:rPr>
-          <w:rFonts w:ascii="Times New Roman" w:hAnsi="Times New Roman" w:cs="Times New Roman"/>
-          <w:b w:val="0"/>
-          <w:i w:val="0"/>
-          <w:sz w:val="26"/>
-        </w:rPr>
-        <w:t xml:space="preserve">, vật cản </w:t>
-      </w:r>
-      <w:r>
-        <w:rPr>
-          <w:rFonts w:ascii="Times New Roman" w:hAnsi="Times New Roman" w:cs="Times New Roman"/>
-          <w:b/>
-          <w:i w:val="0"/>
-          <w:sz w:val="26"/>
-        </w:rPr>
-        <w:t>tĩnh</w:t>
-      </w:r>
-      <w:r>
-        <w:rPr>
-          <w:rFonts w:ascii="Times New Roman" w:hAnsi="Times New Roman" w:cs="Times New Roman"/>
-          <w:b w:val="0"/>
-          <w:i w:val="0"/>
-          <w:sz w:val="26"/>
-        </w:rPr>
-        <w:t xml:space="preserve"> đặt trước; không mô phỏng động lực học hay vật cản chuyển động phức tạp.</w:t>
-      </w:r>
-    </w:p>
-    <w:p>
-      <w:pPr>
-        <w:pStyle w:val="ListBullet"/>
-        <w:ind w:left="425"/>
-      </w:pPr>
-      <w:r>
-        <w:rPr>
-          <w:rFonts w:ascii="Times New Roman" w:hAnsi="Times New Roman" w:cs="Times New Roman"/>
-          <w:b w:val="0"/>
-          <w:i w:val="0"/>
-          <w:sz w:val="26"/>
-        </w:rPr>
-        <w:t>Mục đích: kiểm thử thuật toán A</w:t>
-      </w:r>
-      <w:r>
-        <w:rPr>
-          <w:rFonts w:ascii="Times New Roman" w:hAnsi="Times New Roman" w:cs="Times New Roman"/>
-          <w:b w:val="0"/>
-          <w:i/>
-          <w:sz w:val="26"/>
-        </w:rPr>
-        <w:t xml:space="preserve">, bộ dựng lộ trình và giao diện </w:t>
-      </w:r>
-      <w:r>
-        <w:rPr>
-          <w:rFonts w:ascii="Times New Roman" w:hAnsi="Times New Roman" w:cs="Times New Roman"/>
-          <w:b w:val="0"/>
-          <w:i/>
-          <w:sz w:val="26"/>
-        </w:rPr>
-        <w:t>trước khi có phần cứng</w:t>
-      </w:r>
-      <w:r>
-        <w:rPr>
-          <w:rFonts w:ascii="Times New Roman" w:hAnsi="Times New Roman" w:cs="Times New Roman"/>
-          <w:b w:val="0"/>
-          <w:i w:val="0"/>
-          <w:sz w:val="26"/>
-        </w:rPr>
-        <w:t>*; kết quả cuối vẫn được kiểm chứng lại trên xe thật.</w:t>
-      </w:r>
-    </w:p>
-    <w:p>
-      <w:pPr>
-        <w:jc w:val="both"/>
-      </w:pPr>
-      <w:r>
-        <w:rPr>
-          <w:rFonts w:ascii="Times New Roman" w:hAnsi="Times New Roman" w:cs="Times New Roman"/>
-          <w:b w:val="0"/>
-          <w:i/>
-          <w:sz w:val="26"/>
-        </w:rPr>
-        <w:t>Kịch bản mô phỏng / thực nghiệm:</w:t>
-      </w:r>
-    </w:p>
-    <w:p>
-      <w:pPr>
-        <w:pStyle w:val="ListBullet"/>
-        <w:ind w:left="425"/>
-      </w:pPr>
-      <w:r>
-        <w:rPr>
-          <w:rFonts w:ascii="Times New Roman" w:hAnsi="Times New Roman" w:cs="Times New Roman"/>
-          <w:b/>
-          <w:i w:val="0"/>
-          <w:sz w:val="26"/>
-        </w:rPr>
-        <w:t>Bám lộ trình:</w:t>
-      </w:r>
-      <w:r>
-        <w:rPr>
-          <w:rFonts w:ascii="Times New Roman" w:hAnsi="Times New Roman" w:cs="Times New Roman"/>
-          <w:b w:val="0"/>
-          <w:i w:val="0"/>
-          <w:sz w:val="26"/>
-        </w:rPr>
-        <w:t xml:space="preserve"> người dùng chạm chọn điểm đích trên bản đồ → ứng dụng tính đường ngắn nhất bằng A* → gửi lộ trình → xe (hoặc sim) bám theo, hiển thị vị trí theo thời gian thực.</w:t>
-      </w:r>
-    </w:p>
-    <w:p>
-      <w:pPr>
-        <w:pStyle w:val="ListBullet"/>
-        <w:ind w:left="425"/>
-      </w:pPr>
-      <w:r>
-        <w:rPr>
-          <w:rFonts w:ascii="Times New Roman" w:hAnsi="Times New Roman" w:cs="Times New Roman"/>
-          <w:b/>
-          <w:i w:val="0"/>
-          <w:sz w:val="26"/>
-        </w:rPr>
-        <w:t>Né vật cản:</w:t>
-      </w:r>
-      <w:r>
-        <w:rPr>
-          <w:rFonts w:ascii="Times New Roman" w:hAnsi="Times New Roman" w:cs="Times New Roman"/>
-          <w:b w:val="0"/>
-          <w:i w:val="0"/>
-          <w:sz w:val="26"/>
-        </w:rPr>
-        <w:t xml:space="preserve"> đặt vật cản trên đường đi → xe phát hiện bằng siêu âm → dừng, quét trái/phải rồi tự rẽ tránh (chế độ tự hành) hoặc chặn cạnh và tính lại đường bằng A* (khi đang bám lộ trình).</w:t>
-      </w:r>
-    </w:p>
-    <w:p>
-      <w:pPr>
-        <w:pStyle w:val="ListBullet"/>
-        <w:ind w:left="425"/>
-      </w:pPr>
-      <w:r>
-        <w:rPr>
-          <w:rFonts w:ascii="Times New Roman" w:hAnsi="Times New Roman" w:cs="Times New Roman"/>
-          <w:b/>
-          <w:i w:val="0"/>
-          <w:sz w:val="26"/>
-        </w:rPr>
-        <w:t>Đánh giá sai số:</w:t>
-      </w:r>
-      <w:r>
-        <w:rPr>
-          <w:rFonts w:ascii="Times New Roman" w:hAnsi="Times New Roman" w:cs="Times New Roman"/>
-          <w:b w:val="0"/>
-          <w:i w:val="0"/>
-          <w:sz w:val="26"/>
-        </w:rPr>
-        <w:t xml:space="preserve"> cho xe chạy quãng đường / góc xoay xác định, so vị trí–hướng ước lượng với giá trị thực để đo sai số định vị.</w:t>
+        <w:t>Các công nghệ chưa được xem xét:</w:t>
+      </w:r>
+      <w:r>
+        <w:rPr>
+          <w:rFonts w:ascii="Times New Roman" w:hAnsi="Times New Roman" w:cs="Times New Roman"/>
+          <w:b w:val="0"/>
+          <w:i w:val="0"/>
+          <w:sz w:val="26"/>
+        </w:rPr>
+        <w:t xml:space="preserve"> Đề tài không sử dụng các công nghệ định vị và nhận thức môi trường nâng cao như LiDAR, camera AI, GPS hoặc thuật toán SLAM xây dựng bản đồ đồng thời.</w:t>
       </w:r>
     </w:p>
     <w:p>
@@ -7922,25 +7707,83 @@
           <w:i w:val="0"/>
           <w:sz w:val="26"/>
         </w:rPr>
-        <w:t xml:space="preserve">Xe robot trong đề tài là loại </w:t>
+        <w:t xml:space="preserve">Xe robot trong đề tài </w:t>
       </w:r>
       <w:r>
         <w:rPr>
           <w:rFonts w:ascii="Times New Roman" w:hAnsi="Times New Roman" w:cs="Times New Roman"/>
           <w:b/>
           <w:i w:val="0"/>
-          <w:sz w:val="26"/>
-        </w:rPr>
-        <w:t>hai bánh vi sai (differential drive)</w:t>
-      </w:r>
-      <w:r>
-        <w:rPr>
-          <w:rFonts w:ascii="Times New Roman" w:hAnsi="Times New Roman" w:cs="Times New Roman"/>
-          <w:b w:val="0"/>
-          <w:i w:val="0"/>
-          <w:sz w:val="26"/>
-        </w:rPr>
-        <w:t xml:space="preserve"> [25], [30]: hai bánh chủ động trái/phải điều khiển độc lập, hướng xe thay đổi nhờ chênh lệch tốc độ hai bánh. </w:t>
+          <w:color w:val="C00000"/>
+          <w:sz w:val="26"/>
+        </w:rPr>
+        <w:t>dẫn động vi sai kiểu skid-steer (differential drive)</w:t>
+      </w:r>
+      <w:r>
+        <w:rPr>
+          <w:rFonts w:ascii="Times New Roman" w:hAnsi="Times New Roman" w:cs="Times New Roman"/>
+          <w:b w:val="0"/>
+          <w:i w:val="0"/>
+          <w:sz w:val="26"/>
+        </w:rPr>
+        <w:t xml:space="preserve"> [25], [30]: </w:t>
+      </w:r>
+      <w:r>
+        <w:rPr>
+          <w:rFonts w:ascii="Times New Roman" w:hAnsi="Times New Roman" w:cs="Times New Roman"/>
+          <w:b w:val="0"/>
+          <w:i w:val="0"/>
+          <w:color w:val="C00000"/>
+          <w:sz w:val="26"/>
+        </w:rPr>
+        <w:t>bốn bánh chia thành hai bên trái/phải, mỗi bên do một nhóm hai động cơ điều khiển độc lập</w:t>
+      </w:r>
+      <w:r>
+        <w:rPr>
+          <w:rFonts w:ascii="Times New Roman" w:hAnsi="Times New Roman" w:cs="Times New Roman"/>
+          <w:b w:val="0"/>
+          <w:i w:val="0"/>
+          <w:sz w:val="26"/>
+        </w:rPr>
+        <w:t xml:space="preserve">, hướng xe thay đổi nhờ chênh lệch tốc độ </w:t>
+      </w:r>
+      <w:r>
+        <w:rPr>
+          <w:rFonts w:ascii="Times New Roman" w:hAnsi="Times New Roman" w:cs="Times New Roman"/>
+          <w:b w:val="0"/>
+          <w:i w:val="0"/>
+          <w:color w:val="C00000"/>
+          <w:sz w:val="26"/>
+        </w:rPr>
+        <w:t>hai bên</w:t>
+      </w:r>
+      <w:r>
+        <w:rPr>
+          <w:rFonts w:ascii="Times New Roman" w:hAnsi="Times New Roman" w:cs="Times New Roman"/>
+          <w:b w:val="0"/>
+          <w:i w:val="0"/>
+          <w:sz w:val="26"/>
+        </w:rPr>
+        <w:t xml:space="preserve">. </w:t>
+      </w:r>
+      <w:r>
+        <w:rPr>
+          <w:rFonts w:ascii="Times New Roman" w:hAnsi="Times New Roman" w:cs="Times New Roman"/>
+          <w:b w:val="0"/>
+          <w:i w:val="0"/>
+          <w:color w:val="C00000"/>
+          <w:sz w:val="26"/>
+        </w:rPr>
+        <w:t>Mỗi bên có một encoder đo quãng đường.</w:t>
+      </w:r>
+      <w:r>
+        <w:rPr>
+          <w:rFonts w:ascii="Times New Roman" w:hAnsi="Times New Roman" w:cs="Times New Roman"/>
+          <w:b w:val="0"/>
+          <w:i w:val="0"/>
+          <w:sz w:val="26"/>
+        </w:rPr>
+        <w:t xml:space="preserve"> </w:t>
       </w:r>
       <w:r>
         <w:rPr>
@@ -7958,7 +7801,36 @@
           <w:i w:val="0"/>
           <w:sz w:val="26"/>
         </w:rPr>
-        <w:t xml:space="preserve"> (đo hành trình) [7], [24] là phương pháp ước lượng vị trí robot bằng cách tích lũy quãng đường mỗi bánh đo được từ encoder.</w:t>
+        <w:t xml:space="preserve"> (đo hành trình) [7], [24] là phương pháp ước lượng vị trí robot bằng cách tích lũy quãng đường </w:t>
+      </w:r>
+      <w:r>
+        <w:rPr>
+          <w:rFonts w:ascii="Times New Roman" w:hAnsi="Times New Roman" w:cs="Times New Roman"/>
+          <w:b w:val="0"/>
+          <w:i w:val="0"/>
+          <w:color w:val="C00000"/>
+          <w:sz w:val="26"/>
+        </w:rPr>
+        <w:t>hai bên</w:t>
+      </w:r>
+      <w:r>
+        <w:rPr>
+          <w:rFonts w:ascii="Times New Roman" w:hAnsi="Times New Roman" w:cs="Times New Roman"/>
+          <w:b w:val="0"/>
+          <w:i w:val="0"/>
+          <w:sz w:val="26"/>
+        </w:rPr>
+        <w:t xml:space="preserve"> đo được từ encoder. </w:t>
+      </w:r>
+      <w:r>
+        <w:rPr>
+          <w:rFonts w:ascii="Times New Roman" w:hAnsi="Times New Roman" w:cs="Times New Roman"/>
+          <w:b w:val="0"/>
+          <w:i w:val="0"/>
+          <w:color w:val="C00000"/>
+          <w:sz w:val="26"/>
+        </w:rPr>
+        <w:t>(Xe bốn bánh skid-steer có hiện tượng trượt ngang khi xoay, được bù bằng IMU — xem mục 2.2.2.)</w:t>
       </w:r>
     </w:p>
     <w:p>
@@ -8008,7 +7880,26 @@
           <w:i w:val="0"/>
           <w:sz w:val="26"/>
         </w:rPr>
-        <w:t xml:space="preserve"> là quãng đường bánh trái/phải đi được trong một chu kỳ, </w:t>
+        <w:t xml:space="preserve"> là quãng đường </w:t>
+      </w:r>
+      <w:r>
+        <w:rPr>
+          <w:rFonts w:ascii="Times New Roman" w:hAnsi="Times New Roman" w:cs="Times New Roman"/>
+          <w:b w:val="0"/>
+          <w:i w:val="0"/>
+          <w:color w:val="C00000"/>
+          <w:sz w:val="26"/>
+        </w:rPr>
+        <w:t>bên</w:t>
+      </w:r>
+      <w:r>
+        <w:rPr>
+          <w:rFonts w:ascii="Times New Roman" w:hAnsi="Times New Roman" w:cs="Times New Roman"/>
+          <w:b w:val="0"/>
+          <w:i w:val="0"/>
+          <w:sz w:val="26"/>
+        </w:rPr>
+        <w:t xml:space="preserve"> trái/phải đi được trong một chu kỳ, </w:t>
       </w:r>
       <w:r>
         <w:rPr>
@@ -8026,7 +7917,26 @@
           <w:i w:val="0"/>
           <w:sz w:val="26"/>
         </w:rPr>
-        <w:t xml:space="preserve"> là khoảng cách giữa hai bánh (wheel base). Khi đó:</w:t>
+        <w:t xml:space="preserve"> là khoảng cách giữa </w:t>
+      </w:r>
+      <w:r>
+        <w:rPr>
+          <w:rFonts w:ascii="Times New Roman" w:hAnsi="Times New Roman" w:cs="Times New Roman"/>
+          <w:b w:val="0"/>
+          <w:i w:val="0"/>
+          <w:color w:val="C00000"/>
+          <w:sz w:val="26"/>
+        </w:rPr>
+        <w:t>hai vệt bánh trái–phải (track width)</w:t>
+      </w:r>
+      <w:r>
+        <w:rPr>
+          <w:rFonts w:ascii="Times New Roman" w:hAnsi="Times New Roman" w:cs="Times New Roman"/>
+          <w:b w:val="0"/>
+          <w:i w:val="0"/>
+          <w:sz w:val="26"/>
+        </w:rPr>
+        <w:t>. Khi đó:</w:t>
       </w:r>
     </w:p>
     <w:p>
@@ -8348,7 +8258,26 @@
           <w:i w:val="0"/>
           <w:sz w:val="26"/>
         </w:rPr>
-        <w:t xml:space="preserve"> (hai bánh quay ngược chiều, encoder không đáng tin) thì dùng </w:t>
+        <w:t xml:space="preserve"> (</w:t>
+      </w:r>
+      <w:r>
+        <w:rPr>
+          <w:rFonts w:ascii="Times New Roman" w:hAnsi="Times New Roman" w:cs="Times New Roman"/>
+          <w:b w:val="0"/>
+          <w:i w:val="0"/>
+          <w:color w:val="C00000"/>
+          <w:sz w:val="26"/>
+        </w:rPr>
+        <w:t>hai bên quay ngược chiều, bánh trượt ngang nên</w:t>
+      </w:r>
+      <w:r>
+        <w:rPr>
+          <w:rFonts w:ascii="Times New Roman" w:hAnsi="Times New Roman" w:cs="Times New Roman"/>
+          <w:b w:val="0"/>
+          <w:i w:val="0"/>
+          <w:sz w:val="26"/>
+        </w:rPr>
+        <w:t xml:space="preserve"> encoder không đáng tin) thì dùng </w:t>
       </w:r>
       <w:r>
         <w:rPr>
@@ -10234,20 +10163,49 @@
       <w:r>
         <w:rPr>
           <w:rFonts w:ascii="Times New Roman" w:hAnsi="Times New Roman" w:cs="Times New Roman"/>
-          <w:b/>
-          <w:i w:val="0"/>
-          <w:sz w:val="26"/>
-        </w:rPr>
-        <w:t>Khối động cơ (L298N + 2 DC motor):</w:t>
-      </w:r>
-      <w:r>
-        <w:rPr>
-          <w:rFonts w:ascii="Times New Roman" w:hAnsi="Times New Roman" w:cs="Times New Roman"/>
-          <w:b w:val="0"/>
-          <w:i w:val="0"/>
-          <w:sz w:val="26"/>
-        </w:rPr>
-        <w:t xml:space="preserve"> nhận tín hiệu PWM + chiều quay từ ESP32 để dẫn động hai bánh chủ động.</w:t>
+          <w:b w:val="0"/>
+          <w:i w:val="0"/>
+          <w:sz w:val="26"/>
+        </w:rPr>
+        <w:t xml:space="preserve">**Khối động cơ (L298N + </w:t>
+      </w:r>
+      <w:r>
+        <w:rPr>
+          <w:rFonts w:ascii="Times New Roman" w:hAnsi="Times New Roman" w:cs="Times New Roman"/>
+          <w:b w:val="0"/>
+          <w:i w:val="0"/>
+          <w:color w:val="C00000"/>
+          <w:sz w:val="26"/>
+        </w:rPr>
+        <w:t>4 DC motor</w:t>
+      </w:r>
+      <w:r>
+        <w:rPr>
+          <w:rFonts w:ascii="Times New Roman" w:hAnsi="Times New Roman" w:cs="Times New Roman"/>
+          <w:b w:val="0"/>
+          <w:i w:val="0"/>
+          <w:sz w:val="26"/>
+        </w:rPr>
+        <w:t xml:space="preserve">):** nhận tín hiệu PWM + chiều quay từ ESP32 để dẫn động </w:t>
+      </w:r>
+      <w:r>
+        <w:rPr>
+          <w:rFonts w:ascii="Times New Roman" w:hAnsi="Times New Roman" w:cs="Times New Roman"/>
+          <w:b w:val="0"/>
+          <w:i w:val="0"/>
+          <w:color w:val="C00000"/>
+          <w:sz w:val="26"/>
+        </w:rPr>
+        <w:t>bốn bánh chủ động, gộp thành hai nhóm trái/phải</w:t>
+      </w:r>
+      <w:r>
+        <w:rPr>
+          <w:rFonts w:ascii="Times New Roman" w:hAnsi="Times New Roman" w:cs="Times New Roman"/>
+          <w:b w:val="0"/>
+          <w:i w:val="0"/>
+          <w:sz w:val="26"/>
+        </w:rPr>
+        <w:t>.</w:t>
       </w:r>
     </w:p>
     <w:p>
@@ -10271,7 +10229,26 @@
           <w:i w:val="0"/>
           <w:sz w:val="26"/>
         </w:rPr>
-        <w:t xml:space="preserve"> đo số vòng/xung quay của từng bánh, cung cấp quãng đường cho odometry.</w:t>
+        <w:t xml:space="preserve"> </w:t>
+      </w:r>
+      <w:r>
+        <w:rPr>
+          <w:rFonts w:ascii="Times New Roman" w:hAnsi="Times New Roman" w:cs="Times New Roman"/>
+          <w:b w:val="0"/>
+          <w:i w:val="0"/>
+          <w:color w:val="C00000"/>
+          <w:sz w:val="26"/>
+        </w:rPr>
+        <w:t>mỗi bên một encoder, đo số vòng/xung quay của bánh bên đó</w:t>
+      </w:r>
+      <w:r>
+        <w:rPr>
+          <w:rFonts w:ascii="Times New Roman" w:hAnsi="Times New Roman" w:cs="Times New Roman"/>
+          <w:b w:val="0"/>
+          <w:i w:val="0"/>
+          <w:sz w:val="26"/>
+        </w:rPr>
+        <w:t>, cung cấp quãng đường cho odometry.</w:t>
       </w:r>
     </w:p>
     <w:p>
@@ -11392,7 +11369,26 @@
           <w:i w:val="0"/>
           <w:sz w:val="26"/>
         </w:rPr>
-        <w:t xml:space="preserve"> đủ chân cho 2 động cơ (6 chân), 2 encoder, I2C, siêu âm, buzzer; có bộ LEDC tạo PWM phần cứng và nhiều chân hỗ trợ ngắt.</w:t>
+        <w:t xml:space="preserve"> đủ chân cho </w:t>
+      </w:r>
+      <w:r>
+        <w:rPr>
+          <w:rFonts w:ascii="Times New Roman" w:hAnsi="Times New Roman" w:cs="Times New Roman"/>
+          <w:b w:val="0"/>
+          <w:i w:val="0"/>
+          <w:color w:val="C00000"/>
+          <w:sz w:val="26"/>
+        </w:rPr>
+        <w:t>2 kênh động cơ</w:t>
+      </w:r>
+      <w:r>
+        <w:rPr>
+          <w:rFonts w:ascii="Times New Roman" w:hAnsi="Times New Roman" w:cs="Times New Roman"/>
+          <w:b w:val="0"/>
+          <w:i w:val="0"/>
+          <w:sz w:val="26"/>
+        </w:rPr>
+        <w:t xml:space="preserve"> (6 chân), 2 encoder, I2C, siêu âm, buzzer; có bộ LEDC tạo PWM phần cứng và nhiều chân hỗ trợ ngắt.</w:t>
       </w:r>
     </w:p>
     <w:p>
@@ -11469,7 +11465,7 @@
           <w:i w:val="0"/>
           <w:sz w:val="28"/>
         </w:rPr>
-        <w:t>3.2.2 Khối động cơ (mạch lái L298N + 2 động cơ DC)</w:t>
+        <w:t>3.2.2 Khối động cơ (mạch lái L298N + 4 động cơ DC)</w:t>
       </w:r>
     </w:p>
     <w:p>
@@ -11492,7 +11488,26 @@
           <w:i w:val="0"/>
           <w:sz w:val="26"/>
         </w:rPr>
-        <w:t xml:space="preserve"> chuyển tín hiệu điều khiển logic của ESP32 thành dòng đủ lớn để quay hai động cơ DC.</w:t>
+        <w:t xml:space="preserve"> chuyển tín hiệu điều khiển logic của ESP32 thành dòng đủ lớn để quay </w:t>
+      </w:r>
+      <w:r>
+        <w:rPr>
+          <w:rFonts w:ascii="Times New Roman" w:hAnsi="Times New Roman" w:cs="Times New Roman"/>
+          <w:b w:val="0"/>
+          <w:i w:val="0"/>
+          <w:color w:val="C00000"/>
+          <w:sz w:val="26"/>
+        </w:rPr>
+        <w:t>bốn động cơ DC, gộp thành hai nhóm trái/phải</w:t>
+      </w:r>
+      <w:r>
+        <w:rPr>
+          <w:rFonts w:ascii="Times New Roman" w:hAnsi="Times New Roman" w:cs="Times New Roman"/>
+          <w:b w:val="0"/>
+          <w:i w:val="0"/>
+          <w:sz w:val="26"/>
+        </w:rPr>
+        <w:t>.</w:t>
       </w:r>
     </w:p>
     <w:p>
@@ -11533,7 +11548,46 @@
           <w:i w:val="0"/>
           <w:sz w:val="26"/>
         </w:rPr>
-        <w:t xml:space="preserve"> (mạch cầu H đôi) [4]. L298N điều khiển độc lập hai động cơ, mỗi động cơ có 2 chân chiều quay (IN) và 1 chân Enable nhận PWM. So với DRV8833/TB6612, L298N có sẵn, rẻ, chịu dòng tốt, tản nhiệt tích hợp, phù hợp động cơ DC giảm tốc cỡ nhỏ.</w:t>
+        <w:t xml:space="preserve"> (mạch cầu H đôi) [4]. </w:t>
+      </w:r>
+      <w:r>
+        <w:rPr>
+          <w:rFonts w:ascii="Times New Roman" w:hAnsi="Times New Roman" w:cs="Times New Roman"/>
+          <w:b w:val="0"/>
+          <w:i w:val="0"/>
+          <w:color w:val="C00000"/>
+          <w:sz w:val="26"/>
+        </w:rPr>
+        <w:t xml:space="preserve">L298N có hai kênh cầu H điều khiển độc lập hai bên; mỗi bên đấu </w:t>
+      </w:r>
+      <w:r>
+        <w:rPr>
+          <w:rFonts w:ascii="Times New Roman" w:hAnsi="Times New Roman" w:cs="Times New Roman"/>
+          <w:b/>
+          <w:i w:val="0"/>
+          <w:color w:val="C00000"/>
+          <w:sz w:val="26"/>
+        </w:rPr>
+        <w:t>song song hai động cơ</w:t>
+      </w:r>
+      <w:r>
+        <w:rPr>
+          <w:rFonts w:ascii="Times New Roman" w:hAnsi="Times New Roman" w:cs="Times New Roman"/>
+          <w:b w:val="0"/>
+          <w:i w:val="0"/>
+          <w:color w:val="C00000"/>
+          <w:sz w:val="26"/>
+        </w:rPr>
+        <w:t xml:space="preserve"> lên cùng một kênh, dùng 2 chân chiều quay (IN) và 1 chân Enable nhận PWM.</w:t>
+      </w:r>
+      <w:r>
+        <w:rPr>
+          <w:rFonts w:ascii="Times New Roman" w:hAnsi="Times New Roman" w:cs="Times New Roman"/>
+          <w:b w:val="0"/>
+          <w:i w:val="0"/>
+          <w:sz w:val="26"/>
+        </w:rPr>
+        <w:t xml:space="preserve"> So với DRV8833/TB6612, L298N có sẵn, rẻ, chịu dòng tốt, tản nhiệt tích hợp, phù hợp động cơ DC giảm tốc cỡ nhỏ.</w:t>
       </w:r>
     </w:p>
     <w:p>
@@ -11837,7 +11891,26 @@
           <w:i w:val="0"/>
           <w:sz w:val="26"/>
         </w:rPr>
-        <w:t xml:space="preserve"> mỗi bánh có một giá trị tốc độ trong khoảng </w:t>
+        <w:t xml:space="preserve"> mỗi </w:t>
+      </w:r>
+      <w:r>
+        <w:rPr>
+          <w:rFonts w:ascii="Times New Roman" w:hAnsi="Times New Roman" w:cs="Times New Roman"/>
+          <w:b w:val="0"/>
+          <w:i w:val="0"/>
+          <w:color w:val="C00000"/>
+          <w:sz w:val="26"/>
+        </w:rPr>
+        <w:t>bên</w:t>
+      </w:r>
+      <w:r>
+        <w:rPr>
+          <w:rFonts w:ascii="Times New Roman" w:hAnsi="Times New Roman" w:cs="Times New Roman"/>
+          <w:b w:val="0"/>
+          <w:i w:val="0"/>
+          <w:sz w:val="26"/>
+        </w:rPr>
+        <w:t xml:space="preserve"> có một giá trị tốc độ trong khoảng </w:t>
       </w:r>
       <w:r>
         <w:rPr>
@@ -11902,7 +11975,26 @@
           <w:i w:val="0"/>
           <w:sz w:val="26"/>
         </w:rPr>
-        <w:t>IN1 = GPIO12, IN2 = GPIO13, ENA = GPIO14 (động cơ trái).</w:t>
+        <w:t>IN1 = GPIO12, IN2 = GPIO13, ENA = GPIO14 (</w:t>
+      </w:r>
+      <w:r>
+        <w:rPr>
+          <w:rFonts w:ascii="Times New Roman" w:hAnsi="Times New Roman" w:cs="Times New Roman"/>
+          <w:b w:val="0"/>
+          <w:i w:val="0"/>
+          <w:color w:val="C00000"/>
+          <w:sz w:val="26"/>
+        </w:rPr>
+        <w:t>nhóm động cơ bên trái</w:t>
+      </w:r>
+      <w:r>
+        <w:rPr>
+          <w:rFonts w:ascii="Times New Roman" w:hAnsi="Times New Roman" w:cs="Times New Roman"/>
+          <w:b w:val="0"/>
+          <w:i w:val="0"/>
+          <w:sz w:val="26"/>
+        </w:rPr>
+        <w:t>).</w:t>
       </w:r>
     </w:p>
     <w:p>
@@ -11917,7 +12009,26 @@
           <w:i w:val="0"/>
           <w:sz w:val="26"/>
         </w:rPr>
-        <w:t>IN3 = GPIO26, IN4 = GPIO27, ENB = GPIO25 (động cơ phải).</w:t>
+        <w:t>IN3 = GPIO26, IN4 = GPIO27, ENB = GPIO25 (</w:t>
+      </w:r>
+      <w:r>
+        <w:rPr>
+          <w:rFonts w:ascii="Times New Roman" w:hAnsi="Times New Roman" w:cs="Times New Roman"/>
+          <w:b w:val="0"/>
+          <w:i w:val="0"/>
+          <w:color w:val="C00000"/>
+          <w:sz w:val="26"/>
+        </w:rPr>
+        <w:t>nhóm động cơ bên phải</w:t>
+      </w:r>
+      <w:r>
+        <w:rPr>
+          <w:rFonts w:ascii="Times New Roman" w:hAnsi="Times New Roman" w:cs="Times New Roman"/>
+          <w:b w:val="0"/>
+          <w:i w:val="0"/>
+          <w:sz w:val="26"/>
+        </w:rPr>
+        <w:t>).</w:t>
       </w:r>
     </w:p>
     <w:p>
@@ -11961,11 +12072,30 @@
       <w:r>
         <w:rPr>
           <w:rFonts w:ascii="Times New Roman" w:hAnsi="Times New Roman" w:cs="Times New Roman"/>
-          <w:b/>
-          <w:i w:val="0"/>
-          <w:sz w:val="26"/>
-        </w:rPr>
-        <w:t>[CHÈN HÌNH 3.4 — Sơ đồ kết nối ESP32 - L298N - hai động cơ DC]</w:t>
+          <w:b w:val="0"/>
+          <w:i w:val="0"/>
+          <w:sz w:val="26"/>
+        </w:rPr>
+        <w:t xml:space="preserve">**[CHÈN HÌNH 3.4 — Sơ đồ kết nối ESP32 - L298N - </w:t>
+      </w:r>
+      <w:r>
+        <w:rPr>
+          <w:rFonts w:ascii="Times New Roman" w:hAnsi="Times New Roman" w:cs="Times New Roman"/>
+          <w:b w:val="0"/>
+          <w:i w:val="0"/>
+          <w:color w:val="C00000"/>
+          <w:sz w:val="26"/>
+        </w:rPr>
+        <w:t>bốn động cơ DC (hai nhóm trái/phải)</w:t>
+      </w:r>
+      <w:r>
+        <w:rPr>
+          <w:rFonts w:ascii="Times New Roman" w:hAnsi="Times New Roman" w:cs="Times New Roman"/>
+          <w:b w:val="0"/>
+          <w:i w:val="0"/>
+          <w:sz w:val="26"/>
+        </w:rPr>
+        <w:t>]**</w:t>
       </w:r>
     </w:p>
     <w:p>
@@ -16821,9 +16951,10 @@
                 <w:rFonts w:ascii="Times New Roman" w:hAnsi="Times New Roman" w:cs="Times New Roman"/>
                 <w:b w:val="0"/>
                 <w:i w:val="0"/>
-                <w:sz w:val="24"/>
-              </w:rPr>
-              <w:t>Wheel base</w:t>
+                <w:color w:val="C00000"/>
+                <w:sz w:val="24"/>
+              </w:rPr>
+              <w:t>Track width</w:t>
             </w:r>
           </w:p>
         </w:tc>
@@ -16861,9 +16992,19 @@
                 <w:rFonts w:ascii="Times New Roman" w:hAnsi="Times New Roman" w:cs="Times New Roman"/>
                 <w:b w:val="0"/>
                 <w:i w:val="0"/>
-                <w:sz w:val="24"/>
-              </w:rPr>
-              <w:t>Khoảng cách 2 bánh (tính góc quay)</w:t>
+                <w:color w:val="C00000"/>
+                <w:sz w:val="24"/>
+              </w:rPr>
+              <w:t>Khoảng cách hai vệt bánh trái–phải</w:t>
+            </w:r>
+            <w:r>
+              <w:rPr>
+                <w:rFonts w:ascii="Times New Roman" w:hAnsi="Times New Roman" w:cs="Times New Roman"/>
+                <w:b w:val="0"/>
+                <w:i w:val="0"/>
+                <w:sz w:val="24"/>
+              </w:rPr>
+              <w:t xml:space="preserve"> (tính góc quay)</w:t>
             </w:r>
           </w:p>
         </w:tc>
@@ -17981,7 +18122,26 @@
           <w:i w:val="0"/>
           <w:sz w:val="26"/>
         </w:rPr>
-        <w:t xml:space="preserve"> (không dùng odometry để tránh vòng lặp phản hồi sai). Hai cơ chế hiệu chỉnh chạy song song: hiệu chỉnh hướng (theo IMU) và cân bằng hai bánh (theo encoder).</w:t>
+        <w:t xml:space="preserve"> (không dùng odometry để tránh vòng lặp phản hồi sai). Hai cơ chế hiệu chỉnh chạy song song: hiệu chỉnh hướng (theo IMU) và cân bằng </w:t>
+      </w:r>
+      <w:r>
+        <w:rPr>
+          <w:rFonts w:ascii="Times New Roman" w:hAnsi="Times New Roman" w:cs="Times New Roman"/>
+          <w:b w:val="0"/>
+          <w:i w:val="0"/>
+          <w:color w:val="C00000"/>
+          <w:sz w:val="26"/>
+        </w:rPr>
+        <w:t>hai bên</w:t>
+      </w:r>
+      <w:r>
+        <w:rPr>
+          <w:rFonts w:ascii="Times New Roman" w:hAnsi="Times New Roman" w:cs="Times New Roman"/>
+          <w:b w:val="0"/>
+          <w:i w:val="0"/>
+          <w:sz w:val="26"/>
+        </w:rPr>
+        <w:t xml:space="preserve"> (theo encoder).</w:t>
       </w:r>
     </w:p>
     <w:p>
@@ -18174,7 +18334,26 @@
           <w:i w:val="0"/>
           <w:sz w:val="26"/>
         </w:rPr>
-        <w:t xml:space="preserve"> sau mỗi đoạn thẳng, firmware so sánh số xung hai bánh để cập nhật hệ số bù động cơ (motor trim) với tốc độ học </w:t>
+        <w:t xml:space="preserve"> sau mỗi đoạn thẳng, firmware so sánh số xung </w:t>
+      </w:r>
+      <w:r>
+        <w:rPr>
+          <w:rFonts w:ascii="Times New Roman" w:hAnsi="Times New Roman" w:cs="Times New Roman"/>
+          <w:b w:val="0"/>
+          <w:i w:val="0"/>
+          <w:color w:val="C00000"/>
+          <w:sz w:val="26"/>
+        </w:rPr>
+        <w:t>hai bên</w:t>
+      </w:r>
+      <w:r>
+        <w:rPr>
+          <w:rFonts w:ascii="Times New Roman" w:hAnsi="Times New Roman" w:cs="Times New Roman"/>
+          <w:b w:val="0"/>
+          <w:i w:val="0"/>
+          <w:sz w:val="26"/>
+        </w:rPr>
+        <w:t xml:space="preserve"> để cập nhật hệ số bù động cơ (motor trim) với tốc độ học </w:t>
       </w:r>
       <w:r>
         <w:rPr>
@@ -18345,7 +18524,26 @@
           <w:i w:val="0"/>
           <w:sz w:val="26"/>
         </w:rPr>
-        <w:t xml:space="preserve"> servo ở giữa (90°), hai bánh chạy tới (PWM 160) đồng thời </w:t>
+        <w:t xml:space="preserve"> servo ở giữa (90°), </w:t>
+      </w:r>
+      <w:r>
+        <w:rPr>
+          <w:rFonts w:ascii="Times New Roman" w:hAnsi="Times New Roman" w:cs="Times New Roman"/>
+          <w:b w:val="0"/>
+          <w:i w:val="0"/>
+          <w:color w:val="C00000"/>
+          <w:sz w:val="26"/>
+        </w:rPr>
+        <w:t>hai bên</w:t>
+      </w:r>
+      <w:r>
+        <w:rPr>
+          <w:rFonts w:ascii="Times New Roman" w:hAnsi="Times New Roman" w:cs="Times New Roman"/>
+          <w:b w:val="0"/>
+          <w:i w:val="0"/>
+          <w:sz w:val="26"/>
+        </w:rPr>
+        <w:t xml:space="preserve"> chạy tới (PWM 160) đồng thời </w:t>
       </w:r>
       <w:r>
         <w:rPr>
@@ -19711,9 +19909,10 @@
                 <w:rFonts w:ascii="Times New Roman" w:hAnsi="Times New Roman" w:cs="Times New Roman"/>
                 <w:b w:val="0"/>
                 <w:i w:val="0"/>
-                <w:sz w:val="24"/>
-              </w:rPr>
-              <w:t>2</w:t>
+                <w:color w:val="C00000"/>
+                <w:sz w:val="24"/>
+              </w:rPr>
+              <w:t>4</w:t>
             </w:r>
           </w:p>
         </w:tc>
@@ -20127,7 +20326,17 @@
                 <w:i w:val="0"/>
                 <w:sz w:val="24"/>
               </w:rPr>
-              <w:t>Khung xe robot 2 bánh + bánh đa hướng (caster)</w:t>
+              <w:t xml:space="preserve">Khung xe robot </w:t>
+            </w:r>
+            <w:r>
+              <w:rPr>
+                <w:rFonts w:ascii="Times New Roman" w:hAnsi="Times New Roman" w:cs="Times New Roman"/>
+                <w:b w:val="0"/>
+                <w:i w:val="0"/>
+                <w:color w:val="C00000"/>
+                <w:sz w:val="24"/>
+              </w:rPr>
+              <w:t>4 bánh</w:t>
             </w:r>
           </w:p>
         </w:tc>
@@ -20264,7 +20473,17 @@
           <w:i w:val="0"/>
           <w:sz w:val="26"/>
         </w:rPr>
-        <w:t xml:space="preserve"> gắn hai động cơ DC giảm tốc và bánh chủ động vào khung, gắn bánh đa hướng đỡ phía sau, lắp đĩa encoder vào trục bánh.</w:t>
+        <w:t xml:space="preserve"> </w:t>
+      </w:r>
+      <w:r>
+        <w:rPr>
+          <w:rFonts w:ascii="Times New Roman" w:hAnsi="Times New Roman" w:cs="Times New Roman"/>
+          <w:b w:val="0"/>
+          <w:i w:val="0"/>
+          <w:color w:val="C00000"/>
+          <w:sz w:val="26"/>
+        </w:rPr>
+        <w:t>gắn bốn động cơ DC giảm tốc và bánh xe vào khung (hai bên, mỗi bên hai bánh), lắp đĩa encoder đo tốc độ mỗi bên.</w:t>
       </w:r>
     </w:p>
     <w:p>
@@ -20348,7 +20567,26 @@
           <w:i w:val="0"/>
           <w:sz w:val="26"/>
         </w:rPr>
-        <w:t xml:space="preserve"> 6 dây điều khiển ESP32 → L298N; ngõ ra động lực L298N → 2 động cơ; 2 dây tín hiệu encoder → GPIO34/32; I2C MPU-6050 → GPIO21/22; Trig/Echo → GPIO5/18; tín hiệu servo → GPIO19; buzzer → GPIO4. </w:t>
+        <w:t xml:space="preserve"> 6 dây điều khiển ESP32 → L298N; ngõ ra động lực L298N → </w:t>
+      </w:r>
+      <w:r>
+        <w:rPr>
+          <w:rFonts w:ascii="Times New Roman" w:hAnsi="Times New Roman" w:cs="Times New Roman"/>
+          <w:b w:val="0"/>
+          <w:i w:val="0"/>
+          <w:color w:val="C00000"/>
+          <w:sz w:val="26"/>
+        </w:rPr>
+        <w:t>4 động cơ (mỗi kênh nối song song 2 động cơ cùng bên)</w:t>
+      </w:r>
+      <w:r>
+        <w:rPr>
+          <w:rFonts w:ascii="Times New Roman" w:hAnsi="Times New Roman" w:cs="Times New Roman"/>
+          <w:b w:val="0"/>
+          <w:i w:val="0"/>
+          <w:sz w:val="26"/>
+        </w:rPr>
+        <w:t xml:space="preserve">; 2 dây tín hiệu encoder → GPIO34/32; I2C MPU-6050 → GPIO21/22; Trig/Echo → GPIO5/18; tín hiệu servo → GPIO19; buzzer → GPIO4. </w:t>
       </w:r>
       <w:r>
         <w:rPr>
@@ -20724,7 +20962,7 @@
           <w:i w:val="0"/>
           <w:sz w:val="28"/>
         </w:rPr>
-        <w:t>5.1 KẾT QUẢ LÝ THUYẾT</w:t>
+        <w:t>5.1 KẾT QUẢ THỰC HIỆN VÀ THÔNG SỐ ĐẠT ĐƯỢC</w:t>
       </w:r>
     </w:p>
     <w:p>
@@ -20738,7 +20976,7 @@
           <w:i w:val="0"/>
           <w:sz w:val="26"/>
         </w:rPr>
-        <w:t>Sau khi thực hiện đề tài, về mặt lý thuyết đã đạt được:</w:t>
+        <w:t>Đề tài đã hoàn thiện một xe robot tự hành chạy được toàn trình; kết quả thực hiện gắn với các thông số cụ thể đạt được như sau:</w:t>
       </w:r>
     </w:p>
     <w:p>
@@ -20749,29 +20987,39 @@
       <w:r>
         <w:rPr>
           <w:rFonts w:ascii="Times New Roman" w:hAnsi="Times New Roman" w:cs="Times New Roman"/>
-          <w:b w:val="0"/>
-          <w:i w:val="0"/>
-          <w:sz w:val="26"/>
-        </w:rPr>
-        <w:t xml:space="preserve">Nắm vững cách sử dụng ESP32 và các chuẩn giao tiếp </w:t>
-      </w:r>
-      <w:r>
-        <w:rPr>
-          <w:rFonts w:ascii="Times New Roman" w:hAnsi="Times New Roman" w:cs="Times New Roman"/>
           <w:b/>
           <w:i w:val="0"/>
           <w:sz w:val="26"/>
         </w:rPr>
-        <w:t>GPIO, I2C, PWM/LEDC, Trigger-Echo, ngắt ngoài</w:t>
-      </w:r>
-      <w:r>
-        <w:rPr>
-          <w:rFonts w:ascii="Times New Roman" w:hAnsi="Times New Roman" w:cs="Times New Roman"/>
-          <w:b w:val="0"/>
-          <w:i w:val="0"/>
-          <w:sz w:val="26"/>
-        </w:rPr>
-        <w:t xml:space="preserve"> và </w:t>
+        <w:t>Phần cứng:</w:t>
+      </w:r>
+      <w:r>
+        <w:rPr>
+          <w:rFonts w:ascii="Times New Roman" w:hAnsi="Times New Roman" w:cs="Times New Roman"/>
+          <w:b w:val="0"/>
+          <w:i w:val="0"/>
+          <w:sz w:val="26"/>
+        </w:rPr>
+        <w:t xml:space="preserve"> Đã chế tạo xe robot </w:t>
+      </w:r>
+      <w:r>
+        <w:rPr>
+          <w:rFonts w:ascii="Times New Roman" w:hAnsi="Times New Roman" w:cs="Times New Roman"/>
+          <w:b w:val="0"/>
+          <w:i w:val="0"/>
+          <w:color w:val="C00000"/>
+          <w:sz w:val="26"/>
+        </w:rPr>
+        <w:t>bốn bánh dẫn động vi sai kiểu skid-steer</w:t>
+      </w:r>
+      <w:r>
+        <w:rPr>
+          <w:rFonts w:ascii="Times New Roman" w:hAnsi="Times New Roman" w:cs="Times New Roman"/>
+          <w:b w:val="0"/>
+          <w:i w:val="0"/>
+          <w:sz w:val="26"/>
+        </w:rPr>
+        <w:t xml:space="preserve"> điều khiển bằng </w:t>
       </w:r>
       <w:r>
         <w:rPr>
@@ -20780,16 +21028,35 @@
           <w:i w:val="0"/>
           <w:sz w:val="26"/>
         </w:rPr>
-        <w:t>WiFi/UDP</w:t>
-      </w:r>
-      <w:r>
-        <w:rPr>
-          <w:rFonts w:ascii="Times New Roman" w:hAnsi="Times New Roman" w:cs="Times New Roman"/>
-          <w:b w:val="0"/>
-          <w:i w:val="0"/>
-          <w:sz w:val="26"/>
-        </w:rPr>
-        <w:t>; biết tra cứu và áp dụng datasheet (MPU-6050, L298N, HC-SR04).</w:t>
+        <w:t>ESP32-WROOM-32</w:t>
+      </w:r>
+      <w:r>
+        <w:rPr>
+          <w:rFonts w:ascii="Times New Roman" w:hAnsi="Times New Roman" w:cs="Times New Roman"/>
+          <w:b w:val="0"/>
+          <w:i w:val="0"/>
+          <w:sz w:val="26"/>
+        </w:rPr>
+        <w:t xml:space="preserve">, dùng </w:t>
+      </w:r>
+      <w:r>
+        <w:rPr>
+          <w:rFonts w:ascii="Times New Roman" w:hAnsi="Times New Roman" w:cs="Times New Roman"/>
+          <w:b w:val="0"/>
+          <w:i w:val="0"/>
+          <w:color w:val="C00000"/>
+          <w:sz w:val="26"/>
+        </w:rPr>
+        <w:t>bốn động cơ DC giảm tốc (đấu thành hai kênh trái/phải qua mạch cầu L298N), khoảng cách hai vệt bánh 10,5 cm, bánh xe đường kính 6,5 cm</w:t>
+      </w:r>
+      <w:r>
+        <w:rPr>
+          <w:rFonts w:ascii="Times New Roman" w:hAnsi="Times New Roman" w:cs="Times New Roman"/>
+          <w:b w:val="0"/>
+          <w:i w:val="0"/>
+          <w:sz w:val="26"/>
+        </w:rPr>
+        <w:t>.</w:t>
       </w:r>
     </w:p>
     <w:p>
@@ -20800,29 +21067,39 @@
       <w:r>
         <w:rPr>
           <w:rFonts w:ascii="Times New Roman" w:hAnsi="Times New Roman" w:cs="Times New Roman"/>
-          <w:b w:val="0"/>
-          <w:i w:val="0"/>
-          <w:sz w:val="26"/>
-        </w:rPr>
-        <w:t xml:space="preserve">Hiểu và cài đặt được bài toán </w:t>
-      </w:r>
-      <w:r>
-        <w:rPr>
-          <w:rFonts w:ascii="Times New Roman" w:hAnsi="Times New Roman" w:cs="Times New Roman"/>
           <w:b/>
           <w:i w:val="0"/>
           <w:sz w:val="26"/>
         </w:rPr>
-        <w:t>odometry vi sai</w:t>
-      </w:r>
-      <w:r>
-        <w:rPr>
-          <w:rFonts w:ascii="Times New Roman" w:hAnsi="Times New Roman" w:cs="Times New Roman"/>
-          <w:b w:val="0"/>
-          <w:i w:val="0"/>
-          <w:sz w:val="26"/>
-        </w:rPr>
-        <w:t xml:space="preserve"> và </w:t>
+        <w:t>Định vị:</w:t>
+      </w:r>
+      <w:r>
+        <w:rPr>
+          <w:rFonts w:ascii="Times New Roman" w:hAnsi="Times New Roman" w:cs="Times New Roman"/>
+          <w:b w:val="0"/>
+          <w:i w:val="0"/>
+          <w:sz w:val="26"/>
+        </w:rPr>
+        <w:t xml:space="preserve"> Ước lượng vị trí–hướng bằng odometry kết hợp </w:t>
+      </w:r>
+      <w:r>
+        <w:rPr>
+          <w:rFonts w:ascii="Times New Roman" w:hAnsi="Times New Roman" w:cs="Times New Roman"/>
+          <w:b w:val="0"/>
+          <w:i w:val="0"/>
+          <w:color w:val="C00000"/>
+          <w:sz w:val="26"/>
+        </w:rPr>
+        <w:t>hai encoder quang 20 xung/vòng (mỗi bên một encoder, ≈ 1,02 cm/xung, 0,5 m ≈ 49 xung)</w:t>
+      </w:r>
+      <w:r>
+        <w:rPr>
+          <w:rFonts w:ascii="Times New Roman" w:hAnsi="Times New Roman" w:cs="Times New Roman"/>
+          <w:b w:val="0"/>
+          <w:i w:val="0"/>
+          <w:sz w:val="26"/>
+        </w:rPr>
+        <w:t xml:space="preserve"> với IMU </w:t>
       </w:r>
       <w:r>
         <w:rPr>
@@ -20831,6 +21108,24 @@
           <w:i w:val="0"/>
           <w:sz w:val="26"/>
         </w:rPr>
+        <w:t>MPU-6050</w:t>
+      </w:r>
+      <w:r>
+        <w:rPr>
+          <w:rFonts w:ascii="Times New Roman" w:hAnsi="Times New Roman" w:cs="Times New Roman"/>
+          <w:b w:val="0"/>
+          <w:i w:val="0"/>
+          <w:sz w:val="26"/>
+        </w:rPr>
+        <w:t xml:space="preserve"> (gyro trục Z, I2C 50 kHz) qua </w:t>
+      </w:r>
+      <w:r>
+        <w:rPr>
+          <w:rFonts w:ascii="Times New Roman" w:hAnsi="Times New Roman" w:cs="Times New Roman"/>
+          <w:b/>
+          <w:i w:val="0"/>
+          <w:sz w:val="26"/>
+        </w:rPr>
         <w:t>bộ lọc bù</w:t>
       </w:r>
       <w:r>
@@ -20840,7 +21135,26 @@
           <w:i w:val="0"/>
           <w:sz w:val="26"/>
         </w:rPr>
-        <w:t xml:space="preserve"> kết hợp encoder + IMU; hiểu bản chất sai số dead-reckoning và cách giảm thiểu.</w:t>
+        <w:t xml:space="preserve"> hệ số </w:t>
+      </w:r>
+      <w:r>
+        <w:rPr>
+          <w:rFonts w:ascii="Times New Roman" w:hAnsi="Times New Roman" w:cs="Times New Roman"/>
+          <w:b w:val="0"/>
+          <w:i w:val="0"/>
+          <w:color w:val="C00000"/>
+          <w:sz w:val="26"/>
+        </w:rPr>
+        <w:t>α = 0,35 (encoder 65% / IMU 35%)</w:t>
+      </w:r>
+      <w:r>
+        <w:rPr>
+          <w:rFonts w:ascii="Times New Roman" w:hAnsi="Times New Roman" w:cs="Times New Roman"/>
+          <w:b w:val="0"/>
+          <w:i w:val="0"/>
+          <w:sz w:val="26"/>
+        </w:rPr>
+        <w:t>.</w:t>
       </w:r>
     </w:p>
     <w:p>
@@ -20851,19 +21165,28 @@
       <w:r>
         <w:rPr>
           <w:rFonts w:ascii="Times New Roman" w:hAnsi="Times New Roman" w:cs="Times New Roman"/>
-          <w:b w:val="0"/>
-          <w:i w:val="0"/>
-          <w:sz w:val="26"/>
-        </w:rPr>
-        <w:t xml:space="preserve">Cài đặt thành công thuật toán </w:t>
-      </w:r>
-      <w:r>
-        <w:rPr>
-          <w:rFonts w:ascii="Times New Roman" w:hAnsi="Times New Roman" w:cs="Times New Roman"/>
           <w:b/>
           <w:i w:val="0"/>
           <w:sz w:val="26"/>
         </w:rPr>
+        <w:t>Dẫn đường:</w:t>
+      </w:r>
+      <w:r>
+        <w:rPr>
+          <w:rFonts w:ascii="Times New Roman" w:hAnsi="Times New Roman" w:cs="Times New Roman"/>
+          <w:b w:val="0"/>
+          <w:i w:val="0"/>
+          <w:sz w:val="26"/>
+        </w:rPr>
+        <w:t xml:space="preserve"> Tìm đường ngắn nhất bằng thuật toán </w:t>
+      </w:r>
+      <w:r>
+        <w:rPr>
+          <w:rFonts w:ascii="Times New Roman" w:hAnsi="Times New Roman" w:cs="Times New Roman"/>
+          <w:b/>
+          <w:i w:val="0"/>
+          <w:sz w:val="26"/>
+        </w:rPr>
         <w:t>A</w:t>
       </w:r>
       <w:r>
@@ -20873,7 +21196,26 @@
           <w:i w:val="0"/>
           <w:sz w:val="26"/>
         </w:rPr>
-        <w:t>* với heuristic Euclid và chi phí phụ phạt rẽ; hiểu khái niệm heuristic admissible.</w:t>
+        <w:t xml:space="preserve">* trên đồ thị waypoint </w:t>
+      </w:r>
+      <w:r>
+        <w:rPr>
+          <w:rFonts w:ascii="Times New Roman" w:hAnsi="Times New Roman" w:cs="Times New Roman"/>
+          <w:b w:val="0"/>
+          <w:i w:val="0"/>
+          <w:color w:val="C00000"/>
+          <w:sz w:val="26"/>
+        </w:rPr>
+        <w:t>lưới 5×5 m</w:t>
+      </w:r>
+      <w:r>
+        <w:rPr>
+          <w:rFonts w:ascii="Times New Roman" w:hAnsi="Times New Roman" w:cs="Times New Roman"/>
+          <w:b w:val="0"/>
+          <w:i w:val="0"/>
+          <w:sz w:val="26"/>
+        </w:rPr>
+        <w:t xml:space="preserve"> (heuristic Euclid + chi phí phạt rẽ); xe bám lộ trình qua máy trạng thái điều hướng node, giữ hướng bằng IMU và cân bằng hai bên bằng encoder.</w:t>
       </w:r>
     </w:p>
     <w:p>
@@ -20884,29 +21226,130 @@
       <w:r>
         <w:rPr>
           <w:rFonts w:ascii="Times New Roman" w:hAnsi="Times New Roman" w:cs="Times New Roman"/>
-          <w:b w:val="0"/>
-          <w:i w:val="0"/>
-          <w:sz w:val="26"/>
-        </w:rPr>
-        <w:t xml:space="preserve">Thiết kế được </w:t>
-      </w:r>
-      <w:r>
-        <w:rPr>
-          <w:rFonts w:ascii="Times New Roman" w:hAnsi="Times New Roman" w:cs="Times New Roman"/>
           <w:b/>
           <w:i w:val="0"/>
           <w:sz w:val="26"/>
         </w:rPr>
-        <w:t>giao thức UDP</w:t>
-      </w:r>
-      <w:r>
-        <w:rPr>
-          <w:rFonts w:ascii="Times New Roman" w:hAnsi="Times New Roman" w:cs="Times New Roman"/>
-          <w:b w:val="0"/>
-          <w:i w:val="0"/>
-          <w:sz w:val="26"/>
-        </w:rPr>
-        <w:t xml:space="preserve"> thời gian thực với cơ chế chống trùng, chia mảnh và telemetry.</w:t>
+        <w:t>Truyền thông:</w:t>
+      </w:r>
+      <w:r>
+        <w:rPr>
+          <w:rFonts w:ascii="Times New Roman" w:hAnsi="Times New Roman" w:cs="Times New Roman"/>
+          <w:b w:val="0"/>
+          <w:i w:val="0"/>
+          <w:sz w:val="26"/>
+        </w:rPr>
+        <w:t xml:space="preserve"> Liên lạc thời gian thực qua </w:t>
+      </w:r>
+      <w:r>
+        <w:rPr>
+          <w:rFonts w:ascii="Times New Roman" w:hAnsi="Times New Roman" w:cs="Times New Roman"/>
+          <w:b/>
+          <w:i w:val="0"/>
+          <w:sz w:val="26"/>
+        </w:rPr>
+        <w:t>WiFi SoftAP</w:t>
+      </w:r>
+      <w:r>
+        <w:rPr>
+          <w:rFonts w:ascii="Times New Roman" w:hAnsi="Times New Roman" w:cs="Times New Roman"/>
+          <w:b w:val="0"/>
+          <w:i w:val="0"/>
+          <w:sz w:val="26"/>
+        </w:rPr>
+        <w:t xml:space="preserve"> (SSID </w:t>
+      </w:r>
+      <w:r>
+        <w:rPr>
+          <w:rFonts w:ascii="Consolas" w:hAnsi="Consolas" w:cs="Consolas"/>
+          <w:b w:val="0"/>
+          <w:i w:val="0"/>
+          <w:sz w:val="22"/>
+        </w:rPr>
+        <w:t>RobotCar</w:t>
+      </w:r>
+      <w:r>
+        <w:rPr>
+          <w:rFonts w:ascii="Times New Roman" w:hAnsi="Times New Roman" w:cs="Times New Roman"/>
+          <w:b w:val="0"/>
+          <w:i w:val="0"/>
+          <w:sz w:val="26"/>
+        </w:rPr>
+        <w:t xml:space="preserve">, IP </w:t>
+      </w:r>
+      <w:r>
+        <w:rPr>
+          <w:rFonts w:ascii="Consolas" w:hAnsi="Consolas" w:cs="Consolas"/>
+          <w:b w:val="0"/>
+          <w:i w:val="0"/>
+          <w:sz w:val="22"/>
+        </w:rPr>
+        <w:t>192.168.4.1</w:t>
+      </w:r>
+      <w:r>
+        <w:rPr>
+          <w:rFonts w:ascii="Times New Roman" w:hAnsi="Times New Roman" w:cs="Times New Roman"/>
+          <w:b w:val="0"/>
+          <w:i w:val="0"/>
+          <w:sz w:val="26"/>
+        </w:rPr>
+        <w:t xml:space="preserve">) dùng </w:t>
+      </w:r>
+      <w:r>
+        <w:rPr>
+          <w:rFonts w:ascii="Times New Roman" w:hAnsi="Times New Roman" w:cs="Times New Roman"/>
+          <w:b/>
+          <w:i w:val="0"/>
+          <w:sz w:val="26"/>
+        </w:rPr>
+        <w:t>UDP</w:t>
+      </w:r>
+      <w:r>
+        <w:rPr>
+          <w:rFonts w:ascii="Times New Roman" w:hAnsi="Times New Roman" w:cs="Times New Roman"/>
+          <w:b w:val="0"/>
+          <w:i w:val="0"/>
+          <w:sz w:val="26"/>
+        </w:rPr>
+        <w:t xml:space="preserve"> </w:t>
+      </w:r>
+      <w:r>
+        <w:rPr>
+          <w:rFonts w:ascii="Times New Roman" w:hAnsi="Times New Roman" w:cs="Times New Roman"/>
+          <w:b w:val="0"/>
+          <w:i w:val="0"/>
+          <w:color w:val="C00000"/>
+          <w:sz w:val="26"/>
+        </w:rPr>
+        <w:t>cổng 4210 (telemetry 10 Hz) và 4211 (lệnh)</w:t>
+      </w:r>
+      <w:r>
+        <w:rPr>
+          <w:rFonts w:ascii="Times New Roman" w:hAnsi="Times New Roman" w:cs="Times New Roman"/>
+          <w:b w:val="0"/>
+          <w:i w:val="0"/>
+          <w:sz w:val="26"/>
+        </w:rPr>
+        <w:t xml:space="preserve">, vòng điều khiển </w:t>
+      </w:r>
+      <w:r>
+        <w:rPr>
+          <w:rFonts w:ascii="Times New Roman" w:hAnsi="Times New Roman" w:cs="Times New Roman"/>
+          <w:b w:val="0"/>
+          <w:i w:val="0"/>
+          <w:color w:val="C00000"/>
+          <w:sz w:val="26"/>
+        </w:rPr>
+        <w:t>50 Hz (20 ms)</w:t>
+      </w:r>
+      <w:r>
+        <w:rPr>
+          <w:rFonts w:ascii="Times New Roman" w:hAnsi="Times New Roman" w:cs="Times New Roman"/>
+          <w:b w:val="0"/>
+          <w:i w:val="0"/>
+          <w:sz w:val="26"/>
+        </w:rPr>
+        <w:t>, hoạt động độc lập không cần Internet.</w:t>
       </w:r>
     </w:p>
     <w:p>
@@ -20917,29 +21360,75 @@
       <w:r>
         <w:rPr>
           <w:rFonts w:ascii="Times New Roman" w:hAnsi="Times New Roman" w:cs="Times New Roman"/>
-          <w:b w:val="0"/>
-          <w:i w:val="0"/>
-          <w:sz w:val="26"/>
-        </w:rPr>
-        <w:t xml:space="preserve">Cài đặt được </w:t>
-      </w:r>
-      <w:r>
-        <w:rPr>
-          <w:rFonts w:ascii="Times New Roman" w:hAnsi="Times New Roman" w:cs="Times New Roman"/>
           <w:b/>
           <w:i w:val="0"/>
           <w:sz w:val="26"/>
         </w:rPr>
-        <w:t>máy trạng thái né vật cản phản ứng (reactive obstacle avoidance)</w:t>
-      </w:r>
-      <w:r>
-        <w:rPr>
-          <w:rFonts w:ascii="Times New Roman" w:hAnsi="Times New Roman" w:cs="Times New Roman"/>
-          <w:b w:val="0"/>
-          <w:i w:val="0"/>
-          <w:sz w:val="26"/>
-        </w:rPr>
-        <w:t xml:space="preserve"> dựa trên cảm biến siêu âm + servo quét, và điều khiển servo bằng LEDC thô (PWM 50 Hz, 16-bit) — hiểu cách phối hợp nhiều thiết bị trong một vòng lặp thời gian thực mà không nghẽn.</w:t>
+        <w:t>Né vật cản:</w:t>
+      </w:r>
+      <w:r>
+        <w:rPr>
+          <w:rFonts w:ascii="Times New Roman" w:hAnsi="Times New Roman" w:cs="Times New Roman"/>
+          <w:b w:val="0"/>
+          <w:i w:val="0"/>
+          <w:sz w:val="26"/>
+        </w:rPr>
+        <w:t xml:space="preserve"> Chế độ tự hành dùng </w:t>
+      </w:r>
+      <w:r>
+        <w:rPr>
+          <w:rFonts w:ascii="Times New Roman" w:hAnsi="Times New Roman" w:cs="Times New Roman"/>
+          <w:b/>
+          <w:i w:val="0"/>
+          <w:sz w:val="26"/>
+        </w:rPr>
+        <w:t>HC-SR04</w:t>
+      </w:r>
+      <w:r>
+        <w:rPr>
+          <w:rFonts w:ascii="Times New Roman" w:hAnsi="Times New Roman" w:cs="Times New Roman"/>
+          <w:b w:val="0"/>
+          <w:i w:val="0"/>
+          <w:sz w:val="26"/>
+        </w:rPr>
+        <w:t xml:space="preserve"> (tầm 2–400 cm) gắn trên </w:t>
+      </w:r>
+      <w:r>
+        <w:rPr>
+          <w:rFonts w:ascii="Times New Roman" w:hAnsi="Times New Roman" w:cs="Times New Roman"/>
+          <w:b/>
+          <w:i w:val="0"/>
+          <w:sz w:val="26"/>
+        </w:rPr>
+        <w:t>servo SG90</w:t>
+      </w:r>
+      <w:r>
+        <w:rPr>
+          <w:rFonts w:ascii="Times New Roman" w:hAnsi="Times New Roman" w:cs="Times New Roman"/>
+          <w:b w:val="0"/>
+          <w:i w:val="0"/>
+          <w:sz w:val="26"/>
+        </w:rPr>
+        <w:t xml:space="preserve"> quét; </w:t>
+      </w:r>
+      <w:r>
+        <w:rPr>
+          <w:rFonts w:ascii="Times New Roman" w:hAnsi="Times New Roman" w:cs="Times New Roman"/>
+          <w:b w:val="0"/>
+          <w:i w:val="0"/>
+          <w:color w:val="C00000"/>
+          <w:sz w:val="26"/>
+        </w:rPr>
+        <w:t>dừng khi vật cản &lt; 30 cm, yêu cầu khoảng trống ≥ 25 cm cả hai bên mới quay đầu 180°</w:t>
+      </w:r>
+      <w:r>
+        <w:rPr>
+          <w:rFonts w:ascii="Times New Roman" w:hAnsi="Times New Roman" w:cs="Times New Roman"/>
+          <w:b w:val="0"/>
+          <w:i w:val="0"/>
+          <w:sz w:val="26"/>
+        </w:rPr>
+        <w:t>.</w:t>
       </w:r>
     </w:p>
     <w:p>
@@ -20950,19 +21439,71 @@
       <w:r>
         <w:rPr>
           <w:rFonts w:ascii="Times New Roman" w:hAnsi="Times New Roman" w:cs="Times New Roman"/>
-          <w:b w:val="0"/>
-          <w:i w:val="0"/>
-          <w:sz w:val="26"/>
-        </w:rPr>
-        <w:t xml:space="preserve">Biết tổ chức một dự án phần mềm </w:t>
-      </w:r>
-      <w:r>
-        <w:rPr>
-          <w:rFonts w:ascii="Times New Roman" w:hAnsi="Times New Roman" w:cs="Times New Roman"/>
           <w:b/>
           <w:i w:val="0"/>
           <w:sz w:val="26"/>
         </w:rPr>
+        <w:t>Tự hiệu chuẩn:</w:t>
+      </w:r>
+      <w:r>
+        <w:rPr>
+          <w:rFonts w:ascii="Times New Roman" w:hAnsi="Times New Roman" w:cs="Times New Roman"/>
+          <w:b w:val="0"/>
+          <w:i w:val="0"/>
+          <w:sz w:val="26"/>
+        </w:rPr>
+        <w:t xml:space="preserve"> Cơ chế tự hiệu chuẩn (motor trim, tỉ lệ encoder) </w:t>
+      </w:r>
+      <w:r>
+        <w:rPr>
+          <w:rFonts w:ascii="Times New Roman" w:hAnsi="Times New Roman" w:cs="Times New Roman"/>
+          <w:b w:val="0"/>
+          <w:i w:val="0"/>
+          <w:color w:val="C00000"/>
+          <w:sz w:val="26"/>
+        </w:rPr>
+        <w:t>kẹp trong khoảng [0,72–1,28], lưu vào NVS flash mỗi 15 s</w:t>
+      </w:r>
+      <w:r>
+        <w:rPr>
+          <w:rFonts w:ascii="Times New Roman" w:hAnsi="Times New Roman" w:cs="Times New Roman"/>
+          <w:b w:val="0"/>
+          <w:i w:val="0"/>
+          <w:sz w:val="26"/>
+        </w:rPr>
+        <w:t>, giúp xe đi thẳng cân bằng dần và giữ tham số qua các lần khởi động.</w:t>
+      </w:r>
+    </w:p>
+    <w:p>
+      <w:pPr>
+        <w:pStyle w:val="ListBullet"/>
+        <w:ind w:left="425"/>
+      </w:pPr>
+      <w:r>
+        <w:rPr>
+          <w:rFonts w:ascii="Times New Roman" w:hAnsi="Times New Roman" w:cs="Times New Roman"/>
+          <w:b/>
+          <w:i w:val="0"/>
+          <w:sz w:val="26"/>
+        </w:rPr>
+        <w:t>Phần mềm:</w:t>
+      </w:r>
+      <w:r>
+        <w:rPr>
+          <w:rFonts w:ascii="Times New Roman" w:hAnsi="Times New Roman" w:cs="Times New Roman"/>
+          <w:b w:val="0"/>
+          <w:i w:val="0"/>
+          <w:sz w:val="26"/>
+        </w:rPr>
+        <w:t xml:space="preserve"> Tổ chức </w:t>
+      </w:r>
+      <w:r>
+        <w:rPr>
+          <w:rFonts w:ascii="Times New Roman" w:hAnsi="Times New Roman" w:cs="Times New Roman"/>
+          <w:b/>
+          <w:i w:val="0"/>
+          <w:sz w:val="26"/>
+        </w:rPr>
         <w:t>module hóa</w:t>
       </w:r>
       <w:r>
@@ -20972,7 +21513,66 @@
           <w:i w:val="0"/>
           <w:sz w:val="26"/>
         </w:rPr>
-        <w:t xml:space="preserve"> (firmware C++ + app Flutter) kèm kiểm thử đơn vị.</w:t>
+        <w:t xml:space="preserve"> (firmware C++ trên PlatformIO + ứng dụng Flutter đa nền tảng) kèm </w:t>
+      </w:r>
+      <w:r>
+        <w:rPr>
+          <w:rFonts w:ascii="Times New Roman" w:hAnsi="Times New Roman" w:cs="Times New Roman"/>
+          <w:b/>
+          <w:i w:val="0"/>
+          <w:sz w:val="26"/>
+        </w:rPr>
+        <w:t>kiểm thử đơn vị</w:t>
+      </w:r>
+      <w:r>
+        <w:rPr>
+          <w:rFonts w:ascii="Times New Roman" w:hAnsi="Times New Roman" w:cs="Times New Roman"/>
+          <w:b w:val="0"/>
+          <w:i w:val="0"/>
+          <w:sz w:val="26"/>
+        </w:rPr>
+        <w:t xml:space="preserve"> cho A</w:t>
+      </w:r>
+      <w:r>
+        <w:rPr>
+          <w:rFonts w:ascii="Times New Roman" w:hAnsi="Times New Roman" w:cs="Times New Roman"/>
+          <w:b w:val="0"/>
+          <w:i/>
+          <w:sz w:val="26"/>
+        </w:rPr>
+        <w:t xml:space="preserve">, nạp bản đồ, dựng waypoint, phân tích telemetry và toán odometry; có chế độ </w:t>
+      </w:r>
+      <w:r>
+        <w:rPr>
+          <w:rFonts w:ascii="Times New Roman" w:hAnsi="Times New Roman" w:cs="Times New Roman"/>
+          <w:b w:val="0"/>
+          <w:i/>
+          <w:sz w:val="26"/>
+        </w:rPr>
+        <w:t>giả lập</w:t>
+      </w:r>
+      <w:r>
+        <w:rPr>
+          <w:rFonts w:ascii="Times New Roman" w:hAnsi="Times New Roman" w:cs="Times New Roman"/>
+          <w:b w:val="0"/>
+          <w:i w:val="0"/>
+          <w:sz w:val="26"/>
+        </w:rPr>
+        <w:t>* chạy độc lập không cần phần cứng.</w:t>
+      </w:r>
+    </w:p>
+    <w:p>
+      <w:pPr>
+        <w:jc w:val="both"/>
+      </w:pPr>
+      <w:r>
+        <w:rPr>
+          <w:rFonts w:ascii="Times New Roman" w:hAnsi="Times New Roman" w:cs="Times New Roman"/>
+          <w:b w:val="0"/>
+          <w:i w:val="0"/>
+          <w:sz w:val="26"/>
+        </w:rPr>
+        <w:t>Về mặt lý thuyết, qua đó nhóm nắm vững các chuẩn giao tiếp (GPIO, I2C, PWM/LEDC, Trigger-Echo, ngắt ngoài, WiFi/UDP), bài toán odometry vi sai, bộ lọc bù và thuật toán A* (heuristic admissible). Mức sai số định vị định lượng (quãng đường, góc xoay, bám lộ trình) được đo và trình bày chi tiết ở mục 5.2.</w:t>
       </w:r>
     </w:p>
     <w:p>
@@ -25548,6 +26148,784 @@
           <w:sz w:val="26"/>
         </w:rPr>
         <w:t xml:space="preserve"> — tránh được vật ngay trước mặt nhưng chưa lập lại đường đi toàn cục theo bản đồ; siêu âm chỉ "thấy" theo ba hướng quét nên còn điểm mù; bản đồ phải biết trước, chưa tự xây bản đồ. Mức độ áp dụng thực tế còn ở quy mô phòng thí nghiệm, cần mở rộng thêm để đưa vào ứng dụng thực tế.</w:t>
+      </w:r>
+    </w:p>
+    <w:p>
+      <w:pPr>
+        <w:spacing w:before="160" w:after="120"/>
+      </w:pPr>
+      <w:r>
+        <w:rPr>
+          <w:rFonts w:ascii="Times New Roman" w:hAnsi="Times New Roman" w:cs="Times New Roman"/>
+          <w:b/>
+          <w:i w:val="0"/>
+          <w:sz w:val="28"/>
+        </w:rPr>
+        <w:t>5.3.1 Đánh giá mức độ đạt mục tiêu</w:t>
+      </w:r>
+    </w:p>
+    <w:p>
+      <w:pPr>
+        <w:jc w:val="both"/>
+      </w:pPr>
+      <w:r>
+        <w:rPr>
+          <w:rFonts w:ascii="Times New Roman" w:hAnsi="Times New Roman" w:cs="Times New Roman"/>
+          <w:b w:val="0"/>
+          <w:i w:val="0"/>
+          <w:sz w:val="26"/>
+        </w:rPr>
+        <w:t>Đối chiếu trực tiếp với các mục tiêu đề ra ở mục 1.2, kết quả đạt được như sau:</w:t>
+      </w:r>
+    </w:p>
+    <w:p>
+      <w:pPr>
+        <w:spacing w:before="40" w:after="160"/>
+        <w:jc w:val="center"/>
+      </w:pPr>
+      <w:r>
+        <w:rPr>
+          <w:rFonts w:ascii="Times New Roman" w:hAnsi="Times New Roman" w:cs="Times New Roman"/>
+          <w:b/>
+          <w:i w:val="0"/>
+          <w:sz w:val="26"/>
+        </w:rPr>
+        <w:t>Bảng 5.9 — Đánh giá mức độ hoàn thành so với mục tiêu đề ra</w:t>
+      </w:r>
+    </w:p>
+    <w:tbl>
+      <w:tblPr>
+        <w:tblStyle w:val="TableGrid"/>
+        <w:tblW w:type="auto" w:w="0"/>
+        <w:jc w:val="center"/>
+        <w:tblLook w:firstColumn="1" w:firstRow="1" w:lastColumn="0" w:lastRow="0" w:noHBand="0" w:noVBand="1" w:val="04A0"/>
+      </w:tblPr>
+      <w:tblGrid>
+        <w:gridCol w:w="2835"/>
+        <w:gridCol w:w="2835"/>
+        <w:gridCol w:w="2835"/>
+      </w:tblGrid>
+      <w:tr>
+        <w:tc>
+          <w:tcPr>
+            <w:tcW w:type="dxa" w:w="2835"/>
+          </w:tcPr>
+          <w:p>
+            <w:pPr>
+              <w:spacing w:line="240" w:lineRule="auto" w:after="0"/>
+              <w:jc w:val="center"/>
+            </w:pPr>
+            <w:r/>
+            <w:r>
+              <w:rPr>
+                <w:rFonts w:ascii="Times New Roman" w:hAnsi="Times New Roman" w:cs="Times New Roman"/>
+                <w:b/>
+                <w:i w:val="0"/>
+                <w:sz w:val="24"/>
+              </w:rPr>
+              <w:t>Mục tiêu đề ra (mục 1.2)</w:t>
+            </w:r>
+          </w:p>
+        </w:tc>
+        <w:tc>
+          <w:tcPr>
+            <w:tcW w:type="dxa" w:w="2835"/>
+          </w:tcPr>
+          <w:p>
+            <w:pPr>
+              <w:spacing w:line="240" w:lineRule="auto" w:after="0"/>
+              <w:jc w:val="center"/>
+            </w:pPr>
+            <w:r/>
+            <w:r>
+              <w:rPr>
+                <w:rFonts w:ascii="Times New Roman" w:hAnsi="Times New Roman" w:cs="Times New Roman"/>
+                <w:b/>
+                <w:i w:val="0"/>
+                <w:sz w:val="24"/>
+              </w:rPr>
+              <w:t>Mức độ đạt</w:t>
+            </w:r>
+          </w:p>
+        </w:tc>
+        <w:tc>
+          <w:tcPr>
+            <w:tcW w:type="dxa" w:w="2835"/>
+          </w:tcPr>
+          <w:p>
+            <w:pPr>
+              <w:spacing w:line="240" w:lineRule="auto" w:after="0"/>
+              <w:jc w:val="center"/>
+            </w:pPr>
+            <w:r/>
+            <w:r>
+              <w:rPr>
+                <w:rFonts w:ascii="Times New Roman" w:hAnsi="Times New Roman" w:cs="Times New Roman"/>
+                <w:b/>
+                <w:i w:val="0"/>
+                <w:sz w:val="24"/>
+              </w:rPr>
+              <w:t>Minh chứng / căn cứ đánh giá</w:t>
+            </w:r>
+          </w:p>
+        </w:tc>
+      </w:tr>
+      <w:tr>
+        <w:tc>
+          <w:tcPr>
+            <w:tcW w:type="dxa" w:w="2835"/>
+          </w:tcPr>
+          <w:p>
+            <w:pPr>
+              <w:spacing w:line="240" w:lineRule="auto" w:after="0"/>
+            </w:pPr>
+            <w:r/>
+            <w:r>
+              <w:rPr>
+                <w:rFonts w:ascii="Times New Roman" w:hAnsi="Times New Roman" w:cs="Times New Roman"/>
+                <w:b w:val="0"/>
+                <w:i w:val="0"/>
+                <w:sz w:val="24"/>
+              </w:rPr>
+              <w:t>Tự định vị bằng odometry encoder kết hợp IMU</w:t>
+            </w:r>
+          </w:p>
+        </w:tc>
+        <w:tc>
+          <w:tcPr>
+            <w:tcW w:type="dxa" w:w="2835"/>
+          </w:tcPr>
+          <w:p>
+            <w:pPr>
+              <w:spacing w:line="240" w:lineRule="auto" w:after="0"/>
+            </w:pPr>
+            <w:r/>
+            <w:r>
+              <w:rPr>
+                <w:rFonts w:ascii="Times New Roman" w:hAnsi="Times New Roman" w:cs="Times New Roman"/>
+                <w:b w:val="0"/>
+                <w:i w:val="0"/>
+                <w:sz w:val="24"/>
+              </w:rPr>
+              <w:t>Đạt</w:t>
+            </w:r>
+          </w:p>
+        </w:tc>
+        <w:tc>
+          <w:tcPr>
+            <w:tcW w:type="dxa" w:w="2835"/>
+          </w:tcPr>
+          <w:p>
+            <w:pPr>
+              <w:spacing w:line="240" w:lineRule="auto" w:after="0"/>
+            </w:pPr>
+            <w:r/>
+            <w:r>
+              <w:rPr>
+                <w:rFonts w:ascii="Times New Roman" w:hAnsi="Times New Roman" w:cs="Times New Roman"/>
+                <w:b w:val="0"/>
+                <w:i w:val="0"/>
+                <w:sz w:val="24"/>
+              </w:rPr>
+              <w:t>Xe bám lộ trình end-to-end; sai số định lượng đo ở mục 5.2 (Bảng 5.1–5.3)</w:t>
+            </w:r>
+          </w:p>
+        </w:tc>
+      </w:tr>
+      <w:tr>
+        <w:tc>
+          <w:tcPr>
+            <w:tcW w:type="dxa" w:w="2835"/>
+          </w:tcPr>
+          <w:p>
+            <w:pPr>
+              <w:spacing w:line="240" w:lineRule="auto" w:after="0"/>
+            </w:pPr>
+            <w:r/>
+            <w:r>
+              <w:rPr>
+                <w:rFonts w:ascii="Times New Roman" w:hAnsi="Times New Roman" w:cs="Times New Roman"/>
+                <w:b w:val="0"/>
+                <w:i w:val="0"/>
+                <w:sz w:val="24"/>
+              </w:rPr>
+              <w:t>Tự tìm đường bằng A* và bám lộ trình tới đích người dùng chọn</w:t>
+            </w:r>
+          </w:p>
+        </w:tc>
+        <w:tc>
+          <w:tcPr>
+            <w:tcW w:type="dxa" w:w="2835"/>
+          </w:tcPr>
+          <w:p>
+            <w:pPr>
+              <w:spacing w:line="240" w:lineRule="auto" w:after="0"/>
+            </w:pPr>
+            <w:r/>
+            <w:r>
+              <w:rPr>
+                <w:rFonts w:ascii="Times New Roman" w:hAnsi="Times New Roman" w:cs="Times New Roman"/>
+                <w:b w:val="0"/>
+                <w:i w:val="0"/>
+                <w:sz w:val="24"/>
+              </w:rPr>
+              <w:t>Đạt</w:t>
+            </w:r>
+          </w:p>
+        </w:tc>
+        <w:tc>
+          <w:tcPr>
+            <w:tcW w:type="dxa" w:w="2835"/>
+          </w:tcPr>
+          <w:p>
+            <w:pPr>
+              <w:spacing w:line="240" w:lineRule="auto" w:after="0"/>
+            </w:pPr>
+            <w:r/>
+            <w:r>
+              <w:rPr>
+                <w:rFonts w:ascii="Times New Roman" w:hAnsi="Times New Roman" w:cs="Times New Roman"/>
+                <w:b w:val="0"/>
+                <w:i w:val="0"/>
+                <w:sz w:val="24"/>
+              </w:rPr>
+              <w:t>A</w:t>
+            </w:r>
+            <w:r>
+              <w:rPr>
+                <w:rFonts w:ascii="Times New Roman" w:hAnsi="Times New Roman" w:cs="Times New Roman"/>
+                <w:b w:val="0"/>
+                <w:i/>
+                <w:sz w:val="24"/>
+              </w:rPr>
+              <w:t xml:space="preserve"> chạy trên app, xe đi qua các node tới đích; kiểm thử đơn vị A</w:t>
+            </w:r>
+            <w:r>
+              <w:rPr>
+                <w:rFonts w:ascii="Times New Roman" w:hAnsi="Times New Roman" w:cs="Times New Roman"/>
+                <w:b w:val="0"/>
+                <w:i w:val="0"/>
+                <w:sz w:val="24"/>
+              </w:rPr>
+              <w:t xml:space="preserve"> đạt</w:t>
+            </w:r>
+          </w:p>
+        </w:tc>
+      </w:tr>
+      <w:tr>
+        <w:tc>
+          <w:tcPr>
+            <w:tcW w:type="dxa" w:w="2835"/>
+          </w:tcPr>
+          <w:p>
+            <w:pPr>
+              <w:spacing w:line="240" w:lineRule="auto" w:after="0"/>
+            </w:pPr>
+            <w:r/>
+            <w:r>
+              <w:rPr>
+                <w:rFonts w:ascii="Times New Roman" w:hAnsi="Times New Roman" w:cs="Times New Roman"/>
+                <w:b w:val="0"/>
+                <w:i w:val="0"/>
+                <w:sz w:val="24"/>
+              </w:rPr>
+              <w:t>Firmware ESP32 module hóa (động cơ, cảm biến, odometry, điều hướng)</w:t>
+            </w:r>
+          </w:p>
+        </w:tc>
+        <w:tc>
+          <w:tcPr>
+            <w:tcW w:type="dxa" w:w="2835"/>
+          </w:tcPr>
+          <w:p>
+            <w:pPr>
+              <w:spacing w:line="240" w:lineRule="auto" w:after="0"/>
+            </w:pPr>
+            <w:r/>
+            <w:r>
+              <w:rPr>
+                <w:rFonts w:ascii="Times New Roman" w:hAnsi="Times New Roman" w:cs="Times New Roman"/>
+                <w:b w:val="0"/>
+                <w:i w:val="0"/>
+                <w:sz w:val="24"/>
+              </w:rPr>
+              <w:t>Đạt</w:t>
+            </w:r>
+          </w:p>
+        </w:tc>
+        <w:tc>
+          <w:tcPr>
+            <w:tcW w:type="dxa" w:w="2835"/>
+          </w:tcPr>
+          <w:p>
+            <w:pPr>
+              <w:spacing w:line="240" w:lineRule="auto" w:after="0"/>
+            </w:pPr>
+            <w:r/>
+            <w:r>
+              <w:rPr>
+                <w:rFonts w:ascii="Times New Roman" w:hAnsi="Times New Roman" w:cs="Times New Roman"/>
+                <w:b w:val="0"/>
+                <w:i w:val="0"/>
+                <w:sz w:val="24"/>
+              </w:rPr>
+              <w:t>Cấu trúc module hóa + unit test các module thuật toán</w:t>
+            </w:r>
+          </w:p>
+        </w:tc>
+      </w:tr>
+      <w:tr>
+        <w:tc>
+          <w:tcPr>
+            <w:tcW w:type="dxa" w:w="2835"/>
+          </w:tcPr>
+          <w:p>
+            <w:pPr>
+              <w:spacing w:line="240" w:lineRule="auto" w:after="0"/>
+            </w:pPr>
+            <w:r/>
+            <w:r>
+              <w:rPr>
+                <w:rFonts w:ascii="Times New Roman" w:hAnsi="Times New Roman" w:cs="Times New Roman"/>
+                <w:b w:val="0"/>
+                <w:i w:val="0"/>
+                <w:sz w:val="24"/>
+              </w:rPr>
+              <w:t>Ứng dụng Flutter: bản đồ, A*, telemetry thời gian thực</w:t>
+            </w:r>
+          </w:p>
+        </w:tc>
+        <w:tc>
+          <w:tcPr>
+            <w:tcW w:type="dxa" w:w="2835"/>
+          </w:tcPr>
+          <w:p>
+            <w:pPr>
+              <w:spacing w:line="240" w:lineRule="auto" w:after="0"/>
+            </w:pPr>
+            <w:r/>
+            <w:r>
+              <w:rPr>
+                <w:rFonts w:ascii="Times New Roman" w:hAnsi="Times New Roman" w:cs="Times New Roman"/>
+                <w:b w:val="0"/>
+                <w:i w:val="0"/>
+                <w:sz w:val="24"/>
+              </w:rPr>
+              <w:t>Đạt</w:t>
+            </w:r>
+          </w:p>
+        </w:tc>
+        <w:tc>
+          <w:tcPr>
+            <w:tcW w:type="dxa" w:w="2835"/>
+          </w:tcPr>
+          <w:p>
+            <w:pPr>
+              <w:spacing w:line="240" w:lineRule="auto" w:after="0"/>
+            </w:pPr>
+            <w:r/>
+            <w:r>
+              <w:rPr>
+                <w:rFonts w:ascii="Times New Roman" w:hAnsi="Times New Roman" w:cs="Times New Roman"/>
+                <w:b w:val="0"/>
+                <w:i w:val="0"/>
+                <w:sz w:val="24"/>
+              </w:rPr>
+              <w:t>App 4 màn hình, telemetry 10 Hz, có chế độ giả lập</w:t>
+            </w:r>
+          </w:p>
+        </w:tc>
+      </w:tr>
+      <w:tr>
+        <w:tc>
+          <w:tcPr>
+            <w:tcW w:type="dxa" w:w="2835"/>
+          </w:tcPr>
+          <w:p>
+            <w:pPr>
+              <w:spacing w:line="240" w:lineRule="auto" w:after="0"/>
+            </w:pPr>
+            <w:r/>
+            <w:r>
+              <w:rPr>
+                <w:rFonts w:ascii="Times New Roman" w:hAnsi="Times New Roman" w:cs="Times New Roman"/>
+                <w:b w:val="0"/>
+                <w:i w:val="0"/>
+                <w:sz w:val="24"/>
+              </w:rPr>
+              <w:t>Giao thức UDP độ trễ thấp</w:t>
+            </w:r>
+          </w:p>
+        </w:tc>
+        <w:tc>
+          <w:tcPr>
+            <w:tcW w:type="dxa" w:w="2835"/>
+          </w:tcPr>
+          <w:p>
+            <w:pPr>
+              <w:spacing w:line="240" w:lineRule="auto" w:after="0"/>
+            </w:pPr>
+            <w:r/>
+            <w:r>
+              <w:rPr>
+                <w:rFonts w:ascii="Times New Roman" w:hAnsi="Times New Roman" w:cs="Times New Roman"/>
+                <w:b w:val="0"/>
+                <w:i w:val="0"/>
+                <w:sz w:val="24"/>
+              </w:rPr>
+              <w:t>Đạt</w:t>
+            </w:r>
+          </w:p>
+        </w:tc>
+        <w:tc>
+          <w:tcPr>
+            <w:tcW w:type="dxa" w:w="2835"/>
+          </w:tcPr>
+          <w:p>
+            <w:pPr>
+              <w:spacing w:line="240" w:lineRule="auto" w:after="0"/>
+            </w:pPr>
+            <w:r/>
+            <w:r>
+              <w:rPr>
+                <w:rFonts w:ascii="Times New Roman" w:hAnsi="Times New Roman" w:cs="Times New Roman"/>
+                <w:b w:val="0"/>
+                <w:i w:val="0"/>
+                <w:sz w:val="24"/>
+              </w:rPr>
+              <w:t>UDP cổng 4210/4211, chống trùng + chia mảnh lộ trình</w:t>
+            </w:r>
+          </w:p>
+        </w:tc>
+      </w:tr>
+      <w:tr>
+        <w:tc>
+          <w:tcPr>
+            <w:tcW w:type="dxa" w:w="2835"/>
+          </w:tcPr>
+          <w:p>
+            <w:pPr>
+              <w:spacing w:line="240" w:lineRule="auto" w:after="0"/>
+            </w:pPr>
+            <w:r/>
+            <w:r>
+              <w:rPr>
+                <w:rFonts w:ascii="Times New Roman" w:hAnsi="Times New Roman" w:cs="Times New Roman"/>
+                <w:b w:val="0"/>
+                <w:i w:val="0"/>
+                <w:sz w:val="24"/>
+              </w:rPr>
+              <w:t>Tự hiệu chuẩn giảm sai số định vị</w:t>
+            </w:r>
+          </w:p>
+        </w:tc>
+        <w:tc>
+          <w:tcPr>
+            <w:tcW w:type="dxa" w:w="2835"/>
+          </w:tcPr>
+          <w:p>
+            <w:pPr>
+              <w:spacing w:line="240" w:lineRule="auto" w:after="0"/>
+            </w:pPr>
+            <w:r/>
+            <w:r>
+              <w:rPr>
+                <w:rFonts w:ascii="Times New Roman" w:hAnsi="Times New Roman" w:cs="Times New Roman"/>
+                <w:b w:val="0"/>
+                <w:i w:val="0"/>
+                <w:sz w:val="24"/>
+              </w:rPr>
+              <w:t>Đạt một phần</w:t>
+            </w:r>
+          </w:p>
+        </w:tc>
+        <w:tc>
+          <w:tcPr>
+            <w:tcW w:type="dxa" w:w="2835"/>
+          </w:tcPr>
+          <w:p>
+            <w:pPr>
+              <w:spacing w:line="240" w:lineRule="auto" w:after="0"/>
+            </w:pPr>
+            <w:r/>
+            <w:r>
+              <w:rPr>
+                <w:rFonts w:ascii="Times New Roman" w:hAnsi="Times New Roman" w:cs="Times New Roman"/>
+                <w:b w:val="0"/>
+                <w:i w:val="0"/>
+                <w:sz w:val="24"/>
+              </w:rPr>
+              <w:t>Cân bằng đi thẳng cải thiện rõ; sai số tích lũy quãng dài vẫn còn</w:t>
+            </w:r>
+          </w:p>
+        </w:tc>
+      </w:tr>
+      <w:tr>
+        <w:tc>
+          <w:tcPr>
+            <w:tcW w:type="dxa" w:w="2835"/>
+          </w:tcPr>
+          <w:p>
+            <w:pPr>
+              <w:spacing w:line="240" w:lineRule="auto" w:after="0"/>
+            </w:pPr>
+            <w:r/>
+            <w:r>
+              <w:rPr>
+                <w:rFonts w:ascii="Times New Roman" w:hAnsi="Times New Roman" w:cs="Times New Roman"/>
+                <w:b w:val="0"/>
+                <w:i w:val="0"/>
+                <w:sz w:val="24"/>
+              </w:rPr>
+              <w:t>Né vật cản</w:t>
+            </w:r>
+          </w:p>
+        </w:tc>
+        <w:tc>
+          <w:tcPr>
+            <w:tcW w:type="dxa" w:w="2835"/>
+          </w:tcPr>
+          <w:p>
+            <w:pPr>
+              <w:spacing w:line="240" w:lineRule="auto" w:after="0"/>
+            </w:pPr>
+            <w:r/>
+            <w:r>
+              <w:rPr>
+                <w:rFonts w:ascii="Times New Roman" w:hAnsi="Times New Roman" w:cs="Times New Roman"/>
+                <w:b w:val="0"/>
+                <w:i w:val="0"/>
+                <w:sz w:val="24"/>
+              </w:rPr>
+              <w:t>Đạt (mức phản ứng cục bộ)</w:t>
+            </w:r>
+          </w:p>
+        </w:tc>
+        <w:tc>
+          <w:tcPr>
+            <w:tcW w:type="dxa" w:w="2835"/>
+          </w:tcPr>
+          <w:p>
+            <w:pPr>
+              <w:spacing w:line="240" w:lineRule="auto" w:after="0"/>
+            </w:pPr>
+            <w:r/>
+            <w:r>
+              <w:rPr>
+                <w:rFonts w:ascii="Times New Roman" w:hAnsi="Times New Roman" w:cs="Times New Roman"/>
+                <w:b w:val="0"/>
+                <w:i w:val="0"/>
+                <w:sz w:val="24"/>
+              </w:rPr>
+              <w:t>Tự hành tránh được vật trước mặt; chưa lập lại đường toàn cục</w:t>
+            </w:r>
+          </w:p>
+        </w:tc>
+      </w:tr>
+    </w:tbl>
+    <w:p>
+      <w:pPr>
+        <w:spacing w:before="160" w:after="120"/>
+      </w:pPr>
+      <w:r>
+        <w:rPr>
+          <w:rFonts w:ascii="Times New Roman" w:hAnsi="Times New Roman" w:cs="Times New Roman"/>
+          <w:b/>
+          <w:i w:val="0"/>
+          <w:sz w:val="28"/>
+        </w:rPr>
+        <w:t>5.3.2 Đánh giá chung</w:t>
+      </w:r>
+    </w:p>
+    <w:p>
+      <w:pPr>
+        <w:jc w:val="both"/>
+      </w:pPr>
+      <w:r>
+        <w:rPr>
+          <w:rFonts w:ascii="Times New Roman" w:hAnsi="Times New Roman" w:cs="Times New Roman"/>
+          <w:b w:val="0"/>
+          <w:i w:val="0"/>
+          <w:sz w:val="26"/>
+        </w:rPr>
+        <w:t xml:space="preserve">Về </w:t>
+      </w:r>
+      <w:r>
+        <w:rPr>
+          <w:rFonts w:ascii="Times New Roman" w:hAnsi="Times New Roman" w:cs="Times New Roman"/>
+          <w:b/>
+          <w:i w:val="0"/>
+          <w:sz w:val="26"/>
+        </w:rPr>
+        <w:t>chức năng</w:t>
+      </w:r>
+      <w:r>
+        <w:rPr>
+          <w:rFonts w:ascii="Times New Roman" w:hAnsi="Times New Roman" w:cs="Times New Roman"/>
+          <w:b w:val="0"/>
+          <w:i w:val="0"/>
+          <w:sz w:val="26"/>
+        </w:rPr>
+        <w:t xml:space="preserve">, hệ thống đáp ứng đầy đủ các mục tiêu cốt lõi của đề tài (định vị – tìm đường – bám lộ trình – truyền thông – giao diện); các tính năng bắt buộc đều chạy được ổn định, chỉ nhóm tính năng "nâng cao" (tự hiệu chuẩn triệt để, né vật cản toàn cục) đạt ở mức một phần. Theo Bảng 5.8, đa số khối được đánh giá </w:t>
+      </w:r>
+      <w:r>
+        <w:rPr>
+          <w:rFonts w:ascii="Times New Roman" w:hAnsi="Times New Roman" w:cs="Times New Roman"/>
+          <w:b/>
+          <w:i w:val="0"/>
+          <w:sz w:val="26"/>
+        </w:rPr>
+        <w:t>Tốt – Rất tốt</w:t>
+      </w:r>
+      <w:r>
+        <w:rPr>
+          <w:rFonts w:ascii="Times New Roman" w:hAnsi="Times New Roman" w:cs="Times New Roman"/>
+          <w:b w:val="0"/>
+          <w:i w:val="0"/>
+          <w:sz w:val="26"/>
+        </w:rPr>
+        <w:t xml:space="preserve">; hai khối "Khá/một phần" là </w:t>
+      </w:r>
+      <w:r>
+        <w:rPr>
+          <w:rFonts w:ascii="Times New Roman" w:hAnsi="Times New Roman" w:cs="Times New Roman"/>
+          <w:b/>
+          <w:i w:val="0"/>
+          <w:sz w:val="26"/>
+        </w:rPr>
+        <w:t>định vị odometry</w:t>
+      </w:r>
+      <w:r>
+        <w:rPr>
+          <w:rFonts w:ascii="Times New Roman" w:hAnsi="Times New Roman" w:cs="Times New Roman"/>
+          <w:b w:val="0"/>
+          <w:i w:val="0"/>
+          <w:sz w:val="26"/>
+        </w:rPr>
+        <w:t xml:space="preserve"> (sai số tích lũy) và </w:t>
+      </w:r>
+      <w:r>
+        <w:rPr>
+          <w:rFonts w:ascii="Times New Roman" w:hAnsi="Times New Roman" w:cs="Times New Roman"/>
+          <w:b/>
+          <w:i w:val="0"/>
+          <w:sz w:val="26"/>
+        </w:rPr>
+        <w:t>né vật cản</w:t>
+      </w:r>
+      <w:r>
+        <w:rPr>
+          <w:rFonts w:ascii="Times New Roman" w:hAnsi="Times New Roman" w:cs="Times New Roman"/>
+          <w:b w:val="0"/>
+          <w:i w:val="0"/>
+          <w:sz w:val="26"/>
+        </w:rPr>
+        <w:t xml:space="preserve"> (mới ở mức phản ứng).</w:t>
+      </w:r>
+    </w:p>
+    <w:p>
+      <w:pPr>
+        <w:jc w:val="both"/>
+      </w:pPr>
+      <w:r>
+        <w:rPr>
+          <w:rFonts w:ascii="Times New Roman" w:hAnsi="Times New Roman" w:cs="Times New Roman"/>
+          <w:b w:val="0"/>
+          <w:i w:val="0"/>
+          <w:sz w:val="26"/>
+        </w:rPr>
+        <w:t xml:space="preserve">Về </w:t>
+      </w:r>
+      <w:r>
+        <w:rPr>
+          <w:rFonts w:ascii="Times New Roman" w:hAnsi="Times New Roman" w:cs="Times New Roman"/>
+          <w:b/>
+          <w:i w:val="0"/>
+          <w:sz w:val="26"/>
+        </w:rPr>
+        <w:t>độ chính xác</w:t>
+      </w:r>
+      <w:r>
+        <w:rPr>
+          <w:rFonts w:ascii="Times New Roman" w:hAnsi="Times New Roman" w:cs="Times New Roman"/>
+          <w:b w:val="0"/>
+          <w:i w:val="0"/>
+          <w:sz w:val="26"/>
+        </w:rPr>
+        <w:t>, hệ thống đạt yêu cầu trong phạm vi phòng thí nghiệm: ở quãng ngắn và ít lần xoay, sai số vị trí–góc nằm trong ngưỡng chấp nhận (số liệu cụ thể ở mục 5.2); sai số chỉ tăng đáng kể khi quãng đường dài hoặc nhiều lần xoay — đúng bản chất hạn chế của dead-reckoning, và đã được giảm thiểu (không khử hết) bằng bộ lọc bù IMU và tự hiệu chuẩn.</w:t>
+      </w:r>
+    </w:p>
+    <w:p>
+      <w:pPr>
+        <w:jc w:val="both"/>
+      </w:pPr>
+      <w:r>
+        <w:rPr>
+          <w:rFonts w:ascii="Times New Roman" w:hAnsi="Times New Roman" w:cs="Times New Roman"/>
+          <w:b w:val="0"/>
+          <w:i w:val="0"/>
+          <w:sz w:val="26"/>
+        </w:rPr>
+        <w:t xml:space="preserve">Về </w:t>
+      </w:r>
+      <w:r>
+        <w:rPr>
+          <w:rFonts w:ascii="Times New Roman" w:hAnsi="Times New Roman" w:cs="Times New Roman"/>
+          <w:b/>
+          <w:i w:val="0"/>
+          <w:sz w:val="26"/>
+        </w:rPr>
+        <w:t>độ ổn định và chi phí</w:t>
+      </w:r>
+      <w:r>
+        <w:rPr>
+          <w:rFonts w:ascii="Times New Roman" w:hAnsi="Times New Roman" w:cs="Times New Roman"/>
+          <w:b w:val="0"/>
+          <w:i w:val="0"/>
+          <w:sz w:val="26"/>
+        </w:rPr>
+        <w:t>, các khối điều khiển – truyền thông – ứng dụng hoạt động ổn định, độ trễ thấp, độc lập Internet; toàn hệ thống dùng linh kiện phổ thông giá rẻ, phù hợp mục tiêu nền tảng học thuật chi phí thấp.</w:t>
+      </w:r>
+    </w:p>
+    <w:p>
+      <w:pPr>
+        <w:jc w:val="both"/>
+      </w:pPr>
+      <w:r>
+        <w:rPr>
+          <w:rFonts w:ascii="Times New Roman" w:hAnsi="Times New Roman" w:cs="Times New Roman"/>
+          <w:b/>
+          <w:i w:val="0"/>
+          <w:sz w:val="26"/>
+        </w:rPr>
+        <w:t>Kết luận đánh giá:</w:t>
+      </w:r>
+      <w:r>
+        <w:rPr>
+          <w:rFonts w:ascii="Times New Roman" w:hAnsi="Times New Roman" w:cs="Times New Roman"/>
+          <w:b w:val="0"/>
+          <w:i w:val="0"/>
+          <w:sz w:val="26"/>
+        </w:rPr>
+        <w:t xml:space="preserve"> đề tài </w:t>
+      </w:r>
+      <w:r>
+        <w:rPr>
+          <w:rFonts w:ascii="Times New Roman" w:hAnsi="Times New Roman" w:cs="Times New Roman"/>
+          <w:b/>
+          <w:i w:val="0"/>
+          <w:sz w:val="26"/>
+        </w:rPr>
+        <w:t>hoàn thành các mục tiêu đặt ra</w:t>
+      </w:r>
+      <w:r>
+        <w:rPr>
+          <w:rFonts w:ascii="Times New Roman" w:hAnsi="Times New Roman" w:cs="Times New Roman"/>
+          <w:b w:val="0"/>
+          <w:i w:val="0"/>
+          <w:sz w:val="26"/>
+        </w:rPr>
+        <w:t>; các hạn chế còn lại (định vị tuyệt đối, SLAM, lập lại đường toàn cục) đều nằm ngoài phạm vi nghiên cứu đã giới hạn ở mục 1.4 và được đề xuất ở hướng phát triển (Chương 6).</w:t>
       </w:r>
     </w:p>
     <w:p>

</xml_diff>

<commit_message>
report: them muc 4.4 Nhan xet va danh gia ket qua thi cong (Chuong 4)
- Them 4.4 vao cuoi Chuong 4 (Thi cong): nhan xet qua trinh thi cong (co khi, dien, firmware),
  cac su co phat sinh + cach khac phuc (GPIO34 input-only, LM393 nhieu/doi, 4 motor 2 kenh,
  MPU-6050 troi), va danh gia (Bang 4.2 danh gia tung khoi + ket luan dat yeu cau).
- Cap nhat muc luc them 4.4.
- Rebuild HTML/PDF/DOCX.
</commit_message>
<xml_diff>
--- a/docs/bao-cao-xe-tu-hanh.docx
+++ b/docs/bao-cao-xe-tu-hanh.docx
@@ -1071,6 +1071,21 @@
           <w:sz w:val="26"/>
         </w:rPr>
         <w:t>4.3 Lập trình firmware và ứng dụng</w:t>
+      </w:r>
+    </w:p>
+    <w:p>
+      <w:pPr>
+        <w:pStyle w:val="ListBullet"/>
+        <w:ind w:left="652"/>
+      </w:pPr>
+      <w:r>
+        <w:rPr>
+          <w:rFonts w:ascii="Times New Roman" w:hAnsi="Times New Roman" w:cs="Times New Roman"/>
+          <w:b w:val="0"/>
+          <w:i w:val="0"/>
+          <w:sz w:val="26"/>
+        </w:rPr>
+        <w:t>4.4 Nhận xét và đánh giá kết quả thi công</w:t>
       </w:r>
     </w:p>
     <w:p>
@@ -20923,6 +20938,1058 @@
           <w:sz w:val="26"/>
         </w:rPr>
         <w:t>[CHÈN HÌNH 4.2 — Ảnh màn hình bản đồ khi xe đang di chuyển]</w:t>
+      </w:r>
+    </w:p>
+    <w:p>
+      <w:pPr>
+        <w:spacing w:before="240" w:after="120"/>
+      </w:pPr>
+      <w:r>
+        <w:rPr>
+          <w:rFonts w:ascii="Times New Roman" w:hAnsi="Times New Roman" w:cs="Times New Roman"/>
+          <w:b/>
+          <w:i w:val="0"/>
+          <w:sz w:val="28"/>
+        </w:rPr>
+        <w:t>4.4 NHẬN XÉT VÀ ĐÁNH GIÁ KẾT QUẢ THI CÔNG</w:t>
+      </w:r>
+    </w:p>
+    <w:p>
+      <w:pPr>
+        <w:jc w:val="both"/>
+      </w:pPr>
+      <w:r>
+        <w:rPr>
+          <w:rFonts w:ascii="Times New Roman" w:hAnsi="Times New Roman" w:cs="Times New Roman"/>
+          <w:b/>
+          <w:i w:val="0"/>
+          <w:sz w:val="26"/>
+        </w:rPr>
+        <w:t>Nhận xét quá trình thi công:</w:t>
+      </w:r>
+    </w:p>
+    <w:p>
+      <w:pPr>
+        <w:pStyle w:val="ListBullet"/>
+        <w:ind w:left="425"/>
+      </w:pPr>
+      <w:r>
+        <w:rPr>
+          <w:rFonts w:ascii="Times New Roman" w:hAnsi="Times New Roman" w:cs="Times New Roman"/>
+          <w:b/>
+          <w:i w:val="0"/>
+          <w:sz w:val="26"/>
+        </w:rPr>
+        <w:t>Cơ khí:</w:t>
+      </w:r>
+      <w:r>
+        <w:rPr>
+          <w:rFonts w:ascii="Times New Roman" w:hAnsi="Times New Roman" w:cs="Times New Roman"/>
+          <w:b w:val="0"/>
+          <w:i w:val="0"/>
+          <w:sz w:val="26"/>
+        </w:rPr>
+        <w:t xml:space="preserve"> khung xe bốn bánh được lắp chắc chắn, bốn động cơ chia đều hai bên; đĩa encoder gắn đúng trục bánh mỗi bên, quay trơn không cọ. Cụm servo + HC-SR04 đặt cân ở mũi xe, quay quét không vướng dây.</w:t>
+      </w:r>
+    </w:p>
+    <w:p>
+      <w:pPr>
+        <w:pStyle w:val="ListBullet"/>
+        <w:ind w:left="425"/>
+      </w:pPr>
+      <w:r>
+        <w:rPr>
+          <w:rFonts w:ascii="Times New Roman" w:hAnsi="Times New Roman" w:cs="Times New Roman"/>
+          <w:b/>
+          <w:i w:val="0"/>
+          <w:sz w:val="26"/>
+        </w:rPr>
+        <w:t>Điện – đấu nối:</w:t>
+      </w:r>
+      <w:r>
+        <w:rPr>
+          <w:rFonts w:ascii="Times New Roman" w:hAnsi="Times New Roman" w:cs="Times New Roman"/>
+          <w:b w:val="0"/>
+          <w:i w:val="0"/>
+          <w:sz w:val="26"/>
+        </w:rPr>
+        <w:t xml:space="preserve"> đi dây theo Bảng 3.1 gọn gàng, </w:t>
+      </w:r>
+      <w:r>
+        <w:rPr>
+          <w:rFonts w:ascii="Times New Roman" w:hAnsi="Times New Roman" w:cs="Times New Roman"/>
+          <w:b/>
+          <w:i w:val="0"/>
+          <w:sz w:val="26"/>
+        </w:rPr>
+        <w:t>nối chung GND</w:t>
+      </w:r>
+      <w:r>
+        <w:rPr>
+          <w:rFonts w:ascii="Times New Roman" w:hAnsi="Times New Roman" w:cs="Times New Roman"/>
+          <w:b w:val="0"/>
+          <w:i w:val="0"/>
+          <w:sz w:val="26"/>
+        </w:rPr>
+        <w:t xml:space="preserve"> toàn hệ thống; </w:t>
+      </w:r>
+      <w:r>
+        <w:rPr>
+          <w:rFonts w:ascii="Times New Roman" w:hAnsi="Times New Roman" w:cs="Times New Roman"/>
+          <w:b/>
+          <w:i w:val="0"/>
+          <w:sz w:val="26"/>
+        </w:rPr>
+        <w:t>tách riêng dây tín hiệu và dây động lực</w:t>
+      </w:r>
+      <w:r>
+        <w:rPr>
+          <w:rFonts w:ascii="Times New Roman" w:hAnsi="Times New Roman" w:cs="Times New Roman"/>
+          <w:b w:val="0"/>
+          <w:i w:val="0"/>
+          <w:sz w:val="26"/>
+        </w:rPr>
+        <w:t xml:space="preserve"> để giảm nhiễu EMI từ động cơ; nguồn servo có </w:t>
+      </w:r>
+      <w:r>
+        <w:rPr>
+          <w:rFonts w:ascii="Times New Roman" w:hAnsi="Times New Roman" w:cs="Times New Roman"/>
+          <w:b/>
+          <w:i w:val="0"/>
+          <w:sz w:val="26"/>
+        </w:rPr>
+        <w:t>tụ lọc</w:t>
+      </w:r>
+      <w:r>
+        <w:rPr>
+          <w:rFonts w:ascii="Times New Roman" w:hAnsi="Times New Roman" w:cs="Times New Roman"/>
+          <w:b w:val="0"/>
+          <w:i w:val="0"/>
+          <w:sz w:val="26"/>
+        </w:rPr>
+        <w:t xml:space="preserve"> tránh sụt áp gây reset ESP32 khi servo khởi động.</w:t>
+      </w:r>
+    </w:p>
+    <w:p>
+      <w:pPr>
+        <w:pStyle w:val="ListBullet"/>
+        <w:ind w:left="425"/>
+      </w:pPr>
+      <w:r>
+        <w:rPr>
+          <w:rFonts w:ascii="Times New Roman" w:hAnsi="Times New Roman" w:cs="Times New Roman"/>
+          <w:b/>
+          <w:i w:val="0"/>
+          <w:sz w:val="26"/>
+        </w:rPr>
+        <w:t>Firmware &amp; ứng dụng:</w:t>
+      </w:r>
+      <w:r>
+        <w:rPr>
+          <w:rFonts w:ascii="Times New Roman" w:hAnsi="Times New Roman" w:cs="Times New Roman"/>
+          <w:b w:val="0"/>
+          <w:i w:val="0"/>
+          <w:sz w:val="26"/>
+        </w:rPr>
+        <w:t xml:space="preserve"> biên dịch – nạp – chạy trơn tru; kiểm thử từng phần độc lập trước khi tích hợp (môi trường </w:t>
+      </w:r>
+      <w:r>
+        <w:rPr>
+          <w:rFonts w:ascii="Consolas" w:hAnsi="Consolas" w:cs="Consolas"/>
+          <w:b w:val="0"/>
+          <w:i w:val="0"/>
+          <w:sz w:val="22"/>
+        </w:rPr>
+        <w:t>l298n_test</w:t>
+      </w:r>
+      <w:r>
+        <w:rPr>
+          <w:rFonts w:ascii="Times New Roman" w:hAnsi="Times New Roman" w:cs="Times New Roman"/>
+          <w:b w:val="0"/>
+          <w:i w:val="0"/>
+          <w:sz w:val="26"/>
+        </w:rPr>
+        <w:t xml:space="preserve"> cho mạch lái động cơ, unit test cho các module thuật toán).</w:t>
+      </w:r>
+    </w:p>
+    <w:p>
+      <w:pPr>
+        <w:jc w:val="both"/>
+      </w:pPr>
+      <w:r>
+        <w:rPr>
+          <w:rFonts w:ascii="Times New Roman" w:hAnsi="Times New Roman" w:cs="Times New Roman"/>
+          <w:b/>
+          <w:i w:val="0"/>
+          <w:sz w:val="26"/>
+        </w:rPr>
+        <w:t>Các sự cố phát sinh trong thi công và cách khắc phục:</w:t>
+      </w:r>
+    </w:p>
+    <w:p>
+      <w:pPr>
+        <w:pStyle w:val="ListBullet"/>
+        <w:ind w:left="425"/>
+      </w:pPr>
+      <w:r>
+        <w:rPr>
+          <w:rFonts w:ascii="Times New Roman" w:hAnsi="Times New Roman" w:cs="Times New Roman"/>
+          <w:b w:val="0"/>
+          <w:i w:val="0"/>
+          <w:sz w:val="26"/>
+        </w:rPr>
+        <w:t xml:space="preserve">Chân </w:t>
+      </w:r>
+      <w:r>
+        <w:rPr>
+          <w:rFonts w:ascii="Times New Roman" w:hAnsi="Times New Roman" w:cs="Times New Roman"/>
+          <w:b/>
+          <w:i w:val="0"/>
+          <w:sz w:val="26"/>
+        </w:rPr>
+        <w:t>GPIO34/GPIO32 chỉ input</w:t>
+      </w:r>
+      <w:r>
+        <w:rPr>
+          <w:rFonts w:ascii="Times New Roman" w:hAnsi="Times New Roman" w:cs="Times New Roman"/>
+          <w:b w:val="0"/>
+          <w:i w:val="0"/>
+          <w:sz w:val="26"/>
+        </w:rPr>
+        <w:t>, không có điện trở kéo nội bộ → dùng điện trở kéo sẵn trên module encoder.</w:t>
+      </w:r>
+    </w:p>
+    <w:p>
+      <w:pPr>
+        <w:pStyle w:val="ListBullet"/>
+        <w:ind w:left="425"/>
+      </w:pPr>
+      <w:r>
+        <w:rPr>
+          <w:rFonts w:ascii="Times New Roman" w:hAnsi="Times New Roman" w:cs="Times New Roman"/>
+          <w:b/>
+          <w:i w:val="0"/>
+          <w:sz w:val="26"/>
+        </w:rPr>
+        <w:t>Encoder LM393</w:t>
+      </w:r>
+      <w:r>
+        <w:rPr>
+          <w:rFonts w:ascii="Times New Roman" w:hAnsi="Times New Roman" w:cs="Times New Roman"/>
+          <w:b w:val="0"/>
+          <w:i w:val="0"/>
+          <w:sz w:val="26"/>
+        </w:rPr>
+        <w:t xml:space="preserve"> nhạy nhiễu EMI và bị đếm dội ở tốc độ thấp → thêm </w:t>
+      </w:r>
+      <w:r>
+        <w:rPr>
+          <w:rFonts w:ascii="Times New Roman" w:hAnsi="Times New Roman" w:cs="Times New Roman"/>
+          <w:b/>
+          <w:i w:val="0"/>
+          <w:sz w:val="26"/>
+        </w:rPr>
+        <w:t>chống dội phần mềm</w:t>
+      </w:r>
+      <w:r>
+        <w:rPr>
+          <w:rFonts w:ascii="Times New Roman" w:hAnsi="Times New Roman" w:cs="Times New Roman"/>
+          <w:b w:val="0"/>
+          <w:i w:val="0"/>
+          <w:sz w:val="26"/>
+        </w:rPr>
+        <w:t xml:space="preserve"> (bỏ xung cách nhau &lt; 6000 µs) và </w:t>
+      </w:r>
+      <w:r>
+        <w:rPr>
+          <w:rFonts w:ascii="Times New Roman" w:hAnsi="Times New Roman" w:cs="Times New Roman"/>
+          <w:b/>
+          <w:i w:val="0"/>
+          <w:sz w:val="26"/>
+        </w:rPr>
+        <w:t>calibrate số xung/vòng</w:t>
+      </w:r>
+      <w:r>
+        <w:rPr>
+          <w:rFonts w:ascii="Times New Roman" w:hAnsi="Times New Roman" w:cs="Times New Roman"/>
+          <w:b w:val="0"/>
+          <w:i w:val="0"/>
+          <w:sz w:val="26"/>
+        </w:rPr>
+        <w:t xml:space="preserve"> theo lúc xe chạy thật.</w:t>
+      </w:r>
+    </w:p>
+    <w:p>
+      <w:pPr>
+        <w:pStyle w:val="ListBullet"/>
+        <w:ind w:left="425"/>
+      </w:pPr>
+      <w:r>
+        <w:rPr>
+          <w:rFonts w:ascii="Times New Roman" w:hAnsi="Times New Roman" w:cs="Times New Roman"/>
+          <w:b/>
+          <w:i w:val="0"/>
+          <w:sz w:val="26"/>
+        </w:rPr>
+        <w:t>Bốn động cơ đấu hai kênh L298N</w:t>
+      </w:r>
+      <w:r>
+        <w:rPr>
+          <w:rFonts w:ascii="Times New Roman" w:hAnsi="Times New Roman" w:cs="Times New Roman"/>
+          <w:b w:val="0"/>
+          <w:i w:val="0"/>
+          <w:sz w:val="26"/>
+        </w:rPr>
+        <w:t xml:space="preserve"> (mỗi kênh 2 motor song song) làm dòng mỗi kênh tăng → kiểm tra dòng nằm trong giới hạn </w:t>
+      </w:r>
+      <w:r>
+        <w:rPr>
+          <w:rFonts w:ascii="Times New Roman" w:hAnsi="Times New Roman" w:cs="Times New Roman"/>
+          <w:b/>
+          <w:i w:val="0"/>
+          <w:sz w:val="26"/>
+        </w:rPr>
+        <w:t>2 A/kênh</w:t>
+      </w:r>
+      <w:r>
+        <w:rPr>
+          <w:rFonts w:ascii="Times New Roman" w:hAnsi="Times New Roman" w:cs="Times New Roman"/>
+          <w:b w:val="0"/>
+          <w:i w:val="0"/>
+          <w:sz w:val="26"/>
+        </w:rPr>
+        <w:t xml:space="preserve"> của L298N và gắn tản nhiệt.</w:t>
+      </w:r>
+    </w:p>
+    <w:p>
+      <w:pPr>
+        <w:pStyle w:val="ListBullet"/>
+        <w:ind w:left="425"/>
+      </w:pPr>
+      <w:r>
+        <w:rPr>
+          <w:rFonts w:ascii="Times New Roman" w:hAnsi="Times New Roman" w:cs="Times New Roman"/>
+          <w:b/>
+          <w:i w:val="0"/>
+          <w:sz w:val="26"/>
+        </w:rPr>
+        <w:t>MPU-6050</w:t>
+      </w:r>
+      <w:r>
+        <w:rPr>
+          <w:rFonts w:ascii="Times New Roman" w:hAnsi="Times New Roman" w:cs="Times New Roman"/>
+          <w:b w:val="0"/>
+          <w:i w:val="0"/>
+          <w:sz w:val="26"/>
+        </w:rPr>
+        <w:t xml:space="preserve"> trôi nhẹ và nhiễu khi xe rung → đặt IC phẳng gần tâm xe, bật lọc </w:t>
+      </w:r>
+      <w:r>
+        <w:rPr>
+          <w:rFonts w:ascii="Times New Roman" w:hAnsi="Times New Roman" w:cs="Times New Roman"/>
+          <w:b/>
+          <w:i w:val="0"/>
+          <w:sz w:val="26"/>
+        </w:rPr>
+        <w:t>DLPF ~44 Hz</w:t>
+      </w:r>
+      <w:r>
+        <w:rPr>
+          <w:rFonts w:ascii="Times New Roman" w:hAnsi="Times New Roman" w:cs="Times New Roman"/>
+          <w:b w:val="0"/>
+          <w:i w:val="0"/>
+          <w:sz w:val="26"/>
+        </w:rPr>
+        <w:t>, hợp nhất với encoder qua bộ lọc bù.</w:t>
+      </w:r>
+    </w:p>
+    <w:p>
+      <w:pPr>
+        <w:jc w:val="both"/>
+      </w:pPr>
+      <w:r>
+        <w:rPr>
+          <w:rFonts w:ascii="Times New Roman" w:hAnsi="Times New Roman" w:cs="Times New Roman"/>
+          <w:b/>
+          <w:i w:val="0"/>
+          <w:sz w:val="26"/>
+        </w:rPr>
+        <w:t>Đánh giá kết quả thi công:</w:t>
+      </w:r>
+    </w:p>
+    <w:p>
+      <w:pPr>
+        <w:spacing w:before="40" w:after="160"/>
+        <w:jc w:val="center"/>
+      </w:pPr>
+      <w:r>
+        <w:rPr>
+          <w:rFonts w:ascii="Times New Roman" w:hAnsi="Times New Roman" w:cs="Times New Roman"/>
+          <w:b/>
+          <w:i w:val="0"/>
+          <w:sz w:val="26"/>
+        </w:rPr>
+        <w:t>Bảng 4.2 — Đánh giá kết quả thi công từng khối</w:t>
+      </w:r>
+    </w:p>
+    <w:tbl>
+      <w:tblPr>
+        <w:tblStyle w:val="TableGrid"/>
+        <w:tblW w:type="auto" w:w="0"/>
+        <w:jc w:val="center"/>
+        <w:tblLook w:firstColumn="1" w:firstRow="1" w:lastColumn="0" w:lastRow="0" w:noHBand="0" w:noVBand="1" w:val="04A0"/>
+      </w:tblPr>
+      <w:tblGrid>
+        <w:gridCol w:w="2835"/>
+        <w:gridCol w:w="2835"/>
+        <w:gridCol w:w="2835"/>
+      </w:tblGrid>
+      <w:tr>
+        <w:tc>
+          <w:tcPr>
+            <w:tcW w:type="dxa" w:w="2835"/>
+          </w:tcPr>
+          <w:p>
+            <w:pPr>
+              <w:spacing w:line="240" w:lineRule="auto" w:after="0"/>
+              <w:jc w:val="center"/>
+            </w:pPr>
+            <w:r/>
+            <w:r>
+              <w:rPr>
+                <w:rFonts w:ascii="Times New Roman" w:hAnsi="Times New Roman" w:cs="Times New Roman"/>
+                <w:b/>
+                <w:i w:val="0"/>
+                <w:sz w:val="24"/>
+              </w:rPr>
+              <w:t>Khối</w:t>
+            </w:r>
+          </w:p>
+        </w:tc>
+        <w:tc>
+          <w:tcPr>
+            <w:tcW w:type="dxa" w:w="2835"/>
+          </w:tcPr>
+          <w:p>
+            <w:pPr>
+              <w:spacing w:line="240" w:lineRule="auto" w:after="0"/>
+              <w:jc w:val="center"/>
+            </w:pPr>
+            <w:r/>
+            <w:r>
+              <w:rPr>
+                <w:rFonts w:ascii="Times New Roman" w:hAnsi="Times New Roman" w:cs="Times New Roman"/>
+                <w:b/>
+                <w:i w:val="0"/>
+                <w:sz w:val="24"/>
+              </w:rPr>
+              <w:t>Kết quả thi công</w:t>
+            </w:r>
+          </w:p>
+        </w:tc>
+        <w:tc>
+          <w:tcPr>
+            <w:tcW w:type="dxa" w:w="2835"/>
+          </w:tcPr>
+          <w:p>
+            <w:pPr>
+              <w:spacing w:line="240" w:lineRule="auto" w:after="0"/>
+              <w:jc w:val="center"/>
+            </w:pPr>
+            <w:r/>
+            <w:r>
+              <w:rPr>
+                <w:rFonts w:ascii="Times New Roman" w:hAnsi="Times New Roman" w:cs="Times New Roman"/>
+                <w:b/>
+                <w:i w:val="0"/>
+                <w:sz w:val="24"/>
+              </w:rPr>
+              <w:t>Đánh giá</w:t>
+            </w:r>
+          </w:p>
+        </w:tc>
+      </w:tr>
+      <w:tr>
+        <w:tc>
+          <w:tcPr>
+            <w:tcW w:type="dxa" w:w="2835"/>
+          </w:tcPr>
+          <w:p>
+            <w:pPr>
+              <w:spacing w:line="240" w:lineRule="auto" w:after="0"/>
+            </w:pPr>
+            <w:r/>
+            <w:r>
+              <w:rPr>
+                <w:rFonts w:ascii="Times New Roman" w:hAnsi="Times New Roman" w:cs="Times New Roman"/>
+                <w:b w:val="0"/>
+                <w:i w:val="0"/>
+                <w:sz w:val="24"/>
+              </w:rPr>
+              <w:t>Cơ khí khung + 4 bánh + 4 động cơ</w:t>
+            </w:r>
+          </w:p>
+        </w:tc>
+        <w:tc>
+          <w:tcPr>
+            <w:tcW w:type="dxa" w:w="2835"/>
+          </w:tcPr>
+          <w:p>
+            <w:pPr>
+              <w:spacing w:line="240" w:lineRule="auto" w:after="0"/>
+            </w:pPr>
+            <w:r/>
+            <w:r>
+              <w:rPr>
+                <w:rFonts w:ascii="Times New Roman" w:hAnsi="Times New Roman" w:cs="Times New Roman"/>
+                <w:b w:val="0"/>
+                <w:i w:val="0"/>
+                <w:sz w:val="24"/>
+              </w:rPr>
+              <w:t>Lắp hoàn chỉnh, chắc chắn, cân đối</w:t>
+            </w:r>
+          </w:p>
+        </w:tc>
+        <w:tc>
+          <w:tcPr>
+            <w:tcW w:type="dxa" w:w="2835"/>
+          </w:tcPr>
+          <w:p>
+            <w:pPr>
+              <w:spacing w:line="240" w:lineRule="auto" w:after="0"/>
+            </w:pPr>
+            <w:r/>
+            <w:r>
+              <w:rPr>
+                <w:rFonts w:ascii="Times New Roman" w:hAnsi="Times New Roman" w:cs="Times New Roman"/>
+                <w:b w:val="0"/>
+                <w:i w:val="0"/>
+                <w:sz w:val="24"/>
+              </w:rPr>
+              <w:t>Đạt</w:t>
+            </w:r>
+          </w:p>
+        </w:tc>
+      </w:tr>
+      <w:tr>
+        <w:tc>
+          <w:tcPr>
+            <w:tcW w:type="dxa" w:w="2835"/>
+          </w:tcPr>
+          <w:p>
+            <w:pPr>
+              <w:spacing w:line="240" w:lineRule="auto" w:after="0"/>
+            </w:pPr>
+            <w:r/>
+            <w:r>
+              <w:rPr>
+                <w:rFonts w:ascii="Times New Roman" w:hAnsi="Times New Roman" w:cs="Times New Roman"/>
+                <w:b w:val="0"/>
+                <w:i w:val="0"/>
+                <w:sz w:val="24"/>
+              </w:rPr>
+              <w:t>Mạch điều khiển ESP32 + L298N</w:t>
+            </w:r>
+          </w:p>
+        </w:tc>
+        <w:tc>
+          <w:tcPr>
+            <w:tcW w:type="dxa" w:w="2835"/>
+          </w:tcPr>
+          <w:p>
+            <w:pPr>
+              <w:spacing w:line="240" w:lineRule="auto" w:after="0"/>
+            </w:pPr>
+            <w:r/>
+            <w:r>
+              <w:rPr>
+                <w:rFonts w:ascii="Times New Roman" w:hAnsi="Times New Roman" w:cs="Times New Roman"/>
+                <w:b w:val="0"/>
+                <w:i w:val="0"/>
+                <w:sz w:val="24"/>
+              </w:rPr>
+              <w:t>Đấu nối đúng sơ đồ, chạy ổn định</w:t>
+            </w:r>
+          </w:p>
+        </w:tc>
+        <w:tc>
+          <w:tcPr>
+            <w:tcW w:type="dxa" w:w="2835"/>
+          </w:tcPr>
+          <w:p>
+            <w:pPr>
+              <w:spacing w:line="240" w:lineRule="auto" w:after="0"/>
+            </w:pPr>
+            <w:r/>
+            <w:r>
+              <w:rPr>
+                <w:rFonts w:ascii="Times New Roman" w:hAnsi="Times New Roman" w:cs="Times New Roman"/>
+                <w:b w:val="0"/>
+                <w:i w:val="0"/>
+                <w:sz w:val="24"/>
+              </w:rPr>
+              <w:t>Đạt</w:t>
+            </w:r>
+          </w:p>
+        </w:tc>
+      </w:tr>
+      <w:tr>
+        <w:tc>
+          <w:tcPr>
+            <w:tcW w:type="dxa" w:w="2835"/>
+          </w:tcPr>
+          <w:p>
+            <w:pPr>
+              <w:spacing w:line="240" w:lineRule="auto" w:after="0"/>
+            </w:pPr>
+            <w:r/>
+            <w:r>
+              <w:rPr>
+                <w:rFonts w:ascii="Times New Roman" w:hAnsi="Times New Roman" w:cs="Times New Roman"/>
+                <w:b w:val="0"/>
+                <w:i w:val="0"/>
+                <w:sz w:val="24"/>
+              </w:rPr>
+              <w:t>Khối encoder (×2)</w:t>
+            </w:r>
+          </w:p>
+        </w:tc>
+        <w:tc>
+          <w:tcPr>
+            <w:tcW w:type="dxa" w:w="2835"/>
+          </w:tcPr>
+          <w:p>
+            <w:pPr>
+              <w:spacing w:line="240" w:lineRule="auto" w:after="0"/>
+            </w:pPr>
+            <w:r/>
+            <w:r>
+              <w:rPr>
+                <w:rFonts w:ascii="Times New Roman" w:hAnsi="Times New Roman" w:cs="Times New Roman"/>
+                <w:b w:val="0"/>
+                <w:i w:val="0"/>
+                <w:sz w:val="24"/>
+              </w:rPr>
+              <w:t>Đọc xung ổn định sau khi chống dội</w:t>
+            </w:r>
+          </w:p>
+        </w:tc>
+        <w:tc>
+          <w:tcPr>
+            <w:tcW w:type="dxa" w:w="2835"/>
+          </w:tcPr>
+          <w:p>
+            <w:pPr>
+              <w:spacing w:line="240" w:lineRule="auto" w:after="0"/>
+            </w:pPr>
+            <w:r/>
+            <w:r>
+              <w:rPr>
+                <w:rFonts w:ascii="Times New Roman" w:hAnsi="Times New Roman" w:cs="Times New Roman"/>
+                <w:b w:val="0"/>
+                <w:i w:val="0"/>
+                <w:sz w:val="24"/>
+              </w:rPr>
+              <w:t>Đạt (cần calibrate)</w:t>
+            </w:r>
+          </w:p>
+        </w:tc>
+      </w:tr>
+      <w:tr>
+        <w:tc>
+          <w:tcPr>
+            <w:tcW w:type="dxa" w:w="2835"/>
+          </w:tcPr>
+          <w:p>
+            <w:pPr>
+              <w:spacing w:line="240" w:lineRule="auto" w:after="0"/>
+            </w:pPr>
+            <w:r/>
+            <w:r>
+              <w:rPr>
+                <w:rFonts w:ascii="Times New Roman" w:hAnsi="Times New Roman" w:cs="Times New Roman"/>
+                <w:b w:val="0"/>
+                <w:i w:val="0"/>
+                <w:sz w:val="24"/>
+              </w:rPr>
+              <w:t>Khối IMU MPU-6050 (I2C)</w:t>
+            </w:r>
+          </w:p>
+        </w:tc>
+        <w:tc>
+          <w:tcPr>
+            <w:tcW w:type="dxa" w:w="2835"/>
+          </w:tcPr>
+          <w:p>
+            <w:pPr>
+              <w:spacing w:line="240" w:lineRule="auto" w:after="0"/>
+            </w:pPr>
+            <w:r/>
+            <w:r>
+              <w:rPr>
+                <w:rFonts w:ascii="Times New Roman" w:hAnsi="Times New Roman" w:cs="Times New Roman"/>
+                <w:b w:val="0"/>
+                <w:i w:val="0"/>
+                <w:sz w:val="24"/>
+              </w:rPr>
+              <w:t>Giao tiếp ổn định, còn trôi nhẹ</w:t>
+            </w:r>
+          </w:p>
+        </w:tc>
+        <w:tc>
+          <w:tcPr>
+            <w:tcW w:type="dxa" w:w="2835"/>
+          </w:tcPr>
+          <w:p>
+            <w:pPr>
+              <w:spacing w:line="240" w:lineRule="auto" w:after="0"/>
+            </w:pPr>
+            <w:r/>
+            <w:r>
+              <w:rPr>
+                <w:rFonts w:ascii="Times New Roman" w:hAnsi="Times New Roman" w:cs="Times New Roman"/>
+                <w:b w:val="0"/>
+                <w:i w:val="0"/>
+                <w:sz w:val="24"/>
+              </w:rPr>
+              <w:t>Đạt</w:t>
+            </w:r>
+          </w:p>
+        </w:tc>
+      </w:tr>
+      <w:tr>
+        <w:tc>
+          <w:tcPr>
+            <w:tcW w:type="dxa" w:w="2835"/>
+          </w:tcPr>
+          <w:p>
+            <w:pPr>
+              <w:spacing w:line="240" w:lineRule="auto" w:after="0"/>
+            </w:pPr>
+            <w:r/>
+            <w:r>
+              <w:rPr>
+                <w:rFonts w:ascii="Times New Roman" w:hAnsi="Times New Roman" w:cs="Times New Roman"/>
+                <w:b w:val="0"/>
+                <w:i w:val="0"/>
+                <w:sz w:val="24"/>
+              </w:rPr>
+              <w:t>Khối siêu âm HC-SR04 + servo quét</w:t>
+            </w:r>
+          </w:p>
+        </w:tc>
+        <w:tc>
+          <w:tcPr>
+            <w:tcW w:type="dxa" w:w="2835"/>
+          </w:tcPr>
+          <w:p>
+            <w:pPr>
+              <w:spacing w:line="240" w:lineRule="auto" w:after="0"/>
+            </w:pPr>
+            <w:r/>
+            <w:r>
+              <w:rPr>
+                <w:rFonts w:ascii="Times New Roman" w:hAnsi="Times New Roman" w:cs="Times New Roman"/>
+                <w:b w:val="0"/>
+                <w:i w:val="0"/>
+                <w:sz w:val="24"/>
+              </w:rPr>
+              <w:t>Quét và đo khoảng cách đúng</w:t>
+            </w:r>
+          </w:p>
+        </w:tc>
+        <w:tc>
+          <w:tcPr>
+            <w:tcW w:type="dxa" w:w="2835"/>
+          </w:tcPr>
+          <w:p>
+            <w:pPr>
+              <w:spacing w:line="240" w:lineRule="auto" w:after="0"/>
+            </w:pPr>
+            <w:r/>
+            <w:r>
+              <w:rPr>
+                <w:rFonts w:ascii="Times New Roman" w:hAnsi="Times New Roman" w:cs="Times New Roman"/>
+                <w:b w:val="0"/>
+                <w:i w:val="0"/>
+                <w:sz w:val="24"/>
+              </w:rPr>
+              <w:t>Đạt</w:t>
+            </w:r>
+          </w:p>
+        </w:tc>
+      </w:tr>
+      <w:tr>
+        <w:tc>
+          <w:tcPr>
+            <w:tcW w:type="dxa" w:w="2835"/>
+          </w:tcPr>
+          <w:p>
+            <w:pPr>
+              <w:spacing w:line="240" w:lineRule="auto" w:after="0"/>
+            </w:pPr>
+            <w:r/>
+            <w:r>
+              <w:rPr>
+                <w:rFonts w:ascii="Times New Roman" w:hAnsi="Times New Roman" w:cs="Times New Roman"/>
+                <w:b w:val="0"/>
+                <w:i w:val="0"/>
+                <w:sz w:val="24"/>
+              </w:rPr>
+              <w:t>Khối cấp nguồn (pin + ổn áp)</w:t>
+            </w:r>
+          </w:p>
+        </w:tc>
+        <w:tc>
+          <w:tcPr>
+            <w:tcW w:type="dxa" w:w="2835"/>
+          </w:tcPr>
+          <w:p>
+            <w:pPr>
+              <w:spacing w:line="240" w:lineRule="auto" w:after="0"/>
+            </w:pPr>
+            <w:r/>
+            <w:r>
+              <w:rPr>
+                <w:rFonts w:ascii="Times New Roman" w:hAnsi="Times New Roman" w:cs="Times New Roman"/>
+                <w:b w:val="0"/>
+                <w:i w:val="0"/>
+                <w:sz w:val="24"/>
+              </w:rPr>
+              <w:t>Cấp đủ tải, có lọc nhiễu servo</w:t>
+            </w:r>
+          </w:p>
+        </w:tc>
+        <w:tc>
+          <w:tcPr>
+            <w:tcW w:type="dxa" w:w="2835"/>
+          </w:tcPr>
+          <w:p>
+            <w:pPr>
+              <w:spacing w:line="240" w:lineRule="auto" w:after="0"/>
+            </w:pPr>
+            <w:r/>
+            <w:r>
+              <w:rPr>
+                <w:rFonts w:ascii="Times New Roman" w:hAnsi="Times New Roman" w:cs="Times New Roman"/>
+                <w:b w:val="0"/>
+                <w:i w:val="0"/>
+                <w:sz w:val="24"/>
+              </w:rPr>
+              <w:t>Đạt</w:t>
+            </w:r>
+          </w:p>
+        </w:tc>
+      </w:tr>
+      <w:tr>
+        <w:tc>
+          <w:tcPr>
+            <w:tcW w:type="dxa" w:w="2835"/>
+          </w:tcPr>
+          <w:p>
+            <w:pPr>
+              <w:spacing w:line="240" w:lineRule="auto" w:after="0"/>
+            </w:pPr>
+            <w:r/>
+            <w:r>
+              <w:rPr>
+                <w:rFonts w:ascii="Times New Roman" w:hAnsi="Times New Roman" w:cs="Times New Roman"/>
+                <w:b w:val="0"/>
+                <w:i w:val="0"/>
+                <w:sz w:val="24"/>
+              </w:rPr>
+              <w:t>Firmware (PlatformIO)</w:t>
+            </w:r>
+          </w:p>
+        </w:tc>
+        <w:tc>
+          <w:tcPr>
+            <w:tcW w:type="dxa" w:w="2835"/>
+          </w:tcPr>
+          <w:p>
+            <w:pPr>
+              <w:spacing w:line="240" w:lineRule="auto" w:after="0"/>
+            </w:pPr>
+            <w:r/>
+            <w:r>
+              <w:rPr>
+                <w:rFonts w:ascii="Times New Roman" w:hAnsi="Times New Roman" w:cs="Times New Roman"/>
+                <w:b w:val="0"/>
+                <w:i w:val="0"/>
+                <w:sz w:val="24"/>
+              </w:rPr>
+              <w:t>Biên dịch – nạp – chạy; unit test pass</w:t>
+            </w:r>
+          </w:p>
+        </w:tc>
+        <w:tc>
+          <w:tcPr>
+            <w:tcW w:type="dxa" w:w="2835"/>
+          </w:tcPr>
+          <w:p>
+            <w:pPr>
+              <w:spacing w:line="240" w:lineRule="auto" w:after="0"/>
+            </w:pPr>
+            <w:r/>
+            <w:r>
+              <w:rPr>
+                <w:rFonts w:ascii="Times New Roman" w:hAnsi="Times New Roman" w:cs="Times New Roman"/>
+                <w:b w:val="0"/>
+                <w:i w:val="0"/>
+                <w:sz w:val="24"/>
+              </w:rPr>
+              <w:t>Đạt</w:t>
+            </w:r>
+          </w:p>
+        </w:tc>
+      </w:tr>
+      <w:tr>
+        <w:tc>
+          <w:tcPr>
+            <w:tcW w:type="dxa" w:w="2835"/>
+          </w:tcPr>
+          <w:p>
+            <w:pPr>
+              <w:spacing w:line="240" w:lineRule="auto" w:after="0"/>
+            </w:pPr>
+            <w:r/>
+            <w:r>
+              <w:rPr>
+                <w:rFonts w:ascii="Times New Roman" w:hAnsi="Times New Roman" w:cs="Times New Roman"/>
+                <w:b w:val="0"/>
+                <w:i w:val="0"/>
+                <w:sz w:val="24"/>
+              </w:rPr>
+              <w:t>Ứng dụng Flutter</w:t>
+            </w:r>
+          </w:p>
+        </w:tc>
+        <w:tc>
+          <w:tcPr>
+            <w:tcW w:type="dxa" w:w="2835"/>
+          </w:tcPr>
+          <w:p>
+            <w:pPr>
+              <w:spacing w:line="240" w:lineRule="auto" w:after="0"/>
+            </w:pPr>
+            <w:r/>
+            <w:r>
+              <w:rPr>
+                <w:rFonts w:ascii="Times New Roman" w:hAnsi="Times New Roman" w:cs="Times New Roman"/>
+                <w:b w:val="0"/>
+                <w:i w:val="0"/>
+                <w:sz w:val="24"/>
+              </w:rPr>
+              <w:t>Build và kết nối UDP thành công</w:t>
+            </w:r>
+          </w:p>
+        </w:tc>
+        <w:tc>
+          <w:tcPr>
+            <w:tcW w:type="dxa" w:w="2835"/>
+          </w:tcPr>
+          <w:p>
+            <w:pPr>
+              <w:spacing w:line="240" w:lineRule="auto" w:after="0"/>
+            </w:pPr>
+            <w:r/>
+            <w:r>
+              <w:rPr>
+                <w:rFonts w:ascii="Times New Roman" w:hAnsi="Times New Roman" w:cs="Times New Roman"/>
+                <w:b w:val="0"/>
+                <w:i w:val="0"/>
+                <w:sz w:val="24"/>
+              </w:rPr>
+              <w:t>Đạt</w:t>
+            </w:r>
+          </w:p>
+        </w:tc>
+      </w:tr>
+    </w:tbl>
+    <w:p>
+      <w:pPr>
+        <w:jc w:val="both"/>
+      </w:pPr>
+      <w:r>
+        <w:rPr>
+          <w:rFonts w:ascii="Times New Roman" w:hAnsi="Times New Roman" w:cs="Times New Roman"/>
+          <w:b w:val="0"/>
+          <w:i w:val="0"/>
+          <w:sz w:val="26"/>
+        </w:rPr>
+        <w:t xml:space="preserve">Nhìn chung, quá trình thi công </w:t>
+      </w:r>
+      <w:r>
+        <w:rPr>
+          <w:rFonts w:ascii="Times New Roman" w:hAnsi="Times New Roman" w:cs="Times New Roman"/>
+          <w:b/>
+          <w:i w:val="0"/>
+          <w:sz w:val="26"/>
+        </w:rPr>
+        <w:t>hoàn thành đúng thiết kế ở Chương 3</w:t>
+      </w:r>
+      <w:r>
+        <w:rPr>
+          <w:rFonts w:ascii="Times New Roman" w:hAnsi="Times New Roman" w:cs="Times New Roman"/>
+          <w:b w:val="0"/>
+          <w:i w:val="0"/>
+          <w:sz w:val="26"/>
+        </w:rPr>
+        <w:t xml:space="preserve">: toàn bộ các khối phần cứng được lắp đặt, đấu nối và kiểm tra hoạt động độc lập trước khi tích hợp. Các sự cố gặp phải chủ yếu đến từ </w:t>
+      </w:r>
+      <w:r>
+        <w:rPr>
+          <w:rFonts w:ascii="Times New Roman" w:hAnsi="Times New Roman" w:cs="Times New Roman"/>
+          <w:b/>
+          <w:i w:val="0"/>
+          <w:sz w:val="26"/>
+        </w:rPr>
+        <w:t>nhiễu EMI</w:t>
+      </w:r>
+      <w:r>
+        <w:rPr>
+          <w:rFonts w:ascii="Times New Roman" w:hAnsi="Times New Roman" w:cs="Times New Roman"/>
+          <w:b w:val="0"/>
+          <w:i w:val="0"/>
+          <w:sz w:val="26"/>
+        </w:rPr>
+        <w:t xml:space="preserve"> và </w:t>
+      </w:r>
+      <w:r>
+        <w:rPr>
+          <w:rFonts w:ascii="Times New Roman" w:hAnsi="Times New Roman" w:cs="Times New Roman"/>
+          <w:b/>
+          <w:i w:val="0"/>
+          <w:sz w:val="26"/>
+        </w:rPr>
+        <w:t>đặc tính của cảm biến giá rẻ</w:t>
+      </w:r>
+      <w:r>
+        <w:rPr>
+          <w:rFonts w:ascii="Times New Roman" w:hAnsi="Times New Roman" w:cs="Times New Roman"/>
+          <w:b w:val="0"/>
+          <w:i w:val="0"/>
+          <w:sz w:val="26"/>
+        </w:rPr>
+        <w:t xml:space="preserve">, đều được xử lý triệt để bằng biện pháp phần cứng (đi dây tách biệt, tụ lọc, tản nhiệt, điện trở kéo) kết hợp phần mềm (chống dội, hiệu chuẩn, bộ lọc bù). So với yêu cầu thiết kế, mức độ hoàn thiện thi công </w:t>
+      </w:r>
+      <w:r>
+        <w:rPr>
+          <w:rFonts w:ascii="Times New Roman" w:hAnsi="Times New Roman" w:cs="Times New Roman"/>
+          <w:b/>
+          <w:i w:val="0"/>
+          <w:sz w:val="26"/>
+        </w:rPr>
+        <w:t>đạt yêu cầu</w:t>
+      </w:r>
+      <w:r>
+        <w:rPr>
+          <w:rFonts w:ascii="Times New Roman" w:hAnsi="Times New Roman" w:cs="Times New Roman"/>
+          <w:b w:val="0"/>
+          <w:i w:val="0"/>
+          <w:sz w:val="26"/>
+        </w:rPr>
+        <w:t>; hệ thống sau thi công chạy ổn định, sẵn sàng cho bước đo đạc và đánh giá định lượng ở Chương 5.</w:t>
       </w:r>
     </w:p>
     <w:p>

</xml_diff>

<commit_message>
report: viet lai 6.1 Ket luan dung so lieu do duoc + dien so do tong hop vao 5.2
- Muc 6.1: viet lai theo huong gan ket qua voi thong so cu the (4 banh vi sai, encoder 20
  xung/vong ~1.02cm, alpha=0.35, A* luoi 5x5m, UDP 10Hz/loop 50Hz, dung 30cm) va so lieu do
  thuc nghiem: sai so quang duong ~6-7%, xoay 2-3% (dung sai 4do), giu huong ~1.6do/3m, phat
  hien vat can 100%.
- Dien so do tong hop tuong ung vao 3 dong nhan xet 5.2.2/5.2.3/5.2.4 (o bang per-lan van de
  dien tu file Excel).
- So lieu lay tu tai lieu tom tat do user cung cap.
- Rebuild HTML/PDF/DOCX.
</commit_message>
<xml_diff>
--- a/docs/bao-cao-xe-tu-hanh.docx
+++ b/docs/bao-cao-xe-tu-hanh.docx
@@ -23499,10 +23499,31 @@
         <w:rPr>
           <w:rFonts w:ascii="Times New Roman" w:hAnsi="Times New Roman" w:cs="Times New Roman"/>
           <w:b w:val="0"/>
-          <w:i/>
-          <w:sz w:val="26"/>
-        </w:rPr>
-        <w:t>(Điền nhận xét định lượng theo số đo: sai số trung bình …%.)</w:t>
+          <w:i w:val="0"/>
+          <w:color w:val="C00000"/>
+          <w:sz w:val="26"/>
+        </w:rPr>
+        <w:t xml:space="preserve">Qua đo thực tế, sai số quãng đường trung bình khoảng </w:t>
+      </w:r>
+      <w:r>
+        <w:rPr>
+          <w:rFonts w:ascii="Times New Roman" w:hAnsi="Times New Roman" w:cs="Times New Roman"/>
+          <w:b/>
+          <w:i w:val="0"/>
+          <w:color w:val="C00000"/>
+          <w:sz w:val="26"/>
+        </w:rPr>
+        <w:t>6–7%</w:t>
+      </w:r>
+      <w:r>
+        <w:rPr>
+          <w:rFonts w:ascii="Times New Roman" w:hAnsi="Times New Roman" w:cs="Times New Roman"/>
+          <w:b w:val="0"/>
+          <w:i w:val="0"/>
+          <w:color w:val="C00000"/>
+          <w:sz w:val="26"/>
+        </w:rPr>
+        <w:t>.</w:t>
       </w:r>
     </w:p>
     <w:p>
@@ -23965,10 +23986,31 @@
         <w:rPr>
           <w:rFonts w:ascii="Times New Roman" w:hAnsi="Times New Roman" w:cs="Times New Roman"/>
           <w:b w:val="0"/>
-          <w:i/>
-          <w:sz w:val="26"/>
-        </w:rPr>
-        <w:t>(Điền: sai số trung bình …°, có/không nằm trong dung sai 4°.)</w:t>
+          <w:i w:val="0"/>
+          <w:color w:val="C00000"/>
+          <w:sz w:val="26"/>
+        </w:rPr>
+        <w:t xml:space="preserve">Qua đo thực tế, sai số xoay góc trung bình khoảng </w:t>
+      </w:r>
+      <w:r>
+        <w:rPr>
+          <w:rFonts w:ascii="Times New Roman" w:hAnsi="Times New Roman" w:cs="Times New Roman"/>
+          <w:b/>
+          <w:i w:val="0"/>
+          <w:color w:val="C00000"/>
+          <w:sz w:val="26"/>
+        </w:rPr>
+        <w:t>2–3°</w:t>
+      </w:r>
+      <w:r>
+        <w:rPr>
+          <w:rFonts w:ascii="Times New Roman" w:hAnsi="Times New Roman" w:cs="Times New Roman"/>
+          <w:b w:val="0"/>
+          <w:i w:val="0"/>
+          <w:color w:val="C00000"/>
+          <w:sz w:val="26"/>
+        </w:rPr>
+        <w:t>, nằm trong dung sai cho phép 4°.</w:t>
       </w:r>
     </w:p>
     <w:p>
@@ -24375,10 +24417,31 @@
         <w:rPr>
           <w:rFonts w:ascii="Times New Roman" w:hAnsi="Times New Roman" w:cs="Times New Roman"/>
           <w:b w:val="0"/>
-          <w:i/>
-          <w:sz w:val="26"/>
-        </w:rPr>
-        <w:t>(Điền: độ lệch ngang trung bình …cm trên 3 m, tương đương …°.)</w:t>
+          <w:i w:val="0"/>
+          <w:color w:val="C00000"/>
+          <w:sz w:val="26"/>
+        </w:rPr>
+        <w:t xml:space="preserve">Qua đo thực tế, độ lệch hướng trung bình khoảng </w:t>
+      </w:r>
+      <w:r>
+        <w:rPr>
+          <w:rFonts w:ascii="Times New Roman" w:hAnsi="Times New Roman" w:cs="Times New Roman"/>
+          <w:b/>
+          <w:i w:val="0"/>
+          <w:color w:val="C00000"/>
+          <w:sz w:val="26"/>
+        </w:rPr>
+        <w:t>1,6°</w:t>
+      </w:r>
+      <w:r>
+        <w:rPr>
+          <w:rFonts w:ascii="Times New Roman" w:hAnsi="Times New Roman" w:cs="Times New Roman"/>
+          <w:b w:val="0"/>
+          <w:i w:val="0"/>
+          <w:color w:val="C00000"/>
+          <w:sz w:val="26"/>
+        </w:rPr>
+        <w:t xml:space="preserve"> trên quãng 3 m (tương đương ≈ 8 cm lệch ngang).</w:t>
       </w:r>
     </w:p>
     <w:p>
@@ -28046,25 +28109,35 @@
           <w:i w:val="0"/>
           <w:sz w:val="26"/>
         </w:rPr>
-        <w:t xml:space="preserve">Đề tài đã thiết kế và xây dựng thành công một </w:t>
-      </w:r>
-      <w:r>
-        <w:rPr>
-          <w:rFonts w:ascii="Times New Roman" w:hAnsi="Times New Roman" w:cs="Times New Roman"/>
-          <w:b/>
-          <w:i w:val="0"/>
-          <w:sz w:val="26"/>
-        </w:rPr>
-        <w:t>xe robot tự hành</w:t>
-      </w:r>
-      <w:r>
-        <w:rPr>
-          <w:rFonts w:ascii="Times New Roman" w:hAnsi="Times New Roman" w:cs="Times New Roman"/>
-          <w:b w:val="0"/>
-          <w:i w:val="0"/>
-          <w:sz w:val="26"/>
-        </w:rPr>
-        <w:t xml:space="preserve"> hoàn chỉnh, chạy được toàn trình từ chọn đích đến bám lộ trình. Về cơ bản hệ thống đáp ứng đủ các chức năng:</w:t>
+        <w:t xml:space="preserve">Đề tài đã thiết kế và xây dựng thành công một **xe robot tự hành </w:t>
+      </w:r>
+      <w:r>
+        <w:rPr>
+          <w:rFonts w:ascii="Times New Roman" w:hAnsi="Times New Roman" w:cs="Times New Roman"/>
+          <w:b w:val="0"/>
+          <w:i w:val="0"/>
+          <w:color w:val="C00000"/>
+          <w:sz w:val="26"/>
+        </w:rPr>
+        <w:t>bốn bánh dẫn động vi sai</w:t>
+      </w:r>
+      <w:r>
+        <w:rPr>
+          <w:rFonts w:ascii="Times New Roman" w:hAnsi="Times New Roman" w:cs="Times New Roman"/>
+          <w:b/>
+          <w:i w:val="0"/>
+          <w:sz w:val="26"/>
+        </w:rPr>
+        <w:t xml:space="preserve"> điều khiển bằng </w:t>
+      </w:r>
+      <w:r>
+        <w:rPr>
+          <w:rFonts w:ascii="Times New Roman" w:hAnsi="Times New Roman" w:cs="Times New Roman"/>
+          <w:b w:val="0"/>
+          <w:i w:val="0"/>
+          <w:sz w:val="26"/>
+        </w:rPr>
+        <w:t>ESP32**, chạy được toàn trình từ chọn đích trên ứng dụng đến tự định vị, tự tìm đường và bám lộ trình tới đích. Các kết quả chính đạt được, gắn với thông số cụ thể:</w:t>
       </w:r>
     </w:p>
     <w:p>
@@ -28075,11 +28148,20 @@
       <w:r>
         <w:rPr>
           <w:rFonts w:ascii="Times New Roman" w:hAnsi="Times New Roman" w:cs="Times New Roman"/>
-          <w:b w:val="0"/>
-          <w:i w:val="0"/>
-          <w:sz w:val="26"/>
-        </w:rPr>
-        <w:t xml:space="preserve">Người dùng chọn đích trên app, app tự </w:t>
+          <w:b/>
+          <w:i w:val="0"/>
+          <w:sz w:val="26"/>
+        </w:rPr>
+        <w:t>Tìm đường:</w:t>
+      </w:r>
+      <w:r>
+        <w:rPr>
+          <w:rFonts w:ascii="Times New Roman" w:hAnsi="Times New Roman" w:cs="Times New Roman"/>
+          <w:b w:val="0"/>
+          <w:i w:val="0"/>
+          <w:sz w:val="26"/>
+        </w:rPr>
+        <w:t xml:space="preserve"> người dùng chọn đích trên app, app tự </w:t>
       </w:r>
       <w:r>
         <w:rPr>
@@ -28097,7 +28179,26 @@
           <w:i w:val="0"/>
           <w:sz w:val="26"/>
         </w:rPr>
-        <w:t>*.</w:t>
+        <w:t xml:space="preserve">* trên lưới waypoint </w:t>
+      </w:r>
+      <w:r>
+        <w:rPr>
+          <w:rFonts w:ascii="Times New Roman" w:hAnsi="Times New Roman" w:cs="Times New Roman"/>
+          <w:b w:val="0"/>
+          <w:i w:val="0"/>
+          <w:color w:val="C00000"/>
+          <w:sz w:val="26"/>
+        </w:rPr>
+        <w:t>5×5 m</w:t>
+      </w:r>
+      <w:r>
+        <w:rPr>
+          <w:rFonts w:ascii="Times New Roman" w:hAnsi="Times New Roman" w:cs="Times New Roman"/>
+          <w:b w:val="0"/>
+          <w:i w:val="0"/>
+          <w:sz w:val="26"/>
+        </w:rPr>
+        <w:t xml:space="preserve"> (heuristic Euclid + chi phí phạt rẽ).</w:t>
       </w:r>
     </w:p>
     <w:p>
@@ -28108,11 +28209,20 @@
       <w:r>
         <w:rPr>
           <w:rFonts w:ascii="Times New Roman" w:hAnsi="Times New Roman" w:cs="Times New Roman"/>
-          <w:b w:val="0"/>
-          <w:i w:val="0"/>
-          <w:sz w:val="26"/>
-        </w:rPr>
-        <w:t xml:space="preserve">Xe </w:t>
+          <w:b/>
+          <w:i w:val="0"/>
+          <w:sz w:val="26"/>
+        </w:rPr>
+        <w:t>Định vị:</w:t>
+      </w:r>
+      <w:r>
+        <w:rPr>
+          <w:rFonts w:ascii="Times New Roman" w:hAnsi="Times New Roman" w:cs="Times New Roman"/>
+          <w:b w:val="0"/>
+          <w:i w:val="0"/>
+          <w:sz w:val="26"/>
+        </w:rPr>
+        <w:t xml:space="preserve"> xe </w:t>
       </w:r>
       <w:r>
         <w:rPr>
@@ -28130,25 +28240,138 @@
           <w:i w:val="0"/>
           <w:sz w:val="26"/>
         </w:rPr>
-        <w:t xml:space="preserve"> (encoder + IMU qua bộ lọc bù) và </w:t>
-      </w:r>
-      <w:r>
-        <w:rPr>
-          <w:rFonts w:ascii="Times New Roman" w:hAnsi="Times New Roman" w:cs="Times New Roman"/>
-          <w:b/>
-          <w:i w:val="0"/>
-          <w:sz w:val="26"/>
-        </w:rPr>
-        <w:t>bám theo lộ trình</w:t>
-      </w:r>
-      <w:r>
-        <w:rPr>
-          <w:rFonts w:ascii="Times New Roman" w:hAnsi="Times New Roman" w:cs="Times New Roman"/>
-          <w:b w:val="0"/>
-          <w:i w:val="0"/>
-          <w:sz w:val="26"/>
-        </w:rPr>
-        <w:t xml:space="preserve"> với cơ chế xoay 3 tầng và giữ hướng khi đi thẳng.</w:t>
+        <w:t xml:space="preserve"> </w:t>
+      </w:r>
+      <w:r>
+        <w:rPr>
+          <w:rFonts w:ascii="Times New Roman" w:hAnsi="Times New Roman" w:cs="Times New Roman"/>
+          <w:b w:val="0"/>
+          <w:i w:val="0"/>
+          <w:color w:val="C00000"/>
+          <w:sz w:val="26"/>
+        </w:rPr>
+        <w:t>(2 encoder 20 xung/vòng ≈ 1,02 cm/xung, node 0,5 m ≈ 49 xung)</w:t>
+      </w:r>
+      <w:r>
+        <w:rPr>
+          <w:rFonts w:ascii="Times New Roman" w:hAnsi="Times New Roman" w:cs="Times New Roman"/>
+          <w:b w:val="0"/>
+          <w:i w:val="0"/>
+          <w:sz w:val="26"/>
+        </w:rPr>
+        <w:t xml:space="preserve"> kết hợp IMU MPU-6050 qua </w:t>
+      </w:r>
+      <w:r>
+        <w:rPr>
+          <w:rFonts w:ascii="Times New Roman" w:hAnsi="Times New Roman" w:cs="Times New Roman"/>
+          <w:b/>
+          <w:i w:val="0"/>
+          <w:sz w:val="26"/>
+        </w:rPr>
+        <w:t>bộ lọc bù</w:t>
+      </w:r>
+      <w:r>
+        <w:rPr>
+          <w:rFonts w:ascii="Times New Roman" w:hAnsi="Times New Roman" w:cs="Times New Roman"/>
+          <w:b w:val="0"/>
+          <w:i w:val="0"/>
+          <w:sz w:val="26"/>
+        </w:rPr>
+        <w:t xml:space="preserve"> </w:t>
+      </w:r>
+      <w:r>
+        <w:rPr>
+          <w:rFonts w:ascii="Times New Roman" w:hAnsi="Times New Roman" w:cs="Times New Roman"/>
+          <w:b w:val="0"/>
+          <w:i w:val="0"/>
+          <w:color w:val="C00000"/>
+          <w:sz w:val="26"/>
+        </w:rPr>
+        <w:t>(α = 0,35)</w:t>
+      </w:r>
+      <w:r>
+        <w:rPr>
+          <w:rFonts w:ascii="Times New Roman" w:hAnsi="Times New Roman" w:cs="Times New Roman"/>
+          <w:b w:val="0"/>
+          <w:i w:val="0"/>
+          <w:sz w:val="26"/>
+        </w:rPr>
+        <w:t xml:space="preserve">, </w:t>
+      </w:r>
+      <w:r>
+        <w:rPr>
+          <w:rFonts w:ascii="Times New Roman" w:hAnsi="Times New Roman" w:cs="Times New Roman"/>
+          <w:b/>
+          <w:i w:val="0"/>
+          <w:sz w:val="26"/>
+        </w:rPr>
+        <w:t>bám lộ trình</w:t>
+      </w:r>
+      <w:r>
+        <w:rPr>
+          <w:rFonts w:ascii="Times New Roman" w:hAnsi="Times New Roman" w:cs="Times New Roman"/>
+          <w:b w:val="0"/>
+          <w:i w:val="0"/>
+          <w:sz w:val="26"/>
+        </w:rPr>
+        <w:t xml:space="preserve"> bằng cơ chế xoay 3 tầng và giữ hướng khi đi thẳng. Qua đo thực nghiệm (mục 5.2): sai số quãng đường trung bình </w:t>
+      </w:r>
+      <w:r>
+        <w:rPr>
+          <w:rFonts w:ascii="Times New Roman" w:hAnsi="Times New Roman" w:cs="Times New Roman"/>
+          <w:b w:val="0"/>
+          <w:i w:val="0"/>
+          <w:color w:val="C00000"/>
+          <w:sz w:val="26"/>
+        </w:rPr>
+        <w:t>khoảng 6–7%</w:t>
+      </w:r>
+      <w:r>
+        <w:rPr>
+          <w:rFonts w:ascii="Times New Roman" w:hAnsi="Times New Roman" w:cs="Times New Roman"/>
+          <w:b w:val="0"/>
+          <w:i w:val="0"/>
+          <w:sz w:val="26"/>
+        </w:rPr>
+        <w:t xml:space="preserve">, sai số xoay góc trung bình </w:t>
+      </w:r>
+      <w:r>
+        <w:rPr>
+          <w:rFonts w:ascii="Times New Roman" w:hAnsi="Times New Roman" w:cs="Times New Roman"/>
+          <w:b w:val="0"/>
+          <w:i w:val="0"/>
+          <w:color w:val="C00000"/>
+          <w:sz w:val="26"/>
+        </w:rPr>
+        <w:t>2–3°</w:t>
+      </w:r>
+      <w:r>
+        <w:rPr>
+          <w:rFonts w:ascii="Times New Roman" w:hAnsi="Times New Roman" w:cs="Times New Roman"/>
+          <w:b w:val="0"/>
+          <w:i w:val="0"/>
+          <w:sz w:val="26"/>
+        </w:rPr>
+        <w:t xml:space="preserve"> (trong dung sai 4°), độ lệch giữ hướng </w:t>
+      </w:r>
+      <w:r>
+        <w:rPr>
+          <w:rFonts w:ascii="Times New Roman" w:hAnsi="Times New Roman" w:cs="Times New Roman"/>
+          <w:b w:val="0"/>
+          <w:i w:val="0"/>
+          <w:color w:val="C00000"/>
+          <w:sz w:val="26"/>
+        </w:rPr>
+        <w:t>~1,6° trên 3 m (≈ 8 cm)</w:t>
+      </w:r>
+      <w:r>
+        <w:rPr>
+          <w:rFonts w:ascii="Times New Roman" w:hAnsi="Times New Roman" w:cs="Times New Roman"/>
+          <w:b w:val="0"/>
+          <w:i w:val="0"/>
+          <w:sz w:val="26"/>
+        </w:rPr>
+        <w:t>.</w:t>
       </w:r>
     </w:p>
     <w:p>
@@ -28163,16 +28386,71 @@
           <w:i w:val="0"/>
           <w:sz w:val="26"/>
         </w:rPr>
-        <w:t>Hiển thị vị trí thời gian thực</w:t>
-      </w:r>
-      <w:r>
-        <w:rPr>
-          <w:rFonts w:ascii="Times New Roman" w:hAnsi="Times New Roman" w:cs="Times New Roman"/>
-          <w:b w:val="0"/>
-          <w:i w:val="0"/>
-          <w:sz w:val="26"/>
-        </w:rPr>
-        <w:t xml:space="preserve"> trên bản đồ qua telemetry UDP 10 Hz.</w:t>
+        <w:t>Truyền thông:</w:t>
+      </w:r>
+      <w:r>
+        <w:rPr>
+          <w:rFonts w:ascii="Times New Roman" w:hAnsi="Times New Roman" w:cs="Times New Roman"/>
+          <w:b w:val="0"/>
+          <w:i w:val="0"/>
+          <w:sz w:val="26"/>
+        </w:rPr>
+        <w:t xml:space="preserve"> </w:t>
+      </w:r>
+      <w:r>
+        <w:rPr>
+          <w:rFonts w:ascii="Times New Roman" w:hAnsi="Times New Roman" w:cs="Times New Roman"/>
+          <w:b/>
+          <w:i w:val="0"/>
+          <w:sz w:val="26"/>
+        </w:rPr>
+        <w:t>hiển thị vị trí thời gian thực</w:t>
+      </w:r>
+      <w:r>
+        <w:rPr>
+          <w:rFonts w:ascii="Times New Roman" w:hAnsi="Times New Roman" w:cs="Times New Roman"/>
+          <w:b w:val="0"/>
+          <w:i w:val="0"/>
+          <w:sz w:val="26"/>
+        </w:rPr>
+        <w:t xml:space="preserve"> trên bản đồ qua </w:t>
+      </w:r>
+      <w:r>
+        <w:rPr>
+          <w:rFonts w:ascii="Times New Roman" w:hAnsi="Times New Roman" w:cs="Times New Roman"/>
+          <w:b/>
+          <w:i w:val="0"/>
+          <w:sz w:val="26"/>
+        </w:rPr>
+        <w:t>UDP</w:t>
+      </w:r>
+      <w:r>
+        <w:rPr>
+          <w:rFonts w:ascii="Times New Roman" w:hAnsi="Times New Roman" w:cs="Times New Roman"/>
+          <w:b w:val="0"/>
+          <w:i w:val="0"/>
+          <w:sz w:val="26"/>
+        </w:rPr>
+        <w:t xml:space="preserve"> </w:t>
+      </w:r>
+      <w:r>
+        <w:rPr>
+          <w:rFonts w:ascii="Times New Roman" w:hAnsi="Times New Roman" w:cs="Times New Roman"/>
+          <w:b w:val="0"/>
+          <w:i w:val="0"/>
+          <w:color w:val="C00000"/>
+          <w:sz w:val="26"/>
+        </w:rPr>
+        <w:t>(telemetry 10 Hz, vòng điều khiển 50 Hz)</w:t>
+      </w:r>
+      <w:r>
+        <w:rPr>
+          <w:rFonts w:ascii="Times New Roman" w:hAnsi="Times New Roman" w:cs="Times New Roman"/>
+          <w:b w:val="0"/>
+          <w:i w:val="0"/>
+          <w:sz w:val="26"/>
+        </w:rPr>
+        <w:t>, độ trễ thấp, hoạt động độc lập không cần Internet.</w:t>
       </w:r>
     </w:p>
     <w:p>
@@ -28183,11 +28461,20 @@
       <w:r>
         <w:rPr>
           <w:rFonts w:ascii="Times New Roman" w:hAnsi="Times New Roman" w:cs="Times New Roman"/>
-          <w:b w:val="0"/>
-          <w:i w:val="0"/>
-          <w:sz w:val="26"/>
-        </w:rPr>
-        <w:t xml:space="preserve">Có </w:t>
+          <w:b/>
+          <w:i w:val="0"/>
+          <w:sz w:val="26"/>
+        </w:rPr>
+        <w:t>Né vật cản &amp; tiện ích:</w:t>
+      </w:r>
+      <w:r>
+        <w:rPr>
+          <w:rFonts w:ascii="Times New Roman" w:hAnsi="Times New Roman" w:cs="Times New Roman"/>
+          <w:b w:val="0"/>
+          <w:i w:val="0"/>
+          <w:sz w:val="26"/>
+        </w:rPr>
+        <w:t xml:space="preserve"> </w:t>
       </w:r>
       <w:r>
         <w:rPr>
@@ -28205,40 +28492,62 @@
           <w:i w:val="0"/>
           <w:sz w:val="26"/>
         </w:rPr>
-        <w:t xml:space="preserve"> dùng HC-SR04 + servo quét để tự dừng, dò hai bên và chọn hướng đi.</w:t>
-      </w:r>
-    </w:p>
-    <w:p>
-      <w:pPr>
-        <w:pStyle w:val="ListBullet"/>
-        <w:ind w:left="425"/>
-      </w:pPr>
-      <w:r>
-        <w:rPr>
-          <w:rFonts w:ascii="Times New Roman" w:hAnsi="Times New Roman" w:cs="Times New Roman"/>
-          <w:b w:val="0"/>
-          <w:i w:val="0"/>
-          <w:sz w:val="26"/>
-        </w:rPr>
-        <w:t xml:space="preserve">Hỗ trợ </w:t>
-      </w:r>
-      <w:r>
-        <w:rPr>
-          <w:rFonts w:ascii="Times New Roman" w:hAnsi="Times New Roman" w:cs="Times New Roman"/>
-          <w:b/>
-          <w:i w:val="0"/>
-          <w:sz w:val="26"/>
-        </w:rPr>
-        <w:t>điều khiển tay, tự hiệu chuẩn</w:t>
-      </w:r>
-      <w:r>
-        <w:rPr>
-          <w:rFonts w:ascii="Times New Roman" w:hAnsi="Times New Roman" w:cs="Times New Roman"/>
-          <w:b w:val="0"/>
-          <w:i w:val="0"/>
-          <w:sz w:val="26"/>
-        </w:rPr>
-        <w:t xml:space="preserve"> và </w:t>
+        <w:t xml:space="preserve"> dùng HC-SR04 + servo quét </w:t>
+      </w:r>
+      <w:r>
+        <w:rPr>
+          <w:rFonts w:ascii="Times New Roman" w:hAnsi="Times New Roman" w:cs="Times New Roman"/>
+          <w:b w:val="0"/>
+          <w:i w:val="0"/>
+          <w:color w:val="C00000"/>
+          <w:sz w:val="26"/>
+        </w:rPr>
+        <w:t>(ngưỡng dừng 30 cm; tỉ lệ phát hiện vật cản 100% trong thử nghiệm có kiểm soát)</w:t>
+      </w:r>
+      <w:r>
+        <w:rPr>
+          <w:rFonts w:ascii="Times New Roman" w:hAnsi="Times New Roman" w:cs="Times New Roman"/>
+          <w:b w:val="0"/>
+          <w:i w:val="0"/>
+          <w:sz w:val="26"/>
+        </w:rPr>
+        <w:t xml:space="preserve"> để tự dừng, dò hai bên và chọn hướng; hỗ trợ </w:t>
+      </w:r>
+      <w:r>
+        <w:rPr>
+          <w:rFonts w:ascii="Times New Roman" w:hAnsi="Times New Roman" w:cs="Times New Roman"/>
+          <w:b/>
+          <w:i w:val="0"/>
+          <w:sz w:val="26"/>
+        </w:rPr>
+        <w:t>điều khiển tay</w:t>
+      </w:r>
+      <w:r>
+        <w:rPr>
+          <w:rFonts w:ascii="Times New Roman" w:hAnsi="Times New Roman" w:cs="Times New Roman"/>
+          <w:b w:val="0"/>
+          <w:i w:val="0"/>
+          <w:sz w:val="26"/>
+        </w:rPr>
+        <w:t xml:space="preserve">, </w:t>
+      </w:r>
+      <w:r>
+        <w:rPr>
+          <w:rFonts w:ascii="Times New Roman" w:hAnsi="Times New Roman" w:cs="Times New Roman"/>
+          <w:b/>
+          <w:i w:val="0"/>
+          <w:sz w:val="26"/>
+        </w:rPr>
+        <w:t>tự hiệu chuẩn</w:t>
+      </w:r>
+      <w:r>
+        <w:rPr>
+          <w:rFonts w:ascii="Times New Roman" w:hAnsi="Times New Roman" w:cs="Times New Roman"/>
+          <w:b w:val="0"/>
+          <w:i w:val="0"/>
+          <w:sz w:val="26"/>
+        </w:rPr>
+        <w:t xml:space="preserve"> (lưu NVS) và </w:t>
       </w:r>
       <w:r>
         <w:rPr>
@@ -28270,7 +28579,25 @@
           <w:i w:val="0"/>
           <w:sz w:val="26"/>
         </w:rPr>
-        <w:t>Hệ thống có kiến trúc module hóa rõ ràng, chi phí thấp, hoạt động độc lập không cần Internet — là nền tảng tốt để học tập và phát triển tiếp.</w:t>
+        <w:t xml:space="preserve">Hệ thống có kiến trúc module hóa rõ ràng, chi phí thấp, hoạt động ổn định ở quy mô phòng thí nghiệm — </w:t>
+      </w:r>
+      <w:r>
+        <w:rPr>
+          <w:rFonts w:ascii="Times New Roman" w:hAnsi="Times New Roman" w:cs="Times New Roman"/>
+          <w:b/>
+          <w:i w:val="0"/>
+          <w:sz w:val="26"/>
+        </w:rPr>
+        <w:t>đáp ứng đầy đủ các mục tiêu đề ra</w:t>
+      </w:r>
+      <w:r>
+        <w:rPr>
+          <w:rFonts w:ascii="Times New Roman" w:hAnsi="Times New Roman" w:cs="Times New Roman"/>
+          <w:b w:val="0"/>
+          <w:i w:val="0"/>
+          <w:sz w:val="26"/>
+        </w:rPr>
+        <w:t xml:space="preserve"> và là nền tảng tốt để học tập, phát triển tiếp.</w:t>
       </w:r>
     </w:p>
     <w:p>

</xml_diff>

<commit_message>
report: boi do toan bo danh muc Tai lieu tham khao de ra soat
- Boc span.chg cho toan bo muc Tai lieu tham khao ([1]-[39] + 7 tieu de nhom) -> hien mau do
  o HTML/PDF/DOCX, phuc vu ra soat truoc khi nop.
- Giu nguyen danh so (khong renumber theo thu tu xuat hien).
- Da kiem tra: trich dan trong bai [1]-[39] khop danh muc, khong nguon treo.
- Rebuild HTML/PDF/DOCX.
</commit_message>
<xml_diff>
--- a/docs/bao-cao-xe-tu-hanh.docx
+++ b/docs/bao-cao-xe-tu-hanh.docx
@@ -28819,6 +28819,7 @@
           <w:rFonts w:ascii="Times New Roman" w:hAnsi="Times New Roman" w:cs="Times New Roman"/>
           <w:b/>
           <w:i w:val="0"/>
+          <w:color w:val="C00000"/>
           <w:sz w:val="26"/>
         </w:rPr>
         <w:t>Datasheet và tài liệu kỹ thuật:</w:t>
@@ -28833,6 +28834,7 @@
           <w:rFonts w:ascii="Times New Roman" w:hAnsi="Times New Roman" w:cs="Times New Roman"/>
           <w:b w:val="0"/>
           <w:i w:val="0"/>
+          <w:color w:val="C00000"/>
           <w:sz w:val="26"/>
         </w:rPr>
         <w:t xml:space="preserve">[1] Espressif Systems, </w:t>
@@ -28842,6 +28844,7 @@
           <w:rFonts w:ascii="Times New Roman" w:hAnsi="Times New Roman" w:cs="Times New Roman"/>
           <w:b w:val="0"/>
           <w:i/>
+          <w:color w:val="C00000"/>
           <w:sz w:val="26"/>
         </w:rPr>
         <w:t>ESP32 Series Datasheet</w:t>
@@ -28851,6 +28854,7 @@
           <w:rFonts w:ascii="Times New Roman" w:hAnsi="Times New Roman" w:cs="Times New Roman"/>
           <w:b w:val="0"/>
           <w:i w:val="0"/>
+          <w:color w:val="C00000"/>
           <w:sz w:val="26"/>
         </w:rPr>
         <w:t>, 2024. [Online]. https://www.espressif.com/sites/default/files/documentation/esp32_datasheet_en.pdf</w:t>
@@ -28865,6 +28869,7 @@
           <w:rFonts w:ascii="Times New Roman" w:hAnsi="Times New Roman" w:cs="Times New Roman"/>
           <w:b w:val="0"/>
           <w:i w:val="0"/>
+          <w:color w:val="C00000"/>
           <w:sz w:val="26"/>
         </w:rPr>
         <w:t xml:space="preserve">[2] Espressif Systems, </w:t>
@@ -28874,6 +28879,7 @@
           <w:rFonts w:ascii="Times New Roman" w:hAnsi="Times New Roman" w:cs="Times New Roman"/>
           <w:b w:val="0"/>
           <w:i/>
+          <w:color w:val="C00000"/>
           <w:sz w:val="26"/>
         </w:rPr>
         <w:t>ESP32-WROOM-32 Datasheet</w:t>
@@ -28883,6 +28889,7 @@
           <w:rFonts w:ascii="Times New Roman" w:hAnsi="Times New Roman" w:cs="Times New Roman"/>
           <w:b w:val="0"/>
           <w:i w:val="0"/>
+          <w:color w:val="C00000"/>
           <w:sz w:val="26"/>
         </w:rPr>
         <w:t>, 2024. [Online]. https://www.espressif.com/sites/default/files/documentation/esp32-wroom-32_datasheet_en.pdf</w:t>
@@ -28897,6 +28904,7 @@
           <w:rFonts w:ascii="Times New Roman" w:hAnsi="Times New Roman" w:cs="Times New Roman"/>
           <w:b w:val="0"/>
           <w:i w:val="0"/>
+          <w:color w:val="C00000"/>
           <w:sz w:val="26"/>
         </w:rPr>
         <w:t xml:space="preserve">[3] InvenSense (TDK), </w:t>
@@ -28906,6 +28914,7 @@
           <w:rFonts w:ascii="Times New Roman" w:hAnsi="Times New Roman" w:cs="Times New Roman"/>
           <w:b w:val="0"/>
           <w:i/>
+          <w:color w:val="C00000"/>
           <w:sz w:val="26"/>
         </w:rPr>
         <w:t>MPU-6000/MPU-6050 Product Specification &amp; Register Map</w:t>
@@ -28915,6 +28924,7 @@
           <w:rFonts w:ascii="Times New Roman" w:hAnsi="Times New Roman" w:cs="Times New Roman"/>
           <w:b w:val="0"/>
           <w:i w:val="0"/>
+          <w:color w:val="C00000"/>
           <w:sz w:val="26"/>
         </w:rPr>
         <w:t>, Rev. 3.4/4.2. [Online]. https://invensense.tdk.com/products/motion-tracking/6-axis/mpu-6050/</w:t>
@@ -28929,6 +28939,7 @@
           <w:rFonts w:ascii="Times New Roman" w:hAnsi="Times New Roman" w:cs="Times New Roman"/>
           <w:b w:val="0"/>
           <w:i w:val="0"/>
+          <w:color w:val="C00000"/>
           <w:sz w:val="26"/>
         </w:rPr>
         <w:t xml:space="preserve">[4] STMicroelectronics, </w:t>
@@ -28938,6 +28949,7 @@
           <w:rFonts w:ascii="Times New Roman" w:hAnsi="Times New Roman" w:cs="Times New Roman"/>
           <w:b w:val="0"/>
           <w:i/>
+          <w:color w:val="C00000"/>
           <w:sz w:val="26"/>
         </w:rPr>
         <w:t>L298 Dual Full-Bridge Driver Datasheet</w:t>
@@ -28947,6 +28959,7 @@
           <w:rFonts w:ascii="Times New Roman" w:hAnsi="Times New Roman" w:cs="Times New Roman"/>
           <w:b w:val="0"/>
           <w:i w:val="0"/>
+          <w:color w:val="C00000"/>
           <w:sz w:val="26"/>
         </w:rPr>
         <w:t>. [Online]. https://www.st.com/resource/en/datasheet/l298.pdf</w:t>
@@ -28961,6 +28974,7 @@
           <w:rFonts w:ascii="Times New Roman" w:hAnsi="Times New Roman" w:cs="Times New Roman"/>
           <w:b w:val="0"/>
           <w:i w:val="0"/>
+          <w:color w:val="C00000"/>
           <w:sz w:val="26"/>
         </w:rPr>
         <w:t xml:space="preserve">[5] SparkFun Electronics, </w:t>
@@ -28970,6 +28984,7 @@
           <w:rFonts w:ascii="Times New Roman" w:hAnsi="Times New Roman" w:cs="Times New Roman"/>
           <w:b w:val="0"/>
           <w:i/>
+          <w:color w:val="C00000"/>
           <w:sz w:val="26"/>
         </w:rPr>
         <w:t>HC-SR04 Ultrasonic Sensor Module</w:t>
@@ -28979,6 +28994,7 @@
           <w:rFonts w:ascii="Times New Roman" w:hAnsi="Times New Roman" w:cs="Times New Roman"/>
           <w:b w:val="0"/>
           <w:i w:val="0"/>
+          <w:color w:val="C00000"/>
           <w:sz w:val="26"/>
         </w:rPr>
         <w:t>. [Online]. https://cdn.sparkfun.com/datasheets/Sensors/Proximity/HCSR04.pdf</w:t>
@@ -28993,6 +29009,7 @@
           <w:rFonts w:ascii="Times New Roman" w:hAnsi="Times New Roman" w:cs="Times New Roman"/>
           <w:b/>
           <w:i w:val="0"/>
+          <w:color w:val="C00000"/>
           <w:sz w:val="26"/>
         </w:rPr>
         <w:t>Tài liệu thuật toán và nền tảng:</w:t>
@@ -29007,6 +29024,7 @@
           <w:rFonts w:ascii="Times New Roman" w:hAnsi="Times New Roman" w:cs="Times New Roman"/>
           <w:b w:val="0"/>
           <w:i w:val="0"/>
+          <w:color w:val="C00000"/>
           <w:sz w:val="26"/>
         </w:rPr>
         <w:t xml:space="preserve">[6] P. E. Hart, N. J. Nilsson, B. Raphael, "A Formal Basis for the Heuristic Determination of Minimum Cost Paths", </w:t>
@@ -29016,6 +29034,7 @@
           <w:rFonts w:ascii="Times New Roman" w:hAnsi="Times New Roman" w:cs="Times New Roman"/>
           <w:b w:val="0"/>
           <w:i/>
+          <w:color w:val="C00000"/>
           <w:sz w:val="26"/>
         </w:rPr>
         <w:t>IEEE Trans. on Systems Science and Cybernetics</w:t>
@@ -29025,6 +29044,7 @@
           <w:rFonts w:ascii="Times New Roman" w:hAnsi="Times New Roman" w:cs="Times New Roman"/>
           <w:b w:val="0"/>
           <w:i w:val="0"/>
+          <w:color w:val="C00000"/>
           <w:sz w:val="26"/>
         </w:rPr>
         <w:t>, 1968.</w:t>
@@ -29039,6 +29059,7 @@
           <w:rFonts w:ascii="Times New Roman" w:hAnsi="Times New Roman" w:cs="Times New Roman"/>
           <w:b w:val="0"/>
           <w:i w:val="0"/>
+          <w:color w:val="C00000"/>
           <w:sz w:val="26"/>
         </w:rPr>
         <w:t xml:space="preserve">[7] S. Thrun, W. Burgard, D. Fox, </w:t>
@@ -29048,6 +29069,7 @@
           <w:rFonts w:ascii="Times New Roman" w:hAnsi="Times New Roman" w:cs="Times New Roman"/>
           <w:b w:val="0"/>
           <w:i/>
+          <w:color w:val="C00000"/>
           <w:sz w:val="26"/>
         </w:rPr>
         <w:t>Probabilistic Robotics</w:t>
@@ -29057,6 +29079,7 @@
           <w:rFonts w:ascii="Times New Roman" w:hAnsi="Times New Roman" w:cs="Times New Roman"/>
           <w:b w:val="0"/>
           <w:i w:val="0"/>
+          <w:color w:val="C00000"/>
           <w:sz w:val="26"/>
         </w:rPr>
         <w:t>, MIT Press, 2005 (chương về odometry và mô hình chuyển động vi sai).</w:t>
@@ -29071,6 +29094,7 @@
           <w:rFonts w:ascii="Times New Roman" w:hAnsi="Times New Roman" w:cs="Times New Roman"/>
           <w:b w:val="0"/>
           <w:i w:val="0"/>
+          <w:color w:val="C00000"/>
           <w:sz w:val="26"/>
         </w:rPr>
         <w:t xml:space="preserve">[8] Espressif Systems, </w:t>
@@ -29080,6 +29104,7 @@
           <w:rFonts w:ascii="Times New Roman" w:hAnsi="Times New Roman" w:cs="Times New Roman"/>
           <w:b w:val="0"/>
           <w:i/>
+          <w:color w:val="C00000"/>
           <w:sz w:val="26"/>
         </w:rPr>
         <w:t>ESP-IDF / Arduino-ESP32 Programming Guide</w:t>
@@ -29089,6 +29114,7 @@
           <w:rFonts w:ascii="Times New Roman" w:hAnsi="Times New Roman" w:cs="Times New Roman"/>
           <w:b w:val="0"/>
           <w:i w:val="0"/>
+          <w:color w:val="C00000"/>
           <w:sz w:val="26"/>
         </w:rPr>
         <w:t xml:space="preserve"> (LEDC, GPIO interrupts, WiFi SoftAP). [Online]. https://docs.espressif.com/</w:t>
@@ -29103,6 +29129,7 @@
           <w:rFonts w:ascii="Times New Roman" w:hAnsi="Times New Roman" w:cs="Times New Roman"/>
           <w:b w:val="0"/>
           <w:i w:val="0"/>
+          <w:color w:val="C00000"/>
           <w:sz w:val="26"/>
         </w:rPr>
         <w:t xml:space="preserve">[9] Google, </w:t>
@@ -29112,6 +29139,7 @@
           <w:rFonts w:ascii="Times New Roman" w:hAnsi="Times New Roman" w:cs="Times New Roman"/>
           <w:b w:val="0"/>
           <w:i/>
+          <w:color w:val="C00000"/>
           <w:sz w:val="26"/>
         </w:rPr>
         <w:t>Flutter Documentation</w:t>
@@ -29121,6 +29149,7 @@
           <w:rFonts w:ascii="Times New Roman" w:hAnsi="Times New Roman" w:cs="Times New Roman"/>
           <w:b w:val="0"/>
           <w:i w:val="0"/>
+          <w:color w:val="C00000"/>
           <w:sz w:val="26"/>
         </w:rPr>
         <w:t xml:space="preserve"> và </w:t>
@@ -29130,6 +29159,7 @@
           <w:rFonts w:ascii="Times New Roman" w:hAnsi="Times New Roman" w:cs="Times New Roman"/>
           <w:b w:val="0"/>
           <w:i/>
+          <w:color w:val="C00000"/>
           <w:sz w:val="26"/>
         </w:rPr>
         <w:t>Dart Language Tour</w:t>
@@ -29139,6 +29169,7 @@
           <w:rFonts w:ascii="Times New Roman" w:hAnsi="Times New Roman" w:cs="Times New Roman"/>
           <w:b w:val="0"/>
           <w:i w:val="0"/>
+          <w:color w:val="C00000"/>
           <w:sz w:val="26"/>
         </w:rPr>
         <w:t>. [Online]. https://docs.flutter.dev/</w:t>
@@ -29153,6 +29184,7 @@
           <w:rFonts w:ascii="Times New Roman" w:hAnsi="Times New Roman" w:cs="Times New Roman"/>
           <w:b/>
           <w:i w:val="0"/>
+          <w:color w:val="C00000"/>
           <w:sz w:val="26"/>
         </w:rPr>
         <w:t>Sách và bài báo khoa học về robot di động, định vị và dẫn đường:</w:t>
@@ -29167,6 +29199,7 @@
           <w:rFonts w:ascii="Times New Roman" w:hAnsi="Times New Roman" w:cs="Times New Roman"/>
           <w:b w:val="0"/>
           <w:i w:val="0"/>
+          <w:color w:val="C00000"/>
           <w:sz w:val="26"/>
         </w:rPr>
         <w:t xml:space="preserve">[10] R. Siegwart, I. R. Nourbakhsh, D. Scaramuzza, </w:t>
@@ -29176,6 +29209,7 @@
           <w:rFonts w:ascii="Times New Roman" w:hAnsi="Times New Roman" w:cs="Times New Roman"/>
           <w:b w:val="0"/>
           <w:i/>
+          <w:color w:val="C00000"/>
           <w:sz w:val="26"/>
         </w:rPr>
         <w:t>Introduction to Autonomous Mobile Robots</w:t>
@@ -29185,6 +29219,7 @@
           <w:rFonts w:ascii="Times New Roman" w:hAnsi="Times New Roman" w:cs="Times New Roman"/>
           <w:b w:val="0"/>
           <w:i w:val="0"/>
+          <w:color w:val="C00000"/>
           <w:sz w:val="26"/>
         </w:rPr>
         <w:t>, 2nd ed., MIT Press, 2011.</w:t>
@@ -29199,6 +29234,7 @@
           <w:rFonts w:ascii="Times New Roman" w:hAnsi="Times New Roman" w:cs="Times New Roman"/>
           <w:b w:val="0"/>
           <w:i w:val="0"/>
+          <w:color w:val="C00000"/>
           <w:sz w:val="26"/>
         </w:rPr>
         <w:t xml:space="preserve">[11] J. Borenstein, H. R. Everett, L. Feng, </w:t>
@@ -29208,6 +29244,7 @@
           <w:rFonts w:ascii="Times New Roman" w:hAnsi="Times New Roman" w:cs="Times New Roman"/>
           <w:b w:val="0"/>
           <w:i/>
+          <w:color w:val="C00000"/>
           <w:sz w:val="26"/>
         </w:rPr>
         <w:t>Where am I? Sensors and Methods for Mobile Robot Positioning</w:t>
@@ -29217,6 +29254,7 @@
           <w:rFonts w:ascii="Times New Roman" w:hAnsi="Times New Roman" w:cs="Times New Roman"/>
           <w:b w:val="0"/>
           <w:i w:val="0"/>
+          <w:color w:val="C00000"/>
           <w:sz w:val="26"/>
         </w:rPr>
         <w:t>, University of Michigan, 1996.</w:t>
@@ -29231,6 +29269,7 @@
           <w:rFonts w:ascii="Times New Roman" w:hAnsi="Times New Roman" w:cs="Times New Roman"/>
           <w:b w:val="0"/>
           <w:i w:val="0"/>
+          <w:color w:val="C00000"/>
           <w:sz w:val="26"/>
         </w:rPr>
         <w:t xml:space="preserve">[12] S. M. LaValle, </w:t>
@@ -29240,6 +29279,7 @@
           <w:rFonts w:ascii="Times New Roman" w:hAnsi="Times New Roman" w:cs="Times New Roman"/>
           <w:b w:val="0"/>
           <w:i/>
+          <w:color w:val="C00000"/>
           <w:sz w:val="26"/>
         </w:rPr>
         <w:t>Planning Algorithms</w:t>
@@ -29249,6 +29289,7 @@
           <w:rFonts w:ascii="Times New Roman" w:hAnsi="Times New Roman" w:cs="Times New Roman"/>
           <w:b w:val="0"/>
           <w:i w:val="0"/>
+          <w:color w:val="C00000"/>
           <w:sz w:val="26"/>
         </w:rPr>
         <w:t>, Cambridge University Press, 2006. [Online]. http://lavalle.pl/planning/</w:t>
@@ -29263,6 +29304,7 @@
           <w:rFonts w:ascii="Times New Roman" w:hAnsi="Times New Roman" w:cs="Times New Roman"/>
           <w:b w:val="0"/>
           <w:i w:val="0"/>
+          <w:color w:val="C00000"/>
           <w:sz w:val="26"/>
         </w:rPr>
         <w:t xml:space="preserve">[13] E. W. Dijkstra, "A note on two problems in connexion with graphs", </w:t>
@@ -29272,6 +29314,7 @@
           <w:rFonts w:ascii="Times New Roman" w:hAnsi="Times New Roman" w:cs="Times New Roman"/>
           <w:b w:val="0"/>
           <w:i/>
+          <w:color w:val="C00000"/>
           <w:sz w:val="26"/>
         </w:rPr>
         <w:t>Numerische Mathematik</w:t>
@@ -29281,6 +29324,7 @@
           <w:rFonts w:ascii="Times New Roman" w:hAnsi="Times New Roman" w:cs="Times New Roman"/>
           <w:b w:val="0"/>
           <w:i w:val="0"/>
+          <w:color w:val="C00000"/>
           <w:sz w:val="26"/>
         </w:rPr>
         <w:t>, vol. 1, pp. 269–271, 1959.</w:t>
@@ -29295,6 +29339,7 @@
           <w:rFonts w:ascii="Times New Roman" w:hAnsi="Times New Roman" w:cs="Times New Roman"/>
           <w:b w:val="0"/>
           <w:i w:val="0"/>
+          <w:color w:val="C00000"/>
           <w:sz w:val="26"/>
         </w:rPr>
         <w:t xml:space="preserve">[14] R. Mahony, T. Hamel, J.-M. Pflimlin, "Nonlinear Complementary Filters on the Special Orthogonal Group", </w:t>
@@ -29304,6 +29349,7 @@
           <w:rFonts w:ascii="Times New Roman" w:hAnsi="Times New Roman" w:cs="Times New Roman"/>
           <w:b w:val="0"/>
           <w:i/>
+          <w:color w:val="C00000"/>
           <w:sz w:val="26"/>
         </w:rPr>
         <w:t>IEEE Transactions on Automatic Control</w:t>
@@ -29313,6 +29359,7 @@
           <w:rFonts w:ascii="Times New Roman" w:hAnsi="Times New Roman" w:cs="Times New Roman"/>
           <w:b w:val="0"/>
           <w:i w:val="0"/>
+          <w:color w:val="C00000"/>
           <w:sz w:val="26"/>
         </w:rPr>
         <w:t>, vol. 53, no. 5, pp. 1203–1218, 2008.</w:t>
@@ -29327,6 +29374,7 @@
           <w:rFonts w:ascii="Times New Roman" w:hAnsi="Times New Roman" w:cs="Times New Roman"/>
           <w:b w:val="0"/>
           <w:i w:val="0"/>
+          <w:color w:val="C00000"/>
           <w:sz w:val="26"/>
         </w:rPr>
         <w:t xml:space="preserve">[15] G. Fragapane, D. Ivanov, M. Peron, F. Sgarbossa, J. O. Strandhagen, "Increasing flexibility and productivity in Industry 4.0 production networks with autonomous mobile robots and smart intralogistics", </w:t>
@@ -29336,6 +29384,7 @@
           <w:rFonts w:ascii="Times New Roman" w:hAnsi="Times New Roman" w:cs="Times New Roman"/>
           <w:b w:val="0"/>
           <w:i/>
+          <w:color w:val="C00000"/>
           <w:sz w:val="26"/>
         </w:rPr>
         <w:t>Annals of Operations Research</w:t>
@@ -29345,6 +29394,7 @@
           <w:rFonts w:ascii="Times New Roman" w:hAnsi="Times New Roman" w:cs="Times New Roman"/>
           <w:b w:val="0"/>
           <w:i w:val="0"/>
+          <w:color w:val="C00000"/>
           <w:sz w:val="26"/>
         </w:rPr>
         <w:t>, vol. 308, pp. 125–143, 2021.</w:t>
@@ -29359,6 +29409,7 @@
           <w:rFonts w:ascii="Times New Roman" w:hAnsi="Times New Roman" w:cs="Times New Roman"/>
           <w:b w:val="0"/>
           <w:i w:val="0"/>
+          <w:color w:val="C00000"/>
           <w:sz w:val="26"/>
         </w:rPr>
         <w:t xml:space="preserve">[16] C. Cadena et al., "Past, Present, and Future of Simultaneous Localization and Mapping: Toward the Robust-Perception Age", </w:t>
@@ -29368,6 +29419,7 @@
           <w:rFonts w:ascii="Times New Roman" w:hAnsi="Times New Roman" w:cs="Times New Roman"/>
           <w:b w:val="0"/>
           <w:i/>
+          <w:color w:val="C00000"/>
           <w:sz w:val="26"/>
         </w:rPr>
         <w:t>IEEE Transactions on Robotics</w:t>
@@ -29377,6 +29429,7 @@
           <w:rFonts w:ascii="Times New Roman" w:hAnsi="Times New Roman" w:cs="Times New Roman"/>
           <w:b w:val="0"/>
           <w:i w:val="0"/>
+          <w:color w:val="C00000"/>
           <w:sz w:val="26"/>
         </w:rPr>
         <w:t>, vol. 32, no. 6, pp. 1309–1332, 2016.</w:t>
@@ -29391,6 +29444,7 @@
           <w:rFonts w:ascii="Times New Roman" w:hAnsi="Times New Roman" w:cs="Times New Roman"/>
           <w:b w:val="0"/>
           <w:i w:val="0"/>
+          <w:color w:val="C00000"/>
           <w:sz w:val="26"/>
         </w:rPr>
         <w:t xml:space="preserve">[17] A. Maier, A. Sharp, Y. Vagapov, "Comparative analysis and practical implementation of the ESP32 microcontroller module for the internet of things", in </w:t>
@@ -29400,6 +29454,7 @@
           <w:rFonts w:ascii="Times New Roman" w:hAnsi="Times New Roman" w:cs="Times New Roman"/>
           <w:b w:val="0"/>
           <w:i/>
+          <w:color w:val="C00000"/>
           <w:sz w:val="26"/>
         </w:rPr>
         <w:t>Proc. 7th IEEE Int. Conf. on Internet Technologies and Applications (ITA)</w:t>
@@ -29409,6 +29464,7 @@
           <w:rFonts w:ascii="Times New Roman" w:hAnsi="Times New Roman" w:cs="Times New Roman"/>
           <w:b w:val="0"/>
           <w:i w:val="0"/>
+          <w:color w:val="C00000"/>
           <w:sz w:val="26"/>
         </w:rPr>
         <w:t>, 2017, pp. 143–148.</w:t>
@@ -29423,6 +29479,7 @@
           <w:rFonts w:ascii="Times New Roman" w:hAnsi="Times New Roman" w:cs="Times New Roman"/>
           <w:b/>
           <w:i w:val="0"/>
+          <w:color w:val="C00000"/>
           <w:sz w:val="26"/>
         </w:rPr>
         <w:t>Chuẩn giao tiếp, vi điều khiển và linh kiện:</w:t>
@@ -29437,6 +29494,7 @@
           <w:rFonts w:ascii="Times New Roman" w:hAnsi="Times New Roman" w:cs="Times New Roman"/>
           <w:b w:val="0"/>
           <w:i w:val="0"/>
+          <w:color w:val="C00000"/>
           <w:sz w:val="26"/>
         </w:rPr>
         <w:t xml:space="preserve">[18] Espressif Systems, </w:t>
@@ -29446,6 +29504,7 @@
           <w:rFonts w:ascii="Times New Roman" w:hAnsi="Times New Roman" w:cs="Times New Roman"/>
           <w:b w:val="0"/>
           <w:i/>
+          <w:color w:val="C00000"/>
           <w:sz w:val="26"/>
         </w:rPr>
         <w:t>ESP32 Technical Reference Manual</w:t>
@@ -29455,6 +29514,7 @@
           <w:rFonts w:ascii="Times New Roman" w:hAnsi="Times New Roman" w:cs="Times New Roman"/>
           <w:b w:val="0"/>
           <w:i w:val="0"/>
+          <w:color w:val="C00000"/>
           <w:sz w:val="26"/>
         </w:rPr>
         <w:t>, v5.x, 2023. [Online]. https://www.espressif.com/sites/default/files/documentation/esp32_technical_reference_manual_en.pdf</w:t>
@@ -29469,6 +29529,7 @@
           <w:rFonts w:ascii="Times New Roman" w:hAnsi="Times New Roman" w:cs="Times New Roman"/>
           <w:b w:val="0"/>
           <w:i w:val="0"/>
+          <w:color w:val="C00000"/>
           <w:sz w:val="26"/>
         </w:rPr>
         <w:t xml:space="preserve">[19] NXP Semiconductors, </w:t>
@@ -29478,6 +29539,7 @@
           <w:rFonts w:ascii="Times New Roman" w:hAnsi="Times New Roman" w:cs="Times New Roman"/>
           <w:b w:val="0"/>
           <w:i/>
+          <w:color w:val="C00000"/>
           <w:sz w:val="26"/>
         </w:rPr>
         <w:t>I2C-bus Specification and User Manual</w:t>
@@ -29487,6 +29549,7 @@
           <w:rFonts w:ascii="Times New Roman" w:hAnsi="Times New Roman" w:cs="Times New Roman"/>
           <w:b w:val="0"/>
           <w:i w:val="0"/>
+          <w:color w:val="C00000"/>
           <w:sz w:val="26"/>
         </w:rPr>
         <w:t xml:space="preserve"> (UM10204), Rev. 7.0, 2021.</w:t>
@@ -29501,6 +29564,7 @@
           <w:rFonts w:ascii="Times New Roman" w:hAnsi="Times New Roman" w:cs="Times New Roman"/>
           <w:b w:val="0"/>
           <w:i w:val="0"/>
+          <w:color w:val="C00000"/>
           <w:sz w:val="26"/>
         </w:rPr>
         <w:t xml:space="preserve">[20] D. W. Hart, </w:t>
@@ -29510,6 +29574,7 @@
           <w:rFonts w:ascii="Times New Roman" w:hAnsi="Times New Roman" w:cs="Times New Roman"/>
           <w:b w:val="0"/>
           <w:i/>
+          <w:color w:val="C00000"/>
           <w:sz w:val="26"/>
         </w:rPr>
         <w:t>Power Electronics</w:t>
@@ -29519,6 +29584,7 @@
           <w:rFonts w:ascii="Times New Roman" w:hAnsi="Times New Roman" w:cs="Times New Roman"/>
           <w:b w:val="0"/>
           <w:i w:val="0"/>
+          <w:color w:val="C00000"/>
           <w:sz w:val="26"/>
         </w:rPr>
         <w:t>, McGraw-Hill, 2011 (chương về điều chế độ rộng xung PWM).</w:t>
@@ -29533,6 +29599,7 @@
           <w:rFonts w:ascii="Times New Roman" w:hAnsi="Times New Roman" w:cs="Times New Roman"/>
           <w:b w:val="0"/>
           <w:i w:val="0"/>
+          <w:color w:val="C00000"/>
           <w:sz w:val="26"/>
         </w:rPr>
         <w:t xml:space="preserve">[21] Texas Instruments, </w:t>
@@ -29542,6 +29609,7 @@
           <w:rFonts w:ascii="Times New Roman" w:hAnsi="Times New Roman" w:cs="Times New Roman"/>
           <w:b w:val="0"/>
           <w:i/>
+          <w:color w:val="C00000"/>
           <w:sz w:val="26"/>
         </w:rPr>
         <w:t>LMx93, LM2903 Differential Comparators Datasheet</w:t>
@@ -29551,6 +29619,7 @@
           <w:rFonts w:ascii="Times New Roman" w:hAnsi="Times New Roman" w:cs="Times New Roman"/>
           <w:b w:val="0"/>
           <w:i w:val="0"/>
+          <w:color w:val="C00000"/>
           <w:sz w:val="26"/>
         </w:rPr>
         <w:t>, 2022. [Online]. https://www.ti.com/lit/ds/symlink/lm393.pdf</w:t>
@@ -29565,6 +29634,7 @@
           <w:rFonts w:ascii="Times New Roman" w:hAnsi="Times New Roman" w:cs="Times New Roman"/>
           <w:b w:val="0"/>
           <w:i w:val="0"/>
+          <w:color w:val="C00000"/>
           <w:sz w:val="26"/>
         </w:rPr>
         <w:t xml:space="preserve">[22] IEEE, </w:t>
@@ -29574,6 +29644,7 @@
           <w:rFonts w:ascii="Times New Roman" w:hAnsi="Times New Roman" w:cs="Times New Roman"/>
           <w:b w:val="0"/>
           <w:i/>
+          <w:color w:val="C00000"/>
           <w:sz w:val="26"/>
         </w:rPr>
         <w:t>IEEE Std 802.11-2020 — Wireless LAN Medium Access Control (MAC) and Physical Layer (PHY) Specifications</w:t>
@@ -29583,6 +29654,7 @@
           <w:rFonts w:ascii="Times New Roman" w:hAnsi="Times New Roman" w:cs="Times New Roman"/>
           <w:b w:val="0"/>
           <w:i w:val="0"/>
+          <w:color w:val="C00000"/>
           <w:sz w:val="26"/>
         </w:rPr>
         <w:t>, 2021.</w:t>
@@ -29597,6 +29669,7 @@
           <w:rFonts w:ascii="Times New Roman" w:hAnsi="Times New Roman" w:cs="Times New Roman"/>
           <w:b w:val="0"/>
           <w:i w:val="0"/>
+          <w:color w:val="C00000"/>
           <w:sz w:val="26"/>
         </w:rPr>
         <w:t>[23] J. Postel, "User Datagram Protocol", RFC 768, IETF, 1980. [Online]. https://www.rfc-editor.org/rfc/rfc768</w:t>
@@ -29611,6 +29684,7 @@
           <w:rFonts w:ascii="Times New Roman" w:hAnsi="Times New Roman" w:cs="Times New Roman"/>
           <w:b/>
           <w:i w:val="0"/>
+          <w:color w:val="C00000"/>
           <w:sz w:val="26"/>
         </w:rPr>
         <w:t>Động học, định vị, hợp nhất cảm biến và tìm đường:</w:t>
@@ -29625,6 +29699,7 @@
           <w:rFonts w:ascii="Times New Roman" w:hAnsi="Times New Roman" w:cs="Times New Roman"/>
           <w:b w:val="0"/>
           <w:i w:val="0"/>
+          <w:color w:val="C00000"/>
           <w:sz w:val="26"/>
         </w:rPr>
         <w:t xml:space="preserve">[24] G. Dudek, M. Jenkin, </w:t>
@@ -29634,6 +29709,7 @@
           <w:rFonts w:ascii="Times New Roman" w:hAnsi="Times New Roman" w:cs="Times New Roman"/>
           <w:b w:val="0"/>
           <w:i/>
+          <w:color w:val="C00000"/>
           <w:sz w:val="26"/>
         </w:rPr>
         <w:t>Computational Principles of Mobile Robotics</w:t>
@@ -29643,6 +29719,7 @@
           <w:rFonts w:ascii="Times New Roman" w:hAnsi="Times New Roman" w:cs="Times New Roman"/>
           <w:b w:val="0"/>
           <w:i w:val="0"/>
+          <w:color w:val="C00000"/>
           <w:sz w:val="26"/>
         </w:rPr>
         <w:t>, 2nd ed., Cambridge University Press, 2010.</w:t>
@@ -29657,6 +29734,7 @@
           <w:rFonts w:ascii="Times New Roman" w:hAnsi="Times New Roman" w:cs="Times New Roman"/>
           <w:b w:val="0"/>
           <w:i w:val="0"/>
+          <w:color w:val="C00000"/>
           <w:sz w:val="26"/>
         </w:rPr>
         <w:t xml:space="preserve">[25] K. M. Lynch, F. C. Park, </w:t>
@@ -29666,6 +29744,7 @@
           <w:rFonts w:ascii="Times New Roman" w:hAnsi="Times New Roman" w:cs="Times New Roman"/>
           <w:b w:val="0"/>
           <w:i/>
+          <w:color w:val="C00000"/>
           <w:sz w:val="26"/>
         </w:rPr>
         <w:t>Modern Robotics: Mechanics, Planning, and Control</w:t>
@@ -29675,6 +29754,7 @@
           <w:rFonts w:ascii="Times New Roman" w:hAnsi="Times New Roman" w:cs="Times New Roman"/>
           <w:b w:val="0"/>
           <w:i w:val="0"/>
+          <w:color w:val="C00000"/>
           <w:sz w:val="26"/>
         </w:rPr>
         <w:t>, Cambridge University Press, 2017.</w:t>
@@ -29689,6 +29769,7 @@
           <w:rFonts w:ascii="Times New Roman" w:hAnsi="Times New Roman" w:cs="Times New Roman"/>
           <w:b w:val="0"/>
           <w:i w:val="0"/>
+          <w:color w:val="C00000"/>
           <w:sz w:val="26"/>
         </w:rPr>
         <w:t xml:space="preserve">[26] R. E. Kalman, "A New Approach to Linear Filtering and Prediction Problems", </w:t>
@@ -29698,6 +29779,7 @@
           <w:rFonts w:ascii="Times New Roman" w:hAnsi="Times New Roman" w:cs="Times New Roman"/>
           <w:b w:val="0"/>
           <w:i/>
+          <w:color w:val="C00000"/>
           <w:sz w:val="26"/>
         </w:rPr>
         <w:t>Journal of Basic Engineering</w:t>
@@ -29707,6 +29789,7 @@
           <w:rFonts w:ascii="Times New Roman" w:hAnsi="Times New Roman" w:cs="Times New Roman"/>
           <w:b w:val="0"/>
           <w:i w:val="0"/>
+          <w:color w:val="C00000"/>
           <w:sz w:val="26"/>
         </w:rPr>
         <w:t>, vol. 82, no. 1, pp. 35–45, 1960.</w:t>
@@ -29721,6 +29804,7 @@
           <w:rFonts w:ascii="Times New Roman" w:hAnsi="Times New Roman" w:cs="Times New Roman"/>
           <w:b w:val="0"/>
           <w:i w:val="0"/>
+          <w:color w:val="C00000"/>
           <w:sz w:val="26"/>
         </w:rPr>
         <w:t xml:space="preserve">[27] G. Welch, G. Bishop, </w:t>
@@ -29730,6 +29814,7 @@
           <w:rFonts w:ascii="Times New Roman" w:hAnsi="Times New Roman" w:cs="Times New Roman"/>
           <w:b w:val="0"/>
           <w:i/>
+          <w:color w:val="C00000"/>
           <w:sz w:val="26"/>
         </w:rPr>
         <w:t>An Introduction to the Kalman Filter</w:t>
@@ -29739,6 +29824,7 @@
           <w:rFonts w:ascii="Times New Roman" w:hAnsi="Times New Roman" w:cs="Times New Roman"/>
           <w:b w:val="0"/>
           <w:i w:val="0"/>
+          <w:color w:val="C00000"/>
           <w:sz w:val="26"/>
         </w:rPr>
         <w:t>, Technical Report TR 95-041, University of North Carolina at Chapel Hill, 2006.</w:t>
@@ -29753,6 +29839,7 @@
           <w:rFonts w:ascii="Times New Roman" w:hAnsi="Times New Roman" w:cs="Times New Roman"/>
           <w:b w:val="0"/>
           <w:i w:val="0"/>
+          <w:color w:val="C00000"/>
           <w:sz w:val="26"/>
         </w:rPr>
         <w:t xml:space="preserve">[28] S. J. Russell, P. Norvig, </w:t>
@@ -29762,6 +29849,7 @@
           <w:rFonts w:ascii="Times New Roman" w:hAnsi="Times New Roman" w:cs="Times New Roman"/>
           <w:b w:val="0"/>
           <w:i/>
+          <w:color w:val="C00000"/>
           <w:sz w:val="26"/>
         </w:rPr>
         <w:t>Artificial Intelligence: A Modern Approach</w:t>
@@ -29771,6 +29859,7 @@
           <w:rFonts w:ascii="Times New Roman" w:hAnsi="Times New Roman" w:cs="Times New Roman"/>
           <w:b w:val="0"/>
           <w:i w:val="0"/>
+          <w:color w:val="C00000"/>
           <w:sz w:val="26"/>
         </w:rPr>
         <w:t>, 4th ed., Pearson, 2021 (chương tìm kiếm heuristic, A*).</w:t>
@@ -29785,6 +29874,7 @@
           <w:rFonts w:ascii="Times New Roman" w:hAnsi="Times New Roman" w:cs="Times New Roman"/>
           <w:b w:val="0"/>
           <w:i w:val="0"/>
+          <w:color w:val="C00000"/>
           <w:sz w:val="26"/>
         </w:rPr>
         <w:t>[29] S. Koenig, M. Likhachev, "D</w:t>
@@ -29794,6 +29884,7 @@
           <w:rFonts w:ascii="Times New Roman" w:hAnsi="Times New Roman" w:cs="Times New Roman"/>
           <w:b w:val="0"/>
           <w:i/>
+          <w:color w:val="C00000"/>
           <w:sz w:val="26"/>
         </w:rPr>
         <w:t xml:space="preserve"> Lite", in </w:t>
@@ -29803,6 +29894,7 @@
           <w:rFonts w:ascii="Times New Roman" w:hAnsi="Times New Roman" w:cs="Times New Roman"/>
           <w:b w:val="0"/>
           <w:i w:val="0"/>
+          <w:color w:val="C00000"/>
           <w:sz w:val="26"/>
         </w:rPr>
         <w:t>Proc. AAAI Conf. on Artificial Intelligence*, 2002, pp. 476–483.</w:t>
@@ -29817,6 +29909,7 @@
           <w:rFonts w:ascii="Times New Roman" w:hAnsi="Times New Roman" w:cs="Times New Roman"/>
           <w:b w:val="0"/>
           <w:i w:val="0"/>
+          <w:color w:val="C00000"/>
           <w:sz w:val="26"/>
         </w:rPr>
         <w:t xml:space="preserve">[30] P. Corke, </w:t>
@@ -29826,6 +29919,7 @@
           <w:rFonts w:ascii="Times New Roman" w:hAnsi="Times New Roman" w:cs="Times New Roman"/>
           <w:b w:val="0"/>
           <w:i/>
+          <w:color w:val="C00000"/>
           <w:sz w:val="26"/>
         </w:rPr>
         <w:t>Robotics, Vision and Control: Fundamental Algorithms in MATLAB</w:t>
@@ -29835,6 +29929,7 @@
           <w:rFonts w:ascii="Times New Roman" w:hAnsi="Times New Roman" w:cs="Times New Roman"/>
           <w:b w:val="0"/>
           <w:i w:val="0"/>
+          <w:color w:val="C00000"/>
           <w:sz w:val="26"/>
         </w:rPr>
         <w:t>, 2nd ed., Springer, 2017.</w:t>
@@ -29849,6 +29944,7 @@
           <w:rFonts w:ascii="Times New Roman" w:hAnsi="Times New Roman" w:cs="Times New Roman"/>
           <w:b/>
           <w:i w:val="0"/>
+          <w:color w:val="C00000"/>
           <w:sz w:val="26"/>
         </w:rPr>
         <w:t>Công cụ và nền tảng phát triển:</w:t>
@@ -29863,6 +29959,7 @@
           <w:rFonts w:ascii="Times New Roman" w:hAnsi="Times New Roman" w:cs="Times New Roman"/>
           <w:b w:val="0"/>
           <w:i w:val="0"/>
+          <w:color w:val="C00000"/>
           <w:sz w:val="26"/>
         </w:rPr>
         <w:t xml:space="preserve">[31] PlatformIO Labs, </w:t>
@@ -29872,6 +29969,7 @@
           <w:rFonts w:ascii="Times New Roman" w:hAnsi="Times New Roman" w:cs="Times New Roman"/>
           <w:b w:val="0"/>
           <w:i/>
+          <w:color w:val="C00000"/>
           <w:sz w:val="26"/>
         </w:rPr>
         <w:t>PlatformIO Documentation</w:t>
@@ -29881,6 +29979,7 @@
           <w:rFonts w:ascii="Times New Roman" w:hAnsi="Times New Roman" w:cs="Times New Roman"/>
           <w:b w:val="0"/>
           <w:i w:val="0"/>
+          <w:color w:val="C00000"/>
           <w:sz w:val="26"/>
         </w:rPr>
         <w:t>. [Online]. https://docs.platformio.org/</w:t>
@@ -29895,6 +29994,7 @@
           <w:rFonts w:ascii="Times New Roman" w:hAnsi="Times New Roman" w:cs="Times New Roman"/>
           <w:b w:val="0"/>
           <w:i w:val="0"/>
+          <w:color w:val="C00000"/>
           <w:sz w:val="26"/>
         </w:rPr>
         <w:t xml:space="preserve">[32] Espressif Systems, </w:t>
@@ -29904,6 +30004,7 @@
           <w:rFonts w:ascii="Times New Roman" w:hAnsi="Times New Roman" w:cs="Times New Roman"/>
           <w:b w:val="0"/>
           <w:i/>
+          <w:color w:val="C00000"/>
           <w:sz w:val="26"/>
         </w:rPr>
         <w:t>Non-Volatile Storage (NVS) Library — ESP-IDF Programming Guide</w:t>
@@ -29913,6 +30014,7 @@
           <w:rFonts w:ascii="Times New Roman" w:hAnsi="Times New Roman" w:cs="Times New Roman"/>
           <w:b w:val="0"/>
           <w:i w:val="0"/>
+          <w:color w:val="C00000"/>
           <w:sz w:val="26"/>
         </w:rPr>
         <w:t>. [Online]. https://docs.espressif.com/projects/esp-idf/en/latest/esp32/api-reference/storage/nvs_flash.html</w:t>
@@ -29927,6 +30029,7 @@
           <w:rFonts w:ascii="Times New Roman" w:hAnsi="Times New Roman" w:cs="Times New Roman"/>
           <w:b/>
           <w:i w:val="0"/>
+          <w:color w:val="C00000"/>
           <w:sz w:val="26"/>
         </w:rPr>
         <w:t>Các nghiên cứu liên quan (hợp nhất cảm biến, tìm đường, né vật cản):</w:t>
@@ -29941,6 +30044,7 @@
           <w:rFonts w:ascii="Times New Roman" w:hAnsi="Times New Roman" w:cs="Times New Roman"/>
           <w:b w:val="0"/>
           <w:i w:val="0"/>
+          <w:color w:val="C00000"/>
           <w:sz w:val="26"/>
         </w:rPr>
         <w:t xml:space="preserve">[33] E. I. Al Khatib, M. A. Jaradat, M. Abdel-Hafez, M. Roigari, "Multiple Sensor Fusion for Mobile Robot Localization and Navigation Using the Extended Kalman Filter", in </w:t>
@@ -29950,6 +30054,7 @@
           <w:rFonts w:ascii="Times New Roman" w:hAnsi="Times New Roman" w:cs="Times New Roman"/>
           <w:b w:val="0"/>
           <w:i/>
+          <w:color w:val="C00000"/>
           <w:sz w:val="26"/>
         </w:rPr>
         <w:t>Proc. 10th Int. Symp. on Mechatronics and its Applications (ISMA)</w:t>
@@ -29959,6 +30064,7 @@
           <w:rFonts w:ascii="Times New Roman" w:hAnsi="Times New Roman" w:cs="Times New Roman"/>
           <w:b w:val="0"/>
           <w:i w:val="0"/>
+          <w:color w:val="C00000"/>
           <w:sz w:val="26"/>
         </w:rPr>
         <w:t>, 2015, pp. 1–5.</w:t>
@@ -29973,6 +30079,7 @@
           <w:rFonts w:ascii="Times New Roman" w:hAnsi="Times New Roman" w:cs="Times New Roman"/>
           <w:b w:val="0"/>
           <w:i w:val="0"/>
+          <w:color w:val="C00000"/>
           <w:sz w:val="26"/>
         </w:rPr>
         <w:t xml:space="preserve">[34] T. T. K. Ly, L. T. Phong, D. K. Nhan, "Autonomous Mobile Robot Localization by Using IMU and Encoder Data Fusion Technique by Kalman Filter", in </w:t>
@@ -29982,6 +30089,7 @@
           <w:rFonts w:ascii="Times New Roman" w:hAnsi="Times New Roman" w:cs="Times New Roman"/>
           <w:b w:val="0"/>
           <w:i/>
+          <w:color w:val="C00000"/>
           <w:sz w:val="26"/>
         </w:rPr>
         <w:t>Advances in Engineering Research and Application (ICERA)</w:t>
@@ -29991,6 +30099,7 @@
           <w:rFonts w:ascii="Times New Roman" w:hAnsi="Times New Roman" w:cs="Times New Roman"/>
           <w:b w:val="0"/>
           <w:i w:val="0"/>
+          <w:color w:val="C00000"/>
           <w:sz w:val="26"/>
         </w:rPr>
         <w:t>, Lecture Notes in Networks and Systems, Springer, 2024, pp. 245–256.</w:t>
@@ -30005,6 +30114,7 @@
           <w:rFonts w:ascii="Times New Roman" w:hAnsi="Times New Roman" w:cs="Times New Roman"/>
           <w:b w:val="0"/>
           <w:i w:val="0"/>
+          <w:color w:val="C00000"/>
           <w:sz w:val="26"/>
         </w:rPr>
         <w:t xml:space="preserve">[35] A. A. Housein, G. Xingyu, W. Li, Y. Huang, "Extended Kalman Filter Sensor Fusion in Practice for Mobile Robot Localization", </w:t>
@@ -30014,6 +30124,7 @@
           <w:rFonts w:ascii="Times New Roman" w:hAnsi="Times New Roman" w:cs="Times New Roman"/>
           <w:b w:val="0"/>
           <w:i/>
+          <w:color w:val="C00000"/>
           <w:sz w:val="26"/>
         </w:rPr>
         <w:t>Int. Journal of Advanced Computer Science and Applications (IJACSA)</w:t>
@@ -30023,6 +30134,7 @@
           <w:rFonts w:ascii="Times New Roman" w:hAnsi="Times New Roman" w:cs="Times New Roman"/>
           <w:b w:val="0"/>
           <w:i w:val="0"/>
+          <w:color w:val="C00000"/>
           <w:sz w:val="26"/>
         </w:rPr>
         <w:t>, vol. 13, no. 2, 2022.</w:t>
@@ -30037,6 +30149,7 @@
           <w:rFonts w:ascii="Times New Roman" w:hAnsi="Times New Roman" w:cs="Times New Roman"/>
           <w:b w:val="0"/>
           <w:i w:val="0"/>
+          <w:color w:val="C00000"/>
           <w:sz w:val="26"/>
         </w:rPr>
         <w:t xml:space="preserve">[36] G. Huang et al., "Multi-Sensor Fusion for Wheel-Inertial-Visual Systems Using a Fuzzification-Assisted Iterated Error State Kalman Filter", </w:t>
@@ -30046,6 +30159,7 @@
           <w:rFonts w:ascii="Times New Roman" w:hAnsi="Times New Roman" w:cs="Times New Roman"/>
           <w:b w:val="0"/>
           <w:i/>
+          <w:color w:val="C00000"/>
           <w:sz w:val="26"/>
         </w:rPr>
         <w:t>Sensors</w:t>
@@ -30055,6 +30169,7 @@
           <w:rFonts w:ascii="Times New Roman" w:hAnsi="Times New Roman" w:cs="Times New Roman"/>
           <w:b w:val="0"/>
           <w:i w:val="0"/>
+          <w:color w:val="C00000"/>
           <w:sz w:val="26"/>
         </w:rPr>
         <w:t>, vol. 24, no. 23, art. 7619, 2024.</w:t>
@@ -30069,6 +30184,7 @@
           <w:rFonts w:ascii="Times New Roman" w:hAnsi="Times New Roman" w:cs="Times New Roman"/>
           <w:b w:val="0"/>
           <w:i w:val="0"/>
+          <w:color w:val="C00000"/>
           <w:sz w:val="26"/>
         </w:rPr>
         <w:t>[37] M. Yao, H. Deng, X. Feng, P. Li, Y. Li, H. Liu, "Global Path Planning for Differential Drive Mobile Robots Based on Improved BSGA</w:t>
@@ -30078,6 +30194,7 @@
           <w:rFonts w:ascii="Times New Roman" w:hAnsi="Times New Roman" w:cs="Times New Roman"/>
           <w:b w:val="0"/>
           <w:i/>
+          <w:color w:val="C00000"/>
           <w:sz w:val="26"/>
         </w:rPr>
         <w:t xml:space="preserve"> Algorithm", </w:t>
@@ -30087,6 +30204,7 @@
           <w:rFonts w:ascii="Times New Roman" w:hAnsi="Times New Roman" w:cs="Times New Roman"/>
           <w:b w:val="0"/>
           <w:i w:val="0"/>
+          <w:color w:val="C00000"/>
           <w:sz w:val="26"/>
         </w:rPr>
         <w:t>Applied Sciences*, vol. 13, no. 20, art. 11290, 2023.</w:t>
@@ -30101,6 +30219,7 @@
           <w:rFonts w:ascii="Times New Roman" w:hAnsi="Times New Roman" w:cs="Times New Roman"/>
           <w:b w:val="0"/>
           <w:i w:val="0"/>
+          <w:color w:val="C00000"/>
           <w:sz w:val="26"/>
         </w:rPr>
         <w:t xml:space="preserve">[38] V. Shahapur, B. Dixon, U. Bharti, "Robotic Path Planning Implementation using Search Algorithms", </w:t>
@@ -30110,6 +30229,7 @@
           <w:rFonts w:ascii="Times New Roman" w:hAnsi="Times New Roman" w:cs="Times New Roman"/>
           <w:b w:val="0"/>
           <w:i/>
+          <w:color w:val="C00000"/>
           <w:sz w:val="26"/>
         </w:rPr>
         <w:t>arXiv preprint</w:t>
@@ -30119,6 +30239,7 @@
           <w:rFonts w:ascii="Times New Roman" w:hAnsi="Times New Roman" w:cs="Times New Roman"/>
           <w:b w:val="0"/>
           <w:i w:val="0"/>
+          <w:color w:val="C00000"/>
           <w:sz w:val="26"/>
         </w:rPr>
         <w:t xml:space="preserve"> arXiv:2405.16445, 2024.</w:t>
@@ -30133,6 +30254,7 @@
           <w:rFonts w:ascii="Times New Roman" w:hAnsi="Times New Roman" w:cs="Times New Roman"/>
           <w:b w:val="0"/>
           <w:i w:val="0"/>
+          <w:color w:val="C00000"/>
           <w:sz w:val="26"/>
         </w:rPr>
         <w:t xml:space="preserve">[39] J. N. Yasin, S. A. S. Mohamed, M.-H. Haghbayan, J. Heikkonen, H. Tenhunen, J. Plosila, "Low-cost ultrasonic based object detection and collision avoidance method for autonomous robots", </w:t>
@@ -30142,6 +30264,7 @@
           <w:rFonts w:ascii="Times New Roman" w:hAnsi="Times New Roman" w:cs="Times New Roman"/>
           <w:b w:val="0"/>
           <w:i/>
+          <w:color w:val="C00000"/>
           <w:sz w:val="26"/>
         </w:rPr>
         <w:t>Int. Journal of Information Technology</w:t>
@@ -30151,6 +30274,7 @@
           <w:rFonts w:ascii="Times New Roman" w:hAnsi="Times New Roman" w:cs="Times New Roman"/>
           <w:b w:val="0"/>
           <w:i w:val="0"/>
+          <w:color w:val="C00000"/>
           <w:sz w:val="26"/>
         </w:rPr>
         <w:t>, vol. 13, pp. 97–107, 2020.</w:t>

</xml_diff>

<commit_message>
report: boi do toan bo trich dan [1]-[39] trong than bai
- Boc span.chg cho 50 trich dan [n] trong than bai (Chuong 1-5) -> hien mau do o HTML/PDF/DOCX.
- Bao ve cac span.chg san co, khong boc long (kiem tra: 0 nested).
- Trich dan [1]-[39] van khop danh muc.
- Rebuild HTML/PDF/DOCX.
</commit_message>
<xml_diff>
--- a/docs/bao-cao-xe-tu-hanh.docx
+++ b/docs/bao-cao-xe-tu-hanh.docx
@@ -5387,7 +5387,64 @@
           <w:i w:val="0"/>
           <w:sz w:val="26"/>
         </w:rPr>
-        <w:t>Robot di động tự hành (Autonomous Mobile Robot – AMR) đang trở thành một trong những hướng công nghệ phát triển nhanh nhất, gắn liền với làn sóng tự động hóa và cuộc Cách mạng công nghiệp 4.0. Khác với robot cố định hay xe dẫn đường tự động (AGV) truyền thống vốn bám theo vạch từ/băng dẫn cố định, AMR có khả năng tự định vị, tự lập kế hoạch đường đi và tự điều hướng trong môi trường, nhờ đó được ứng dụng ngày càng rộng rãi trong kho vận thông minh (intralogistics), robot dịch vụ, y tế, nông nghiệp và các nền tảng nghiên cứu [10], [15]. Nhiều khảo sát cho thấy việc thay thế AGV cứng nhắc bằng AMR linh hoạt giúp tăng đáng kể năng suất và khả năng thích ứng của dây chuyền sản xuất trong mô hình nhà máy thông minh [15].</w:t>
+        <w:t xml:space="preserve">Robot di động tự hành (Autonomous Mobile Robot – AMR) đang trở thành một trong những hướng công nghệ phát triển nhanh nhất, gắn liền với làn sóng tự động hóa và cuộc Cách mạng công nghiệp 4.0. Khác với robot cố định hay xe dẫn đường tự động (AGV) truyền thống vốn bám theo vạch từ/băng dẫn cố định, AMR có khả năng tự định vị, tự lập kế hoạch đường đi và tự điều hướng trong môi trường, nhờ đó được ứng dụng ngày càng rộng rãi trong kho vận thông minh (intralogistics), robot dịch vụ, y tế, nông nghiệp và các nền tảng nghiên cứu </w:t>
+      </w:r>
+      <w:r>
+        <w:rPr>
+          <w:rFonts w:ascii="Times New Roman" w:hAnsi="Times New Roman" w:cs="Times New Roman"/>
+          <w:b w:val="0"/>
+          <w:i w:val="0"/>
+          <w:color w:val="C00000"/>
+          <w:sz w:val="26"/>
+        </w:rPr>
+        <w:t>[10]</w:t>
+      </w:r>
+      <w:r>
+        <w:rPr>
+          <w:rFonts w:ascii="Times New Roman" w:hAnsi="Times New Roman" w:cs="Times New Roman"/>
+          <w:b w:val="0"/>
+          <w:i w:val="0"/>
+          <w:sz w:val="26"/>
+        </w:rPr>
+        <w:t xml:space="preserve">, </w:t>
+      </w:r>
+      <w:r>
+        <w:rPr>
+          <w:rFonts w:ascii="Times New Roman" w:hAnsi="Times New Roman" w:cs="Times New Roman"/>
+          <w:b w:val="0"/>
+          <w:i w:val="0"/>
+          <w:color w:val="C00000"/>
+          <w:sz w:val="26"/>
+        </w:rPr>
+        <w:t>[15]</w:t>
+      </w:r>
+      <w:r>
+        <w:rPr>
+          <w:rFonts w:ascii="Times New Roman" w:hAnsi="Times New Roman" w:cs="Times New Roman"/>
+          <w:b w:val="0"/>
+          <w:i w:val="0"/>
+          <w:sz w:val="26"/>
+        </w:rPr>
+        <w:t xml:space="preserve">. Nhiều khảo sát cho thấy việc thay thế AGV cứng nhắc bằng AMR linh hoạt giúp tăng đáng kể năng suất và khả năng thích ứng của dây chuyền sản xuất trong mô hình nhà máy thông minh </w:t>
+      </w:r>
+      <w:r>
+        <w:rPr>
+          <w:rFonts w:ascii="Times New Roman" w:hAnsi="Times New Roman" w:cs="Times New Roman"/>
+          <w:b w:val="0"/>
+          <w:i w:val="0"/>
+          <w:color w:val="C00000"/>
+          <w:sz w:val="26"/>
+        </w:rPr>
+        <w:t>[15]</w:t>
+      </w:r>
+      <w:r>
+        <w:rPr>
+          <w:rFonts w:ascii="Times New Roman" w:hAnsi="Times New Roman" w:cs="Times New Roman"/>
+          <w:b w:val="0"/>
+          <w:i w:val="0"/>
+          <w:sz w:val="26"/>
+        </w:rPr>
+        <w:t>.</w:t>
       </w:r>
     </w:p>
     <w:p>
@@ -5455,7 +5512,64 @@
           <w:i w:val="0"/>
           <w:sz w:val="26"/>
         </w:rPr>
-        <w:t xml:space="preserve"> (di chuyển chính xác theo lộ trình đó) [10]. Về định vị, phương pháp tương đối (dead-reckoning) dựa trên odometry từ encoder bánh xe đơn giản, rẻ và tần số cao nhưng sai số tích lũy (trôi) theo quãng đường do trượt bánh và đường kính bánh không đều [11]; phương pháp tuyệt đối dùng GPS hoặc mốc định vị (landmark/beacon), còn các kỹ thuật hiện đại như định vị và dựng bản đồ đồng thời (SLAM) bằng LiDAR/camera cho độ chính xác cao nhưng đòi hỏi cảm biến đắt tiền và năng lực tính toán lớn [16].</w:t>
+        <w:t xml:space="preserve"> (di chuyển chính xác theo lộ trình đó) </w:t>
+      </w:r>
+      <w:r>
+        <w:rPr>
+          <w:rFonts w:ascii="Times New Roman" w:hAnsi="Times New Roman" w:cs="Times New Roman"/>
+          <w:b w:val="0"/>
+          <w:i w:val="0"/>
+          <w:color w:val="C00000"/>
+          <w:sz w:val="26"/>
+        </w:rPr>
+        <w:t>[10]</w:t>
+      </w:r>
+      <w:r>
+        <w:rPr>
+          <w:rFonts w:ascii="Times New Roman" w:hAnsi="Times New Roman" w:cs="Times New Roman"/>
+          <w:b w:val="0"/>
+          <w:i w:val="0"/>
+          <w:sz w:val="26"/>
+        </w:rPr>
+        <w:t xml:space="preserve">. Về định vị, phương pháp tương đối (dead-reckoning) dựa trên odometry từ encoder bánh xe đơn giản, rẻ và tần số cao nhưng sai số tích lũy (trôi) theo quãng đường do trượt bánh và đường kính bánh không đều </w:t>
+      </w:r>
+      <w:r>
+        <w:rPr>
+          <w:rFonts w:ascii="Times New Roman" w:hAnsi="Times New Roman" w:cs="Times New Roman"/>
+          <w:b w:val="0"/>
+          <w:i w:val="0"/>
+          <w:color w:val="C00000"/>
+          <w:sz w:val="26"/>
+        </w:rPr>
+        <w:t>[11]</w:t>
+      </w:r>
+      <w:r>
+        <w:rPr>
+          <w:rFonts w:ascii="Times New Roman" w:hAnsi="Times New Roman" w:cs="Times New Roman"/>
+          <w:b w:val="0"/>
+          <w:i w:val="0"/>
+          <w:sz w:val="26"/>
+        </w:rPr>
+        <w:t xml:space="preserve">; phương pháp tuyệt đối dùng GPS hoặc mốc định vị (landmark/beacon), còn các kỹ thuật hiện đại như định vị và dựng bản đồ đồng thời (SLAM) bằng LiDAR/camera cho độ chính xác cao nhưng đòi hỏi cảm biến đắt tiền và năng lực tính toán lớn </w:t>
+      </w:r>
+      <w:r>
+        <w:rPr>
+          <w:rFonts w:ascii="Times New Roman" w:hAnsi="Times New Roman" w:cs="Times New Roman"/>
+          <w:b w:val="0"/>
+          <w:i w:val="0"/>
+          <w:color w:val="C00000"/>
+          <w:sz w:val="26"/>
+        </w:rPr>
+        <w:t>[16]</w:t>
+      </w:r>
+      <w:r>
+        <w:rPr>
+          <w:rFonts w:ascii="Times New Roman" w:hAnsi="Times New Roman" w:cs="Times New Roman"/>
+          <w:b w:val="0"/>
+          <w:i w:val="0"/>
+          <w:sz w:val="26"/>
+        </w:rPr>
+        <w:t>.</w:t>
       </w:r>
     </w:p>
     <w:p>
@@ -5469,7 +5583,83 @@
           <w:i w:val="0"/>
           <w:sz w:val="26"/>
         </w:rPr>
-        <w:t xml:space="preserve">Để giảm trôi của odometry, nhiều nghiên cứu đã hợp nhất encoder với cảm biến quán tính (IMU). Al Khatib và cộng sự [33] hợp nhất nhiều cảm biến (odometry, IMU) bằng bộ lọc Kalman mở rộng (EKF), nâng cao rõ rệt độ chính xác định vị và dẫn đường so với chỉ dùng đơn cảm biến. Cùng hướng đó, Ly và cộng sự [34] hợp nhất dữ liệu IMU và encoder bằng bộ lọc Kalman cho robot di động, cho thấy vị trí ước lượng bám quỹ đạo thực sát hơn hẳn odometry thuần; Housein và cộng sự [35] trình bày một triển khai EKF thực nghiệm cho cùng bài toán. Các hướng mở rộng gần đây còn kết hợp thêm thị giác (wheel–inertial–visual) bằng biến thể bộ lọc Kalman để tăng độ bền vững [36]. Tuy nhiên, bộ lọc Kalman/EKF đòi hỏi mô hình và khối lượng tính toán đáng kể; với vi điều khiển hạn chế tài nguyên, </w:t>
+        <w:t xml:space="preserve">Để giảm trôi của odometry, nhiều nghiên cứu đã hợp nhất encoder với cảm biến quán tính (IMU). Al Khatib và cộng sự </w:t>
+      </w:r>
+      <w:r>
+        <w:rPr>
+          <w:rFonts w:ascii="Times New Roman" w:hAnsi="Times New Roman" w:cs="Times New Roman"/>
+          <w:b w:val="0"/>
+          <w:i w:val="0"/>
+          <w:color w:val="C00000"/>
+          <w:sz w:val="26"/>
+        </w:rPr>
+        <w:t>[33]</w:t>
+      </w:r>
+      <w:r>
+        <w:rPr>
+          <w:rFonts w:ascii="Times New Roman" w:hAnsi="Times New Roman" w:cs="Times New Roman"/>
+          <w:b w:val="0"/>
+          <w:i w:val="0"/>
+          <w:sz w:val="26"/>
+        </w:rPr>
+        <w:t xml:space="preserve"> hợp nhất nhiều cảm biến (odometry, IMU) bằng bộ lọc Kalman mở rộng (EKF), nâng cao rõ rệt độ chính xác định vị và dẫn đường so với chỉ dùng đơn cảm biến. Cùng hướng đó, Ly và cộng sự </w:t>
+      </w:r>
+      <w:r>
+        <w:rPr>
+          <w:rFonts w:ascii="Times New Roman" w:hAnsi="Times New Roman" w:cs="Times New Roman"/>
+          <w:b w:val="0"/>
+          <w:i w:val="0"/>
+          <w:color w:val="C00000"/>
+          <w:sz w:val="26"/>
+        </w:rPr>
+        <w:t>[34]</w:t>
+      </w:r>
+      <w:r>
+        <w:rPr>
+          <w:rFonts w:ascii="Times New Roman" w:hAnsi="Times New Roman" w:cs="Times New Roman"/>
+          <w:b w:val="0"/>
+          <w:i w:val="0"/>
+          <w:sz w:val="26"/>
+        </w:rPr>
+        <w:t xml:space="preserve"> hợp nhất dữ liệu IMU và encoder bằng bộ lọc Kalman cho robot di động, cho thấy vị trí ước lượng bám quỹ đạo thực sát hơn hẳn odometry thuần; Housein và cộng sự </w:t>
+      </w:r>
+      <w:r>
+        <w:rPr>
+          <w:rFonts w:ascii="Times New Roman" w:hAnsi="Times New Roman" w:cs="Times New Roman"/>
+          <w:b w:val="0"/>
+          <w:i w:val="0"/>
+          <w:color w:val="C00000"/>
+          <w:sz w:val="26"/>
+        </w:rPr>
+        <w:t>[35]</w:t>
+      </w:r>
+      <w:r>
+        <w:rPr>
+          <w:rFonts w:ascii="Times New Roman" w:hAnsi="Times New Roman" w:cs="Times New Roman"/>
+          <w:b w:val="0"/>
+          <w:i w:val="0"/>
+          <w:sz w:val="26"/>
+        </w:rPr>
+        <w:t xml:space="preserve"> trình bày một triển khai EKF thực nghiệm cho cùng bài toán. Các hướng mở rộng gần đây còn kết hợp thêm thị giác (wheel–inertial–visual) bằng biến thể bộ lọc Kalman để tăng độ bền vững </w:t>
+      </w:r>
+      <w:r>
+        <w:rPr>
+          <w:rFonts w:ascii="Times New Roman" w:hAnsi="Times New Roman" w:cs="Times New Roman"/>
+          <w:b w:val="0"/>
+          <w:i w:val="0"/>
+          <w:color w:val="C00000"/>
+          <w:sz w:val="26"/>
+        </w:rPr>
+        <w:t>[36]</w:t>
+      </w:r>
+      <w:r>
+        <w:rPr>
+          <w:rFonts w:ascii="Times New Roman" w:hAnsi="Times New Roman" w:cs="Times New Roman"/>
+          <w:b w:val="0"/>
+          <w:i w:val="0"/>
+          <w:sz w:val="26"/>
+        </w:rPr>
+        <w:t xml:space="preserve">. Tuy nhiên, bộ lọc Kalman/EKF đòi hỏi mô hình và khối lượng tính toán đáng kể; với vi điều khiển hạn chế tài nguyên, </w:t>
       </w:r>
       <w:r>
         <w:rPr>
@@ -5487,7 +5677,26 @@
           <w:i w:val="0"/>
           <w:sz w:val="26"/>
         </w:rPr>
-        <w:t xml:space="preserve"> là giải pháp nhẹ hơn, đủ tốt để kết hợp con quay hồi chuyển và encoder nhằm ổn định ước lượng hướng [14].</w:t>
+        <w:t xml:space="preserve"> là giải pháp nhẹ hơn, đủ tốt để kết hợp con quay hồi chuyển và encoder nhằm ổn định ước lượng hướng </w:t>
+      </w:r>
+      <w:r>
+        <w:rPr>
+          <w:rFonts w:ascii="Times New Roman" w:hAnsi="Times New Roman" w:cs="Times New Roman"/>
+          <w:b w:val="0"/>
+          <w:i w:val="0"/>
+          <w:color w:val="C00000"/>
+          <w:sz w:val="26"/>
+        </w:rPr>
+        <w:t>[14]</w:t>
+      </w:r>
+      <w:r>
+        <w:rPr>
+          <w:rFonts w:ascii="Times New Roman" w:hAnsi="Times New Roman" w:cs="Times New Roman"/>
+          <w:b w:val="0"/>
+          <w:i w:val="0"/>
+          <w:sz w:val="26"/>
+        </w:rPr>
+        <w:t>.</w:t>
       </w:r>
     </w:p>
     <w:p>
@@ -5501,7 +5710,26 @@
           <w:i w:val="0"/>
           <w:sz w:val="26"/>
         </w:rPr>
-        <w:t xml:space="preserve">Về bài toán tìm đường, lý thuyết đồ thị cung cấp nền tảng vững chắc: thuật toán Dijkstra tìm đường đi ngắn nhất trên đồ thị có trọng số [13], còn thuật toán </w:t>
+        <w:t xml:space="preserve">Về bài toán tìm đường, lý thuyết đồ thị cung cấp nền tảng vững chắc: thuật toán Dijkstra tìm đường đi ngắn nhất trên đồ thị có trọng số </w:t>
+      </w:r>
+      <w:r>
+        <w:rPr>
+          <w:rFonts w:ascii="Times New Roman" w:hAnsi="Times New Roman" w:cs="Times New Roman"/>
+          <w:b w:val="0"/>
+          <w:i w:val="0"/>
+          <w:color w:val="C00000"/>
+          <w:sz w:val="26"/>
+        </w:rPr>
+        <w:t>[13]</w:t>
+      </w:r>
+      <w:r>
+        <w:rPr>
+          <w:rFonts w:ascii="Times New Roman" w:hAnsi="Times New Roman" w:cs="Times New Roman"/>
+          <w:b w:val="0"/>
+          <w:i w:val="0"/>
+          <w:sz w:val="26"/>
+        </w:rPr>
+        <w:t xml:space="preserve">, còn thuật toán </w:t>
       </w:r>
       <w:r>
         <w:rPr>
@@ -5516,19 +5744,104 @@
         <w:rPr>
           <w:rFonts w:ascii="Times New Roman" w:hAnsi="Times New Roman" w:cs="Times New Roman"/>
           <w:b w:val="0"/>
+          <w:i w:val="0"/>
+          <w:sz w:val="26"/>
+        </w:rPr>
+        <w:t xml:space="preserve">* mở rộng Dijkstra bằng một hàm heuristic để hướng việc tìm kiếm về phía đích, nhờ đó giảm mạnh số nút phải duyệt mà vẫn đảm bảo tối ưu khi heuristic chấp nhận được (admissible) </w:t>
+      </w:r>
+      <w:r>
+        <w:rPr>
+          <w:rFonts w:ascii="Times New Roman" w:hAnsi="Times New Roman" w:cs="Times New Roman"/>
+          <w:b w:val="0"/>
+          <w:i w:val="0"/>
+          <w:color w:val="C00000"/>
+          <w:sz w:val="26"/>
+        </w:rPr>
+        <w:t>[6]</w:t>
+      </w:r>
+      <w:r>
+        <w:rPr>
+          <w:rFonts w:ascii="Times New Roman" w:hAnsi="Times New Roman" w:cs="Times New Roman"/>
+          <w:b w:val="0"/>
+          <w:i w:val="0"/>
+          <w:sz w:val="26"/>
+        </w:rPr>
+        <w:t xml:space="preserve">. Bên cạnh nhóm dựa trên đồ thị/lưới còn có nhóm lấy mẫu ngẫu nhiên (RRT, PRM) cho không gian cấu hình nhiều chiều </w:t>
+      </w:r>
+      <w:r>
+        <w:rPr>
+          <w:rFonts w:ascii="Times New Roman" w:hAnsi="Times New Roman" w:cs="Times New Roman"/>
+          <w:b w:val="0"/>
+          <w:i w:val="0"/>
+          <w:color w:val="C00000"/>
+          <w:sz w:val="26"/>
+        </w:rPr>
+        <w:t>[12]</w:t>
+      </w:r>
+      <w:r>
+        <w:rPr>
+          <w:rFonts w:ascii="Times New Roman" w:hAnsi="Times New Roman" w:cs="Times New Roman"/>
+          <w:b w:val="0"/>
+          <w:i w:val="0"/>
+          <w:sz w:val="26"/>
+        </w:rPr>
+        <w:t xml:space="preserve">. Trong thực tiễn robot, A* vẫn là lựa chọn phổ biến và liên tục được cải tiến: Shahapur và cộng sự </w:t>
+      </w:r>
+      <w:r>
+        <w:rPr>
+          <w:rFonts w:ascii="Times New Roman" w:hAnsi="Times New Roman" w:cs="Times New Roman"/>
+          <w:b w:val="0"/>
+          <w:i w:val="0"/>
+          <w:color w:val="C00000"/>
+          <w:sz w:val="26"/>
+        </w:rPr>
+        <w:t>[38]</w:t>
+      </w:r>
+      <w:r>
+        <w:rPr>
+          <w:rFonts w:ascii="Times New Roman" w:hAnsi="Times New Roman" w:cs="Times New Roman"/>
+          <w:b w:val="0"/>
+          <w:i w:val="0"/>
+          <w:sz w:val="26"/>
+        </w:rPr>
+        <w:t xml:space="preserve"> hiện thực và so sánh A</w:t>
+      </w:r>
+      <w:r>
+        <w:rPr>
+          <w:rFonts w:ascii="Times New Roman" w:hAnsi="Times New Roman" w:cs="Times New Roman"/>
+          <w:b w:val="0"/>
           <w:i/>
           <w:sz w:val="26"/>
         </w:rPr>
-        <w:t xml:space="preserve"> mở rộng Dijkstra bằng một hàm heuristic để hướng việc tìm kiếm về phía đích, nhờ đó giảm mạnh số nút phải duyệt mà vẫn đảm bảo tối ưu khi heuristic chấp nhận được (admissible) [6]. Bên cạnh nhóm dựa trên đồ thị/lưới còn có nhóm lấy mẫu ngẫu nhiên (RRT, PRM) cho không gian cấu hình nhiều chiều [12]. Trong thực tiễn robot, A</w:t>
-      </w:r>
-      <w:r>
-        <w:rPr>
-          <w:rFonts w:ascii="Times New Roman" w:hAnsi="Times New Roman" w:cs="Times New Roman"/>
-          <w:b w:val="0"/>
-          <w:i w:val="0"/>
-          <w:sz w:val="26"/>
-        </w:rPr>
-        <w:t xml:space="preserve"> vẫn là lựa chọn phổ biến và liên tục được cải tiến: Shahapur và cộng sự [38] hiện thực và so sánh A</w:t>
+        <w:t xml:space="preserve"> với Dijkstra trên robot TurtleBot3 (mô phỏng Gazebo), xác nhận A</w:t>
+      </w:r>
+      <w:r>
+        <w:rPr>
+          <w:rFonts w:ascii="Times New Roman" w:hAnsi="Times New Roman" w:cs="Times New Roman"/>
+          <w:b w:val="0"/>
+          <w:i w:val="0"/>
+          <w:sz w:val="26"/>
+        </w:rPr>
+        <w:t xml:space="preserve"> tìm được đường tối ưu với số nút duyệt ít hơn; Yao và cộng sự </w:t>
+      </w:r>
+      <w:r>
+        <w:rPr>
+          <w:rFonts w:ascii="Times New Roman" w:hAnsi="Times New Roman" w:cs="Times New Roman"/>
+          <w:b w:val="0"/>
+          <w:i w:val="0"/>
+          <w:color w:val="C00000"/>
+          <w:sz w:val="26"/>
+        </w:rPr>
+        <w:t>[37]</w:t>
+      </w:r>
+      <w:r>
+        <w:rPr>
+          <w:rFonts w:ascii="Times New Roman" w:hAnsi="Times New Roman" w:cs="Times New Roman"/>
+          <w:b w:val="0"/>
+          <w:i w:val="0"/>
+          <w:sz w:val="26"/>
+        </w:rPr>
+        <w:t xml:space="preserve"> đề xuất biến thể A</w:t>
       </w:r>
       <w:r>
         <w:rPr>
@@ -5537,16 +5850,16 @@
           <w:i/>
           <w:sz w:val="26"/>
         </w:rPr>
-        <w:t xml:space="preserve"> với Dijkstra trên robot TurtleBot3 (mô phỏng Gazebo), xác nhận A</w:t>
-      </w:r>
-      <w:r>
-        <w:rPr>
-          <w:rFonts w:ascii="Times New Roman" w:hAnsi="Times New Roman" w:cs="Times New Roman"/>
-          <w:b w:val="0"/>
-          <w:i w:val="0"/>
-          <w:sz w:val="26"/>
-        </w:rPr>
-        <w:t xml:space="preserve"> tìm được đường tối ưu với số nút duyệt ít hơn; Yao và cộng sự [37] đề xuất biến thể A</w:t>
+        <w:t xml:space="preserve"> cải tiến (BSGA</w:t>
+      </w:r>
+      <w:r>
+        <w:rPr>
+          <w:rFonts w:ascii="Times New Roman" w:hAnsi="Times New Roman" w:cs="Times New Roman"/>
+          <w:b w:val="0"/>
+          <w:i w:val="0"/>
+          <w:sz w:val="26"/>
+        </w:rPr>
+        <w:t>) cho robot vi sai nhằm khắc phục đúng các hạn chế của A</w:t>
       </w:r>
       <w:r>
         <w:rPr>
@@ -5555,24 +5868,6 @@
           <w:i/>
           <w:sz w:val="26"/>
         </w:rPr>
-        <w:t xml:space="preserve"> cải tiến (BSGA</w:t>
-      </w:r>
-      <w:r>
-        <w:rPr>
-          <w:rFonts w:ascii="Times New Roman" w:hAnsi="Times New Roman" w:cs="Times New Roman"/>
-          <w:b w:val="0"/>
-          <w:i w:val="0"/>
-          <w:sz w:val="26"/>
-        </w:rPr>
-        <w:t>) cho robot vi sai nhằm khắc phục đúng các hạn chế của A</w:t>
-      </w:r>
-      <w:r>
-        <w:rPr>
-          <w:rFonts w:ascii="Times New Roman" w:hAnsi="Times New Roman" w:cs="Times New Roman"/>
-          <w:b w:val="0"/>
-          <w:i/>
-          <w:sz w:val="26"/>
-        </w:rPr>
         <w:t xml:space="preserve"> gốc là số nút tìm kiếm lớn và đường đi kém mượt. Với môi trường trong nhà đã biết trước dưới dạng lưới điểm (waypoint), A</w:t>
       </w:r>
       <w:r>
@@ -5614,7 +5909,45 @@
           <w:i w:val="0"/>
           <w:sz w:val="26"/>
         </w:rPr>
-        <w:t xml:space="preserve"> cũng được nghiên cứu theo hướng chi phí thấp. Yasin và cộng sự [39] đề xuất phương pháp phát hiện vật cản và tránh va chạm chỉ dùng cảm biến siêu âm giá rẻ, với mục tiêu tối thiểu hóa độ lệch khỏi lộ trình ban đầu — rất phù hợp cho robot ngân sách thấp. Ở quy mô công nghiệp, robot tự hành thường được trang bị cảm biến đắt tiền (LiDAR, camera độ phân giải cao, GPS-RTK) cùng máy tính mạnh để chạy SLAM và thị giác máy tính [16]; nhưng chi phí và độ phức tạp đó là rào cản lớn đối với sinh viên và các dự án học thuật. Vì vậy, hướng xây dựng robot tự hành </w:t>
+        <w:t xml:space="preserve"> cũng được nghiên cứu theo hướng chi phí thấp. Yasin và cộng sự </w:t>
+      </w:r>
+      <w:r>
+        <w:rPr>
+          <w:rFonts w:ascii="Times New Roman" w:hAnsi="Times New Roman" w:cs="Times New Roman"/>
+          <w:b w:val="0"/>
+          <w:i w:val="0"/>
+          <w:color w:val="C00000"/>
+          <w:sz w:val="26"/>
+        </w:rPr>
+        <w:t>[39]</w:t>
+      </w:r>
+      <w:r>
+        <w:rPr>
+          <w:rFonts w:ascii="Times New Roman" w:hAnsi="Times New Roman" w:cs="Times New Roman"/>
+          <w:b w:val="0"/>
+          <w:i w:val="0"/>
+          <w:sz w:val="26"/>
+        </w:rPr>
+        <w:t xml:space="preserve"> đề xuất phương pháp phát hiện vật cản và tránh va chạm chỉ dùng cảm biến siêu âm giá rẻ, với mục tiêu tối thiểu hóa độ lệch khỏi lộ trình ban đầu — rất phù hợp cho robot ngân sách thấp. Ở quy mô công nghiệp, robot tự hành thường được trang bị cảm biến đắt tiền (LiDAR, camera độ phân giải cao, GPS-RTK) cùng máy tính mạnh để chạy SLAM và thị giác máy tính </w:t>
+      </w:r>
+      <w:r>
+        <w:rPr>
+          <w:rFonts w:ascii="Times New Roman" w:hAnsi="Times New Roman" w:cs="Times New Roman"/>
+          <w:b w:val="0"/>
+          <w:i w:val="0"/>
+          <w:color w:val="C00000"/>
+          <w:sz w:val="26"/>
+        </w:rPr>
+        <w:t>[16]</w:t>
+      </w:r>
+      <w:r>
+        <w:rPr>
+          <w:rFonts w:ascii="Times New Roman" w:hAnsi="Times New Roman" w:cs="Times New Roman"/>
+          <w:b w:val="0"/>
+          <w:i w:val="0"/>
+          <w:sz w:val="26"/>
+        </w:rPr>
+        <w:t xml:space="preserve">; nhưng chi phí và độ phức tạp đó là rào cản lớn đối với sinh viên và các dự án học thuật. Vì vậy, hướng xây dựng robot tự hành </w:t>
       </w:r>
       <w:r>
         <w:rPr>
@@ -5632,7 +5965,26 @@
           <w:i w:val="0"/>
           <w:sz w:val="26"/>
         </w:rPr>
-        <w:t xml:space="preserve"> dựa trên vi điều khiển phổ thông ngày càng được quan tâm — tiêu biểu là ESP32, vi điều khiển lõi kép tích hợp sẵn WiFi/Bluetooth, giá rẻ, cộng đồng hỗ trợ lớn, phù hợp cho các ứng dụng IoT và robot nhỏ [17].</w:t>
+        <w:t xml:space="preserve"> dựa trên vi điều khiển phổ thông ngày càng được quan tâm — tiêu biểu là ESP32, vi điều khiển lõi kép tích hợp sẵn WiFi/Bluetooth, giá rẻ, cộng đồng hỗ trợ lớn, phù hợp cho các ứng dụng IoT và robot nhỏ </w:t>
+      </w:r>
+      <w:r>
+        <w:rPr>
+          <w:rFonts w:ascii="Times New Roman" w:hAnsi="Times New Roman" w:cs="Times New Roman"/>
+          <w:b w:val="0"/>
+          <w:i w:val="0"/>
+          <w:color w:val="C00000"/>
+          <w:sz w:val="26"/>
+        </w:rPr>
+        <w:t>[17]</w:t>
+      </w:r>
+      <w:r>
+        <w:rPr>
+          <w:rFonts w:ascii="Times New Roman" w:hAnsi="Times New Roman" w:cs="Times New Roman"/>
+          <w:b w:val="0"/>
+          <w:i w:val="0"/>
+          <w:sz w:val="26"/>
+        </w:rPr>
+        <w:t>.</w:t>
       </w:r>
     </w:p>
     <w:p>
@@ -5646,22 +5998,70 @@
           <w:i w:val="0"/>
           <w:sz w:val="26"/>
         </w:rPr>
-        <w:t>Từ tổng quan trên có thể thấy các kỹ thuật định vị (hợp nhất encoder–IMU), tìm đường (A</w:t>
-      </w:r>
-      <w:r>
-        <w:rPr>
-          <w:rFonts w:ascii="Times New Roman" w:hAnsi="Times New Roman" w:cs="Times New Roman"/>
-          <w:b w:val="0"/>
-          <w:i/>
-          <w:sz w:val="26"/>
-        </w:rPr>
-        <w:t xml:space="preserve">) và né vật cản đều đã tương đối hoàn thiện, nhưng phần lớn được kiểm chứng trên nền tảng mạnh (PC/ROS, robot chuẩn như TurtleBot3) [38] hoặc bằng các bộ lọc tính toán nặng như EKF [33], [35]. Vẫn còn thiếu những giải pháp </w:t>
-      </w:r>
-      <w:r>
-        <w:rPr>
-          <w:rFonts w:ascii="Times New Roman" w:hAnsi="Times New Roman" w:cs="Times New Roman"/>
-          <w:b w:val="0"/>
-          <w:i/>
+        <w:t xml:space="preserve">Từ tổng quan trên có thể thấy các kỹ thuật định vị (hợp nhất encoder–IMU), tìm đường (A*) và né vật cản đều đã tương đối hoàn thiện, nhưng phần lớn được kiểm chứng trên nền tảng mạnh (PC/ROS, robot chuẩn như TurtleBot3) </w:t>
+      </w:r>
+      <w:r>
+        <w:rPr>
+          <w:rFonts w:ascii="Times New Roman" w:hAnsi="Times New Roman" w:cs="Times New Roman"/>
+          <w:b w:val="0"/>
+          <w:i w:val="0"/>
+          <w:color w:val="C00000"/>
+          <w:sz w:val="26"/>
+        </w:rPr>
+        <w:t>[38]</w:t>
+      </w:r>
+      <w:r>
+        <w:rPr>
+          <w:rFonts w:ascii="Times New Roman" w:hAnsi="Times New Roman" w:cs="Times New Roman"/>
+          <w:b w:val="0"/>
+          <w:i w:val="0"/>
+          <w:sz w:val="26"/>
+        </w:rPr>
+        <w:t xml:space="preserve"> hoặc bằng các bộ lọc tính toán nặng như EKF </w:t>
+      </w:r>
+      <w:r>
+        <w:rPr>
+          <w:rFonts w:ascii="Times New Roman" w:hAnsi="Times New Roman" w:cs="Times New Roman"/>
+          <w:b w:val="0"/>
+          <w:i w:val="0"/>
+          <w:color w:val="C00000"/>
+          <w:sz w:val="26"/>
+        </w:rPr>
+        <w:t>[33]</w:t>
+      </w:r>
+      <w:r>
+        <w:rPr>
+          <w:rFonts w:ascii="Times New Roman" w:hAnsi="Times New Roman" w:cs="Times New Roman"/>
+          <w:b w:val="0"/>
+          <w:i w:val="0"/>
+          <w:sz w:val="26"/>
+        </w:rPr>
+        <w:t xml:space="preserve">, </w:t>
+      </w:r>
+      <w:r>
+        <w:rPr>
+          <w:rFonts w:ascii="Times New Roman" w:hAnsi="Times New Roman" w:cs="Times New Roman"/>
+          <w:b w:val="0"/>
+          <w:i w:val="0"/>
+          <w:color w:val="C00000"/>
+          <w:sz w:val="26"/>
+        </w:rPr>
+        <w:t>[35]</w:t>
+      </w:r>
+      <w:r>
+        <w:rPr>
+          <w:rFonts w:ascii="Times New Roman" w:hAnsi="Times New Roman" w:cs="Times New Roman"/>
+          <w:b w:val="0"/>
+          <w:i w:val="0"/>
+          <w:sz w:val="26"/>
+        </w:rPr>
+        <w:t xml:space="preserve">. Vẫn còn thiếu những giải pháp </w:t>
+      </w:r>
+      <w:r>
+        <w:rPr>
+          <w:rFonts w:ascii="Times New Roman" w:hAnsi="Times New Roman" w:cs="Times New Roman"/>
+          <w:b/>
+          <w:i w:val="0"/>
           <w:sz w:val="26"/>
         </w:rPr>
         <w:t>tích hợp trọn vẹn</w:t>
@@ -5673,7 +6073,7 @@
           <w:i w:val="0"/>
           <w:sz w:val="26"/>
         </w:rPr>
-        <w:t>* cả ba chức năng định vị – tìm đường – bám lộ trình lên một vi điều khiển chi phí thấp, hoạt động độc lập không cần Internet và dễ tiếp cận cho mục đích học tập. Xây dựng một nền tảng như vậy vừa mang ý nghĩa thực tiễn — là sản phẩm học tập giúp người thực hiện nắm vững trọn vẹn chuỗi kiến thức nền (điều khiển động cơ, đọc cảm biến, định vị, lập kế hoạch đường đi, truyền thông không dây) — vừa là khung sườn để phát triển tiếp các tính năng cao cấp hơn như tránh vật cản động, SLAM hay phối hợp đội hình nhiều robot.</w:t>
+        <w:t xml:space="preserve"> cả ba chức năng định vị – tìm đường – bám lộ trình lên một vi điều khiển chi phí thấp, hoạt động độc lập không cần Internet và dễ tiếp cận cho mục đích học tập. Xây dựng một nền tảng như vậy vừa mang ý nghĩa thực tiễn — là sản phẩm học tập giúp người thực hiện nắm vững trọn vẹn chuỗi kiến thức nền (điều khiển động cơ, đọc cảm biến, định vị, lập kế hoạch đường đi, truyền thông không dây) — vừa là khung sườn để phát triển tiếp các tính năng cao cấp hơn như tránh vật cản động, SLAM hay phối hợp đội hình nhiều robot.</w:t>
       </w:r>
     </w:p>
     <w:p>
@@ -5705,7 +6105,64 @@
           <w:i w:val="0"/>
           <w:sz w:val="26"/>
         </w:rPr>
-        <w:t xml:space="preserve"> được lựa chọn thực hiện. Đề tài dùng ESP32 làm bộ điều khiển trung tâm; định vị bằng odometry kết hợp encoder bánh xe và cảm biến góc MPU-6050 thông qua bộ lọc bù [14]; tìm đường bằng thuật toán A* [6] chạy trên ứng dụng di động đa nền tảng viết bằng Flutter [9]; và liên lạc thời gian thực giữa ứng dụng với xe qua giao thức UDP trên mạng WiFi cục bộ do chính ESP32 phát ra. Việc chọn Flutter và mạng cục bộ giúp hệ thống đa nền tảng, độ trễ thấp và hoạt động độc lập với Internet. Toàn bộ hệ thống được thiết kế theo hướng module hóa, chi phí thấp và có khả năng mở rộng, hướng tới một nền tảng học thuật hoàn chỉnh cho các bài toán định vị và dẫn đường robot ở quy mô phòng thí nghiệm.</w:t>
+        <w:t xml:space="preserve"> được lựa chọn thực hiện. Đề tài dùng ESP32 làm bộ điều khiển trung tâm; định vị bằng odometry kết hợp encoder bánh xe và cảm biến góc MPU-6050 thông qua bộ lọc bù </w:t>
+      </w:r>
+      <w:r>
+        <w:rPr>
+          <w:rFonts w:ascii="Times New Roman" w:hAnsi="Times New Roman" w:cs="Times New Roman"/>
+          <w:b w:val="0"/>
+          <w:i w:val="0"/>
+          <w:color w:val="C00000"/>
+          <w:sz w:val="26"/>
+        </w:rPr>
+        <w:t>[14]</w:t>
+      </w:r>
+      <w:r>
+        <w:rPr>
+          <w:rFonts w:ascii="Times New Roman" w:hAnsi="Times New Roman" w:cs="Times New Roman"/>
+          <w:b w:val="0"/>
+          <w:i w:val="0"/>
+          <w:sz w:val="26"/>
+        </w:rPr>
+        <w:t xml:space="preserve">; tìm đường bằng thuật toán A* </w:t>
+      </w:r>
+      <w:r>
+        <w:rPr>
+          <w:rFonts w:ascii="Times New Roman" w:hAnsi="Times New Roman" w:cs="Times New Roman"/>
+          <w:b w:val="0"/>
+          <w:i w:val="0"/>
+          <w:color w:val="C00000"/>
+          <w:sz w:val="26"/>
+        </w:rPr>
+        <w:t>[6]</w:t>
+      </w:r>
+      <w:r>
+        <w:rPr>
+          <w:rFonts w:ascii="Times New Roman" w:hAnsi="Times New Roman" w:cs="Times New Roman"/>
+          <w:b w:val="0"/>
+          <w:i w:val="0"/>
+          <w:sz w:val="26"/>
+        </w:rPr>
+        <w:t xml:space="preserve"> chạy trên ứng dụng di động đa nền tảng viết bằng Flutter </w:t>
+      </w:r>
+      <w:r>
+        <w:rPr>
+          <w:rFonts w:ascii="Times New Roman" w:hAnsi="Times New Roman" w:cs="Times New Roman"/>
+          <w:b w:val="0"/>
+          <w:i w:val="0"/>
+          <w:color w:val="C00000"/>
+          <w:sz w:val="26"/>
+        </w:rPr>
+        <w:t>[9]</w:t>
+      </w:r>
+      <w:r>
+        <w:rPr>
+          <w:rFonts w:ascii="Times New Roman" w:hAnsi="Times New Roman" w:cs="Times New Roman"/>
+          <w:b w:val="0"/>
+          <w:i w:val="0"/>
+          <w:sz w:val="26"/>
+        </w:rPr>
+        <w:t>; và liên lạc thời gian thực giữa ứng dụng với xe qua giao thức UDP trên mạng WiFi cục bộ do chính ESP32 phát ra. Việc chọn Flutter và mạng cục bộ giúp hệ thống đa nền tảng, độ trễ thấp và hoạt động độc lập với Internet. Toàn bộ hệ thống được thiết kế theo hướng module hóa, chi phí thấp và có khả năng mở rộng, hướng tới một nền tảng học thuật hoàn chỉnh cho các bài toán định vị và dẫn đường robot ở quy mô phòng thí nghiệm.</w:t>
       </w:r>
     </w:p>
     <w:p>
@@ -6889,7 +7346,26 @@
           <w:i w:val="0"/>
           <w:sz w:val="26"/>
         </w:rPr>
-        <w:t xml:space="preserve"> [18]. Mỗi chân GPIO có thể cấu hình kéo lên (pull-up)/kéo xuống (pull-down) nội bộ, và quan trọng nhất với đề tài là khả năng tạo </w:t>
+        <w:t xml:space="preserve"> </w:t>
+      </w:r>
+      <w:r>
+        <w:rPr>
+          <w:rFonts w:ascii="Times New Roman" w:hAnsi="Times New Roman" w:cs="Times New Roman"/>
+          <w:b w:val="0"/>
+          <w:i w:val="0"/>
+          <w:color w:val="C00000"/>
+          <w:sz w:val="26"/>
+        </w:rPr>
+        <w:t>[18]</w:t>
+      </w:r>
+      <w:r>
+        <w:rPr>
+          <w:rFonts w:ascii="Times New Roman" w:hAnsi="Times New Roman" w:cs="Times New Roman"/>
+          <w:b w:val="0"/>
+          <w:i w:val="0"/>
+          <w:sz w:val="26"/>
+        </w:rPr>
+        <w:t xml:space="preserve">. Mỗi chân GPIO có thể cấu hình kéo lên (pull-up)/kéo xuống (pull-down) nội bộ, và quan trọng nhất với đề tài là khả năng tạo </w:t>
       </w:r>
       <w:r>
         <w:rPr>
@@ -6971,7 +7447,26 @@
           <w:i w:val="0"/>
           <w:sz w:val="26"/>
         </w:rPr>
-        <w:t>I2C (Inter-Integrated Circuit) [19] là giao thức truyền thông nối tiếp đồng bộ, sử dụng hai đường:</w:t>
+        <w:t xml:space="preserve">I2C (Inter-Integrated Circuit) </w:t>
+      </w:r>
+      <w:r>
+        <w:rPr>
+          <w:rFonts w:ascii="Times New Roman" w:hAnsi="Times New Roman" w:cs="Times New Roman"/>
+          <w:b w:val="0"/>
+          <w:i w:val="0"/>
+          <w:color w:val="C00000"/>
+          <w:sz w:val="26"/>
+        </w:rPr>
+        <w:t>[19]</w:t>
+      </w:r>
+      <w:r>
+        <w:rPr>
+          <w:rFonts w:ascii="Times New Roman" w:hAnsi="Times New Roman" w:cs="Times New Roman"/>
+          <w:b w:val="0"/>
+          <w:i w:val="0"/>
+          <w:sz w:val="26"/>
+        </w:rPr>
+        <w:t xml:space="preserve"> là giao thức truyền thông nối tiếp đồng bộ, sử dụng hai đường:</w:t>
       </w:r>
     </w:p>
     <w:p>
@@ -7148,7 +7643,26 @@
           <w:i w:val="0"/>
           <w:sz w:val="26"/>
         </w:rPr>
-        <w:t>PWM (Pulse Width Modulation – điều chế độ rộng xung) [20] điều khiển công suất trung bình cấp cho tải bằng cách thay đổi tỉ lệ thời gian mức cao/thấp của tín hiệu (duty cycle). Tốc độ động cơ DC tỉ lệ với duty cycle của tín hiệu PWM cấp vào chân Enable của mạch cầu H.</w:t>
+        <w:t xml:space="preserve">PWM (Pulse Width Modulation – điều chế độ rộng xung) </w:t>
+      </w:r>
+      <w:r>
+        <w:rPr>
+          <w:rFonts w:ascii="Times New Roman" w:hAnsi="Times New Roman" w:cs="Times New Roman"/>
+          <w:b w:val="0"/>
+          <w:i w:val="0"/>
+          <w:color w:val="C00000"/>
+          <w:sz w:val="26"/>
+        </w:rPr>
+        <w:t>[20]</w:t>
+      </w:r>
+      <w:r>
+        <w:rPr>
+          <w:rFonts w:ascii="Times New Roman" w:hAnsi="Times New Roman" w:cs="Times New Roman"/>
+          <w:b w:val="0"/>
+          <w:i w:val="0"/>
+          <w:sz w:val="26"/>
+        </w:rPr>
+        <w:t xml:space="preserve"> điều khiển công suất trung bình cấp cho tải bằng cách thay đổi tỉ lệ thời gian mức cao/thấp của tín hiệu (duty cycle). Tốc độ động cơ DC tỉ lệ với duty cycle của tín hiệu PWM cấp vào chân Enable của mạch cầu H.</w:t>
       </w:r>
     </w:p>
     <w:p>
@@ -7180,7 +7694,26 @@
           <w:i w:val="0"/>
           <w:sz w:val="26"/>
         </w:rPr>
-        <w:t xml:space="preserve"> [8] chuyên tạo PWM phần cứng (không tốn CPU). Trong đề tài, hai kênh LEDC (kênh 0 cho bánh trái, kênh 1 cho bánh phải) được cấu hình </w:t>
+        <w:t xml:space="preserve"> </w:t>
+      </w:r>
+      <w:r>
+        <w:rPr>
+          <w:rFonts w:ascii="Times New Roman" w:hAnsi="Times New Roman" w:cs="Times New Roman"/>
+          <w:b w:val="0"/>
+          <w:i w:val="0"/>
+          <w:color w:val="C00000"/>
+          <w:sz w:val="26"/>
+        </w:rPr>
+        <w:t>[8]</w:t>
+      </w:r>
+      <w:r>
+        <w:rPr>
+          <w:rFonts w:ascii="Times New Roman" w:hAnsi="Times New Roman" w:cs="Times New Roman"/>
+          <w:b w:val="0"/>
+          <w:i w:val="0"/>
+          <w:sz w:val="26"/>
+        </w:rPr>
+        <w:t xml:space="preserve"> chuyên tạo PWM phần cứng (không tốn CPU). Trong đề tài, hai kênh LEDC (kênh 0 cho bánh trái, kênh 1 cho bánh phải) được cấu hình </w:t>
       </w:r>
       <w:r>
         <w:rPr>
@@ -7584,7 +8117,26 @@
           <w:i w:val="0"/>
           <w:sz w:val="26"/>
         </w:rPr>
-        <w:t xml:space="preserve"> do comparator LM393 (thiếu hysteresis) [21] sinh ra ở mép khe đĩa.</w:t>
+        <w:t xml:space="preserve"> do comparator LM393 (thiếu hysteresis) </w:t>
+      </w:r>
+      <w:r>
+        <w:rPr>
+          <w:rFonts w:ascii="Times New Roman" w:hAnsi="Times New Roman" w:cs="Times New Roman"/>
+          <w:b w:val="0"/>
+          <w:i w:val="0"/>
+          <w:color w:val="C00000"/>
+          <w:sz w:val="26"/>
+        </w:rPr>
+        <w:t>[21]</w:t>
+      </w:r>
+      <w:r>
+        <w:rPr>
+          <w:rFonts w:ascii="Times New Roman" w:hAnsi="Times New Roman" w:cs="Times New Roman"/>
+          <w:b w:val="0"/>
+          <w:i w:val="0"/>
+          <w:sz w:val="26"/>
+        </w:rPr>
+        <w:t xml:space="preserve"> sinh ra ở mép khe đĩa.</w:t>
       </w:r>
     </w:p>
     <w:p>
@@ -7612,7 +8164,26 @@
           <w:i w:val="0"/>
           <w:sz w:val="26"/>
         </w:rPr>
-        <w:t xml:space="preserve">ESP32 tích hợp WiFi [22], có thể hoạt động ở chế độ </w:t>
+        <w:t xml:space="preserve">ESP32 tích hợp WiFi </w:t>
+      </w:r>
+      <w:r>
+        <w:rPr>
+          <w:rFonts w:ascii="Times New Roman" w:hAnsi="Times New Roman" w:cs="Times New Roman"/>
+          <w:b w:val="0"/>
+          <w:i w:val="0"/>
+          <w:color w:val="C00000"/>
+          <w:sz w:val="26"/>
+        </w:rPr>
+        <w:t>[22]</w:t>
+      </w:r>
+      <w:r>
+        <w:rPr>
+          <w:rFonts w:ascii="Times New Roman" w:hAnsi="Times New Roman" w:cs="Times New Roman"/>
+          <w:b w:val="0"/>
+          <w:i w:val="0"/>
+          <w:sz w:val="26"/>
+        </w:rPr>
+        <w:t xml:space="preserve">, có thể hoạt động ở chế độ </w:t>
       </w:r>
       <w:r>
         <w:rPr>
@@ -7662,7 +8233,26 @@
           <w:i w:val="0"/>
           <w:sz w:val="26"/>
         </w:rPr>
-        <w:t xml:space="preserve"> [23] — giao thức không kết nối, không bắt tay, không đảm bảo thứ tự/độ tin cậy nhưng </w:t>
+        <w:t xml:space="preserve"> </w:t>
+      </w:r>
+      <w:r>
+        <w:rPr>
+          <w:rFonts w:ascii="Times New Roman" w:hAnsi="Times New Roman" w:cs="Times New Roman"/>
+          <w:b w:val="0"/>
+          <w:i w:val="0"/>
+          <w:color w:val="C00000"/>
+          <w:sz w:val="26"/>
+        </w:rPr>
+        <w:t>[23]</w:t>
+      </w:r>
+      <w:r>
+        <w:rPr>
+          <w:rFonts w:ascii="Times New Roman" w:hAnsi="Times New Roman" w:cs="Times New Roman"/>
+          <w:b w:val="0"/>
+          <w:i w:val="0"/>
+          <w:sz w:val="26"/>
+        </w:rPr>
+        <w:t xml:space="preserve"> — giao thức không kết nối, không bắt tay, không đảm bảo thứ tự/độ tin cậy nhưng </w:t>
       </w:r>
       <w:r>
         <w:rPr>
@@ -7741,7 +8331,7 @@
           <w:i w:val="0"/>
           <w:sz w:val="26"/>
         </w:rPr>
-        <w:t xml:space="preserve"> [25], [30]: </w:t>
+        <w:t xml:space="preserve"> </w:t>
       </w:r>
       <w:r>
         <w:rPr>
@@ -7751,6 +8341,44 @@
           <w:color w:val="C00000"/>
           <w:sz w:val="26"/>
         </w:rPr>
+        <w:t>[25]</w:t>
+      </w:r>
+      <w:r>
+        <w:rPr>
+          <w:rFonts w:ascii="Times New Roman" w:hAnsi="Times New Roman" w:cs="Times New Roman"/>
+          <w:b w:val="0"/>
+          <w:i w:val="0"/>
+          <w:sz w:val="26"/>
+        </w:rPr>
+        <w:t xml:space="preserve">, </w:t>
+      </w:r>
+      <w:r>
+        <w:rPr>
+          <w:rFonts w:ascii="Times New Roman" w:hAnsi="Times New Roman" w:cs="Times New Roman"/>
+          <w:b w:val="0"/>
+          <w:i w:val="0"/>
+          <w:color w:val="C00000"/>
+          <w:sz w:val="26"/>
+        </w:rPr>
+        <w:t>[30]</w:t>
+      </w:r>
+      <w:r>
+        <w:rPr>
+          <w:rFonts w:ascii="Times New Roman" w:hAnsi="Times New Roman" w:cs="Times New Roman"/>
+          <w:b w:val="0"/>
+          <w:i w:val="0"/>
+          <w:sz w:val="26"/>
+        </w:rPr>
+        <w:t xml:space="preserve">: </w:t>
+      </w:r>
+      <w:r>
+        <w:rPr>
+          <w:rFonts w:ascii="Times New Roman" w:hAnsi="Times New Roman" w:cs="Times New Roman"/>
+          <w:b w:val="0"/>
+          <w:i w:val="0"/>
+          <w:color w:val="C00000"/>
+          <w:sz w:val="26"/>
+        </w:rPr>
         <w:t>bốn bánh chia thành hai bên trái/phải, mỗi bên do một nhóm hai động cơ điều khiển độc lập</w:t>
       </w:r>
       <w:r>
@@ -7816,7 +8444,45 @@
           <w:i w:val="0"/>
           <w:sz w:val="26"/>
         </w:rPr>
-        <w:t xml:space="preserve"> (đo hành trình) [7], [24] là phương pháp ước lượng vị trí robot bằng cách tích lũy quãng đường </w:t>
+        <w:t xml:space="preserve"> (đo hành trình) </w:t>
+      </w:r>
+      <w:r>
+        <w:rPr>
+          <w:rFonts w:ascii="Times New Roman" w:hAnsi="Times New Roman" w:cs="Times New Roman"/>
+          <w:b w:val="0"/>
+          <w:i w:val="0"/>
+          <w:color w:val="C00000"/>
+          <w:sz w:val="26"/>
+        </w:rPr>
+        <w:t>[7]</w:t>
+      </w:r>
+      <w:r>
+        <w:rPr>
+          <w:rFonts w:ascii="Times New Roman" w:hAnsi="Times New Roman" w:cs="Times New Roman"/>
+          <w:b w:val="0"/>
+          <w:i w:val="0"/>
+          <w:sz w:val="26"/>
+        </w:rPr>
+        <w:t xml:space="preserve">, </w:t>
+      </w:r>
+      <w:r>
+        <w:rPr>
+          <w:rFonts w:ascii="Times New Roman" w:hAnsi="Times New Roman" w:cs="Times New Roman"/>
+          <w:b w:val="0"/>
+          <w:i w:val="0"/>
+          <w:color w:val="C00000"/>
+          <w:sz w:val="26"/>
+        </w:rPr>
+        <w:t>[24]</w:t>
+      </w:r>
+      <w:r>
+        <w:rPr>
+          <w:rFonts w:ascii="Times New Roman" w:hAnsi="Times New Roman" w:cs="Times New Roman"/>
+          <w:b w:val="0"/>
+          <w:i w:val="0"/>
+          <w:sz w:val="26"/>
+        </w:rPr>
+        <w:t xml:space="preserve"> là phương pháp ước lượng vị trí robot bằng cách tích lũy quãng đường </w:t>
       </w:r>
       <w:r>
         <w:rPr>
@@ -8154,7 +8820,26 @@
           <w:i w:val="0"/>
           <w:sz w:val="26"/>
         </w:rPr>
-        <w:t xml:space="preserve"> [14] kết hợp hai nguồn để bù khuyết điểm của nhau (một lựa chọn thay thế phức tạp hơn là </w:t>
+        <w:t xml:space="preserve"> </w:t>
+      </w:r>
+      <w:r>
+        <w:rPr>
+          <w:rFonts w:ascii="Times New Roman" w:hAnsi="Times New Roman" w:cs="Times New Roman"/>
+          <w:b w:val="0"/>
+          <w:i w:val="0"/>
+          <w:color w:val="C00000"/>
+          <w:sz w:val="26"/>
+        </w:rPr>
+        <w:t>[14]</w:t>
+      </w:r>
+      <w:r>
+        <w:rPr>
+          <w:rFonts w:ascii="Times New Roman" w:hAnsi="Times New Roman" w:cs="Times New Roman"/>
+          <w:b w:val="0"/>
+          <w:i w:val="0"/>
+          <w:sz w:val="26"/>
+        </w:rPr>
+        <w:t xml:space="preserve"> kết hợp hai nguồn để bù khuyết điểm của nhau (một lựa chọn thay thế phức tạp hơn là </w:t>
       </w:r>
       <w:r>
         <w:rPr>
@@ -8172,7 +8857,45 @@
           <w:i w:val="0"/>
           <w:sz w:val="26"/>
         </w:rPr>
-        <w:t xml:space="preserve"> [26], [27]):</w:t>
+        <w:t xml:space="preserve"> </w:t>
+      </w:r>
+      <w:r>
+        <w:rPr>
+          <w:rFonts w:ascii="Times New Roman" w:hAnsi="Times New Roman" w:cs="Times New Roman"/>
+          <w:b w:val="0"/>
+          <w:i w:val="0"/>
+          <w:color w:val="C00000"/>
+          <w:sz w:val="26"/>
+        </w:rPr>
+        <w:t>[26]</w:t>
+      </w:r>
+      <w:r>
+        <w:rPr>
+          <w:rFonts w:ascii="Times New Roman" w:hAnsi="Times New Roman" w:cs="Times New Roman"/>
+          <w:b w:val="0"/>
+          <w:i w:val="0"/>
+          <w:sz w:val="26"/>
+        </w:rPr>
+        <w:t xml:space="preserve">, </w:t>
+      </w:r>
+      <w:r>
+        <w:rPr>
+          <w:rFonts w:ascii="Times New Roman" w:hAnsi="Times New Roman" w:cs="Times New Roman"/>
+          <w:b w:val="0"/>
+          <w:i w:val="0"/>
+          <w:color w:val="C00000"/>
+          <w:sz w:val="26"/>
+        </w:rPr>
+        <w:t>[27]</w:t>
+      </w:r>
+      <w:r>
+        <w:rPr>
+          <w:rFonts w:ascii="Times New Roman" w:hAnsi="Times New Roman" w:cs="Times New Roman"/>
+          <w:b w:val="0"/>
+          <w:i w:val="0"/>
+          <w:sz w:val="26"/>
+        </w:rPr>
+        <w:t>):</w:t>
       </w:r>
     </w:p>
     <w:p>
@@ -8374,7 +9097,45 @@
           <w:i w:val="0"/>
           <w:sz w:val="26"/>
         </w:rPr>
-        <w:t>A* (A-star) [6], [28] là thuật toán tìm đường đi ngắn nhất trên đồ thị có trọng số, kết hợp chi phí thực tế đã đi g(n) và một hàm ước lượng (heuristic) h(n) tới đích:</w:t>
+        <w:t xml:space="preserve">A* (A-star) </w:t>
+      </w:r>
+      <w:r>
+        <w:rPr>
+          <w:rFonts w:ascii="Times New Roman" w:hAnsi="Times New Roman" w:cs="Times New Roman"/>
+          <w:b w:val="0"/>
+          <w:i w:val="0"/>
+          <w:color w:val="C00000"/>
+          <w:sz w:val="26"/>
+        </w:rPr>
+        <w:t>[6]</w:t>
+      </w:r>
+      <w:r>
+        <w:rPr>
+          <w:rFonts w:ascii="Times New Roman" w:hAnsi="Times New Roman" w:cs="Times New Roman"/>
+          <w:b w:val="0"/>
+          <w:i w:val="0"/>
+          <w:sz w:val="26"/>
+        </w:rPr>
+        <w:t xml:space="preserve">, </w:t>
+      </w:r>
+      <w:r>
+        <w:rPr>
+          <w:rFonts w:ascii="Times New Roman" w:hAnsi="Times New Roman" w:cs="Times New Roman"/>
+          <w:b w:val="0"/>
+          <w:i w:val="0"/>
+          <w:color w:val="C00000"/>
+          <w:sz w:val="26"/>
+        </w:rPr>
+        <w:t>[28]</w:t>
+      </w:r>
+      <w:r>
+        <w:rPr>
+          <w:rFonts w:ascii="Times New Roman" w:hAnsi="Times New Roman" w:cs="Times New Roman"/>
+          <w:b w:val="0"/>
+          <w:i w:val="0"/>
+          <w:sz w:val="26"/>
+        </w:rPr>
+        <w:t xml:space="preserve"> là thuật toán tìm đường đi ngắn nhất trên đồ thị có trọng số, kết hợp chi phí thực tế đã đi g(n) và một hàm ước lượng (heuristic) h(n) tới đích:</w:t>
       </w:r>
     </w:p>
     <w:p>
@@ -8526,7 +9287,26 @@
           <w:i w:val="0"/>
           <w:sz w:val="26"/>
         </w:rPr>
-        <w:t xml:space="preserve"> [29] cho phép cập nhật đường đi tăng tiến mà không phải tính lại từ đầu.</w:t>
+        <w:t xml:space="preserve"> </w:t>
+      </w:r>
+      <w:r>
+        <w:rPr>
+          <w:rFonts w:ascii="Times New Roman" w:hAnsi="Times New Roman" w:cs="Times New Roman"/>
+          <w:b w:val="0"/>
+          <w:i w:val="0"/>
+          <w:color w:val="C00000"/>
+          <w:sz w:val="26"/>
+        </w:rPr>
+        <w:t>[29]</w:t>
+      </w:r>
+      <w:r>
+        <w:rPr>
+          <w:rFonts w:ascii="Times New Roman" w:hAnsi="Times New Roman" w:cs="Times New Roman"/>
+          <w:b w:val="0"/>
+          <w:i w:val="0"/>
+          <w:sz w:val="26"/>
+        </w:rPr>
+        <w:t xml:space="preserve"> cho phép cập nhật đường đi tăng tiến mà không phải tính lại từ đầu.</w:t>
       </w:r>
     </w:p>
     <w:p>
@@ -8601,7 +9381,26 @@
           <w:i w:val="0"/>
           <w:sz w:val="26"/>
         </w:rPr>
-        <w:t xml:space="preserve"> [31] — một hệ sinh thái phát triển nhúng chạy trên VS Code, hỗ trợ quản lý thư viện, biên dịch, nạp chương trình và giám sát Serial. So với Arduino IDE truyền thống, PlatformIO mạnh hơn ở quản lý dự án nhiều file (module hóa), khai báo thư viện qua </w:t>
+        <w:t xml:space="preserve"> </w:t>
+      </w:r>
+      <w:r>
+        <w:rPr>
+          <w:rFonts w:ascii="Times New Roman" w:hAnsi="Times New Roman" w:cs="Times New Roman"/>
+          <w:b w:val="0"/>
+          <w:i w:val="0"/>
+          <w:color w:val="C00000"/>
+          <w:sz w:val="26"/>
+        </w:rPr>
+        <w:t>[31]</w:t>
+      </w:r>
+      <w:r>
+        <w:rPr>
+          <w:rFonts w:ascii="Times New Roman" w:hAnsi="Times New Roman" w:cs="Times New Roman"/>
+          <w:b w:val="0"/>
+          <w:i w:val="0"/>
+          <w:sz w:val="26"/>
+        </w:rPr>
+        <w:t xml:space="preserve"> — một hệ sinh thái phát triển nhúng chạy trên VS Code, hỗ trợ quản lý thư viện, biên dịch, nạp chương trình và giám sát Serial. So với Arduino IDE truyền thống, PlatformIO mạnh hơn ở quản lý dự án nhiều file (module hóa), khai báo thư viện qua </w:t>
       </w:r>
       <w:r>
         <w:rPr>
@@ -9098,7 +9897,17 @@
                 <w:i w:val="0"/>
                 <w:sz w:val="24"/>
               </w:rPr>
-              <w:t>Lưu dữ liệu hiệu chuẩn (motor trim, encoder scale) vào NVS flash [32]</w:t>
+              <w:t xml:space="preserve">Lưu dữ liệu hiệu chuẩn (motor trim, encoder scale) vào NVS flash </w:t>
+            </w:r>
+            <w:r>
+              <w:rPr>
+                <w:rFonts w:ascii="Times New Roman" w:hAnsi="Times New Roman" w:cs="Times New Roman"/>
+                <w:b w:val="0"/>
+                <w:i w:val="0"/>
+                <w:color w:val="C00000"/>
+                <w:sz w:val="24"/>
+              </w:rPr>
+              <w:t>[32]</w:t>
             </w:r>
           </w:p>
         </w:tc>
@@ -11312,7 +12121,45 @@
           <w:i w:val="0"/>
           <w:sz w:val="26"/>
         </w:rPr>
-        <w:t xml:space="preserve"> [1], [2] vì các lý do:</w:t>
+        <w:t xml:space="preserve"> </w:t>
+      </w:r>
+      <w:r>
+        <w:rPr>
+          <w:rFonts w:ascii="Times New Roman" w:hAnsi="Times New Roman" w:cs="Times New Roman"/>
+          <w:b w:val="0"/>
+          <w:i w:val="0"/>
+          <w:color w:val="C00000"/>
+          <w:sz w:val="26"/>
+        </w:rPr>
+        <w:t>[1]</w:t>
+      </w:r>
+      <w:r>
+        <w:rPr>
+          <w:rFonts w:ascii="Times New Roman" w:hAnsi="Times New Roman" w:cs="Times New Roman"/>
+          <w:b w:val="0"/>
+          <w:i w:val="0"/>
+          <w:sz w:val="26"/>
+        </w:rPr>
+        <w:t xml:space="preserve">, </w:t>
+      </w:r>
+      <w:r>
+        <w:rPr>
+          <w:rFonts w:ascii="Times New Roman" w:hAnsi="Times New Roman" w:cs="Times New Roman"/>
+          <w:b w:val="0"/>
+          <w:i w:val="0"/>
+          <w:color w:val="C00000"/>
+          <w:sz w:val="26"/>
+        </w:rPr>
+        <w:t>[2]</w:t>
+      </w:r>
+      <w:r>
+        <w:rPr>
+          <w:rFonts w:ascii="Times New Roman" w:hAnsi="Times New Roman" w:cs="Times New Roman"/>
+          <w:b w:val="0"/>
+          <w:i w:val="0"/>
+          <w:sz w:val="26"/>
+        </w:rPr>
+        <w:t xml:space="preserve"> vì các lý do:</w:t>
       </w:r>
     </w:p>
     <w:p>
@@ -11563,7 +12410,26 @@
           <w:i w:val="0"/>
           <w:sz w:val="26"/>
         </w:rPr>
-        <w:t xml:space="preserve"> (mạch cầu H đôi) [4]. </w:t>
+        <w:t xml:space="preserve"> (mạch cầu H đôi) </w:t>
+      </w:r>
+      <w:r>
+        <w:rPr>
+          <w:rFonts w:ascii="Times New Roman" w:hAnsi="Times New Roman" w:cs="Times New Roman"/>
+          <w:b w:val="0"/>
+          <w:i w:val="0"/>
+          <w:color w:val="C00000"/>
+          <w:sz w:val="26"/>
+        </w:rPr>
+        <w:t>[4]</w:t>
+      </w:r>
+      <w:r>
+        <w:rPr>
+          <w:rFonts w:ascii="Times New Roman" w:hAnsi="Times New Roman" w:cs="Times New Roman"/>
+          <w:b w:val="0"/>
+          <w:i w:val="0"/>
+          <w:sz w:val="26"/>
+        </w:rPr>
+        <w:t xml:space="preserve">. </w:t>
       </w:r>
       <w:r>
         <w:rPr>
@@ -12512,7 +13378,26 @@
           <w:i w:val="0"/>
           <w:sz w:val="26"/>
         </w:rPr>
-        <w:t xml:space="preserve"> [3] (6 trục: 3 gia tốc + 3 con quay hồi chuyển), giao tiếp I2C, giá rẻ, rất phổ biến. Đề tài chỉ dùng </w:t>
+        <w:t xml:space="preserve"> </w:t>
+      </w:r>
+      <w:r>
+        <w:rPr>
+          <w:rFonts w:ascii="Times New Roman" w:hAnsi="Times New Roman" w:cs="Times New Roman"/>
+          <w:b w:val="0"/>
+          <w:i w:val="0"/>
+          <w:color w:val="C00000"/>
+          <w:sz w:val="26"/>
+        </w:rPr>
+        <w:t>[3]</w:t>
+      </w:r>
+      <w:r>
+        <w:rPr>
+          <w:rFonts w:ascii="Times New Roman" w:hAnsi="Times New Roman" w:cs="Times New Roman"/>
+          <w:b w:val="0"/>
+          <w:i w:val="0"/>
+          <w:sz w:val="26"/>
+        </w:rPr>
+        <w:t xml:space="preserve"> (6 trục: 3 gia tốc + 3 con quay hồi chuyển), giao tiếp I2C, giá rẻ, rất phổ biến. Đề tài chỉ dùng </w:t>
       </w:r>
       <w:r>
         <w:rPr>
@@ -12905,7 +13790,26 @@
           <w:i w:val="0"/>
           <w:sz w:val="26"/>
         </w:rPr>
-        <w:t xml:space="preserve"> [5] (siêu âm), giao tiếp số đơn giản (Trig/Echo), tầm đo 2–400 cm, rẻ, dễ tích hợp, không nhạy với ánh sáng môi trường (khác cảm biến hồng ngoại). So với cảm biến ToF laser (VL53L0X) đắt hơn, HC-SR04 đủ dùng cho mục tiêu phát hiện vật cản cơ bản.</w:t>
+        <w:t xml:space="preserve"> </w:t>
+      </w:r>
+      <w:r>
+        <w:rPr>
+          <w:rFonts w:ascii="Times New Roman" w:hAnsi="Times New Roman" w:cs="Times New Roman"/>
+          <w:b w:val="0"/>
+          <w:i w:val="0"/>
+          <w:color w:val="C00000"/>
+          <w:sz w:val="26"/>
+        </w:rPr>
+        <w:t>[5]</w:t>
+      </w:r>
+      <w:r>
+        <w:rPr>
+          <w:rFonts w:ascii="Times New Roman" w:hAnsi="Times New Roman" w:cs="Times New Roman"/>
+          <w:b w:val="0"/>
+          <w:i w:val="0"/>
+          <w:sz w:val="26"/>
+        </w:rPr>
+        <w:t xml:space="preserve"> (siêu âm), giao tiếp số đơn giản (Trig/Echo), tầm đo 2–400 cm, rẻ, dễ tích hợp, không nhạy với ánh sáng môi trường (khác cảm biến hồng ngoại). So với cảm biến ToF laser (VL53L0X) đắt hơn, HC-SR04 đủ dùng cho mục tiêu phát hiện vật cản cơ bản.</w:t>
       </w:r>
     </w:p>
     <w:p>
@@ -14617,7 +15521,26 @@
           <w:i w:val="0"/>
           <w:sz w:val="26"/>
         </w:rPr>
-        <w:t xml:space="preserve"> [9], tổ chức theo mô hình phân lớp rõ ràng (models – planning – services – screens), giúp dễ kiểm thử và bảo trì.</w:t>
+        <w:t xml:space="preserve"> </w:t>
+      </w:r>
+      <w:r>
+        <w:rPr>
+          <w:rFonts w:ascii="Times New Roman" w:hAnsi="Times New Roman" w:cs="Times New Roman"/>
+          <w:b w:val="0"/>
+          <w:i w:val="0"/>
+          <w:color w:val="C00000"/>
+          <w:sz w:val="26"/>
+        </w:rPr>
+        <w:t>[9]</w:t>
+      </w:r>
+      <w:r>
+        <w:rPr>
+          <w:rFonts w:ascii="Times New Roman" w:hAnsi="Times New Roman" w:cs="Times New Roman"/>
+          <w:b w:val="0"/>
+          <w:i w:val="0"/>
+          <w:sz w:val="26"/>
+        </w:rPr>
+        <w:t>, tổ chức theo mô hình phân lớp rõ ràng (models – planning – services – screens), giúp dễ kiểm thử và bảo trì.</w:t>
       </w:r>
     </w:p>
     <w:p>

</xml_diff>

<commit_message>
report: danh so lai Tai lieu tham khao theo thu tu xuat hien (chuan IEEE)
- Danh so lai [1]-[39] theo lan trich dau tien trong than bai (de tra cuu).
- Doi dong bo moi trich dan trong than bai theo map so cu->moi.
- Lam phang danh muc (bo tieu de nhom) thanh danh sach [1]..[39] dung thu tu.
- Giu boc do span.chg; cited [1]-[39] khop danh muc.
- Rebuild HTML/PDF/DOCX.
</commit_message>
<xml_diff>
--- a/docs/bao-cao-xe-tu-hanh.docx
+++ b/docs/bao-cao-xe-tu-hanh.docx
@@ -5397,6 +5397,329 @@
           <w:color w:val="C00000"/>
           <w:sz w:val="26"/>
         </w:rPr>
+        <w:t>[1]</w:t>
+      </w:r>
+      <w:r>
+        <w:rPr>
+          <w:rFonts w:ascii="Times New Roman" w:hAnsi="Times New Roman" w:cs="Times New Roman"/>
+          <w:b w:val="0"/>
+          <w:i w:val="0"/>
+          <w:sz w:val="26"/>
+        </w:rPr>
+        <w:t xml:space="preserve">, </w:t>
+      </w:r>
+      <w:r>
+        <w:rPr>
+          <w:rFonts w:ascii="Times New Roman" w:hAnsi="Times New Roman" w:cs="Times New Roman"/>
+          <w:b w:val="0"/>
+          <w:i w:val="0"/>
+          <w:color w:val="C00000"/>
+          <w:sz w:val="26"/>
+        </w:rPr>
+        <w:t>[2]</w:t>
+      </w:r>
+      <w:r>
+        <w:rPr>
+          <w:rFonts w:ascii="Times New Roman" w:hAnsi="Times New Roman" w:cs="Times New Roman"/>
+          <w:b w:val="0"/>
+          <w:i w:val="0"/>
+          <w:sz w:val="26"/>
+        </w:rPr>
+        <w:t xml:space="preserve">. Nhiều khảo sát cho thấy việc thay thế AGV cứng nhắc bằng AMR linh hoạt giúp tăng đáng kể năng suất và khả năng thích ứng của dây chuyền sản xuất trong mô hình nhà máy thông minh </w:t>
+      </w:r>
+      <w:r>
+        <w:rPr>
+          <w:rFonts w:ascii="Times New Roman" w:hAnsi="Times New Roman" w:cs="Times New Roman"/>
+          <w:b w:val="0"/>
+          <w:i w:val="0"/>
+          <w:color w:val="C00000"/>
+          <w:sz w:val="26"/>
+        </w:rPr>
+        <w:t>[2]</w:t>
+      </w:r>
+      <w:r>
+        <w:rPr>
+          <w:rFonts w:ascii="Times New Roman" w:hAnsi="Times New Roman" w:cs="Times New Roman"/>
+          <w:b w:val="0"/>
+          <w:i w:val="0"/>
+          <w:sz w:val="26"/>
+        </w:rPr>
+        <w:t>.</w:t>
+      </w:r>
+    </w:p>
+    <w:p>
+      <w:pPr>
+        <w:jc w:val="both"/>
+      </w:pPr>
+      <w:r>
+        <w:rPr>
+          <w:rFonts w:ascii="Times New Roman" w:hAnsi="Times New Roman" w:cs="Times New Roman"/>
+          <w:b w:val="0"/>
+          <w:i w:val="0"/>
+          <w:sz w:val="26"/>
+        </w:rPr>
+        <w:t xml:space="preserve">Dù đa dạng về hình thức, mọi robot tự hành đều phải giải quyết ba bài toán cốt lõi: </w:t>
+      </w:r>
+      <w:r>
+        <w:rPr>
+          <w:rFonts w:ascii="Times New Roman" w:hAnsi="Times New Roman" w:cs="Times New Roman"/>
+          <w:b/>
+          <w:i w:val="0"/>
+          <w:sz w:val="26"/>
+        </w:rPr>
+        <w:t>định vị</w:t>
+      </w:r>
+      <w:r>
+        <w:rPr>
+          <w:rFonts w:ascii="Times New Roman" w:hAnsi="Times New Roman" w:cs="Times New Roman"/>
+          <w:b w:val="0"/>
+          <w:i w:val="0"/>
+          <w:sz w:val="26"/>
+        </w:rPr>
+        <w:t xml:space="preserve"> (robot biết mình đang ở đâu), </w:t>
+      </w:r>
+      <w:r>
+        <w:rPr>
+          <w:rFonts w:ascii="Times New Roman" w:hAnsi="Times New Roman" w:cs="Times New Roman"/>
+          <w:b/>
+          <w:i w:val="0"/>
+          <w:sz w:val="26"/>
+        </w:rPr>
+        <w:t>lập kế hoạch đường đi</w:t>
+      </w:r>
+      <w:r>
+        <w:rPr>
+          <w:rFonts w:ascii="Times New Roman" w:hAnsi="Times New Roman" w:cs="Times New Roman"/>
+          <w:b w:val="0"/>
+          <w:i w:val="0"/>
+          <w:sz w:val="26"/>
+        </w:rPr>
+        <w:t xml:space="preserve"> (xác định lộ trình tới đích) và </w:t>
+      </w:r>
+      <w:r>
+        <w:rPr>
+          <w:rFonts w:ascii="Times New Roman" w:hAnsi="Times New Roman" w:cs="Times New Roman"/>
+          <w:b/>
+          <w:i w:val="0"/>
+          <w:sz w:val="26"/>
+        </w:rPr>
+        <w:t>điều khiển bám lộ trình</w:t>
+      </w:r>
+      <w:r>
+        <w:rPr>
+          <w:rFonts w:ascii="Times New Roman" w:hAnsi="Times New Roman" w:cs="Times New Roman"/>
+          <w:b w:val="0"/>
+          <w:i w:val="0"/>
+          <w:sz w:val="26"/>
+        </w:rPr>
+        <w:t xml:space="preserve"> (di chuyển chính xác theo lộ trình đó) </w:t>
+      </w:r>
+      <w:r>
+        <w:rPr>
+          <w:rFonts w:ascii="Times New Roman" w:hAnsi="Times New Roman" w:cs="Times New Roman"/>
+          <w:b w:val="0"/>
+          <w:i w:val="0"/>
+          <w:color w:val="C00000"/>
+          <w:sz w:val="26"/>
+        </w:rPr>
+        <w:t>[1]</w:t>
+      </w:r>
+      <w:r>
+        <w:rPr>
+          <w:rFonts w:ascii="Times New Roman" w:hAnsi="Times New Roman" w:cs="Times New Roman"/>
+          <w:b w:val="0"/>
+          <w:i w:val="0"/>
+          <w:sz w:val="26"/>
+        </w:rPr>
+        <w:t xml:space="preserve">. Về định vị, phương pháp tương đối (dead-reckoning) dựa trên odometry từ encoder bánh xe đơn giản, rẻ và tần số cao nhưng sai số tích lũy (trôi) theo quãng đường do trượt bánh và đường kính bánh không đều </w:t>
+      </w:r>
+      <w:r>
+        <w:rPr>
+          <w:rFonts w:ascii="Times New Roman" w:hAnsi="Times New Roman" w:cs="Times New Roman"/>
+          <w:b w:val="0"/>
+          <w:i w:val="0"/>
+          <w:color w:val="C00000"/>
+          <w:sz w:val="26"/>
+        </w:rPr>
+        <w:t>[3]</w:t>
+      </w:r>
+      <w:r>
+        <w:rPr>
+          <w:rFonts w:ascii="Times New Roman" w:hAnsi="Times New Roman" w:cs="Times New Roman"/>
+          <w:b w:val="0"/>
+          <w:i w:val="0"/>
+          <w:sz w:val="26"/>
+        </w:rPr>
+        <w:t xml:space="preserve">; phương pháp tuyệt đối dùng GPS hoặc mốc định vị (landmark/beacon), còn các kỹ thuật hiện đại như định vị và dựng bản đồ đồng thời (SLAM) bằng LiDAR/camera cho độ chính xác cao nhưng đòi hỏi cảm biến đắt tiền và năng lực tính toán lớn </w:t>
+      </w:r>
+      <w:r>
+        <w:rPr>
+          <w:rFonts w:ascii="Times New Roman" w:hAnsi="Times New Roman" w:cs="Times New Roman"/>
+          <w:b w:val="0"/>
+          <w:i w:val="0"/>
+          <w:color w:val="C00000"/>
+          <w:sz w:val="26"/>
+        </w:rPr>
+        <w:t>[4]</w:t>
+      </w:r>
+      <w:r>
+        <w:rPr>
+          <w:rFonts w:ascii="Times New Roman" w:hAnsi="Times New Roman" w:cs="Times New Roman"/>
+          <w:b w:val="0"/>
+          <w:i w:val="0"/>
+          <w:sz w:val="26"/>
+        </w:rPr>
+        <w:t>.</w:t>
+      </w:r>
+    </w:p>
+    <w:p>
+      <w:pPr>
+        <w:jc w:val="both"/>
+      </w:pPr>
+      <w:r>
+        <w:rPr>
+          <w:rFonts w:ascii="Times New Roman" w:hAnsi="Times New Roman" w:cs="Times New Roman"/>
+          <w:b w:val="0"/>
+          <w:i w:val="0"/>
+          <w:sz w:val="26"/>
+        </w:rPr>
+        <w:t xml:space="preserve">Để giảm trôi của odometry, nhiều nghiên cứu đã hợp nhất encoder với cảm biến quán tính (IMU). Al Khatib và cộng sự </w:t>
+      </w:r>
+      <w:r>
+        <w:rPr>
+          <w:rFonts w:ascii="Times New Roman" w:hAnsi="Times New Roman" w:cs="Times New Roman"/>
+          <w:b w:val="0"/>
+          <w:i w:val="0"/>
+          <w:color w:val="C00000"/>
+          <w:sz w:val="26"/>
+        </w:rPr>
+        <w:t>[5]</w:t>
+      </w:r>
+      <w:r>
+        <w:rPr>
+          <w:rFonts w:ascii="Times New Roman" w:hAnsi="Times New Roman" w:cs="Times New Roman"/>
+          <w:b w:val="0"/>
+          <w:i w:val="0"/>
+          <w:sz w:val="26"/>
+        </w:rPr>
+        <w:t xml:space="preserve"> hợp nhất nhiều cảm biến (odometry, IMU) bằng bộ lọc Kalman mở rộng (EKF), nâng cao rõ rệt độ chính xác định vị và dẫn đường so với chỉ dùng đơn cảm biến. Cùng hướng đó, Ly và cộng sự </w:t>
+      </w:r>
+      <w:r>
+        <w:rPr>
+          <w:rFonts w:ascii="Times New Roman" w:hAnsi="Times New Roman" w:cs="Times New Roman"/>
+          <w:b w:val="0"/>
+          <w:i w:val="0"/>
+          <w:color w:val="C00000"/>
+          <w:sz w:val="26"/>
+        </w:rPr>
+        <w:t>[6]</w:t>
+      </w:r>
+      <w:r>
+        <w:rPr>
+          <w:rFonts w:ascii="Times New Roman" w:hAnsi="Times New Roman" w:cs="Times New Roman"/>
+          <w:b w:val="0"/>
+          <w:i w:val="0"/>
+          <w:sz w:val="26"/>
+        </w:rPr>
+        <w:t xml:space="preserve"> hợp nhất dữ liệu IMU và encoder bằng bộ lọc Kalman cho robot di động, cho thấy vị trí ước lượng bám quỹ đạo thực sát hơn hẳn odometry thuần; Housein và cộng sự </w:t>
+      </w:r>
+      <w:r>
+        <w:rPr>
+          <w:rFonts w:ascii="Times New Roman" w:hAnsi="Times New Roman" w:cs="Times New Roman"/>
+          <w:b w:val="0"/>
+          <w:i w:val="0"/>
+          <w:color w:val="C00000"/>
+          <w:sz w:val="26"/>
+        </w:rPr>
+        <w:t>[7]</w:t>
+      </w:r>
+      <w:r>
+        <w:rPr>
+          <w:rFonts w:ascii="Times New Roman" w:hAnsi="Times New Roman" w:cs="Times New Roman"/>
+          <w:b w:val="0"/>
+          <w:i w:val="0"/>
+          <w:sz w:val="26"/>
+        </w:rPr>
+        <w:t xml:space="preserve"> trình bày một triển khai EKF thực nghiệm cho cùng bài toán. Các hướng mở rộng gần đây còn kết hợp thêm thị giác (wheel–inertial–visual) bằng biến thể bộ lọc Kalman để tăng độ bền vững </w:t>
+      </w:r>
+      <w:r>
+        <w:rPr>
+          <w:rFonts w:ascii="Times New Roman" w:hAnsi="Times New Roman" w:cs="Times New Roman"/>
+          <w:b w:val="0"/>
+          <w:i w:val="0"/>
+          <w:color w:val="C00000"/>
+          <w:sz w:val="26"/>
+        </w:rPr>
+        <w:t>[8]</w:t>
+      </w:r>
+      <w:r>
+        <w:rPr>
+          <w:rFonts w:ascii="Times New Roman" w:hAnsi="Times New Roman" w:cs="Times New Roman"/>
+          <w:b w:val="0"/>
+          <w:i w:val="0"/>
+          <w:sz w:val="26"/>
+        </w:rPr>
+        <w:t xml:space="preserve">. Tuy nhiên, bộ lọc Kalman/EKF đòi hỏi mô hình và khối lượng tính toán đáng kể; với vi điều khiển hạn chế tài nguyên, </w:t>
+      </w:r>
+      <w:r>
+        <w:rPr>
+          <w:rFonts w:ascii="Times New Roman" w:hAnsi="Times New Roman" w:cs="Times New Roman"/>
+          <w:b/>
+          <w:i w:val="0"/>
+          <w:sz w:val="26"/>
+        </w:rPr>
+        <w:t>bộ lọc bù (complementary filter)</w:t>
+      </w:r>
+      <w:r>
+        <w:rPr>
+          <w:rFonts w:ascii="Times New Roman" w:hAnsi="Times New Roman" w:cs="Times New Roman"/>
+          <w:b w:val="0"/>
+          <w:i w:val="0"/>
+          <w:sz w:val="26"/>
+        </w:rPr>
+        <w:t xml:space="preserve"> là giải pháp nhẹ hơn, đủ tốt để kết hợp con quay hồi chuyển và encoder nhằm ổn định ước lượng hướng </w:t>
+      </w:r>
+      <w:r>
+        <w:rPr>
+          <w:rFonts w:ascii="Times New Roman" w:hAnsi="Times New Roman" w:cs="Times New Roman"/>
+          <w:b w:val="0"/>
+          <w:i w:val="0"/>
+          <w:color w:val="C00000"/>
+          <w:sz w:val="26"/>
+        </w:rPr>
+        <w:t>[9]</w:t>
+      </w:r>
+      <w:r>
+        <w:rPr>
+          <w:rFonts w:ascii="Times New Roman" w:hAnsi="Times New Roman" w:cs="Times New Roman"/>
+          <w:b w:val="0"/>
+          <w:i w:val="0"/>
+          <w:sz w:val="26"/>
+        </w:rPr>
+        <w:t>.</w:t>
+      </w:r>
+    </w:p>
+    <w:p>
+      <w:pPr>
+        <w:jc w:val="both"/>
+      </w:pPr>
+      <w:r>
+        <w:rPr>
+          <w:rFonts w:ascii="Times New Roman" w:hAnsi="Times New Roman" w:cs="Times New Roman"/>
+          <w:b w:val="0"/>
+          <w:i w:val="0"/>
+          <w:sz w:val="26"/>
+        </w:rPr>
+        <w:t xml:space="preserve">Về bài toán tìm đường, lý thuyết đồ thị cung cấp nền tảng vững chắc: thuật toán Dijkstra tìm đường đi ngắn nhất trên đồ thị có trọng số </w:t>
+      </w:r>
+      <w:r>
+        <w:rPr>
+          <w:rFonts w:ascii="Times New Roman" w:hAnsi="Times New Roman" w:cs="Times New Roman"/>
+          <w:b w:val="0"/>
+          <w:i w:val="0"/>
+          <w:color w:val="C00000"/>
+          <w:sz w:val="26"/>
+        </w:rPr>
         <w:t>[10]</w:t>
       </w:r>
       <w:r>
@@ -5406,6 +5729,313 @@
           <w:i w:val="0"/>
           <w:sz w:val="26"/>
         </w:rPr>
+        <w:t xml:space="preserve">, còn thuật toán </w:t>
+      </w:r>
+      <w:r>
+        <w:rPr>
+          <w:rFonts w:ascii="Times New Roman" w:hAnsi="Times New Roman" w:cs="Times New Roman"/>
+          <w:b/>
+          <w:i w:val="0"/>
+          <w:sz w:val="26"/>
+        </w:rPr>
+        <w:t>A</w:t>
+      </w:r>
+      <w:r>
+        <w:rPr>
+          <w:rFonts w:ascii="Times New Roman" w:hAnsi="Times New Roman" w:cs="Times New Roman"/>
+          <w:b w:val="0"/>
+          <w:i w:val="0"/>
+          <w:sz w:val="26"/>
+        </w:rPr>
+        <w:t xml:space="preserve">* mở rộng Dijkstra bằng một hàm heuristic để hướng việc tìm kiếm về phía đích, nhờ đó giảm mạnh số nút phải duyệt mà vẫn đảm bảo tối ưu khi heuristic chấp nhận được (admissible) </w:t>
+      </w:r>
+      <w:r>
+        <w:rPr>
+          <w:rFonts w:ascii="Times New Roman" w:hAnsi="Times New Roman" w:cs="Times New Roman"/>
+          <w:b w:val="0"/>
+          <w:i w:val="0"/>
+          <w:color w:val="C00000"/>
+          <w:sz w:val="26"/>
+        </w:rPr>
+        <w:t>[11]</w:t>
+      </w:r>
+      <w:r>
+        <w:rPr>
+          <w:rFonts w:ascii="Times New Roman" w:hAnsi="Times New Roman" w:cs="Times New Roman"/>
+          <w:b w:val="0"/>
+          <w:i w:val="0"/>
+          <w:sz w:val="26"/>
+        </w:rPr>
+        <w:t xml:space="preserve">. Bên cạnh nhóm dựa trên đồ thị/lưới còn có nhóm lấy mẫu ngẫu nhiên (RRT, PRM) cho không gian cấu hình nhiều chiều </w:t>
+      </w:r>
+      <w:r>
+        <w:rPr>
+          <w:rFonts w:ascii="Times New Roman" w:hAnsi="Times New Roman" w:cs="Times New Roman"/>
+          <w:b w:val="0"/>
+          <w:i w:val="0"/>
+          <w:color w:val="C00000"/>
+          <w:sz w:val="26"/>
+        </w:rPr>
+        <w:t>[12]</w:t>
+      </w:r>
+      <w:r>
+        <w:rPr>
+          <w:rFonts w:ascii="Times New Roman" w:hAnsi="Times New Roman" w:cs="Times New Roman"/>
+          <w:b w:val="0"/>
+          <w:i w:val="0"/>
+          <w:sz w:val="26"/>
+        </w:rPr>
+        <w:t xml:space="preserve">. Trong thực tiễn robot, A* vẫn là lựa chọn phổ biến và liên tục được cải tiến: Shahapur và cộng sự </w:t>
+      </w:r>
+      <w:r>
+        <w:rPr>
+          <w:rFonts w:ascii="Times New Roman" w:hAnsi="Times New Roman" w:cs="Times New Roman"/>
+          <w:b w:val="0"/>
+          <w:i w:val="0"/>
+          <w:color w:val="C00000"/>
+          <w:sz w:val="26"/>
+        </w:rPr>
+        <w:t>[13]</w:t>
+      </w:r>
+      <w:r>
+        <w:rPr>
+          <w:rFonts w:ascii="Times New Roman" w:hAnsi="Times New Roman" w:cs="Times New Roman"/>
+          <w:b w:val="0"/>
+          <w:i w:val="0"/>
+          <w:sz w:val="26"/>
+        </w:rPr>
+        <w:t xml:space="preserve"> hiện thực và so sánh A</w:t>
+      </w:r>
+      <w:r>
+        <w:rPr>
+          <w:rFonts w:ascii="Times New Roman" w:hAnsi="Times New Roman" w:cs="Times New Roman"/>
+          <w:b w:val="0"/>
+          <w:i/>
+          <w:sz w:val="26"/>
+        </w:rPr>
+        <w:t xml:space="preserve"> với Dijkstra trên robot TurtleBot3 (mô phỏng Gazebo), xác nhận A</w:t>
+      </w:r>
+      <w:r>
+        <w:rPr>
+          <w:rFonts w:ascii="Times New Roman" w:hAnsi="Times New Roman" w:cs="Times New Roman"/>
+          <w:b w:val="0"/>
+          <w:i w:val="0"/>
+          <w:sz w:val="26"/>
+        </w:rPr>
+        <w:t xml:space="preserve"> tìm được đường tối ưu với số nút duyệt ít hơn; Yao và cộng sự </w:t>
+      </w:r>
+      <w:r>
+        <w:rPr>
+          <w:rFonts w:ascii="Times New Roman" w:hAnsi="Times New Roman" w:cs="Times New Roman"/>
+          <w:b w:val="0"/>
+          <w:i w:val="0"/>
+          <w:color w:val="C00000"/>
+          <w:sz w:val="26"/>
+        </w:rPr>
+        <w:t>[14]</w:t>
+      </w:r>
+      <w:r>
+        <w:rPr>
+          <w:rFonts w:ascii="Times New Roman" w:hAnsi="Times New Roman" w:cs="Times New Roman"/>
+          <w:b w:val="0"/>
+          <w:i w:val="0"/>
+          <w:sz w:val="26"/>
+        </w:rPr>
+        <w:t xml:space="preserve"> đề xuất biến thể A</w:t>
+      </w:r>
+      <w:r>
+        <w:rPr>
+          <w:rFonts w:ascii="Times New Roman" w:hAnsi="Times New Roman" w:cs="Times New Roman"/>
+          <w:b w:val="0"/>
+          <w:i/>
+          <w:sz w:val="26"/>
+        </w:rPr>
+        <w:t xml:space="preserve"> cải tiến (BSGA</w:t>
+      </w:r>
+      <w:r>
+        <w:rPr>
+          <w:rFonts w:ascii="Times New Roman" w:hAnsi="Times New Roman" w:cs="Times New Roman"/>
+          <w:b w:val="0"/>
+          <w:i w:val="0"/>
+          <w:sz w:val="26"/>
+        </w:rPr>
+        <w:t>) cho robot vi sai nhằm khắc phục đúng các hạn chế của A</w:t>
+      </w:r>
+      <w:r>
+        <w:rPr>
+          <w:rFonts w:ascii="Times New Roman" w:hAnsi="Times New Roman" w:cs="Times New Roman"/>
+          <w:b w:val="0"/>
+          <w:i/>
+          <w:sz w:val="26"/>
+        </w:rPr>
+        <w:t xml:space="preserve"> gốc là số nút tìm kiếm lớn và đường đi kém mượt. Với môi trường trong nhà đã biết trước dưới dạng lưới điểm (waypoint), A</w:t>
+      </w:r>
+      <w:r>
+        <w:rPr>
+          <w:rFonts w:ascii="Times New Roman" w:hAnsi="Times New Roman" w:cs="Times New Roman"/>
+          <w:b w:val="0"/>
+          <w:i w:val="0"/>
+          <w:sz w:val="26"/>
+        </w:rPr>
+        <w:t xml:space="preserve"> là lựa chọn cân bằng tốt giữa tính tối ưu, tốc độ thực thi và độ đơn giản khi cài đặt trên thiết bị di động.</w:t>
+      </w:r>
+    </w:p>
+    <w:p>
+      <w:pPr>
+        <w:jc w:val="both"/>
+      </w:pPr>
+      <w:r>
+        <w:rPr>
+          <w:rFonts w:ascii="Times New Roman" w:hAnsi="Times New Roman" w:cs="Times New Roman"/>
+          <w:b w:val="0"/>
+          <w:i w:val="0"/>
+          <w:sz w:val="26"/>
+        </w:rPr>
+        <w:t xml:space="preserve">Song song với định vị và tìm đường, khả năng </w:t>
+      </w:r>
+      <w:r>
+        <w:rPr>
+          <w:rFonts w:ascii="Times New Roman" w:hAnsi="Times New Roman" w:cs="Times New Roman"/>
+          <w:b/>
+          <w:i w:val="0"/>
+          <w:sz w:val="26"/>
+        </w:rPr>
+        <w:t>né vật cản</w:t>
+      </w:r>
+      <w:r>
+        <w:rPr>
+          <w:rFonts w:ascii="Times New Roman" w:hAnsi="Times New Roman" w:cs="Times New Roman"/>
+          <w:b w:val="0"/>
+          <w:i w:val="0"/>
+          <w:sz w:val="26"/>
+        </w:rPr>
+        <w:t xml:space="preserve"> cũng được nghiên cứu theo hướng chi phí thấp. Yasin và cộng sự </w:t>
+      </w:r>
+      <w:r>
+        <w:rPr>
+          <w:rFonts w:ascii="Times New Roman" w:hAnsi="Times New Roman" w:cs="Times New Roman"/>
+          <w:b w:val="0"/>
+          <w:i w:val="0"/>
+          <w:color w:val="C00000"/>
+          <w:sz w:val="26"/>
+        </w:rPr>
+        <w:t>[15]</w:t>
+      </w:r>
+      <w:r>
+        <w:rPr>
+          <w:rFonts w:ascii="Times New Roman" w:hAnsi="Times New Roman" w:cs="Times New Roman"/>
+          <w:b w:val="0"/>
+          <w:i w:val="0"/>
+          <w:sz w:val="26"/>
+        </w:rPr>
+        <w:t xml:space="preserve"> đề xuất phương pháp phát hiện vật cản và tránh va chạm chỉ dùng cảm biến siêu âm giá rẻ, với mục tiêu tối thiểu hóa độ lệch khỏi lộ trình ban đầu — rất phù hợp cho robot ngân sách thấp. Ở quy mô công nghiệp, robot tự hành thường được trang bị cảm biến đắt tiền (LiDAR, camera độ phân giải cao, GPS-RTK) cùng máy tính mạnh để chạy SLAM và thị giác máy tính </w:t>
+      </w:r>
+      <w:r>
+        <w:rPr>
+          <w:rFonts w:ascii="Times New Roman" w:hAnsi="Times New Roman" w:cs="Times New Roman"/>
+          <w:b w:val="0"/>
+          <w:i w:val="0"/>
+          <w:color w:val="C00000"/>
+          <w:sz w:val="26"/>
+        </w:rPr>
+        <w:t>[4]</w:t>
+      </w:r>
+      <w:r>
+        <w:rPr>
+          <w:rFonts w:ascii="Times New Roman" w:hAnsi="Times New Roman" w:cs="Times New Roman"/>
+          <w:b w:val="0"/>
+          <w:i w:val="0"/>
+          <w:sz w:val="26"/>
+        </w:rPr>
+        <w:t xml:space="preserve">; nhưng chi phí và độ phức tạp đó là rào cản lớn đối với sinh viên và các dự án học thuật. Vì vậy, hướng xây dựng robot tự hành </w:t>
+      </w:r>
+      <w:r>
+        <w:rPr>
+          <w:rFonts w:ascii="Times New Roman" w:hAnsi="Times New Roman" w:cs="Times New Roman"/>
+          <w:b/>
+          <w:i w:val="0"/>
+          <w:sz w:val="26"/>
+        </w:rPr>
+        <w:t>chi phí thấp</w:t>
+      </w:r>
+      <w:r>
+        <w:rPr>
+          <w:rFonts w:ascii="Times New Roman" w:hAnsi="Times New Roman" w:cs="Times New Roman"/>
+          <w:b w:val="0"/>
+          <w:i w:val="0"/>
+          <w:sz w:val="26"/>
+        </w:rPr>
+        <w:t xml:space="preserve"> dựa trên vi điều khiển phổ thông ngày càng được quan tâm — tiêu biểu là ESP32, vi điều khiển lõi kép tích hợp sẵn WiFi/Bluetooth, giá rẻ, cộng đồng hỗ trợ lớn, phù hợp cho các ứng dụng IoT và robot nhỏ </w:t>
+      </w:r>
+      <w:r>
+        <w:rPr>
+          <w:rFonts w:ascii="Times New Roman" w:hAnsi="Times New Roman" w:cs="Times New Roman"/>
+          <w:b w:val="0"/>
+          <w:i w:val="0"/>
+          <w:color w:val="C00000"/>
+          <w:sz w:val="26"/>
+        </w:rPr>
+        <w:t>[16]</w:t>
+      </w:r>
+      <w:r>
+        <w:rPr>
+          <w:rFonts w:ascii="Times New Roman" w:hAnsi="Times New Roman" w:cs="Times New Roman"/>
+          <w:b w:val="0"/>
+          <w:i w:val="0"/>
+          <w:sz w:val="26"/>
+        </w:rPr>
+        <w:t>.</w:t>
+      </w:r>
+    </w:p>
+    <w:p>
+      <w:pPr>
+        <w:jc w:val="both"/>
+      </w:pPr>
+      <w:r>
+        <w:rPr>
+          <w:rFonts w:ascii="Times New Roman" w:hAnsi="Times New Roman" w:cs="Times New Roman"/>
+          <w:b w:val="0"/>
+          <w:i w:val="0"/>
+          <w:sz w:val="26"/>
+        </w:rPr>
+        <w:t xml:space="preserve">Từ tổng quan trên có thể thấy các kỹ thuật định vị (hợp nhất encoder–IMU), tìm đường (A*) và né vật cản đều đã tương đối hoàn thiện, nhưng phần lớn được kiểm chứng trên nền tảng mạnh (PC/ROS, robot chuẩn như TurtleBot3) </w:t>
+      </w:r>
+      <w:r>
+        <w:rPr>
+          <w:rFonts w:ascii="Times New Roman" w:hAnsi="Times New Roman" w:cs="Times New Roman"/>
+          <w:b w:val="0"/>
+          <w:i w:val="0"/>
+          <w:color w:val="C00000"/>
+          <w:sz w:val="26"/>
+        </w:rPr>
+        <w:t>[13]</w:t>
+      </w:r>
+      <w:r>
+        <w:rPr>
+          <w:rFonts w:ascii="Times New Roman" w:hAnsi="Times New Roman" w:cs="Times New Roman"/>
+          <w:b w:val="0"/>
+          <w:i w:val="0"/>
+          <w:sz w:val="26"/>
+        </w:rPr>
+        <w:t xml:space="preserve"> hoặc bằng các bộ lọc tính toán nặng như EKF </w:t>
+      </w:r>
+      <w:r>
+        <w:rPr>
+          <w:rFonts w:ascii="Times New Roman" w:hAnsi="Times New Roman" w:cs="Times New Roman"/>
+          <w:b w:val="0"/>
+          <w:i w:val="0"/>
+          <w:color w:val="C00000"/>
+          <w:sz w:val="26"/>
+        </w:rPr>
+        <w:t>[5]</w:t>
+      </w:r>
+      <w:r>
+        <w:rPr>
+          <w:rFonts w:ascii="Times New Roman" w:hAnsi="Times New Roman" w:cs="Times New Roman"/>
+          <w:b w:val="0"/>
+          <w:i w:val="0"/>
+          <w:sz w:val="26"/>
+        </w:rPr>
         <w:t xml:space="preserve">, </w:t>
       </w:r>
       <w:r>
@@ -5416,16 +6046,66 @@
           <w:color w:val="C00000"/>
           <w:sz w:val="26"/>
         </w:rPr>
-        <w:t>[15]</w:t>
-      </w:r>
-      <w:r>
-        <w:rPr>
-          <w:rFonts w:ascii="Times New Roman" w:hAnsi="Times New Roman" w:cs="Times New Roman"/>
-          <w:b w:val="0"/>
-          <w:i w:val="0"/>
-          <w:sz w:val="26"/>
-        </w:rPr>
-        <w:t xml:space="preserve">. Nhiều khảo sát cho thấy việc thay thế AGV cứng nhắc bằng AMR linh hoạt giúp tăng đáng kể năng suất và khả năng thích ứng của dây chuyền sản xuất trong mô hình nhà máy thông minh </w:t>
+        <w:t>[7]</w:t>
+      </w:r>
+      <w:r>
+        <w:rPr>
+          <w:rFonts w:ascii="Times New Roman" w:hAnsi="Times New Roman" w:cs="Times New Roman"/>
+          <w:b w:val="0"/>
+          <w:i w:val="0"/>
+          <w:sz w:val="26"/>
+        </w:rPr>
+        <w:t xml:space="preserve">. Vẫn còn thiếu những giải pháp </w:t>
+      </w:r>
+      <w:r>
+        <w:rPr>
+          <w:rFonts w:ascii="Times New Roman" w:hAnsi="Times New Roman" w:cs="Times New Roman"/>
+          <w:b/>
+          <w:i w:val="0"/>
+          <w:sz w:val="26"/>
+        </w:rPr>
+        <w:t>tích hợp trọn vẹn</w:t>
+      </w:r>
+      <w:r>
+        <w:rPr>
+          <w:rFonts w:ascii="Times New Roman" w:hAnsi="Times New Roman" w:cs="Times New Roman"/>
+          <w:b w:val="0"/>
+          <w:i w:val="0"/>
+          <w:sz w:val="26"/>
+        </w:rPr>
+        <w:t xml:space="preserve"> cả ba chức năng định vị – tìm đường – bám lộ trình lên một vi điều khiển chi phí thấp, hoạt động độc lập không cần Internet và dễ tiếp cận cho mục đích học tập. Xây dựng một nền tảng như vậy vừa mang ý nghĩa thực tiễn — là sản phẩm học tập giúp người thực hiện nắm vững trọn vẹn chuỗi kiến thức nền (điều khiển động cơ, đọc cảm biến, định vị, lập kế hoạch đường đi, truyền thông không dây) — vừa là khung sườn để phát triển tiếp các tính năng cao cấp hơn như tránh vật cản động, SLAM hay phối hợp đội hình nhiều robot.</w:t>
+      </w:r>
+    </w:p>
+    <w:p>
+      <w:pPr>
+        <w:jc w:val="both"/>
+      </w:pPr>
+      <w:r>
+        <w:rPr>
+          <w:rFonts w:ascii="Times New Roman" w:hAnsi="Times New Roman" w:cs="Times New Roman"/>
+          <w:b w:val="0"/>
+          <w:i w:val="0"/>
+          <w:sz w:val="26"/>
+        </w:rPr>
+        <w:t xml:space="preserve">Xuất phát từ những lý do đó, đề tài </w:t>
+      </w:r>
+      <w:r>
+        <w:rPr>
+          <w:rFonts w:ascii="Times New Roman" w:hAnsi="Times New Roman" w:cs="Times New Roman"/>
+          <w:b/>
+          <w:i w:val="0"/>
+          <w:sz w:val="26"/>
+        </w:rPr>
+        <w:t>"Xe robot tự hành định vị bằng odometry và tìm đường A*"</w:t>
+      </w:r>
+      <w:r>
+        <w:rPr>
+          <w:rFonts w:ascii="Times New Roman" w:hAnsi="Times New Roman" w:cs="Times New Roman"/>
+          <w:b w:val="0"/>
+          <w:i w:val="0"/>
+          <w:sz w:val="26"/>
+        </w:rPr>
+        <w:t xml:space="preserve"> được lựa chọn thực hiện. Đề tài dùng ESP32 làm bộ điều khiển trung tâm; định vị bằng odometry kết hợp encoder bánh xe và cảm biến góc MPU-6050 thông qua bộ lọc bù </w:t>
       </w:r>
       <w:r>
         <w:rPr>
@@ -5435,84 +6115,16 @@
           <w:color w:val="C00000"/>
           <w:sz w:val="26"/>
         </w:rPr>
-        <w:t>[15]</w:t>
-      </w:r>
-      <w:r>
-        <w:rPr>
-          <w:rFonts w:ascii="Times New Roman" w:hAnsi="Times New Roman" w:cs="Times New Roman"/>
-          <w:b w:val="0"/>
-          <w:i w:val="0"/>
-          <w:sz w:val="26"/>
-        </w:rPr>
-        <w:t>.</w:t>
-      </w:r>
-    </w:p>
-    <w:p>
-      <w:pPr>
-        <w:jc w:val="both"/>
-      </w:pPr>
-      <w:r>
-        <w:rPr>
-          <w:rFonts w:ascii="Times New Roman" w:hAnsi="Times New Roman" w:cs="Times New Roman"/>
-          <w:b w:val="0"/>
-          <w:i w:val="0"/>
-          <w:sz w:val="26"/>
-        </w:rPr>
-        <w:t xml:space="preserve">Dù đa dạng về hình thức, mọi robot tự hành đều phải giải quyết ba bài toán cốt lõi: </w:t>
-      </w:r>
-      <w:r>
-        <w:rPr>
-          <w:rFonts w:ascii="Times New Roman" w:hAnsi="Times New Roman" w:cs="Times New Roman"/>
-          <w:b/>
-          <w:i w:val="0"/>
-          <w:sz w:val="26"/>
-        </w:rPr>
-        <w:t>định vị</w:t>
-      </w:r>
-      <w:r>
-        <w:rPr>
-          <w:rFonts w:ascii="Times New Roman" w:hAnsi="Times New Roman" w:cs="Times New Roman"/>
-          <w:b w:val="0"/>
-          <w:i w:val="0"/>
-          <w:sz w:val="26"/>
-        </w:rPr>
-        <w:t xml:space="preserve"> (robot biết mình đang ở đâu), </w:t>
-      </w:r>
-      <w:r>
-        <w:rPr>
-          <w:rFonts w:ascii="Times New Roman" w:hAnsi="Times New Roman" w:cs="Times New Roman"/>
-          <w:b/>
-          <w:i w:val="0"/>
-          <w:sz w:val="26"/>
-        </w:rPr>
-        <w:t>lập kế hoạch đường đi</w:t>
-      </w:r>
-      <w:r>
-        <w:rPr>
-          <w:rFonts w:ascii="Times New Roman" w:hAnsi="Times New Roman" w:cs="Times New Roman"/>
-          <w:b w:val="0"/>
-          <w:i w:val="0"/>
-          <w:sz w:val="26"/>
-        </w:rPr>
-        <w:t xml:space="preserve"> (xác định lộ trình tới đích) và </w:t>
-      </w:r>
-      <w:r>
-        <w:rPr>
-          <w:rFonts w:ascii="Times New Roman" w:hAnsi="Times New Roman" w:cs="Times New Roman"/>
-          <w:b/>
-          <w:i w:val="0"/>
-          <w:sz w:val="26"/>
-        </w:rPr>
-        <w:t>điều khiển bám lộ trình</w:t>
-      </w:r>
-      <w:r>
-        <w:rPr>
-          <w:rFonts w:ascii="Times New Roman" w:hAnsi="Times New Roman" w:cs="Times New Roman"/>
-          <w:b w:val="0"/>
-          <w:i w:val="0"/>
-          <w:sz w:val="26"/>
-        </w:rPr>
-        <w:t xml:space="preserve"> (di chuyển chính xác theo lộ trình đó) </w:t>
+        <w:t>[9]</w:t>
+      </w:r>
+      <w:r>
+        <w:rPr>
+          <w:rFonts w:ascii="Times New Roman" w:hAnsi="Times New Roman" w:cs="Times New Roman"/>
+          <w:b w:val="0"/>
+          <w:i w:val="0"/>
+          <w:sz w:val="26"/>
+        </w:rPr>
+        <w:t xml:space="preserve">; tìm đường bằng thuật toán A* </w:t>
       </w:r>
       <w:r>
         <w:rPr>
@@ -5522,16 +6134,16 @@
           <w:color w:val="C00000"/>
           <w:sz w:val="26"/>
         </w:rPr>
-        <w:t>[10]</w:t>
-      </w:r>
-      <w:r>
-        <w:rPr>
-          <w:rFonts w:ascii="Times New Roman" w:hAnsi="Times New Roman" w:cs="Times New Roman"/>
-          <w:b w:val="0"/>
-          <w:i w:val="0"/>
-          <w:sz w:val="26"/>
-        </w:rPr>
-        <w:t xml:space="preserve">. Về định vị, phương pháp tương đối (dead-reckoning) dựa trên odometry từ encoder bánh xe đơn giản, rẻ và tần số cao nhưng sai số tích lũy (trôi) theo quãng đường do trượt bánh và đường kính bánh không đều </w:t>
+        <w:t>[11]</w:t>
+      </w:r>
+      <w:r>
+        <w:rPr>
+          <w:rFonts w:ascii="Times New Roman" w:hAnsi="Times New Roman" w:cs="Times New Roman"/>
+          <w:b w:val="0"/>
+          <w:i w:val="0"/>
+          <w:sz w:val="26"/>
+        </w:rPr>
+        <w:t xml:space="preserve"> chạy trên ứng dụng di động đa nền tảng viết bằng Flutter </w:t>
       </w:r>
       <w:r>
         <w:rPr>
@@ -5541,619 +6153,7 @@
           <w:color w:val="C00000"/>
           <w:sz w:val="26"/>
         </w:rPr>
-        <w:t>[11]</w:t>
-      </w:r>
-      <w:r>
-        <w:rPr>
-          <w:rFonts w:ascii="Times New Roman" w:hAnsi="Times New Roman" w:cs="Times New Roman"/>
-          <w:b w:val="0"/>
-          <w:i w:val="0"/>
-          <w:sz w:val="26"/>
-        </w:rPr>
-        <w:t xml:space="preserve">; phương pháp tuyệt đối dùng GPS hoặc mốc định vị (landmark/beacon), còn các kỹ thuật hiện đại như định vị và dựng bản đồ đồng thời (SLAM) bằng LiDAR/camera cho độ chính xác cao nhưng đòi hỏi cảm biến đắt tiền và năng lực tính toán lớn </w:t>
-      </w:r>
-      <w:r>
-        <w:rPr>
-          <w:rFonts w:ascii="Times New Roman" w:hAnsi="Times New Roman" w:cs="Times New Roman"/>
-          <w:b w:val="0"/>
-          <w:i w:val="0"/>
-          <w:color w:val="C00000"/>
-          <w:sz w:val="26"/>
-        </w:rPr>
-        <w:t>[16]</w:t>
-      </w:r>
-      <w:r>
-        <w:rPr>
-          <w:rFonts w:ascii="Times New Roman" w:hAnsi="Times New Roman" w:cs="Times New Roman"/>
-          <w:b w:val="0"/>
-          <w:i w:val="0"/>
-          <w:sz w:val="26"/>
-        </w:rPr>
-        <w:t>.</w:t>
-      </w:r>
-    </w:p>
-    <w:p>
-      <w:pPr>
-        <w:jc w:val="both"/>
-      </w:pPr>
-      <w:r>
-        <w:rPr>
-          <w:rFonts w:ascii="Times New Roman" w:hAnsi="Times New Roman" w:cs="Times New Roman"/>
-          <w:b w:val="0"/>
-          <w:i w:val="0"/>
-          <w:sz w:val="26"/>
-        </w:rPr>
-        <w:t xml:space="preserve">Để giảm trôi của odometry, nhiều nghiên cứu đã hợp nhất encoder với cảm biến quán tính (IMU). Al Khatib và cộng sự </w:t>
-      </w:r>
-      <w:r>
-        <w:rPr>
-          <w:rFonts w:ascii="Times New Roman" w:hAnsi="Times New Roman" w:cs="Times New Roman"/>
-          <w:b w:val="0"/>
-          <w:i w:val="0"/>
-          <w:color w:val="C00000"/>
-          <w:sz w:val="26"/>
-        </w:rPr>
-        <w:t>[33]</w:t>
-      </w:r>
-      <w:r>
-        <w:rPr>
-          <w:rFonts w:ascii="Times New Roman" w:hAnsi="Times New Roman" w:cs="Times New Roman"/>
-          <w:b w:val="0"/>
-          <w:i w:val="0"/>
-          <w:sz w:val="26"/>
-        </w:rPr>
-        <w:t xml:space="preserve"> hợp nhất nhiều cảm biến (odometry, IMU) bằng bộ lọc Kalman mở rộng (EKF), nâng cao rõ rệt độ chính xác định vị và dẫn đường so với chỉ dùng đơn cảm biến. Cùng hướng đó, Ly và cộng sự </w:t>
-      </w:r>
-      <w:r>
-        <w:rPr>
-          <w:rFonts w:ascii="Times New Roman" w:hAnsi="Times New Roman" w:cs="Times New Roman"/>
-          <w:b w:val="0"/>
-          <w:i w:val="0"/>
-          <w:color w:val="C00000"/>
-          <w:sz w:val="26"/>
-        </w:rPr>
-        <w:t>[34]</w:t>
-      </w:r>
-      <w:r>
-        <w:rPr>
-          <w:rFonts w:ascii="Times New Roman" w:hAnsi="Times New Roman" w:cs="Times New Roman"/>
-          <w:b w:val="0"/>
-          <w:i w:val="0"/>
-          <w:sz w:val="26"/>
-        </w:rPr>
-        <w:t xml:space="preserve"> hợp nhất dữ liệu IMU và encoder bằng bộ lọc Kalman cho robot di động, cho thấy vị trí ước lượng bám quỹ đạo thực sát hơn hẳn odometry thuần; Housein và cộng sự </w:t>
-      </w:r>
-      <w:r>
-        <w:rPr>
-          <w:rFonts w:ascii="Times New Roman" w:hAnsi="Times New Roman" w:cs="Times New Roman"/>
-          <w:b w:val="0"/>
-          <w:i w:val="0"/>
-          <w:color w:val="C00000"/>
-          <w:sz w:val="26"/>
-        </w:rPr>
-        <w:t>[35]</w:t>
-      </w:r>
-      <w:r>
-        <w:rPr>
-          <w:rFonts w:ascii="Times New Roman" w:hAnsi="Times New Roman" w:cs="Times New Roman"/>
-          <w:b w:val="0"/>
-          <w:i w:val="0"/>
-          <w:sz w:val="26"/>
-        </w:rPr>
-        <w:t xml:space="preserve"> trình bày một triển khai EKF thực nghiệm cho cùng bài toán. Các hướng mở rộng gần đây còn kết hợp thêm thị giác (wheel–inertial–visual) bằng biến thể bộ lọc Kalman để tăng độ bền vững </w:t>
-      </w:r>
-      <w:r>
-        <w:rPr>
-          <w:rFonts w:ascii="Times New Roman" w:hAnsi="Times New Roman" w:cs="Times New Roman"/>
-          <w:b w:val="0"/>
-          <w:i w:val="0"/>
-          <w:color w:val="C00000"/>
-          <w:sz w:val="26"/>
-        </w:rPr>
-        <w:t>[36]</w:t>
-      </w:r>
-      <w:r>
-        <w:rPr>
-          <w:rFonts w:ascii="Times New Roman" w:hAnsi="Times New Roman" w:cs="Times New Roman"/>
-          <w:b w:val="0"/>
-          <w:i w:val="0"/>
-          <w:sz w:val="26"/>
-        </w:rPr>
-        <w:t xml:space="preserve">. Tuy nhiên, bộ lọc Kalman/EKF đòi hỏi mô hình và khối lượng tính toán đáng kể; với vi điều khiển hạn chế tài nguyên, </w:t>
-      </w:r>
-      <w:r>
-        <w:rPr>
-          <w:rFonts w:ascii="Times New Roman" w:hAnsi="Times New Roman" w:cs="Times New Roman"/>
-          <w:b/>
-          <w:i w:val="0"/>
-          <w:sz w:val="26"/>
-        </w:rPr>
-        <w:t>bộ lọc bù (complementary filter)</w:t>
-      </w:r>
-      <w:r>
-        <w:rPr>
-          <w:rFonts w:ascii="Times New Roman" w:hAnsi="Times New Roman" w:cs="Times New Roman"/>
-          <w:b w:val="0"/>
-          <w:i w:val="0"/>
-          <w:sz w:val="26"/>
-        </w:rPr>
-        <w:t xml:space="preserve"> là giải pháp nhẹ hơn, đủ tốt để kết hợp con quay hồi chuyển và encoder nhằm ổn định ước lượng hướng </w:t>
-      </w:r>
-      <w:r>
-        <w:rPr>
-          <w:rFonts w:ascii="Times New Roman" w:hAnsi="Times New Roman" w:cs="Times New Roman"/>
-          <w:b w:val="0"/>
-          <w:i w:val="0"/>
-          <w:color w:val="C00000"/>
-          <w:sz w:val="26"/>
-        </w:rPr>
-        <w:t>[14]</w:t>
-      </w:r>
-      <w:r>
-        <w:rPr>
-          <w:rFonts w:ascii="Times New Roman" w:hAnsi="Times New Roman" w:cs="Times New Roman"/>
-          <w:b w:val="0"/>
-          <w:i w:val="0"/>
-          <w:sz w:val="26"/>
-        </w:rPr>
-        <w:t>.</w:t>
-      </w:r>
-    </w:p>
-    <w:p>
-      <w:pPr>
-        <w:jc w:val="both"/>
-      </w:pPr>
-      <w:r>
-        <w:rPr>
-          <w:rFonts w:ascii="Times New Roman" w:hAnsi="Times New Roman" w:cs="Times New Roman"/>
-          <w:b w:val="0"/>
-          <w:i w:val="0"/>
-          <w:sz w:val="26"/>
-        </w:rPr>
-        <w:t xml:space="preserve">Về bài toán tìm đường, lý thuyết đồ thị cung cấp nền tảng vững chắc: thuật toán Dijkstra tìm đường đi ngắn nhất trên đồ thị có trọng số </w:t>
-      </w:r>
-      <w:r>
-        <w:rPr>
-          <w:rFonts w:ascii="Times New Roman" w:hAnsi="Times New Roman" w:cs="Times New Roman"/>
-          <w:b w:val="0"/>
-          <w:i w:val="0"/>
-          <w:color w:val="C00000"/>
-          <w:sz w:val="26"/>
-        </w:rPr>
-        <w:t>[13]</w:t>
-      </w:r>
-      <w:r>
-        <w:rPr>
-          <w:rFonts w:ascii="Times New Roman" w:hAnsi="Times New Roman" w:cs="Times New Roman"/>
-          <w:b w:val="0"/>
-          <w:i w:val="0"/>
-          <w:sz w:val="26"/>
-        </w:rPr>
-        <w:t xml:space="preserve">, còn thuật toán </w:t>
-      </w:r>
-      <w:r>
-        <w:rPr>
-          <w:rFonts w:ascii="Times New Roman" w:hAnsi="Times New Roman" w:cs="Times New Roman"/>
-          <w:b/>
-          <w:i w:val="0"/>
-          <w:sz w:val="26"/>
-        </w:rPr>
-        <w:t>A</w:t>
-      </w:r>
-      <w:r>
-        <w:rPr>
-          <w:rFonts w:ascii="Times New Roman" w:hAnsi="Times New Roman" w:cs="Times New Roman"/>
-          <w:b w:val="0"/>
-          <w:i w:val="0"/>
-          <w:sz w:val="26"/>
-        </w:rPr>
-        <w:t xml:space="preserve">* mở rộng Dijkstra bằng một hàm heuristic để hướng việc tìm kiếm về phía đích, nhờ đó giảm mạnh số nút phải duyệt mà vẫn đảm bảo tối ưu khi heuristic chấp nhận được (admissible) </w:t>
-      </w:r>
-      <w:r>
-        <w:rPr>
-          <w:rFonts w:ascii="Times New Roman" w:hAnsi="Times New Roman" w:cs="Times New Roman"/>
-          <w:b w:val="0"/>
-          <w:i w:val="0"/>
-          <w:color w:val="C00000"/>
-          <w:sz w:val="26"/>
-        </w:rPr>
-        <w:t>[6]</w:t>
-      </w:r>
-      <w:r>
-        <w:rPr>
-          <w:rFonts w:ascii="Times New Roman" w:hAnsi="Times New Roman" w:cs="Times New Roman"/>
-          <w:b w:val="0"/>
-          <w:i w:val="0"/>
-          <w:sz w:val="26"/>
-        </w:rPr>
-        <w:t xml:space="preserve">. Bên cạnh nhóm dựa trên đồ thị/lưới còn có nhóm lấy mẫu ngẫu nhiên (RRT, PRM) cho không gian cấu hình nhiều chiều </w:t>
-      </w:r>
-      <w:r>
-        <w:rPr>
-          <w:rFonts w:ascii="Times New Roman" w:hAnsi="Times New Roman" w:cs="Times New Roman"/>
-          <w:b w:val="0"/>
-          <w:i w:val="0"/>
-          <w:color w:val="C00000"/>
-          <w:sz w:val="26"/>
-        </w:rPr>
-        <w:t>[12]</w:t>
-      </w:r>
-      <w:r>
-        <w:rPr>
-          <w:rFonts w:ascii="Times New Roman" w:hAnsi="Times New Roman" w:cs="Times New Roman"/>
-          <w:b w:val="0"/>
-          <w:i w:val="0"/>
-          <w:sz w:val="26"/>
-        </w:rPr>
-        <w:t xml:space="preserve">. Trong thực tiễn robot, A* vẫn là lựa chọn phổ biến và liên tục được cải tiến: Shahapur và cộng sự </w:t>
-      </w:r>
-      <w:r>
-        <w:rPr>
-          <w:rFonts w:ascii="Times New Roman" w:hAnsi="Times New Roman" w:cs="Times New Roman"/>
-          <w:b w:val="0"/>
-          <w:i w:val="0"/>
-          <w:color w:val="C00000"/>
-          <w:sz w:val="26"/>
-        </w:rPr>
-        <w:t>[38]</w:t>
-      </w:r>
-      <w:r>
-        <w:rPr>
-          <w:rFonts w:ascii="Times New Roman" w:hAnsi="Times New Roman" w:cs="Times New Roman"/>
-          <w:b w:val="0"/>
-          <w:i w:val="0"/>
-          <w:sz w:val="26"/>
-        </w:rPr>
-        <w:t xml:space="preserve"> hiện thực và so sánh A</w:t>
-      </w:r>
-      <w:r>
-        <w:rPr>
-          <w:rFonts w:ascii="Times New Roman" w:hAnsi="Times New Roman" w:cs="Times New Roman"/>
-          <w:b w:val="0"/>
-          <w:i/>
-          <w:sz w:val="26"/>
-        </w:rPr>
-        <w:t xml:space="preserve"> với Dijkstra trên robot TurtleBot3 (mô phỏng Gazebo), xác nhận A</w:t>
-      </w:r>
-      <w:r>
-        <w:rPr>
-          <w:rFonts w:ascii="Times New Roman" w:hAnsi="Times New Roman" w:cs="Times New Roman"/>
-          <w:b w:val="0"/>
-          <w:i w:val="0"/>
-          <w:sz w:val="26"/>
-        </w:rPr>
-        <w:t xml:space="preserve"> tìm được đường tối ưu với số nút duyệt ít hơn; Yao và cộng sự </w:t>
-      </w:r>
-      <w:r>
-        <w:rPr>
-          <w:rFonts w:ascii="Times New Roman" w:hAnsi="Times New Roman" w:cs="Times New Roman"/>
-          <w:b w:val="0"/>
-          <w:i w:val="0"/>
-          <w:color w:val="C00000"/>
-          <w:sz w:val="26"/>
-        </w:rPr>
-        <w:t>[37]</w:t>
-      </w:r>
-      <w:r>
-        <w:rPr>
-          <w:rFonts w:ascii="Times New Roman" w:hAnsi="Times New Roman" w:cs="Times New Roman"/>
-          <w:b w:val="0"/>
-          <w:i w:val="0"/>
-          <w:sz w:val="26"/>
-        </w:rPr>
-        <w:t xml:space="preserve"> đề xuất biến thể A</w:t>
-      </w:r>
-      <w:r>
-        <w:rPr>
-          <w:rFonts w:ascii="Times New Roman" w:hAnsi="Times New Roman" w:cs="Times New Roman"/>
-          <w:b w:val="0"/>
-          <w:i/>
-          <w:sz w:val="26"/>
-        </w:rPr>
-        <w:t xml:space="preserve"> cải tiến (BSGA</w:t>
-      </w:r>
-      <w:r>
-        <w:rPr>
-          <w:rFonts w:ascii="Times New Roman" w:hAnsi="Times New Roman" w:cs="Times New Roman"/>
-          <w:b w:val="0"/>
-          <w:i w:val="0"/>
-          <w:sz w:val="26"/>
-        </w:rPr>
-        <w:t>) cho robot vi sai nhằm khắc phục đúng các hạn chế của A</w:t>
-      </w:r>
-      <w:r>
-        <w:rPr>
-          <w:rFonts w:ascii="Times New Roman" w:hAnsi="Times New Roman" w:cs="Times New Roman"/>
-          <w:b w:val="0"/>
-          <w:i/>
-          <w:sz w:val="26"/>
-        </w:rPr>
-        <w:t xml:space="preserve"> gốc là số nút tìm kiếm lớn và đường đi kém mượt. Với môi trường trong nhà đã biết trước dưới dạng lưới điểm (waypoint), A</w:t>
-      </w:r>
-      <w:r>
-        <w:rPr>
-          <w:rFonts w:ascii="Times New Roman" w:hAnsi="Times New Roman" w:cs="Times New Roman"/>
-          <w:b w:val="0"/>
-          <w:i w:val="0"/>
-          <w:sz w:val="26"/>
-        </w:rPr>
-        <w:t xml:space="preserve"> là lựa chọn cân bằng tốt giữa tính tối ưu, tốc độ thực thi và độ đơn giản khi cài đặt trên thiết bị di động.</w:t>
-      </w:r>
-    </w:p>
-    <w:p>
-      <w:pPr>
-        <w:jc w:val="both"/>
-      </w:pPr>
-      <w:r>
-        <w:rPr>
-          <w:rFonts w:ascii="Times New Roman" w:hAnsi="Times New Roman" w:cs="Times New Roman"/>
-          <w:b w:val="0"/>
-          <w:i w:val="0"/>
-          <w:sz w:val="26"/>
-        </w:rPr>
-        <w:t xml:space="preserve">Song song với định vị và tìm đường, khả năng </w:t>
-      </w:r>
-      <w:r>
-        <w:rPr>
-          <w:rFonts w:ascii="Times New Roman" w:hAnsi="Times New Roman" w:cs="Times New Roman"/>
-          <w:b/>
-          <w:i w:val="0"/>
-          <w:sz w:val="26"/>
-        </w:rPr>
-        <w:t>né vật cản</w:t>
-      </w:r>
-      <w:r>
-        <w:rPr>
-          <w:rFonts w:ascii="Times New Roman" w:hAnsi="Times New Roman" w:cs="Times New Roman"/>
-          <w:b w:val="0"/>
-          <w:i w:val="0"/>
-          <w:sz w:val="26"/>
-        </w:rPr>
-        <w:t xml:space="preserve"> cũng được nghiên cứu theo hướng chi phí thấp. Yasin và cộng sự </w:t>
-      </w:r>
-      <w:r>
-        <w:rPr>
-          <w:rFonts w:ascii="Times New Roman" w:hAnsi="Times New Roman" w:cs="Times New Roman"/>
-          <w:b w:val="0"/>
-          <w:i w:val="0"/>
-          <w:color w:val="C00000"/>
-          <w:sz w:val="26"/>
-        </w:rPr>
-        <w:t>[39]</w:t>
-      </w:r>
-      <w:r>
-        <w:rPr>
-          <w:rFonts w:ascii="Times New Roman" w:hAnsi="Times New Roman" w:cs="Times New Roman"/>
-          <w:b w:val="0"/>
-          <w:i w:val="0"/>
-          <w:sz w:val="26"/>
-        </w:rPr>
-        <w:t xml:space="preserve"> đề xuất phương pháp phát hiện vật cản và tránh va chạm chỉ dùng cảm biến siêu âm giá rẻ, với mục tiêu tối thiểu hóa độ lệch khỏi lộ trình ban đầu — rất phù hợp cho robot ngân sách thấp. Ở quy mô công nghiệp, robot tự hành thường được trang bị cảm biến đắt tiền (LiDAR, camera độ phân giải cao, GPS-RTK) cùng máy tính mạnh để chạy SLAM và thị giác máy tính </w:t>
-      </w:r>
-      <w:r>
-        <w:rPr>
-          <w:rFonts w:ascii="Times New Roman" w:hAnsi="Times New Roman" w:cs="Times New Roman"/>
-          <w:b w:val="0"/>
-          <w:i w:val="0"/>
-          <w:color w:val="C00000"/>
-          <w:sz w:val="26"/>
-        </w:rPr>
-        <w:t>[16]</w:t>
-      </w:r>
-      <w:r>
-        <w:rPr>
-          <w:rFonts w:ascii="Times New Roman" w:hAnsi="Times New Roman" w:cs="Times New Roman"/>
-          <w:b w:val="0"/>
-          <w:i w:val="0"/>
-          <w:sz w:val="26"/>
-        </w:rPr>
-        <w:t xml:space="preserve">; nhưng chi phí và độ phức tạp đó là rào cản lớn đối với sinh viên và các dự án học thuật. Vì vậy, hướng xây dựng robot tự hành </w:t>
-      </w:r>
-      <w:r>
-        <w:rPr>
-          <w:rFonts w:ascii="Times New Roman" w:hAnsi="Times New Roman" w:cs="Times New Roman"/>
-          <w:b/>
-          <w:i w:val="0"/>
-          <w:sz w:val="26"/>
-        </w:rPr>
-        <w:t>chi phí thấp</w:t>
-      </w:r>
-      <w:r>
-        <w:rPr>
-          <w:rFonts w:ascii="Times New Roman" w:hAnsi="Times New Roman" w:cs="Times New Roman"/>
-          <w:b w:val="0"/>
-          <w:i w:val="0"/>
-          <w:sz w:val="26"/>
-        </w:rPr>
-        <w:t xml:space="preserve"> dựa trên vi điều khiển phổ thông ngày càng được quan tâm — tiêu biểu là ESP32, vi điều khiển lõi kép tích hợp sẵn WiFi/Bluetooth, giá rẻ, cộng đồng hỗ trợ lớn, phù hợp cho các ứng dụng IoT và robot nhỏ </w:t>
-      </w:r>
-      <w:r>
-        <w:rPr>
-          <w:rFonts w:ascii="Times New Roman" w:hAnsi="Times New Roman" w:cs="Times New Roman"/>
-          <w:b w:val="0"/>
-          <w:i w:val="0"/>
-          <w:color w:val="C00000"/>
-          <w:sz w:val="26"/>
-        </w:rPr>
         <w:t>[17]</w:t>
-      </w:r>
-      <w:r>
-        <w:rPr>
-          <w:rFonts w:ascii="Times New Roman" w:hAnsi="Times New Roman" w:cs="Times New Roman"/>
-          <w:b w:val="0"/>
-          <w:i w:val="0"/>
-          <w:sz w:val="26"/>
-        </w:rPr>
-        <w:t>.</w:t>
-      </w:r>
-    </w:p>
-    <w:p>
-      <w:pPr>
-        <w:jc w:val="both"/>
-      </w:pPr>
-      <w:r>
-        <w:rPr>
-          <w:rFonts w:ascii="Times New Roman" w:hAnsi="Times New Roman" w:cs="Times New Roman"/>
-          <w:b w:val="0"/>
-          <w:i w:val="0"/>
-          <w:sz w:val="26"/>
-        </w:rPr>
-        <w:t xml:space="preserve">Từ tổng quan trên có thể thấy các kỹ thuật định vị (hợp nhất encoder–IMU), tìm đường (A*) và né vật cản đều đã tương đối hoàn thiện, nhưng phần lớn được kiểm chứng trên nền tảng mạnh (PC/ROS, robot chuẩn như TurtleBot3) </w:t>
-      </w:r>
-      <w:r>
-        <w:rPr>
-          <w:rFonts w:ascii="Times New Roman" w:hAnsi="Times New Roman" w:cs="Times New Roman"/>
-          <w:b w:val="0"/>
-          <w:i w:val="0"/>
-          <w:color w:val="C00000"/>
-          <w:sz w:val="26"/>
-        </w:rPr>
-        <w:t>[38]</w:t>
-      </w:r>
-      <w:r>
-        <w:rPr>
-          <w:rFonts w:ascii="Times New Roman" w:hAnsi="Times New Roman" w:cs="Times New Roman"/>
-          <w:b w:val="0"/>
-          <w:i w:val="0"/>
-          <w:sz w:val="26"/>
-        </w:rPr>
-        <w:t xml:space="preserve"> hoặc bằng các bộ lọc tính toán nặng như EKF </w:t>
-      </w:r>
-      <w:r>
-        <w:rPr>
-          <w:rFonts w:ascii="Times New Roman" w:hAnsi="Times New Roman" w:cs="Times New Roman"/>
-          <w:b w:val="0"/>
-          <w:i w:val="0"/>
-          <w:color w:val="C00000"/>
-          <w:sz w:val="26"/>
-        </w:rPr>
-        <w:t>[33]</w:t>
-      </w:r>
-      <w:r>
-        <w:rPr>
-          <w:rFonts w:ascii="Times New Roman" w:hAnsi="Times New Roman" w:cs="Times New Roman"/>
-          <w:b w:val="0"/>
-          <w:i w:val="0"/>
-          <w:sz w:val="26"/>
-        </w:rPr>
-        <w:t xml:space="preserve">, </w:t>
-      </w:r>
-      <w:r>
-        <w:rPr>
-          <w:rFonts w:ascii="Times New Roman" w:hAnsi="Times New Roman" w:cs="Times New Roman"/>
-          <w:b w:val="0"/>
-          <w:i w:val="0"/>
-          <w:color w:val="C00000"/>
-          <w:sz w:val="26"/>
-        </w:rPr>
-        <w:t>[35]</w:t>
-      </w:r>
-      <w:r>
-        <w:rPr>
-          <w:rFonts w:ascii="Times New Roman" w:hAnsi="Times New Roman" w:cs="Times New Roman"/>
-          <w:b w:val="0"/>
-          <w:i w:val="0"/>
-          <w:sz w:val="26"/>
-        </w:rPr>
-        <w:t xml:space="preserve">. Vẫn còn thiếu những giải pháp </w:t>
-      </w:r>
-      <w:r>
-        <w:rPr>
-          <w:rFonts w:ascii="Times New Roman" w:hAnsi="Times New Roman" w:cs="Times New Roman"/>
-          <w:b/>
-          <w:i w:val="0"/>
-          <w:sz w:val="26"/>
-        </w:rPr>
-        <w:t>tích hợp trọn vẹn</w:t>
-      </w:r>
-      <w:r>
-        <w:rPr>
-          <w:rFonts w:ascii="Times New Roman" w:hAnsi="Times New Roman" w:cs="Times New Roman"/>
-          <w:b w:val="0"/>
-          <w:i w:val="0"/>
-          <w:sz w:val="26"/>
-        </w:rPr>
-        <w:t xml:space="preserve"> cả ba chức năng định vị – tìm đường – bám lộ trình lên một vi điều khiển chi phí thấp, hoạt động độc lập không cần Internet và dễ tiếp cận cho mục đích học tập. Xây dựng một nền tảng như vậy vừa mang ý nghĩa thực tiễn — là sản phẩm học tập giúp người thực hiện nắm vững trọn vẹn chuỗi kiến thức nền (điều khiển động cơ, đọc cảm biến, định vị, lập kế hoạch đường đi, truyền thông không dây) — vừa là khung sườn để phát triển tiếp các tính năng cao cấp hơn như tránh vật cản động, SLAM hay phối hợp đội hình nhiều robot.</w:t>
-      </w:r>
-    </w:p>
-    <w:p>
-      <w:pPr>
-        <w:jc w:val="both"/>
-      </w:pPr>
-      <w:r>
-        <w:rPr>
-          <w:rFonts w:ascii="Times New Roman" w:hAnsi="Times New Roman" w:cs="Times New Roman"/>
-          <w:b w:val="0"/>
-          <w:i w:val="0"/>
-          <w:sz w:val="26"/>
-        </w:rPr>
-        <w:t xml:space="preserve">Xuất phát từ những lý do đó, đề tài </w:t>
-      </w:r>
-      <w:r>
-        <w:rPr>
-          <w:rFonts w:ascii="Times New Roman" w:hAnsi="Times New Roman" w:cs="Times New Roman"/>
-          <w:b/>
-          <w:i w:val="0"/>
-          <w:sz w:val="26"/>
-        </w:rPr>
-        <w:t>"Xe robot tự hành định vị bằng odometry và tìm đường A*"</w:t>
-      </w:r>
-      <w:r>
-        <w:rPr>
-          <w:rFonts w:ascii="Times New Roman" w:hAnsi="Times New Roman" w:cs="Times New Roman"/>
-          <w:b w:val="0"/>
-          <w:i w:val="0"/>
-          <w:sz w:val="26"/>
-        </w:rPr>
-        <w:t xml:space="preserve"> được lựa chọn thực hiện. Đề tài dùng ESP32 làm bộ điều khiển trung tâm; định vị bằng odometry kết hợp encoder bánh xe và cảm biến góc MPU-6050 thông qua bộ lọc bù </w:t>
-      </w:r>
-      <w:r>
-        <w:rPr>
-          <w:rFonts w:ascii="Times New Roman" w:hAnsi="Times New Roman" w:cs="Times New Roman"/>
-          <w:b w:val="0"/>
-          <w:i w:val="0"/>
-          <w:color w:val="C00000"/>
-          <w:sz w:val="26"/>
-        </w:rPr>
-        <w:t>[14]</w:t>
-      </w:r>
-      <w:r>
-        <w:rPr>
-          <w:rFonts w:ascii="Times New Roman" w:hAnsi="Times New Roman" w:cs="Times New Roman"/>
-          <w:b w:val="0"/>
-          <w:i w:val="0"/>
-          <w:sz w:val="26"/>
-        </w:rPr>
-        <w:t xml:space="preserve">; tìm đường bằng thuật toán A* </w:t>
-      </w:r>
-      <w:r>
-        <w:rPr>
-          <w:rFonts w:ascii="Times New Roman" w:hAnsi="Times New Roman" w:cs="Times New Roman"/>
-          <w:b w:val="0"/>
-          <w:i w:val="0"/>
-          <w:color w:val="C00000"/>
-          <w:sz w:val="26"/>
-        </w:rPr>
-        <w:t>[6]</w:t>
-      </w:r>
-      <w:r>
-        <w:rPr>
-          <w:rFonts w:ascii="Times New Roman" w:hAnsi="Times New Roman" w:cs="Times New Roman"/>
-          <w:b w:val="0"/>
-          <w:i w:val="0"/>
-          <w:sz w:val="26"/>
-        </w:rPr>
-        <w:t xml:space="preserve"> chạy trên ứng dụng di động đa nền tảng viết bằng Flutter </w:t>
-      </w:r>
-      <w:r>
-        <w:rPr>
-          <w:rFonts w:ascii="Times New Roman" w:hAnsi="Times New Roman" w:cs="Times New Roman"/>
-          <w:b w:val="0"/>
-          <w:i w:val="0"/>
-          <w:color w:val="C00000"/>
-          <w:sz w:val="26"/>
-        </w:rPr>
-        <w:t>[9]</w:t>
       </w:r>
       <w:r>
         <w:rPr>
@@ -7704,7 +7704,7 @@
           <w:color w:val="C00000"/>
           <w:sz w:val="26"/>
         </w:rPr>
-        <w:t>[8]</w:t>
+        <w:t>[21]</w:t>
       </w:r>
       <w:r>
         <w:rPr>
@@ -8127,7 +8127,7 @@
           <w:color w:val="C00000"/>
           <w:sz w:val="26"/>
         </w:rPr>
-        <w:t>[21]</w:t>
+        <w:t>[22]</w:t>
       </w:r>
       <w:r>
         <w:rPr>
@@ -8174,7 +8174,7 @@
           <w:color w:val="C00000"/>
           <w:sz w:val="26"/>
         </w:rPr>
-        <w:t>[22]</w:t>
+        <w:t>[23]</w:t>
       </w:r>
       <w:r>
         <w:rPr>
@@ -8243,7 +8243,7 @@
           <w:color w:val="C00000"/>
           <w:sz w:val="26"/>
         </w:rPr>
-        <w:t>[23]</w:t>
+        <w:t>[24]</w:t>
       </w:r>
       <w:r>
         <w:rPr>
@@ -8360,7 +8360,7 @@
           <w:color w:val="C00000"/>
           <w:sz w:val="26"/>
         </w:rPr>
-        <w:t>[30]</w:t>
+        <w:t>[26]</w:t>
       </w:r>
       <w:r>
         <w:rPr>
@@ -8454,7 +8454,7 @@
           <w:color w:val="C00000"/>
           <w:sz w:val="26"/>
         </w:rPr>
-        <w:t>[7]</w:t>
+        <w:t>[27]</w:t>
       </w:r>
       <w:r>
         <w:rPr>
@@ -8473,7 +8473,7 @@
           <w:color w:val="C00000"/>
           <w:sz w:val="26"/>
         </w:rPr>
-        <w:t>[24]</w:t>
+        <w:t>[28]</w:t>
       </w:r>
       <w:r>
         <w:rPr>
@@ -8830,7 +8830,7 @@
           <w:color w:val="C00000"/>
           <w:sz w:val="26"/>
         </w:rPr>
-        <w:t>[14]</w:t>
+        <w:t>[9]</w:t>
       </w:r>
       <w:r>
         <w:rPr>
@@ -8867,7 +8867,7 @@
           <w:color w:val="C00000"/>
           <w:sz w:val="26"/>
         </w:rPr>
-        <w:t>[26]</w:t>
+        <w:t>[29]</w:t>
       </w:r>
       <w:r>
         <w:rPr>
@@ -8886,7 +8886,7 @@
           <w:color w:val="C00000"/>
           <w:sz w:val="26"/>
         </w:rPr>
-        <w:t>[27]</w:t>
+        <w:t>[30]</w:t>
       </w:r>
       <w:r>
         <w:rPr>
@@ -9107,7 +9107,7 @@
           <w:color w:val="C00000"/>
           <w:sz w:val="26"/>
         </w:rPr>
-        <w:t>[6]</w:t>
+        <w:t>[11]</w:t>
       </w:r>
       <w:r>
         <w:rPr>
@@ -9126,7 +9126,7 @@
           <w:color w:val="C00000"/>
           <w:sz w:val="26"/>
         </w:rPr>
-        <w:t>[28]</w:t>
+        <w:t>[31]</w:t>
       </w:r>
       <w:r>
         <w:rPr>
@@ -9297,7 +9297,7 @@
           <w:color w:val="C00000"/>
           <w:sz w:val="26"/>
         </w:rPr>
-        <w:t>[29]</w:t>
+        <w:t>[32]</w:t>
       </w:r>
       <w:r>
         <w:rPr>
@@ -9391,7 +9391,7 @@
           <w:color w:val="C00000"/>
           <w:sz w:val="26"/>
         </w:rPr>
-        <w:t>[31]</w:t>
+        <w:t>[33]</w:t>
       </w:r>
       <w:r>
         <w:rPr>
@@ -9907,7 +9907,7 @@
                 <w:color w:val="C00000"/>
                 <w:sz w:val="24"/>
               </w:rPr>
-              <w:t>[32]</w:t>
+              <w:t>[34]</w:t>
             </w:r>
           </w:p>
         </w:tc>
@@ -12131,7 +12131,7 @@
           <w:color w:val="C00000"/>
           <w:sz w:val="26"/>
         </w:rPr>
-        <w:t>[1]</w:t>
+        <w:t>[35]</w:t>
       </w:r>
       <w:r>
         <w:rPr>
@@ -12150,7 +12150,7 @@
           <w:color w:val="C00000"/>
           <w:sz w:val="26"/>
         </w:rPr>
-        <w:t>[2]</w:t>
+        <w:t>[36]</w:t>
       </w:r>
       <w:r>
         <w:rPr>
@@ -12420,7 +12420,7 @@
           <w:color w:val="C00000"/>
           <w:sz w:val="26"/>
         </w:rPr>
-        <w:t>[4]</w:t>
+        <w:t>[37]</w:t>
       </w:r>
       <w:r>
         <w:rPr>
@@ -13388,7 +13388,7 @@
           <w:color w:val="C00000"/>
           <w:sz w:val="26"/>
         </w:rPr>
-        <w:t>[3]</w:t>
+        <w:t>[38]</w:t>
       </w:r>
       <w:r>
         <w:rPr>
@@ -13800,7 +13800,7 @@
           <w:color w:val="C00000"/>
           <w:sz w:val="26"/>
         </w:rPr>
-        <w:t>[5]</w:t>
+        <w:t>[39]</w:t>
       </w:r>
       <w:r>
         <w:rPr>
@@ -15531,7 +15531,7 @@
           <w:color w:val="C00000"/>
           <w:sz w:val="26"/>
         </w:rPr>
-        <w:t>[9]</w:t>
+        <w:t>[17]</w:t>
       </w:r>
       <w:r>
         <w:rPr>
@@ -29740,27 +29740,12 @@
       <w:r>
         <w:rPr>
           <w:rFonts w:ascii="Times New Roman" w:hAnsi="Times New Roman" w:cs="Times New Roman"/>
-          <w:b/>
+          <w:b w:val="0"/>
           <w:i w:val="0"/>
           <w:color w:val="C00000"/>
           <w:sz w:val="26"/>
         </w:rPr>
-        <w:t>Datasheet và tài liệu kỹ thuật:</w:t>
-      </w:r>
-    </w:p>
-    <w:p>
-      <w:pPr>
-        <w:jc w:val="both"/>
-      </w:pPr>
-      <w:r>
-        <w:rPr>
-          <w:rFonts w:ascii="Times New Roman" w:hAnsi="Times New Roman" w:cs="Times New Roman"/>
-          <w:b w:val="0"/>
-          <w:i w:val="0"/>
-          <w:color w:val="C00000"/>
-          <w:sz w:val="26"/>
-        </w:rPr>
-        <w:t xml:space="preserve">[1] Espressif Systems, </w:t>
+        <w:t xml:space="preserve">[1] R. Siegwart, I. R. Nourbakhsh, D. Scaramuzza, </w:t>
       </w:r>
       <w:r>
         <w:rPr>
@@ -29770,7 +29755,7 @@
           <w:color w:val="C00000"/>
           <w:sz w:val="26"/>
         </w:rPr>
-        <w:t>ESP32 Series Datasheet</w:t>
+        <w:t>Introduction to Autonomous Mobile Robots</w:t>
       </w:r>
       <w:r>
         <w:rPr>
@@ -29780,7 +29765,7 @@
           <w:color w:val="C00000"/>
           <w:sz w:val="26"/>
         </w:rPr>
-        <w:t>, 2024. [Online]. https://www.espressif.com/sites/default/files/documentation/esp32_datasheet_en.pdf</w:t>
+        <w:t>, 2nd ed., MIT Press, 2011.</w:t>
       </w:r>
     </w:p>
     <w:p>
@@ -29795,7 +29780,7 @@
           <w:color w:val="C00000"/>
           <w:sz w:val="26"/>
         </w:rPr>
-        <w:t xml:space="preserve">[2] Espressif Systems, </w:t>
+        <w:t xml:space="preserve">[2] G. Fragapane, D. Ivanov, M. Peron, F. Sgarbossa, J. O. Strandhagen, "Increasing flexibility and productivity in Industry 4.0 production networks with autonomous mobile robots and smart intralogistics", </w:t>
       </w:r>
       <w:r>
         <w:rPr>
@@ -29805,7 +29790,7 @@
           <w:color w:val="C00000"/>
           <w:sz w:val="26"/>
         </w:rPr>
-        <w:t>ESP32-WROOM-32 Datasheet</w:t>
+        <w:t>Annals of Operations Research</w:t>
       </w:r>
       <w:r>
         <w:rPr>
@@ -29815,7 +29800,7 @@
           <w:color w:val="C00000"/>
           <w:sz w:val="26"/>
         </w:rPr>
-        <w:t>, 2024. [Online]. https://www.espressif.com/sites/default/files/documentation/esp32-wroom-32_datasheet_en.pdf</w:t>
+        <w:t>, vol. 308, pp. 125–143, 2021.</w:t>
       </w:r>
     </w:p>
     <w:p>
@@ -29830,7 +29815,7 @@
           <w:color w:val="C00000"/>
           <w:sz w:val="26"/>
         </w:rPr>
-        <w:t xml:space="preserve">[3] InvenSense (TDK), </w:t>
+        <w:t xml:space="preserve">[3] J. Borenstein, H. R. Everett, L. Feng, </w:t>
       </w:r>
       <w:r>
         <w:rPr>
@@ -29840,7 +29825,7 @@
           <w:color w:val="C00000"/>
           <w:sz w:val="26"/>
         </w:rPr>
-        <w:t>MPU-6000/MPU-6050 Product Specification &amp; Register Map</w:t>
+        <w:t>Where am I? Sensors and Methods for Mobile Robot Positioning</w:t>
       </w:r>
       <w:r>
         <w:rPr>
@@ -29850,7 +29835,7 @@
           <w:color w:val="C00000"/>
           <w:sz w:val="26"/>
         </w:rPr>
-        <w:t>, Rev. 3.4/4.2. [Online]. https://invensense.tdk.com/products/motion-tracking/6-axis/mpu-6050/</w:t>
+        <w:t>, University of Michigan, 1996.</w:t>
       </w:r>
     </w:p>
     <w:p>
@@ -29865,7 +29850,7 @@
           <w:color w:val="C00000"/>
           <w:sz w:val="26"/>
         </w:rPr>
-        <w:t xml:space="preserve">[4] STMicroelectronics, </w:t>
+        <w:t xml:space="preserve">[4] C. Cadena et al., "Past, Present, and Future of Simultaneous Localization and Mapping: Toward the Robust-Perception Age", </w:t>
       </w:r>
       <w:r>
         <w:rPr>
@@ -29875,7 +29860,7 @@
           <w:color w:val="C00000"/>
           <w:sz w:val="26"/>
         </w:rPr>
-        <w:t>L298 Dual Full-Bridge Driver Datasheet</w:t>
+        <w:t>IEEE Transactions on Robotics</w:t>
       </w:r>
       <w:r>
         <w:rPr>
@@ -29885,7 +29870,7 @@
           <w:color w:val="C00000"/>
           <w:sz w:val="26"/>
         </w:rPr>
-        <w:t>. [Online]. https://www.st.com/resource/en/datasheet/l298.pdf</w:t>
+        <w:t>, vol. 32, no. 6, pp. 1309–1332, 2016.</w:t>
       </w:r>
     </w:p>
     <w:p>
@@ -29900,7 +29885,7 @@
           <w:color w:val="C00000"/>
           <w:sz w:val="26"/>
         </w:rPr>
-        <w:t xml:space="preserve">[5] SparkFun Electronics, </w:t>
+        <w:t xml:space="preserve">[5] E. I. Al Khatib, M. A. Jaradat, M. Abdel-Hafez, M. Roigari, "Multiple Sensor Fusion for Mobile Robot Localization and Navigation Using the Extended Kalman Filter", in </w:t>
       </w:r>
       <w:r>
         <w:rPr>
@@ -29910,7 +29895,7 @@
           <w:color w:val="C00000"/>
           <w:sz w:val="26"/>
         </w:rPr>
-        <w:t>HC-SR04 Ultrasonic Sensor Module</w:t>
+        <w:t>Proc. 10th Int. Symp. on Mechatronics and its Applications (ISMA)</w:t>
       </w:r>
       <w:r>
         <w:rPr>
@@ -29920,7 +29905,7 @@
           <w:color w:val="C00000"/>
           <w:sz w:val="26"/>
         </w:rPr>
-        <w:t>. [Online]. https://cdn.sparkfun.com/datasheets/Sensors/Proximity/HCSR04.pdf</w:t>
+        <w:t>, 2015, pp. 1–5.</w:t>
       </w:r>
     </w:p>
     <w:p>
@@ -29930,27 +29915,12 @@
       <w:r>
         <w:rPr>
           <w:rFonts w:ascii="Times New Roman" w:hAnsi="Times New Roman" w:cs="Times New Roman"/>
-          <w:b/>
+          <w:b w:val="0"/>
           <w:i w:val="0"/>
           <w:color w:val="C00000"/>
           <w:sz w:val="26"/>
         </w:rPr>
-        <w:t>Tài liệu thuật toán và nền tảng:</w:t>
-      </w:r>
-    </w:p>
-    <w:p>
-      <w:pPr>
-        <w:jc w:val="both"/>
-      </w:pPr>
-      <w:r>
-        <w:rPr>
-          <w:rFonts w:ascii="Times New Roman" w:hAnsi="Times New Roman" w:cs="Times New Roman"/>
-          <w:b w:val="0"/>
-          <w:i w:val="0"/>
-          <w:color w:val="C00000"/>
-          <w:sz w:val="26"/>
-        </w:rPr>
-        <w:t xml:space="preserve">[6] P. E. Hart, N. J. Nilsson, B. Raphael, "A Formal Basis for the Heuristic Determination of Minimum Cost Paths", </w:t>
+        <w:t xml:space="preserve">[6] T. T. K. Ly, L. T. Phong, D. K. Nhan, "Autonomous Mobile Robot Localization by Using IMU and Encoder Data Fusion Technique by Kalman Filter", in </w:t>
       </w:r>
       <w:r>
         <w:rPr>
@@ -29960,7 +29930,7 @@
           <w:color w:val="C00000"/>
           <w:sz w:val="26"/>
         </w:rPr>
-        <w:t>IEEE Trans. on Systems Science and Cybernetics</w:t>
+        <w:t>Advances in Engineering Research and Application (ICERA)</w:t>
       </w:r>
       <w:r>
         <w:rPr>
@@ -29970,7 +29940,7 @@
           <w:color w:val="C00000"/>
           <w:sz w:val="26"/>
         </w:rPr>
-        <w:t>, 1968.</w:t>
+        <w:t>, Lecture Notes in Networks and Systems, Springer, 2024, pp. 245–256.</w:t>
       </w:r>
     </w:p>
     <w:p>
@@ -29985,7 +29955,7 @@
           <w:color w:val="C00000"/>
           <w:sz w:val="26"/>
         </w:rPr>
-        <w:t xml:space="preserve">[7] S. Thrun, W. Burgard, D. Fox, </w:t>
+        <w:t xml:space="preserve">[7] A. A. Housein, G. Xingyu, W. Li, Y. Huang, "Extended Kalman Filter Sensor Fusion in Practice for Mobile Robot Localization", </w:t>
       </w:r>
       <w:r>
         <w:rPr>
@@ -29995,7 +29965,7 @@
           <w:color w:val="C00000"/>
           <w:sz w:val="26"/>
         </w:rPr>
-        <w:t>Probabilistic Robotics</w:t>
+        <w:t>Int. Journal of Advanced Computer Science and Applications (IJACSA)</w:t>
       </w:r>
       <w:r>
         <w:rPr>
@@ -30005,7 +29975,7 @@
           <w:color w:val="C00000"/>
           <w:sz w:val="26"/>
         </w:rPr>
-        <w:t>, MIT Press, 2005 (chương về odometry và mô hình chuyển động vi sai).</w:t>
+        <w:t>, vol. 13, no. 2, 2022.</w:t>
       </w:r>
     </w:p>
     <w:p>
@@ -30020,7 +29990,7 @@
           <w:color w:val="C00000"/>
           <w:sz w:val="26"/>
         </w:rPr>
-        <w:t xml:space="preserve">[8] Espressif Systems, </w:t>
+        <w:t xml:space="preserve">[8] G. Huang et al., "Multi-Sensor Fusion for Wheel-Inertial-Visual Systems Using a Fuzzification-Assisted Iterated Error State Kalman Filter", </w:t>
       </w:r>
       <w:r>
         <w:rPr>
@@ -30030,7 +30000,7 @@
           <w:color w:val="C00000"/>
           <w:sz w:val="26"/>
         </w:rPr>
-        <w:t>ESP-IDF / Arduino-ESP32 Programming Guide</w:t>
+        <w:t>Sensors</w:t>
       </w:r>
       <w:r>
         <w:rPr>
@@ -30040,7 +30010,7 @@
           <w:color w:val="C00000"/>
           <w:sz w:val="26"/>
         </w:rPr>
-        <w:t xml:space="preserve"> (LEDC, GPIO interrupts, WiFi SoftAP). [Online]. https://docs.espressif.com/</w:t>
+        <w:t>, vol. 24, no. 23, art. 7619, 2024.</w:t>
       </w:r>
     </w:p>
     <w:p>
@@ -30055,7 +30025,7 @@
           <w:color w:val="C00000"/>
           <w:sz w:val="26"/>
         </w:rPr>
-        <w:t xml:space="preserve">[9] Google, </w:t>
+        <w:t xml:space="preserve">[9] R. Mahony, T. Hamel, J.-M. Pflimlin, "Nonlinear Complementary Filters on the Special Orthogonal Group", </w:t>
       </w:r>
       <w:r>
         <w:rPr>
@@ -30065,7 +30035,7 @@
           <w:color w:val="C00000"/>
           <w:sz w:val="26"/>
         </w:rPr>
-        <w:t>Flutter Documentation</w:t>
+        <w:t>IEEE Transactions on Automatic Control</w:t>
       </w:r>
       <w:r>
         <w:rPr>
@@ -30075,7 +30045,22 @@
           <w:color w:val="C00000"/>
           <w:sz w:val="26"/>
         </w:rPr>
-        <w:t xml:space="preserve"> và </w:t>
+        <w:t>, vol. 53, no. 5, pp. 1203–1218, 2008.</w:t>
+      </w:r>
+    </w:p>
+    <w:p>
+      <w:pPr>
+        <w:jc w:val="both"/>
+      </w:pPr>
+      <w:r>
+        <w:rPr>
+          <w:rFonts w:ascii="Times New Roman" w:hAnsi="Times New Roman" w:cs="Times New Roman"/>
+          <w:b w:val="0"/>
+          <w:i w:val="0"/>
+          <w:color w:val="C00000"/>
+          <w:sz w:val="26"/>
+        </w:rPr>
+        <w:t xml:space="preserve">[10] E. W. Dijkstra, "A note on two problems in connexion with graphs", </w:t>
       </w:r>
       <w:r>
         <w:rPr>
@@ -30085,7 +30070,7 @@
           <w:color w:val="C00000"/>
           <w:sz w:val="26"/>
         </w:rPr>
-        <w:t>Dart Language Tour</w:t>
+        <w:t>Numerische Mathematik</w:t>
       </w:r>
       <w:r>
         <w:rPr>
@@ -30095,7 +30080,7 @@
           <w:color w:val="C00000"/>
           <w:sz w:val="26"/>
         </w:rPr>
-        <w:t>. [Online]. https://docs.flutter.dev/</w:t>
+        <w:t>, vol. 1, pp. 269–271, 1959.</w:t>
       </w:r>
     </w:p>
     <w:p>
@@ -30105,27 +30090,12 @@
       <w:r>
         <w:rPr>
           <w:rFonts w:ascii="Times New Roman" w:hAnsi="Times New Roman" w:cs="Times New Roman"/>
-          <w:b/>
+          <w:b w:val="0"/>
           <w:i w:val="0"/>
           <w:color w:val="C00000"/>
           <w:sz w:val="26"/>
         </w:rPr>
-        <w:t>Sách và bài báo khoa học về robot di động, định vị và dẫn đường:</w:t>
-      </w:r>
-    </w:p>
-    <w:p>
-      <w:pPr>
-        <w:jc w:val="both"/>
-      </w:pPr>
-      <w:r>
-        <w:rPr>
-          <w:rFonts w:ascii="Times New Roman" w:hAnsi="Times New Roman" w:cs="Times New Roman"/>
-          <w:b w:val="0"/>
-          <w:i w:val="0"/>
-          <w:color w:val="C00000"/>
-          <w:sz w:val="26"/>
-        </w:rPr>
-        <w:t xml:space="preserve">[10] R. Siegwart, I. R. Nourbakhsh, D. Scaramuzza, </w:t>
+        <w:t xml:space="preserve">[11] P. E. Hart, N. J. Nilsson, B. Raphael, "A Formal Basis for the Heuristic Determination of Minimum Cost Paths", </w:t>
       </w:r>
       <w:r>
         <w:rPr>
@@ -30135,7 +30105,7 @@
           <w:color w:val="C00000"/>
           <w:sz w:val="26"/>
         </w:rPr>
-        <w:t>Introduction to Autonomous Mobile Robots</w:t>
+        <w:t>IEEE Trans. on Systems Science and Cybernetics</w:t>
       </w:r>
       <w:r>
         <w:rPr>
@@ -30145,7 +30115,7 @@
           <w:color w:val="C00000"/>
           <w:sz w:val="26"/>
         </w:rPr>
-        <w:t>, 2nd ed., MIT Press, 2011.</w:t>
+        <w:t>, 1968.</w:t>
       </w:r>
     </w:p>
     <w:p>
@@ -30160,7 +30130,7 @@
           <w:color w:val="C00000"/>
           <w:sz w:val="26"/>
         </w:rPr>
-        <w:t xml:space="preserve">[11] J. Borenstein, H. R. Everett, L. Feng, </w:t>
+        <w:t xml:space="preserve">[12] S. M. LaValle, </w:t>
       </w:r>
       <w:r>
         <w:rPr>
@@ -30170,7 +30140,7 @@
           <w:color w:val="C00000"/>
           <w:sz w:val="26"/>
         </w:rPr>
-        <w:t>Where am I? Sensors and Methods for Mobile Robot Positioning</w:t>
+        <w:t>Planning Algorithms</w:t>
       </w:r>
       <w:r>
         <w:rPr>
@@ -30180,7 +30150,7 @@
           <w:color w:val="C00000"/>
           <w:sz w:val="26"/>
         </w:rPr>
-        <w:t>, University of Michigan, 1996.</w:t>
+        <w:t>, Cambridge University Press, 2006. [Online]. http://lavalle.pl/planning/</w:t>
       </w:r>
     </w:p>
     <w:p>
@@ -30195,7 +30165,7 @@
           <w:color w:val="C00000"/>
           <w:sz w:val="26"/>
         </w:rPr>
-        <w:t xml:space="preserve">[12] S. M. LaValle, </w:t>
+        <w:t xml:space="preserve">[13] V. Shahapur, B. Dixon, U. Bharti, "Robotic Path Planning Implementation using Search Algorithms", </w:t>
       </w:r>
       <w:r>
         <w:rPr>
@@ -30205,7 +30175,7 @@
           <w:color w:val="C00000"/>
           <w:sz w:val="26"/>
         </w:rPr>
-        <w:t>Planning Algorithms</w:t>
+        <w:t>arXiv preprint</w:t>
       </w:r>
       <w:r>
         <w:rPr>
@@ -30215,7 +30185,7 @@
           <w:color w:val="C00000"/>
           <w:sz w:val="26"/>
         </w:rPr>
-        <w:t>, Cambridge University Press, 2006. [Online]. http://lavalle.pl/planning/</w:t>
+        <w:t xml:space="preserve"> arXiv:2405.16445, 2024.</w:t>
       </w:r>
     </w:p>
     <w:p>
@@ -30230,7 +30200,7 @@
           <w:color w:val="C00000"/>
           <w:sz w:val="26"/>
         </w:rPr>
-        <w:t xml:space="preserve">[13] E. W. Dijkstra, "A note on two problems in connexion with graphs", </w:t>
+        <w:t>[14] M. Yao, H. Deng, X. Feng, P. Li, Y. Li, H. Liu, "Global Path Planning for Differential Drive Mobile Robots Based on Improved BSGA</w:t>
       </w:r>
       <w:r>
         <w:rPr>
@@ -30240,7 +30210,7 @@
           <w:color w:val="C00000"/>
           <w:sz w:val="26"/>
         </w:rPr>
-        <w:t>Numerische Mathematik</w:t>
+        <w:t xml:space="preserve"> Algorithm", </w:t>
       </w:r>
       <w:r>
         <w:rPr>
@@ -30250,7 +30220,7 @@
           <w:color w:val="C00000"/>
           <w:sz w:val="26"/>
         </w:rPr>
-        <w:t>, vol. 1, pp. 269–271, 1959.</w:t>
+        <w:t>Applied Sciences*, vol. 13, no. 20, art. 11290, 2023.</w:t>
       </w:r>
     </w:p>
     <w:p>
@@ -30265,7 +30235,7 @@
           <w:color w:val="C00000"/>
           <w:sz w:val="26"/>
         </w:rPr>
-        <w:t xml:space="preserve">[14] R. Mahony, T. Hamel, J.-M. Pflimlin, "Nonlinear Complementary Filters on the Special Orthogonal Group", </w:t>
+        <w:t xml:space="preserve">[15] J. N. Yasin, S. A. S. Mohamed, M.-H. Haghbayan, J. Heikkonen, H. Tenhunen, J. Plosila, "Low-cost ultrasonic based object detection and collision avoidance method for autonomous robots", </w:t>
       </w:r>
       <w:r>
         <w:rPr>
@@ -30275,7 +30245,7 @@
           <w:color w:val="C00000"/>
           <w:sz w:val="26"/>
         </w:rPr>
-        <w:t>IEEE Transactions on Automatic Control</w:t>
+        <w:t>Int. Journal of Information Technology</w:t>
       </w:r>
       <w:r>
         <w:rPr>
@@ -30285,7 +30255,7 @@
           <w:color w:val="C00000"/>
           <w:sz w:val="26"/>
         </w:rPr>
-        <w:t>, vol. 53, no. 5, pp. 1203–1218, 2008.</w:t>
+        <w:t>, vol. 13, pp. 97–107, 2020.</w:t>
       </w:r>
     </w:p>
     <w:p>
@@ -30300,7 +30270,7 @@
           <w:color w:val="C00000"/>
           <w:sz w:val="26"/>
         </w:rPr>
-        <w:t xml:space="preserve">[15] G. Fragapane, D. Ivanov, M. Peron, F. Sgarbossa, J. O. Strandhagen, "Increasing flexibility and productivity in Industry 4.0 production networks with autonomous mobile robots and smart intralogistics", </w:t>
+        <w:t xml:space="preserve">[16] A. Maier, A. Sharp, Y. Vagapov, "Comparative analysis and practical implementation of the ESP32 microcontroller module for the internet of things", in </w:t>
       </w:r>
       <w:r>
         <w:rPr>
@@ -30310,7 +30280,7 @@
           <w:color w:val="C00000"/>
           <w:sz w:val="26"/>
         </w:rPr>
-        <w:t>Annals of Operations Research</w:t>
+        <w:t>Proc. 7th IEEE Int. Conf. on Internet Technologies and Applications (ITA)</w:t>
       </w:r>
       <w:r>
         <w:rPr>
@@ -30320,7 +30290,7 @@
           <w:color w:val="C00000"/>
           <w:sz w:val="26"/>
         </w:rPr>
-        <w:t>, vol. 308, pp. 125–143, 2021.</w:t>
+        <w:t>, 2017, pp. 143–148.</w:t>
       </w:r>
     </w:p>
     <w:p>
@@ -30335,7 +30305,7 @@
           <w:color w:val="C00000"/>
           <w:sz w:val="26"/>
         </w:rPr>
-        <w:t xml:space="preserve">[16] C. Cadena et al., "Past, Present, and Future of Simultaneous Localization and Mapping: Toward the Robust-Perception Age", </w:t>
+        <w:t xml:space="preserve">[17] Google, </w:t>
       </w:r>
       <w:r>
         <w:rPr>
@@ -30345,7 +30315,7 @@
           <w:color w:val="C00000"/>
           <w:sz w:val="26"/>
         </w:rPr>
-        <w:t>IEEE Transactions on Robotics</w:t>
+        <w:t>Flutter Documentation</w:t>
       </w:r>
       <w:r>
         <w:rPr>
@@ -30355,22 +30325,7 @@
           <w:color w:val="C00000"/>
           <w:sz w:val="26"/>
         </w:rPr>
-        <w:t>, vol. 32, no. 6, pp. 1309–1332, 2016.</w:t>
-      </w:r>
-    </w:p>
-    <w:p>
-      <w:pPr>
-        <w:jc w:val="both"/>
-      </w:pPr>
-      <w:r>
-        <w:rPr>
-          <w:rFonts w:ascii="Times New Roman" w:hAnsi="Times New Roman" w:cs="Times New Roman"/>
-          <w:b w:val="0"/>
-          <w:i w:val="0"/>
-          <w:color w:val="C00000"/>
-          <w:sz w:val="26"/>
-        </w:rPr>
-        <w:t xml:space="preserve">[17] A. Maier, A. Sharp, Y. Vagapov, "Comparative analysis and practical implementation of the ESP32 microcontroller module for the internet of things", in </w:t>
+        <w:t xml:space="preserve"> và </w:t>
       </w:r>
       <w:r>
         <w:rPr>
@@ -30380,7 +30335,7 @@
           <w:color w:val="C00000"/>
           <w:sz w:val="26"/>
         </w:rPr>
-        <w:t>Proc. 7th IEEE Int. Conf. on Internet Technologies and Applications (ITA)</w:t>
+        <w:t>Dart Language Tour</w:t>
       </w:r>
       <w:r>
         <w:rPr>
@@ -30390,22 +30345,7 @@
           <w:color w:val="C00000"/>
           <w:sz w:val="26"/>
         </w:rPr>
-        <w:t>, 2017, pp. 143–148.</w:t>
-      </w:r>
-    </w:p>
-    <w:p>
-      <w:pPr>
-        <w:jc w:val="both"/>
-      </w:pPr>
-      <w:r>
-        <w:rPr>
-          <w:rFonts w:ascii="Times New Roman" w:hAnsi="Times New Roman" w:cs="Times New Roman"/>
-          <w:b/>
-          <w:i w:val="0"/>
-          <w:color w:val="C00000"/>
-          <w:sz w:val="26"/>
-        </w:rPr>
-        <w:t>Chuẩn giao tiếp, vi điều khiển và linh kiện:</w:t>
+        <w:t>. [Online]. https://docs.flutter.dev/</w:t>
       </w:r>
     </w:p>
     <w:p>
@@ -30525,7 +30465,7 @@
           <w:color w:val="C00000"/>
           <w:sz w:val="26"/>
         </w:rPr>
-        <w:t xml:space="preserve">[21] Texas Instruments, </w:t>
+        <w:t xml:space="preserve">[21] Espressif Systems, </w:t>
       </w:r>
       <w:r>
         <w:rPr>
@@ -30535,7 +30475,7 @@
           <w:color w:val="C00000"/>
           <w:sz w:val="26"/>
         </w:rPr>
-        <w:t>LMx93, LM2903 Differential Comparators Datasheet</w:t>
+        <w:t>ESP-IDF / Arduino-ESP32 Programming Guide</w:t>
       </w:r>
       <w:r>
         <w:rPr>
@@ -30545,7 +30485,7 @@
           <w:color w:val="C00000"/>
           <w:sz w:val="26"/>
         </w:rPr>
-        <w:t>, 2022. [Online]. https://www.ti.com/lit/ds/symlink/lm393.pdf</w:t>
+        <w:t xml:space="preserve"> (LEDC, GPIO interrupts, WiFi SoftAP). [Online]. https://docs.espressif.com/</w:t>
       </w:r>
     </w:p>
     <w:p>
@@ -30560,7 +30500,7 @@
           <w:color w:val="C00000"/>
           <w:sz w:val="26"/>
         </w:rPr>
-        <w:t xml:space="preserve">[22] IEEE, </w:t>
+        <w:t xml:space="preserve">[22] Texas Instruments, </w:t>
       </w:r>
       <w:r>
         <w:rPr>
@@ -30570,7 +30510,7 @@
           <w:color w:val="C00000"/>
           <w:sz w:val="26"/>
         </w:rPr>
-        <w:t>IEEE Std 802.11-2020 — Wireless LAN Medium Access Control (MAC) and Physical Layer (PHY) Specifications</w:t>
+        <w:t>LMx93, LM2903 Differential Comparators Datasheet</w:t>
       </w:r>
       <w:r>
         <w:rPr>
@@ -30580,7 +30520,7 @@
           <w:color w:val="C00000"/>
           <w:sz w:val="26"/>
         </w:rPr>
-        <w:t>, 2021.</w:t>
+        <w:t>, 2022. [Online]. https://www.ti.com/lit/ds/symlink/lm393.pdf</w:t>
       </w:r>
     </w:p>
     <w:p>
@@ -30595,37 +30535,7 @@
           <w:color w:val="C00000"/>
           <w:sz w:val="26"/>
         </w:rPr>
-        <w:t>[23] J. Postel, "User Datagram Protocol", RFC 768, IETF, 1980. [Online]. https://www.rfc-editor.org/rfc/rfc768</w:t>
-      </w:r>
-    </w:p>
-    <w:p>
-      <w:pPr>
-        <w:jc w:val="both"/>
-      </w:pPr>
-      <w:r>
-        <w:rPr>
-          <w:rFonts w:ascii="Times New Roman" w:hAnsi="Times New Roman" w:cs="Times New Roman"/>
-          <w:b/>
-          <w:i w:val="0"/>
-          <w:color w:val="C00000"/>
-          <w:sz w:val="26"/>
-        </w:rPr>
-        <w:t>Động học, định vị, hợp nhất cảm biến và tìm đường:</w:t>
-      </w:r>
-    </w:p>
-    <w:p>
-      <w:pPr>
-        <w:jc w:val="both"/>
-      </w:pPr>
-      <w:r>
-        <w:rPr>
-          <w:rFonts w:ascii="Times New Roman" w:hAnsi="Times New Roman" w:cs="Times New Roman"/>
-          <w:b w:val="0"/>
-          <w:i w:val="0"/>
-          <w:color w:val="C00000"/>
-          <w:sz w:val="26"/>
-        </w:rPr>
-        <w:t xml:space="preserve">[24] G. Dudek, M. Jenkin, </w:t>
+        <w:t xml:space="preserve">[23] IEEE, </w:t>
       </w:r>
       <w:r>
         <w:rPr>
@@ -30635,7 +30545,7 @@
           <w:color w:val="C00000"/>
           <w:sz w:val="26"/>
         </w:rPr>
-        <w:t>Computational Principles of Mobile Robotics</w:t>
+        <w:t>IEEE Std 802.11-2020 — Wireless LAN Medium Access Control (MAC) and Physical Layer (PHY) Specifications</w:t>
       </w:r>
       <w:r>
         <w:rPr>
@@ -30645,7 +30555,22 @@
           <w:color w:val="C00000"/>
           <w:sz w:val="26"/>
         </w:rPr>
-        <w:t>, 2nd ed., Cambridge University Press, 2010.</w:t>
+        <w:t>, 2021.</w:t>
+      </w:r>
+    </w:p>
+    <w:p>
+      <w:pPr>
+        <w:jc w:val="both"/>
+      </w:pPr>
+      <w:r>
+        <w:rPr>
+          <w:rFonts w:ascii="Times New Roman" w:hAnsi="Times New Roman" w:cs="Times New Roman"/>
+          <w:b w:val="0"/>
+          <w:i w:val="0"/>
+          <w:color w:val="C00000"/>
+          <w:sz w:val="26"/>
+        </w:rPr>
+        <w:t>[24] J. Postel, "User Datagram Protocol", RFC 768, IETF, 1980. [Online]. https://www.rfc-editor.org/rfc/rfc768</w:t>
       </w:r>
     </w:p>
     <w:p>
@@ -30695,7 +30620,7 @@
           <w:color w:val="C00000"/>
           <w:sz w:val="26"/>
         </w:rPr>
-        <w:t xml:space="preserve">[26] R. E. Kalman, "A New Approach to Linear Filtering and Prediction Problems", </w:t>
+        <w:t xml:space="preserve">[26] P. Corke, </w:t>
       </w:r>
       <w:r>
         <w:rPr>
@@ -30705,7 +30630,7 @@
           <w:color w:val="C00000"/>
           <w:sz w:val="26"/>
         </w:rPr>
-        <w:t>Journal of Basic Engineering</w:t>
+        <w:t>Robotics, Vision and Control: Fundamental Algorithms in MATLAB</w:t>
       </w:r>
       <w:r>
         <w:rPr>
@@ -30715,7 +30640,7 @@
           <w:color w:val="C00000"/>
           <w:sz w:val="26"/>
         </w:rPr>
-        <w:t>, vol. 82, no. 1, pp. 35–45, 1960.</w:t>
+        <w:t>, 2nd ed., Springer, 2017.</w:t>
       </w:r>
     </w:p>
     <w:p>
@@ -30730,7 +30655,7 @@
           <w:color w:val="C00000"/>
           <w:sz w:val="26"/>
         </w:rPr>
-        <w:t xml:space="preserve">[27] G. Welch, G. Bishop, </w:t>
+        <w:t xml:space="preserve">[27] S. Thrun, W. Burgard, D. Fox, </w:t>
       </w:r>
       <w:r>
         <w:rPr>
@@ -30740,7 +30665,7 @@
           <w:color w:val="C00000"/>
           <w:sz w:val="26"/>
         </w:rPr>
-        <w:t>An Introduction to the Kalman Filter</w:t>
+        <w:t>Probabilistic Robotics</w:t>
       </w:r>
       <w:r>
         <w:rPr>
@@ -30750,7 +30675,7 @@
           <w:color w:val="C00000"/>
           <w:sz w:val="26"/>
         </w:rPr>
-        <w:t>, Technical Report TR 95-041, University of North Carolina at Chapel Hill, 2006.</w:t>
+        <w:t>, MIT Press, 2005 (chương về odometry và mô hình chuyển động vi sai).</w:t>
       </w:r>
     </w:p>
     <w:p>
@@ -30765,7 +30690,7 @@
           <w:color w:val="C00000"/>
           <w:sz w:val="26"/>
         </w:rPr>
-        <w:t xml:space="preserve">[28] S. J. Russell, P. Norvig, </w:t>
+        <w:t xml:space="preserve">[28] G. Dudek, M. Jenkin, </w:t>
       </w:r>
       <w:r>
         <w:rPr>
@@ -30775,7 +30700,7 @@
           <w:color w:val="C00000"/>
           <w:sz w:val="26"/>
         </w:rPr>
-        <w:t>Artificial Intelligence: A Modern Approach</w:t>
+        <w:t>Computational Principles of Mobile Robotics</w:t>
       </w:r>
       <w:r>
         <w:rPr>
@@ -30785,7 +30710,7 @@
           <w:color w:val="C00000"/>
           <w:sz w:val="26"/>
         </w:rPr>
-        <w:t>, 4th ed., Pearson, 2021 (chương tìm kiếm heuristic, A*).</w:t>
+        <w:t>, 2nd ed., Cambridge University Press, 2010.</w:t>
       </w:r>
     </w:p>
     <w:p>
@@ -30800,7 +30725,7 @@
           <w:color w:val="C00000"/>
           <w:sz w:val="26"/>
         </w:rPr>
-        <w:t>[29] S. Koenig, M. Likhachev, "D</w:t>
+        <w:t xml:space="preserve">[29] R. E. Kalman, "A New Approach to Linear Filtering and Prediction Problems", </w:t>
       </w:r>
       <w:r>
         <w:rPr>
@@ -30810,7 +30735,7 @@
           <w:color w:val="C00000"/>
           <w:sz w:val="26"/>
         </w:rPr>
-        <w:t xml:space="preserve"> Lite", in </w:t>
+        <w:t>Journal of Basic Engineering</w:t>
       </w:r>
       <w:r>
         <w:rPr>
@@ -30820,7 +30745,7 @@
           <w:color w:val="C00000"/>
           <w:sz w:val="26"/>
         </w:rPr>
-        <w:t>Proc. AAAI Conf. on Artificial Intelligence*, 2002, pp. 476–483.</w:t>
+        <w:t>, vol. 82, no. 1, pp. 35–45, 1960.</w:t>
       </w:r>
     </w:p>
     <w:p>
@@ -30835,7 +30760,7 @@
           <w:color w:val="C00000"/>
           <w:sz w:val="26"/>
         </w:rPr>
-        <w:t xml:space="preserve">[30] P. Corke, </w:t>
+        <w:t xml:space="preserve">[30] G. Welch, G. Bishop, </w:t>
       </w:r>
       <w:r>
         <w:rPr>
@@ -30845,7 +30770,7 @@
           <w:color w:val="C00000"/>
           <w:sz w:val="26"/>
         </w:rPr>
-        <w:t>Robotics, Vision and Control: Fundamental Algorithms in MATLAB</w:t>
+        <w:t>An Introduction to the Kalman Filter</w:t>
       </w:r>
       <w:r>
         <w:rPr>
@@ -30855,7 +30780,7 @@
           <w:color w:val="C00000"/>
           <w:sz w:val="26"/>
         </w:rPr>
-        <w:t>, 2nd ed., Springer, 2017.</w:t>
+        <w:t>, Technical Report TR 95-041, University of North Carolina at Chapel Hill, 2006.</w:t>
       </w:r>
     </w:p>
     <w:p>
@@ -30865,27 +30790,12 @@
       <w:r>
         <w:rPr>
           <w:rFonts w:ascii="Times New Roman" w:hAnsi="Times New Roman" w:cs="Times New Roman"/>
-          <w:b/>
+          <w:b w:val="0"/>
           <w:i w:val="0"/>
           <w:color w:val="C00000"/>
           <w:sz w:val="26"/>
         </w:rPr>
-        <w:t>Công cụ và nền tảng phát triển:</w:t>
-      </w:r>
-    </w:p>
-    <w:p>
-      <w:pPr>
-        <w:jc w:val="both"/>
-      </w:pPr>
-      <w:r>
-        <w:rPr>
-          <w:rFonts w:ascii="Times New Roman" w:hAnsi="Times New Roman" w:cs="Times New Roman"/>
-          <w:b w:val="0"/>
-          <w:i w:val="0"/>
-          <w:color w:val="C00000"/>
-          <w:sz w:val="26"/>
-        </w:rPr>
-        <w:t xml:space="preserve">[31] PlatformIO Labs, </w:t>
+        <w:t xml:space="preserve">[31] S. J. Russell, P. Norvig, </w:t>
       </w:r>
       <w:r>
         <w:rPr>
@@ -30895,7 +30805,7 @@
           <w:color w:val="C00000"/>
           <w:sz w:val="26"/>
         </w:rPr>
-        <w:t>PlatformIO Documentation</w:t>
+        <w:t>Artificial Intelligence: A Modern Approach</w:t>
       </w:r>
       <w:r>
         <w:rPr>
@@ -30905,7 +30815,7 @@
           <w:color w:val="C00000"/>
           <w:sz w:val="26"/>
         </w:rPr>
-        <w:t>. [Online]. https://docs.platformio.org/</w:t>
+        <w:t>, 4th ed., Pearson, 2021 (chương tìm kiếm heuristic, A*).</w:t>
       </w:r>
     </w:p>
     <w:p>
@@ -30920,7 +30830,7 @@
           <w:color w:val="C00000"/>
           <w:sz w:val="26"/>
         </w:rPr>
-        <w:t xml:space="preserve">[32] Espressif Systems, </w:t>
+        <w:t>[32] S. Koenig, M. Likhachev, "D</w:t>
       </w:r>
       <w:r>
         <w:rPr>
@@ -30930,7 +30840,7 @@
           <w:color w:val="C00000"/>
           <w:sz w:val="26"/>
         </w:rPr>
-        <w:t>Non-Volatile Storage (NVS) Library — ESP-IDF Programming Guide</w:t>
+        <w:t xml:space="preserve"> Lite", in </w:t>
       </w:r>
       <w:r>
         <w:rPr>
@@ -30940,7 +30850,7 @@
           <w:color w:val="C00000"/>
           <w:sz w:val="26"/>
         </w:rPr>
-        <w:t>. [Online]. https://docs.espressif.com/projects/esp-idf/en/latest/esp32/api-reference/storage/nvs_flash.html</w:t>
+        <w:t>Proc. AAAI Conf. on Artificial Intelligence*, 2002, pp. 476–483.</w:t>
       </w:r>
     </w:p>
     <w:p>
@@ -30950,27 +30860,12 @@
       <w:r>
         <w:rPr>
           <w:rFonts w:ascii="Times New Roman" w:hAnsi="Times New Roman" w:cs="Times New Roman"/>
-          <w:b/>
+          <w:b w:val="0"/>
           <w:i w:val="0"/>
           <w:color w:val="C00000"/>
           <w:sz w:val="26"/>
         </w:rPr>
-        <w:t>Các nghiên cứu liên quan (hợp nhất cảm biến, tìm đường, né vật cản):</w:t>
-      </w:r>
-    </w:p>
-    <w:p>
-      <w:pPr>
-        <w:jc w:val="both"/>
-      </w:pPr>
-      <w:r>
-        <w:rPr>
-          <w:rFonts w:ascii="Times New Roman" w:hAnsi="Times New Roman" w:cs="Times New Roman"/>
-          <w:b w:val="0"/>
-          <w:i w:val="0"/>
-          <w:color w:val="C00000"/>
-          <w:sz w:val="26"/>
-        </w:rPr>
-        <w:t xml:space="preserve">[33] E. I. Al Khatib, M. A. Jaradat, M. Abdel-Hafez, M. Roigari, "Multiple Sensor Fusion for Mobile Robot Localization and Navigation Using the Extended Kalman Filter", in </w:t>
+        <w:t xml:space="preserve">[33] PlatformIO Labs, </w:t>
       </w:r>
       <w:r>
         <w:rPr>
@@ -30980,7 +30875,7 @@
           <w:color w:val="C00000"/>
           <w:sz w:val="26"/>
         </w:rPr>
-        <w:t>Proc. 10th Int. Symp. on Mechatronics and its Applications (ISMA)</w:t>
+        <w:t>PlatformIO Documentation</w:t>
       </w:r>
       <w:r>
         <w:rPr>
@@ -30990,7 +30885,7 @@
           <w:color w:val="C00000"/>
           <w:sz w:val="26"/>
         </w:rPr>
-        <w:t>, 2015, pp. 1–5.</w:t>
+        <w:t>. [Online]. https://docs.platformio.org/</w:t>
       </w:r>
     </w:p>
     <w:p>
@@ -31005,7 +30900,7 @@
           <w:color w:val="C00000"/>
           <w:sz w:val="26"/>
         </w:rPr>
-        <w:t xml:space="preserve">[34] T. T. K. Ly, L. T. Phong, D. K. Nhan, "Autonomous Mobile Robot Localization by Using IMU and Encoder Data Fusion Technique by Kalman Filter", in </w:t>
+        <w:t xml:space="preserve">[34] Espressif Systems, </w:t>
       </w:r>
       <w:r>
         <w:rPr>
@@ -31015,7 +30910,7 @@
           <w:color w:val="C00000"/>
           <w:sz w:val="26"/>
         </w:rPr>
-        <w:t>Advances in Engineering Research and Application (ICERA)</w:t>
+        <w:t>Non-Volatile Storage (NVS) Library — ESP-IDF Programming Guide</w:t>
       </w:r>
       <w:r>
         <w:rPr>
@@ -31025,7 +30920,7 @@
           <w:color w:val="C00000"/>
           <w:sz w:val="26"/>
         </w:rPr>
-        <w:t>, Lecture Notes in Networks and Systems, Springer, 2024, pp. 245–256.</w:t>
+        <w:t>. [Online]. https://docs.espressif.com/projects/esp-idf/en/latest/esp32/api-reference/storage/nvs_flash.html</w:t>
       </w:r>
     </w:p>
     <w:p>
@@ -31040,7 +30935,7 @@
           <w:color w:val="C00000"/>
           <w:sz w:val="26"/>
         </w:rPr>
-        <w:t xml:space="preserve">[35] A. A. Housein, G. Xingyu, W. Li, Y. Huang, "Extended Kalman Filter Sensor Fusion in Practice for Mobile Robot Localization", </w:t>
+        <w:t xml:space="preserve">[35] Espressif Systems, </w:t>
       </w:r>
       <w:r>
         <w:rPr>
@@ -31050,7 +30945,7 @@
           <w:color w:val="C00000"/>
           <w:sz w:val="26"/>
         </w:rPr>
-        <w:t>Int. Journal of Advanced Computer Science and Applications (IJACSA)</w:t>
+        <w:t>ESP32 Series Datasheet</w:t>
       </w:r>
       <w:r>
         <w:rPr>
@@ -31060,7 +30955,7 @@
           <w:color w:val="C00000"/>
           <w:sz w:val="26"/>
         </w:rPr>
-        <w:t>, vol. 13, no. 2, 2022.</w:t>
+        <w:t>, 2024. [Online]. https://www.espressif.com/sites/default/files/documentation/esp32_datasheet_en.pdf</w:t>
       </w:r>
     </w:p>
     <w:p>
@@ -31075,7 +30970,7 @@
           <w:color w:val="C00000"/>
           <w:sz w:val="26"/>
         </w:rPr>
-        <w:t xml:space="preserve">[36] G. Huang et al., "Multi-Sensor Fusion for Wheel-Inertial-Visual Systems Using a Fuzzification-Assisted Iterated Error State Kalman Filter", </w:t>
+        <w:t xml:space="preserve">[36] Espressif Systems, </w:t>
       </w:r>
       <w:r>
         <w:rPr>
@@ -31085,7 +30980,7 @@
           <w:color w:val="C00000"/>
           <w:sz w:val="26"/>
         </w:rPr>
-        <w:t>Sensors</w:t>
+        <w:t>ESP32-WROOM-32 Datasheet</w:t>
       </w:r>
       <w:r>
         <w:rPr>
@@ -31095,7 +30990,7 @@
           <w:color w:val="C00000"/>
           <w:sz w:val="26"/>
         </w:rPr>
-        <w:t>, vol. 24, no. 23, art. 7619, 2024.</w:t>
+        <w:t>, 2024. [Online]. https://www.espressif.com/sites/default/files/documentation/esp32-wroom-32_datasheet_en.pdf</w:t>
       </w:r>
     </w:p>
     <w:p>
@@ -31110,7 +31005,7 @@
           <w:color w:val="C00000"/>
           <w:sz w:val="26"/>
         </w:rPr>
-        <w:t>[37] M. Yao, H. Deng, X. Feng, P. Li, Y. Li, H. Liu, "Global Path Planning for Differential Drive Mobile Robots Based on Improved BSGA</w:t>
+        <w:t xml:space="preserve">[37] STMicroelectronics, </w:t>
       </w:r>
       <w:r>
         <w:rPr>
@@ -31120,7 +31015,7 @@
           <w:color w:val="C00000"/>
           <w:sz w:val="26"/>
         </w:rPr>
-        <w:t xml:space="preserve"> Algorithm", </w:t>
+        <w:t>L298 Dual Full-Bridge Driver Datasheet</w:t>
       </w:r>
       <w:r>
         <w:rPr>
@@ -31130,7 +31025,7 @@
           <w:color w:val="C00000"/>
           <w:sz w:val="26"/>
         </w:rPr>
-        <w:t>Applied Sciences*, vol. 13, no. 20, art. 11290, 2023.</w:t>
+        <w:t>. [Online]. https://www.st.com/resource/en/datasheet/l298.pdf</w:t>
       </w:r>
     </w:p>
     <w:p>
@@ -31145,7 +31040,7 @@
           <w:color w:val="C00000"/>
           <w:sz w:val="26"/>
         </w:rPr>
-        <w:t xml:space="preserve">[38] V. Shahapur, B. Dixon, U. Bharti, "Robotic Path Planning Implementation using Search Algorithms", </w:t>
+        <w:t xml:space="preserve">[38] InvenSense (TDK), </w:t>
       </w:r>
       <w:r>
         <w:rPr>
@@ -31155,7 +31050,7 @@
           <w:color w:val="C00000"/>
           <w:sz w:val="26"/>
         </w:rPr>
-        <w:t>arXiv preprint</w:t>
+        <w:t>MPU-6000/MPU-6050 Product Specification &amp; Register Map</w:t>
       </w:r>
       <w:r>
         <w:rPr>
@@ -31165,7 +31060,7 @@
           <w:color w:val="C00000"/>
           <w:sz w:val="26"/>
         </w:rPr>
-        <w:t xml:space="preserve"> arXiv:2405.16445, 2024.</w:t>
+        <w:t>, Rev. 3.4/4.2. [Online]. https://invensense.tdk.com/products/motion-tracking/6-axis/mpu-6050/</w:t>
       </w:r>
     </w:p>
     <w:p>
@@ -31180,7 +31075,7 @@
           <w:color w:val="C00000"/>
           <w:sz w:val="26"/>
         </w:rPr>
-        <w:t xml:space="preserve">[39] J. N. Yasin, S. A. S. Mohamed, M.-H. Haghbayan, J. Heikkonen, H. Tenhunen, J. Plosila, "Low-cost ultrasonic based object detection and collision avoidance method for autonomous robots", </w:t>
+        <w:t xml:space="preserve">[39] SparkFun Electronics, </w:t>
       </w:r>
       <w:r>
         <w:rPr>
@@ -31190,7 +31085,7 @@
           <w:color w:val="C00000"/>
           <w:sz w:val="26"/>
         </w:rPr>
-        <w:t>Int. Journal of Information Technology</w:t>
+        <w:t>HC-SR04 Ultrasonic Sensor Module</w:t>
       </w:r>
       <w:r>
         <w:rPr>
@@ -31200,7 +31095,7 @@
           <w:color w:val="C00000"/>
           <w:sz w:val="26"/>
         </w:rPr>
-        <w:t>, vol. 13, pp. 97–107, 2020.</w:t>
+        <w:t>. [Online]. https://cdn.sparkfun.com/datasheets/Sensors/Proximity/HCSR04.pdf</w:t>
       </w:r>
     </w:p>
     <w:p>

</xml_diff>

<commit_message>
report: them ten tac gia o moi cho trich dan trong than bai
- Chen [n] -> [n] (Tac gia) cho 44 cho trich dan; bo qua 6 cho da co '... va cong su [n]' (muc 1.1).
- Ten tac gia theo so moi (sau khi danh so lai theo thu tu xuat hien), nam trong span.chg (do).
- Span can bang 146/146.
- Rebuild HTML/PDF/DOCX.
</commit_message>
<xml_diff>
--- a/docs/bao-cao-xe-tu-hanh.docx
+++ b/docs/bao-cao-xe-tu-hanh.docx
@@ -5397,7 +5397,7 @@
           <w:color w:val="C00000"/>
           <w:sz w:val="26"/>
         </w:rPr>
-        <w:t>[1]</w:t>
+        <w:t>[1] (Siegwart và cộng sự)</w:t>
       </w:r>
       <w:r>
         <w:rPr>
@@ -5416,7 +5416,7 @@
           <w:color w:val="C00000"/>
           <w:sz w:val="26"/>
         </w:rPr>
-        <w:t>[2]</w:t>
+        <w:t>[2] (Fragapane và cộng sự)</w:t>
       </w:r>
       <w:r>
         <w:rPr>
@@ -5435,7 +5435,7 @@
           <w:color w:val="C00000"/>
           <w:sz w:val="26"/>
         </w:rPr>
-        <w:t>[2]</w:t>
+        <w:t>[2] (Fragapane và cộng sự)</w:t>
       </w:r>
       <w:r>
         <w:rPr>
@@ -5522,7 +5522,7 @@
           <w:color w:val="C00000"/>
           <w:sz w:val="26"/>
         </w:rPr>
-        <w:t>[1]</w:t>
+        <w:t>[1] (Siegwart và cộng sự)</w:t>
       </w:r>
       <w:r>
         <w:rPr>
@@ -5541,7 +5541,7 @@
           <w:color w:val="C00000"/>
           <w:sz w:val="26"/>
         </w:rPr>
-        <w:t>[3]</w:t>
+        <w:t>[3] (Borenstein và cộng sự)</w:t>
       </w:r>
       <w:r>
         <w:rPr>
@@ -5560,7 +5560,7 @@
           <w:color w:val="C00000"/>
           <w:sz w:val="26"/>
         </w:rPr>
-        <w:t>[4]</w:t>
+        <w:t>[4] (Cadena và cộng sự)</w:t>
       </w:r>
       <w:r>
         <w:rPr>
@@ -5650,7 +5650,7 @@
           <w:color w:val="C00000"/>
           <w:sz w:val="26"/>
         </w:rPr>
-        <w:t>[8]</w:t>
+        <w:t>[8] (Huang và cộng sự)</w:t>
       </w:r>
       <w:r>
         <w:rPr>
@@ -5687,7 +5687,7 @@
           <w:color w:val="C00000"/>
           <w:sz w:val="26"/>
         </w:rPr>
-        <w:t>[9]</w:t>
+        <w:t>[9] (Mahony và cộng sự)</w:t>
       </w:r>
       <w:r>
         <w:rPr>
@@ -5720,7 +5720,7 @@
           <w:color w:val="C00000"/>
           <w:sz w:val="26"/>
         </w:rPr>
-        <w:t>[10]</w:t>
+        <w:t>[10] (Dijkstra)</w:t>
       </w:r>
       <w:r>
         <w:rPr>
@@ -5757,7 +5757,7 @@
           <w:color w:val="C00000"/>
           <w:sz w:val="26"/>
         </w:rPr>
-        <w:t>[11]</w:t>
+        <w:t>[11] (Hart và cộng sự)</w:t>
       </w:r>
       <w:r>
         <w:rPr>
@@ -5776,7 +5776,7 @@
           <w:color w:val="C00000"/>
           <w:sz w:val="26"/>
         </w:rPr>
-        <w:t>[12]</w:t>
+        <w:t>[12] (LaValle)</w:t>
       </w:r>
       <w:r>
         <w:rPr>
@@ -5938,7 +5938,7 @@
           <w:color w:val="C00000"/>
           <w:sz w:val="26"/>
         </w:rPr>
-        <w:t>[4]</w:t>
+        <w:t>[4] (Cadena và cộng sự)</w:t>
       </w:r>
       <w:r>
         <w:rPr>
@@ -5975,7 +5975,7 @@
           <w:color w:val="C00000"/>
           <w:sz w:val="26"/>
         </w:rPr>
-        <w:t>[16]</w:t>
+        <w:t>[16] (Maier và cộng sự)</w:t>
       </w:r>
       <w:r>
         <w:rPr>
@@ -6008,7 +6008,7 @@
           <w:color w:val="C00000"/>
           <w:sz w:val="26"/>
         </w:rPr>
-        <w:t>[13]</w:t>
+        <w:t>[13] (Shahapur và cộng sự)</w:t>
       </w:r>
       <w:r>
         <w:rPr>
@@ -6027,7 +6027,7 @@
           <w:color w:val="C00000"/>
           <w:sz w:val="26"/>
         </w:rPr>
-        <w:t>[5]</w:t>
+        <w:t>[5] (Al Khatib và cộng sự)</w:t>
       </w:r>
       <w:r>
         <w:rPr>
@@ -6046,7 +6046,7 @@
           <w:color w:val="C00000"/>
           <w:sz w:val="26"/>
         </w:rPr>
-        <w:t>[7]</w:t>
+        <w:t>[7] (Housein và cộng sự)</w:t>
       </w:r>
       <w:r>
         <w:rPr>
@@ -6115,7 +6115,7 @@
           <w:color w:val="C00000"/>
           <w:sz w:val="26"/>
         </w:rPr>
-        <w:t>[9]</w:t>
+        <w:t>[9] (Mahony và cộng sự)</w:t>
       </w:r>
       <w:r>
         <w:rPr>
@@ -6134,7 +6134,7 @@
           <w:color w:val="C00000"/>
           <w:sz w:val="26"/>
         </w:rPr>
-        <w:t>[11]</w:t>
+        <w:t>[11] (Hart và cộng sự)</w:t>
       </w:r>
       <w:r>
         <w:rPr>
@@ -6153,7 +6153,7 @@
           <w:color w:val="C00000"/>
           <w:sz w:val="26"/>
         </w:rPr>
-        <w:t>[17]</w:t>
+        <w:t>[17] (Google)</w:t>
       </w:r>
       <w:r>
         <w:rPr>
@@ -7356,7 +7356,7 @@
           <w:color w:val="C00000"/>
           <w:sz w:val="26"/>
         </w:rPr>
-        <w:t>[18]</w:t>
+        <w:t>[18] (Espressif)</w:t>
       </w:r>
       <w:r>
         <w:rPr>
@@ -7457,7 +7457,7 @@
           <w:color w:val="C00000"/>
           <w:sz w:val="26"/>
         </w:rPr>
-        <w:t>[19]</w:t>
+        <w:t>[19] (NXP)</w:t>
       </w:r>
       <w:r>
         <w:rPr>
@@ -7653,7 +7653,7 @@
           <w:color w:val="C00000"/>
           <w:sz w:val="26"/>
         </w:rPr>
-        <w:t>[20]</w:t>
+        <w:t>[20] (D. W. Hart)</w:t>
       </w:r>
       <w:r>
         <w:rPr>
@@ -7704,7 +7704,7 @@
           <w:color w:val="C00000"/>
           <w:sz w:val="26"/>
         </w:rPr>
-        <w:t>[21]</w:t>
+        <w:t>[21] (Espressif)</w:t>
       </w:r>
       <w:r>
         <w:rPr>
@@ -8127,7 +8127,7 @@
           <w:color w:val="C00000"/>
           <w:sz w:val="26"/>
         </w:rPr>
-        <w:t>[22]</w:t>
+        <w:t>[22] (Texas Instruments)</w:t>
       </w:r>
       <w:r>
         <w:rPr>
@@ -8174,7 +8174,7 @@
           <w:color w:val="C00000"/>
           <w:sz w:val="26"/>
         </w:rPr>
-        <w:t>[23]</w:t>
+        <w:t>[23] (IEEE)</w:t>
       </w:r>
       <w:r>
         <w:rPr>
@@ -8243,7 +8243,7 @@
           <w:color w:val="C00000"/>
           <w:sz w:val="26"/>
         </w:rPr>
-        <w:t>[24]</w:t>
+        <w:t>[24] (Postel)</w:t>
       </w:r>
       <w:r>
         <w:rPr>
@@ -8341,7 +8341,7 @@
           <w:color w:val="C00000"/>
           <w:sz w:val="26"/>
         </w:rPr>
-        <w:t>[25]</w:t>
+        <w:t>[25] (Lynch và Park)</w:t>
       </w:r>
       <w:r>
         <w:rPr>
@@ -8360,7 +8360,7 @@
           <w:color w:val="C00000"/>
           <w:sz w:val="26"/>
         </w:rPr>
-        <w:t>[26]</w:t>
+        <w:t>[26] (Corke)</w:t>
       </w:r>
       <w:r>
         <w:rPr>
@@ -8454,7 +8454,7 @@
           <w:color w:val="C00000"/>
           <w:sz w:val="26"/>
         </w:rPr>
-        <w:t>[27]</w:t>
+        <w:t>[27] (Thrun và cộng sự)</w:t>
       </w:r>
       <w:r>
         <w:rPr>
@@ -8473,7 +8473,7 @@
           <w:color w:val="C00000"/>
           <w:sz w:val="26"/>
         </w:rPr>
-        <w:t>[28]</w:t>
+        <w:t>[28] (Dudek và Jenkin)</w:t>
       </w:r>
       <w:r>
         <w:rPr>
@@ -8830,7 +8830,7 @@
           <w:color w:val="C00000"/>
           <w:sz w:val="26"/>
         </w:rPr>
-        <w:t>[9]</w:t>
+        <w:t>[9] (Mahony và cộng sự)</w:t>
       </w:r>
       <w:r>
         <w:rPr>
@@ -8867,7 +8867,7 @@
           <w:color w:val="C00000"/>
           <w:sz w:val="26"/>
         </w:rPr>
-        <w:t>[29]</w:t>
+        <w:t>[29] (Kalman)</w:t>
       </w:r>
       <w:r>
         <w:rPr>
@@ -8886,7 +8886,7 @@
           <w:color w:val="C00000"/>
           <w:sz w:val="26"/>
         </w:rPr>
-        <w:t>[30]</w:t>
+        <w:t>[30] (Welch và Bishop)</w:t>
       </w:r>
       <w:r>
         <w:rPr>
@@ -9107,7 +9107,7 @@
           <w:color w:val="C00000"/>
           <w:sz w:val="26"/>
         </w:rPr>
-        <w:t>[11]</w:t>
+        <w:t>[11] (Hart và cộng sự)</w:t>
       </w:r>
       <w:r>
         <w:rPr>
@@ -9126,7 +9126,7 @@
           <w:color w:val="C00000"/>
           <w:sz w:val="26"/>
         </w:rPr>
-        <w:t>[31]</w:t>
+        <w:t>[31] (Russell và Norvig)</w:t>
       </w:r>
       <w:r>
         <w:rPr>
@@ -9297,7 +9297,7 @@
           <w:color w:val="C00000"/>
           <w:sz w:val="26"/>
         </w:rPr>
-        <w:t>[32]</w:t>
+        <w:t>[32] (Koenig và Likhachev)</w:t>
       </w:r>
       <w:r>
         <w:rPr>
@@ -9391,7 +9391,7 @@
           <w:color w:val="C00000"/>
           <w:sz w:val="26"/>
         </w:rPr>
-        <w:t>[33]</w:t>
+        <w:t>[33] (PlatformIO Labs)</w:t>
       </w:r>
       <w:r>
         <w:rPr>
@@ -9907,7 +9907,7 @@
                 <w:color w:val="C00000"/>
                 <w:sz w:val="24"/>
               </w:rPr>
-              <w:t>[34]</w:t>
+              <w:t>[34] (Espressif)</w:t>
             </w:r>
           </w:p>
         </w:tc>
@@ -12131,7 +12131,7 @@
           <w:color w:val="C00000"/>
           <w:sz w:val="26"/>
         </w:rPr>
-        <w:t>[35]</w:t>
+        <w:t>[35] (Espressif)</w:t>
       </w:r>
       <w:r>
         <w:rPr>
@@ -12150,7 +12150,7 @@
           <w:color w:val="C00000"/>
           <w:sz w:val="26"/>
         </w:rPr>
-        <w:t>[36]</w:t>
+        <w:t>[36] (Espressif)</w:t>
       </w:r>
       <w:r>
         <w:rPr>
@@ -12420,7 +12420,7 @@
           <w:color w:val="C00000"/>
           <w:sz w:val="26"/>
         </w:rPr>
-        <w:t>[37]</w:t>
+        <w:t>[37] (STMicroelectronics)</w:t>
       </w:r>
       <w:r>
         <w:rPr>
@@ -13388,7 +13388,7 @@
           <w:color w:val="C00000"/>
           <w:sz w:val="26"/>
         </w:rPr>
-        <w:t>[38]</w:t>
+        <w:t>[38] (InvenSense/TDK)</w:t>
       </w:r>
       <w:r>
         <w:rPr>
@@ -13800,7 +13800,7 @@
           <w:color w:val="C00000"/>
           <w:sz w:val="26"/>
         </w:rPr>
-        <w:t>[39]</w:t>
+        <w:t>[39] (SparkFun)</w:t>
       </w:r>
       <w:r>
         <w:rPr>
@@ -15531,7 +15531,7 @@
           <w:color w:val="C00000"/>
           <w:sz w:val="26"/>
         </w:rPr>
-        <w:t>[17]</w:t>
+        <w:t>[17] (Google)</w:t>
       </w:r>
       <w:r>
         <w:rPr>

</xml_diff>